<commit_message>
docs: fix mermaid parse error in AI micro-lesson sequence diagram
mermaid read '->' inside the Note as an arrow token. Reworded the note (and dropped braces/brackets in that diagram's messages); rebuilt the .docx.

Co-Authored-By: Claude Opus 4.8 <noreply@anthropic.com>
</commit_message>
<xml_diff>
--- a/docs/LARE-Documentation.docx
+++ b/docs/LARE-Documentation.docx
@@ -60,6 +60,11 @@
         </w:p>
       </w:sdtContent>
     </w:sdt>
+    <w:p>
+      <w:r>
+        <w:br w:type="page"/>
+      </w:r>
+    </w:p>
     <w:bookmarkStart w:id="9" w:name="executive-summary"/>
     <w:p>
       <w:pPr>
@@ -389,6 +394,11 @@
         <w:t xml:space="preserve">Security, deployment, operations, and the roadmap.</w:t>
       </w:r>
     </w:p>
+    <w:p>
+      <w:r>
+        <w:br w:type="page"/>
+      </w:r>
+    </w:p>
     <w:bookmarkEnd w:id="9"/>
     <w:bookmarkStart w:id="14" w:name="the-problem-we-are-overcoming"/>
     <w:p>
@@ -876,6 +886,11 @@
           <w:bCs/>
         </w:rPr>
         <w:t xml:space="preserve">Teach a skill, measure it honestly, prove it verifiably, and connect it to an opportunity — on one platform.</w:t>
+      </w:r>
+    </w:p>
+    <w:p>
+      <w:r>
+        <w:br w:type="page"/>
       </w:r>
     </w:p>
     <w:bookmarkEnd w:id="13"/>
@@ -1989,6 +2004,11 @@
         <w:t xml:space="preserve">End‑to‑end AWS deployment (Nginx + systemd/process model + RDS + TLS).</w:t>
       </w:r>
     </w:p>
+    <w:p>
+      <w:r>
+        <w:br w:type="page"/>
+      </w:r>
+    </w:p>
     <w:bookmarkEnd w:id="17"/>
     <w:bookmarkEnd w:id="18"/>
     <w:bookmarkStart w:id="23" w:name="system-architecture-three-tier"/>
@@ -3120,6 +3140,11 @@
           <w:rStyle w:val="VerbatimChar"/>
         </w:rPr>
         <w:t xml:space="preserve">                                                  RDS PostgreSQL :5432</w:t>
+      </w:r>
+    </w:p>
+    <w:p>
+      <w:r>
+        <w:br w:type="page"/>
       </w:r>
     </w:p>
     <w:bookmarkEnd w:id="22"/>
@@ -5820,6 +5845,11 @@
         <w:t xml:space="preserve">. This decouples producers from consumers - e.g. earning a badge can trigger a notification without the gamification service knowing about email.</w:t>
       </w:r>
     </w:p>
+    <w:p>
+      <w:r>
+        <w:br w:type="page"/>
+      </w:r>
+    </w:p>
     <w:bookmarkEnd w:id="27"/>
     <w:bookmarkEnd w:id="28"/>
     <w:bookmarkStart w:id="30" w:name="data-model-conceptual-er"/>
@@ -6285,6 +6315,11 @@
         <w:t xml:space="preserve">(result) - compiled ranks and issued offers/PPOs.</w:t>
       </w:r>
     </w:p>
+    <w:p>
+      <w:r>
+        <w:br w:type="page"/>
+      </w:r>
+    </w:p>
     <w:bookmarkEnd w:id="29"/>
     <w:bookmarkEnd w:id="30"/>
     <w:bookmarkStart w:id="44" w:name="api-architecture"/>
@@ -9508,6 +9543,11 @@
       </w:r>
       <w:r>
         <w:t xml:space="preserve">- AI tutor.</w:t>
+      </w:r>
+    </w:p>
+    <w:p>
+      <w:r>
+        <w:br w:type="page"/>
       </w:r>
     </w:p>
     <w:bookmarkEnd w:id="42"/>
@@ -10738,6 +10778,11 @@
         <w:t xml:space="preserve">).</w:t>
       </w:r>
     </w:p>
+    <w:p>
+      <w:r>
+        <w:br w:type="page"/>
+      </w:r>
+    </w:p>
     <w:bookmarkEnd w:id="51"/>
     <w:bookmarkEnd w:id="52"/>
     <w:bookmarkStart w:id="100" w:name="page-by-page-walkthrough"/>
@@ -17407,6 +17452,11 @@
       </w:r>
       <w:r>
         <w:t xml:space="preserve">.</w:t>
+      </w:r>
+    </w:p>
+    <w:p>
+      <w:r>
+        <w:br w:type="page"/>
       </w:r>
     </w:p>
     <w:bookmarkEnd w:id="98"/>
@@ -18666,7 +18716,7 @@
         <w:rPr>
           <w:rStyle w:val="VerbatimChar"/>
         </w:rPr>
-        <w:t xml:space="preserve">  S-&gt;&gt;GW: POST /lms/v1/micro-lessons/{id}/generate {topic}</w:t>
+        <w:t xml:space="preserve">  S-&gt;&gt;GW: POST micro-lessons generate (topic)</w:t>
       </w:r>
       <w:r>
         <w:br/>
@@ -18720,16 +18770,16 @@
         <w:rPr>
           <w:rStyle w:val="VerbatimChar"/>
         </w:rPr>
-        <w:t xml:space="preserve">  AS--&gt;&gt;S: { lesson: [blocks] }  (persisted)</w:t>
-      </w:r>
-      <w:r>
-        <w:br/>
-      </w:r>
-      <w:r>
-        <w:rPr>
-          <w:rStyle w:val="VerbatimChar"/>
-        </w:rPr>
-        <w:t xml:space="preserve">  Note over AS: transient 503 -&gt; retry; never persist a generic template</w:t>
+        <w:t xml:space="preserve">  AS--&gt;&gt;S: lesson blocks (persisted)</w:t>
+      </w:r>
+      <w:r>
+        <w:br/>
+      </w:r>
+      <w:r>
+        <w:rPr>
+          <w:rStyle w:val="VerbatimChar"/>
+        </w:rPr>
+        <w:t xml:space="preserve">  Note over AS: transient 503 retries, never a generic template</w:t>
       </w:r>
     </w:p>
     <w:bookmarkEnd w:id="105"/>
@@ -19453,6 +19503,11 @@
           <w:rStyle w:val="VerbatimChar"/>
         </w:rPr>
         <w:t xml:space="preserve">  S --&gt; SMTP["Zoho SMTP"]</w:t>
+      </w:r>
+    </w:p>
+    <w:p>
+      <w:r>
+        <w:br w:type="page"/>
       </w:r>
     </w:p>
     <w:bookmarkEnd w:id="109"/>
@@ -19893,6 +19948,11 @@
       </w:r>
       <w:r>
         <w:t xml:space="preserve">and reports integrity events (focus/tab/visibility) to the anticheat service, which flags anomalies for the exam session.</w:t>
+      </w:r>
+    </w:p>
+    <w:p>
+      <w:r>
+        <w:br w:type="page"/>
       </w:r>
     </w:p>
     <w:bookmarkEnd w:id="119"/>
@@ -20282,6 +20342,11 @@
         </w:tc>
       </w:tr>
     </w:tbl>
+    <w:p>
+      <w:r>
+        <w:br w:type="page"/>
+      </w:r>
+    </w:p>
     <w:bookmarkEnd w:id="121"/>
     <w:bookmarkStart w:id="126" w:name="deployment-operations"/>
     <w:p>
@@ -20877,6 +20942,11 @@
       </w:r>
       <w:r>
         <w:t xml:space="preserve">: exports/PDFs refresh the token like any other call, so they survive an access-token expiry mid-session.</w:t>
+      </w:r>
+    </w:p>
+    <w:p>
+      <w:r>
+        <w:br w:type="page"/>
       </w:r>
     </w:p>
     <w:bookmarkEnd w:id="125"/>
@@ -20943,6 +21013,11 @@
       </w:pPr>
       <w:r>
         <w:t xml:space="preserve">Further product directions: richer analytics, deeper AI evaluation, mobile-optimised take-flows, and expanded credential standards.</w:t>
+      </w:r>
+    </w:p>
+    <w:p>
+      <w:r>
+        <w:br w:type="page"/>
       </w:r>
     </w:p>
     <w:bookmarkEnd w:id="127"/>

</xml_diff>

<commit_message>
docs: add per-service data dictionaries (all 25 services, real schemas)
Co-Authored-By: Claude Opus 4.8 <noreply@anthropic.com>
</commit_message>
<xml_diff>
--- a/docs/LARE-Documentation.docx
+++ b/docs/LARE-Documentation.docx
@@ -21684,6 +21684,3158 @@
     </w:p>
     <w:p>
       <w:r>
+        <w:br w:type="page"/>
+      </w:r>
+    </w:p>
+    <w:bookmarkEnd w:id="131"/>
+    <w:bookmarkEnd w:id="132"/>
+    <w:bookmarkStart w:id="143" w:name="data-dictionary-identity-learn-services"/>
+    <w:p>
+      <w:pPr>
+        <w:pStyle w:val="Heading1"/>
+      </w:pPr>
+      <w:r>
+        <w:t xml:space="preserve">16. Data Dictionary — Identity &amp; Learn Services</w:t>
+      </w:r>
+    </w:p>
+    <w:p>
+      <w:pPr>
+        <w:pStyle w:val="FirstParagraph"/>
+      </w:pPr>
+      <w:r>
+        <w:t xml:space="preserve">This appendix documents the real tables and columns for the identity and LARE Learn services (source: each service’s</w:t>
+      </w:r>
+      <w:r>
+        <w:t xml:space="preserve"> </w:t>
+      </w:r>
+      <w:r>
+        <w:rPr>
+          <w:rStyle w:val="VerbatimChar"/>
+        </w:rPr>
+        <w:t xml:space="preserve">models.py</w:t>
+      </w:r>
+      <w:r>
+        <w:t xml:space="preserve">). Every table uses a string primary key</w:t>
+      </w:r>
+      <w:r>
+        <w:t xml:space="preserve"> </w:t>
+      </w:r>
+      <w:r>
+        <w:rPr>
+          <w:rStyle w:val="VerbatimChar"/>
+        </w:rPr>
+        <w:t xml:space="preserve">id</w:t>
+      </w:r>
+      <w:r>
+        <w:t xml:space="preserve"> </w:t>
+      </w:r>
+      <w:r>
+        <w:t xml:space="preserve">(a generated uuid) unless noted. Timestamps are timezone-aware.</w:t>
+      </w:r>
+      <w:r>
+        <w:t xml:space="preserve"> </w:t>
+      </w:r>
+      <w:r>
+        <w:rPr>
+          <w:rStyle w:val="VerbatimChar"/>
+        </w:rPr>
+        <w:t xml:space="preserve">JSON</w:t>
+      </w:r>
+      <w:r>
+        <w:t xml:space="preserve"> </w:t>
+      </w:r>
+      <w:r>
+        <w:t xml:space="preserve">columns store structured payloads.</w:t>
+      </w:r>
+    </w:p>
+    <w:bookmarkStart w:id="133" w:name="auth-schema-lare_auth"/>
+    <w:p>
+      <w:pPr>
+        <w:pStyle w:val="Heading2"/>
+      </w:pPr>
+      <w:r>
+        <w:t xml:space="preserve">16.1 auth (schema:</w:t>
+      </w:r>
+      <w:r>
+        <w:t xml:space="preserve"> </w:t>
+      </w:r>
+      <w:r>
+        <w:rPr>
+          <w:rStyle w:val="VerbatimChar"/>
+        </w:rPr>
+        <w:t xml:space="preserve">lare_auth</w:t>
+      </w:r>
+      <w:r>
+        <w:t xml:space="preserve">)</w:t>
+      </w:r>
+    </w:p>
+    <w:p>
+      <w:pPr>
+        <w:pStyle w:val="FirstParagraph"/>
+      </w:pPr>
+      <w:r>
+        <w:rPr>
+          <w:b/>
+          <w:bCs/>
+        </w:rPr>
+        <w:t xml:space="preserve">users</w:t>
+      </w:r>
+    </w:p>
+    <w:tbl>
+      <w:tblPr>
+        <w:tblStyle w:val="Table"/>
+        <w:tblW w:type="auto" w:w="0"/>
+        <w:tblLook w:firstRow="1" w:lastRow="0" w:firstColumn="0" w:lastColumn="0" w:noHBand="0" w:noVBand="0" w:val="0020"/>
+      </w:tblPr>
+      <w:tblGrid>
+        <w:gridCol w:w="2640"/>
+        <w:gridCol w:w="2640"/>
+        <w:gridCol w:w="2640"/>
+      </w:tblGrid>
+      <w:tr>
+        <w:trPr>
+          <w:tblHeader w:val="on"/>
+        </w:trPr>
+        <w:tc>
+          <w:tcPr/>
+          <w:p>
+            <w:pPr>
+              <w:pStyle w:val="Compact"/>
+            </w:pPr>
+            <w:r>
+              <w:t xml:space="preserve">Column</w:t>
+            </w:r>
+          </w:p>
+        </w:tc>
+        <w:tc>
+          <w:tcPr/>
+          <w:p>
+            <w:pPr>
+              <w:pStyle w:val="Compact"/>
+            </w:pPr>
+            <w:r>
+              <w:t xml:space="preserve">Type</w:t>
+            </w:r>
+          </w:p>
+        </w:tc>
+        <w:tc>
+          <w:tcPr/>
+          <w:p>
+            <w:pPr>
+              <w:pStyle w:val="Compact"/>
+            </w:pPr>
+            <w:r>
+              <w:t xml:space="preserve">Notes</w:t>
+            </w:r>
+          </w:p>
+        </w:tc>
+      </w:tr>
+      <w:tr>
+        <w:tc>
+          <w:tcPr/>
+          <w:p>
+            <w:pPr>
+              <w:pStyle w:val="Compact"/>
+            </w:pPr>
+            <w:r>
+              <w:t xml:space="preserve">id</w:t>
+            </w:r>
+          </w:p>
+        </w:tc>
+        <w:tc>
+          <w:tcPr/>
+          <w:p>
+            <w:pPr>
+              <w:pStyle w:val="Compact"/>
+            </w:pPr>
+            <w:r>
+              <w:t xml:space="preserve">String PK</w:t>
+            </w:r>
+          </w:p>
+        </w:tc>
+        <w:tc>
+          <w:tcPr/>
+          <w:p>
+            <w:pPr>
+              <w:pStyle w:val="Compact"/>
+            </w:pPr>
+            <w:r>
+              <w:t xml:space="preserve">uuid</w:t>
+            </w:r>
+          </w:p>
+        </w:tc>
+      </w:tr>
+      <w:tr>
+        <w:tc>
+          <w:tcPr/>
+          <w:p>
+            <w:pPr>
+              <w:pStyle w:val="Compact"/>
+            </w:pPr>
+            <w:r>
+              <w:t xml:space="preserve">email</w:t>
+            </w:r>
+          </w:p>
+        </w:tc>
+        <w:tc>
+          <w:tcPr/>
+          <w:p>
+            <w:pPr>
+              <w:pStyle w:val="Compact"/>
+            </w:pPr>
+            <w:r>
+              <w:t xml:space="preserve">String(255)</w:t>
+            </w:r>
+          </w:p>
+        </w:tc>
+        <w:tc>
+          <w:tcPr/>
+          <w:p>
+            <w:pPr>
+              <w:pStyle w:val="Compact"/>
+            </w:pPr>
+            <w:r>
+              <w:t xml:space="preserve">unique, indexed</w:t>
+            </w:r>
+          </w:p>
+        </w:tc>
+      </w:tr>
+      <w:tr>
+        <w:tc>
+          <w:tcPr/>
+          <w:p>
+            <w:pPr>
+              <w:pStyle w:val="Compact"/>
+            </w:pPr>
+            <w:r>
+              <w:t xml:space="preserve">password_hash</w:t>
+            </w:r>
+          </w:p>
+        </w:tc>
+        <w:tc>
+          <w:tcPr/>
+          <w:p>
+            <w:pPr>
+              <w:pStyle w:val="Compact"/>
+            </w:pPr>
+            <w:r>
+              <w:t xml:space="preserve">String(255)</w:t>
+            </w:r>
+          </w:p>
+        </w:tc>
+        <w:tc>
+          <w:tcPr/>
+          <w:p>
+            <w:pPr>
+              <w:pStyle w:val="Compact"/>
+            </w:pPr>
+            <w:r>
+              <w:t xml:space="preserve">bcrypt hash</w:t>
+            </w:r>
+          </w:p>
+        </w:tc>
+      </w:tr>
+      <w:tr>
+        <w:tc>
+          <w:tcPr/>
+          <w:p>
+            <w:pPr>
+              <w:pStyle w:val="Compact"/>
+            </w:pPr>
+            <w:r>
+              <w:t xml:space="preserve">full_name</w:t>
+            </w:r>
+          </w:p>
+        </w:tc>
+        <w:tc>
+          <w:tcPr/>
+          <w:p>
+            <w:pPr>
+              <w:pStyle w:val="Compact"/>
+            </w:pPr>
+            <w:r>
+              <w:t xml:space="preserve">String(255)</w:t>
+            </w:r>
+          </w:p>
+        </w:tc>
+        <w:tc>
+          <w:tcPr/>
+          <w:p>
+            <w:pPr>
+              <w:pStyle w:val="Compact"/>
+            </w:pPr>
+            <w:r>
+              <w:t xml:space="preserve">nullable</w:t>
+            </w:r>
+          </w:p>
+        </w:tc>
+      </w:tr>
+      <w:tr>
+        <w:tc>
+          <w:tcPr/>
+          <w:p>
+            <w:pPr>
+              <w:pStyle w:val="Compact"/>
+            </w:pPr>
+            <w:r>
+              <w:t xml:space="preserve">status</w:t>
+            </w:r>
+          </w:p>
+        </w:tc>
+        <w:tc>
+          <w:tcPr/>
+          <w:p>
+            <w:pPr>
+              <w:pStyle w:val="Compact"/>
+            </w:pPr>
+            <w:r>
+              <w:t xml:space="preserve">String(32)</w:t>
+            </w:r>
+          </w:p>
+        </w:tc>
+        <w:tc>
+          <w:tcPr/>
+          <w:p>
+            <w:pPr>
+              <w:pStyle w:val="Compact"/>
+            </w:pPr>
+            <w:r>
+              <w:t xml:space="preserve">active / locked / disabled</w:t>
+            </w:r>
+          </w:p>
+        </w:tc>
+      </w:tr>
+      <w:tr>
+        <w:tc>
+          <w:tcPr/>
+          <w:p>
+            <w:pPr>
+              <w:pStyle w:val="Compact"/>
+            </w:pPr>
+            <w:r>
+              <w:t xml:space="preserve">email_verified</w:t>
+            </w:r>
+          </w:p>
+        </w:tc>
+        <w:tc>
+          <w:tcPr/>
+          <w:p>
+            <w:pPr>
+              <w:pStyle w:val="Compact"/>
+            </w:pPr>
+            <w:r>
+              <w:t xml:space="preserve">Boolean</w:t>
+            </w:r>
+          </w:p>
+        </w:tc>
+        <w:tc>
+          <w:tcPr/>
+          <w:p>
+            <w:pPr>
+              <w:pStyle w:val="Compact"/>
+            </w:pPr>
+            <w:r>
+              <w:t xml:space="preserve">default false</w:t>
+            </w:r>
+          </w:p>
+        </w:tc>
+      </w:tr>
+      <w:tr>
+        <w:tc>
+          <w:tcPr/>
+          <w:p>
+            <w:pPr>
+              <w:pStyle w:val="Compact"/>
+            </w:pPr>
+            <w:r>
+              <w:t xml:space="preserve">mfa_enabled</w:t>
+            </w:r>
+          </w:p>
+        </w:tc>
+        <w:tc>
+          <w:tcPr/>
+          <w:p>
+            <w:pPr>
+              <w:pStyle w:val="Compact"/>
+            </w:pPr>
+            <w:r>
+              <w:t xml:space="preserve">Boolean</w:t>
+            </w:r>
+          </w:p>
+        </w:tc>
+        <w:tc>
+          <w:tcPr/>
+          <w:p>
+            <w:pPr>
+              <w:pStyle w:val="Compact"/>
+            </w:pPr>
+            <w:r>
+              <w:t xml:space="preserve">default false</w:t>
+            </w:r>
+          </w:p>
+        </w:tc>
+      </w:tr>
+      <w:tr>
+        <w:tc>
+          <w:tcPr/>
+          <w:p>
+            <w:pPr>
+              <w:pStyle w:val="Compact"/>
+            </w:pPr>
+            <w:r>
+              <w:t xml:space="preserve">tenant_id</w:t>
+            </w:r>
+          </w:p>
+        </w:tc>
+        <w:tc>
+          <w:tcPr/>
+          <w:p>
+            <w:pPr>
+              <w:pStyle w:val="Compact"/>
+            </w:pPr>
+            <w:r>
+              <w:t xml:space="preserve">String(64)</w:t>
+            </w:r>
+          </w:p>
+        </w:tc>
+        <w:tc>
+          <w:tcPr/>
+          <w:p>
+            <w:pPr>
+              <w:pStyle w:val="Compact"/>
+            </w:pPr>
+            <w:r>
+              <w:t xml:space="preserve">default</w:t>
+            </w:r>
+            <w:r>
+              <w:t xml:space="preserve"> </w:t>
+            </w:r>
+            <w:r>
+              <w:t xml:space="preserve">“lare”</w:t>
+            </w:r>
+            <w:r>
+              <w:t xml:space="preserve">, indexed</w:t>
+            </w:r>
+          </w:p>
+        </w:tc>
+      </w:tr>
+      <w:tr>
+        <w:tc>
+          <w:tcPr/>
+          <w:p>
+            <w:pPr>
+              <w:pStyle w:val="Compact"/>
+            </w:pPr>
+            <w:r>
+              <w:t xml:space="preserve">failed_attempts</w:t>
+            </w:r>
+          </w:p>
+        </w:tc>
+        <w:tc>
+          <w:tcPr/>
+          <w:p>
+            <w:pPr>
+              <w:pStyle w:val="Compact"/>
+            </w:pPr>
+            <w:r>
+              <w:t xml:space="preserve">Integer</w:t>
+            </w:r>
+          </w:p>
+        </w:tc>
+        <w:tc>
+          <w:tcPr/>
+          <w:p>
+            <w:pPr>
+              <w:pStyle w:val="Compact"/>
+            </w:pPr>
+            <w:r>
+              <w:t xml:space="preserve">lockout counter</w:t>
+            </w:r>
+          </w:p>
+        </w:tc>
+      </w:tr>
+      <w:tr>
+        <w:tc>
+          <w:tcPr/>
+          <w:p>
+            <w:pPr>
+              <w:pStyle w:val="Compact"/>
+            </w:pPr>
+            <w:r>
+              <w:t xml:space="preserve">locked_until</w:t>
+            </w:r>
+          </w:p>
+        </w:tc>
+        <w:tc>
+          <w:tcPr/>
+          <w:p>
+            <w:pPr>
+              <w:pStyle w:val="Compact"/>
+            </w:pPr>
+            <w:r>
+              <w:t xml:space="preserve">DateTime</w:t>
+            </w:r>
+          </w:p>
+        </w:tc>
+        <w:tc>
+          <w:tcPr/>
+          <w:p>
+            <w:pPr>
+              <w:pStyle w:val="Compact"/>
+            </w:pPr>
+            <w:r>
+              <w:t xml:space="preserve">nullable</w:t>
+            </w:r>
+          </w:p>
+        </w:tc>
+      </w:tr>
+      <w:tr>
+        <w:tc>
+          <w:tcPr/>
+          <w:p>
+            <w:pPr>
+              <w:pStyle w:val="Compact"/>
+            </w:pPr>
+            <w:r>
+              <w:t xml:space="preserve">created_at</w:t>
+            </w:r>
+          </w:p>
+        </w:tc>
+        <w:tc>
+          <w:tcPr/>
+          <w:p>
+            <w:pPr>
+              <w:pStyle w:val="Compact"/>
+            </w:pPr>
+            <w:r>
+              <w:t xml:space="preserve">DateTime</w:t>
+            </w:r>
+          </w:p>
+        </w:tc>
+        <w:tc>
+          <w:tcPr/>
+          <w:p>
+            <w:pPr>
+              <w:pStyle w:val="Compact"/>
+            </w:pPr>
+            <w:r>
+              <w:t xml:space="preserve">default now</w:t>
+            </w:r>
+          </w:p>
+        </w:tc>
+      </w:tr>
+    </w:tbl>
+    <w:p>
+      <w:pPr>
+        <w:pStyle w:val="BodyText"/>
+      </w:pPr>
+      <w:r>
+        <w:rPr>
+          <w:b/>
+          <w:bCs/>
+        </w:rPr>
+        <w:t xml:space="preserve">roles</w:t>
+      </w:r>
+      <w:r>
+        <w:t xml:space="preserve"> </w:t>
+      </w:r>
+      <w:r>
+        <w:t xml:space="preserve">— id, name (unique), description.</w:t>
+      </w:r>
+      <w:r>
+        <w:t xml:space="preserve"> </w:t>
+      </w:r>
+      <w:r>
+        <w:rPr>
+          <w:b/>
+          <w:bCs/>
+        </w:rPr>
+        <w:t xml:space="preserve">permissions</w:t>
+      </w:r>
+      <w:r>
+        <w:t xml:space="preserve"> </w:t>
+      </w:r>
+      <w:r>
+        <w:t xml:space="preserve">— id, code (unique), description, domain.</w:t>
+      </w:r>
+      <w:r>
+        <w:t xml:space="preserve"> </w:t>
+      </w:r>
+      <w:r>
+        <w:rPr>
+          <w:b/>
+          <w:bCs/>
+        </w:rPr>
+        <w:t xml:space="preserve">role_permissions</w:t>
+      </w:r>
+      <w:r>
+        <w:t xml:space="preserve"> </w:t>
+      </w:r>
+      <w:r>
+        <w:t xml:space="preserve">— (role_id, permission_id) join.</w:t>
+      </w:r>
+      <w:r>
+        <w:t xml:space="preserve"> </w:t>
+      </w:r>
+      <w:r>
+        <w:rPr>
+          <w:b/>
+          <w:bCs/>
+        </w:rPr>
+        <w:t xml:space="preserve">user_roles</w:t>
+      </w:r>
+      <w:r>
+        <w:t xml:space="preserve"> </w:t>
+      </w:r>
+      <w:r>
+        <w:t xml:space="preserve">— id, user_id (FK), role_id (FK), college_id (nullable = global scope); unique (user_id, role_id, college_id).</w:t>
+      </w:r>
+    </w:p>
+    <w:p>
+      <w:pPr>
+        <w:pStyle w:val="BodyText"/>
+      </w:pPr>
+      <w:r>
+        <w:rPr>
+          <w:b/>
+          <w:bCs/>
+        </w:rPr>
+        <w:t xml:space="preserve">refresh_tokens</w:t>
+      </w:r>
+      <w:r>
+        <w:t xml:space="preserve"> </w:t>
+      </w:r>
+      <w:r>
+        <w:t xml:space="preserve">— id, user_id (FK), family_id (rotation family), token_hash (unique), device, expires_at, revoked_at, created_at;</w:t>
+      </w:r>
+      <w:r>
+        <w:t xml:space="preserve"> </w:t>
+      </w:r>
+      <w:r>
+        <w:rPr>
+          <w:rStyle w:val="VerbatimChar"/>
+        </w:rPr>
+        <w:t xml:space="preserve">is_active</w:t>
+      </w:r>
+      <w:r>
+        <w:t xml:space="preserve"> </w:t>
+      </w:r>
+      <w:r>
+        <w:t xml:space="preserve">derived.</w:t>
+      </w:r>
+      <w:r>
+        <w:t xml:space="preserve"> </w:t>
+      </w:r>
+      <w:r>
+        <w:rPr>
+          <w:b/>
+          <w:bCs/>
+        </w:rPr>
+        <w:t xml:space="preserve">verification_tokens</w:t>
+      </w:r>
+      <w:r>
+        <w:t xml:space="preserve"> </w:t>
+      </w:r>
+      <w:r>
+        <w:t xml:space="preserve">— id, user_id (FK), purpose (otp / password_reset / email_verify), token_hash, expires_at, consumed_at (single-use), created_at. Only SHA-256 hashes are stored; secrets are delivered out-of-band.</w:t>
+      </w:r>
+    </w:p>
+    <w:bookmarkEnd w:id="133"/>
+    <w:bookmarkStart w:id="134" w:name="institution-schema-lms_institution"/>
+    <w:p>
+      <w:pPr>
+        <w:pStyle w:val="Heading2"/>
+      </w:pPr>
+      <w:r>
+        <w:t xml:space="preserve">16.2 institution (schema:</w:t>
+      </w:r>
+      <w:r>
+        <w:t xml:space="preserve"> </w:t>
+      </w:r>
+      <w:r>
+        <w:rPr>
+          <w:rStyle w:val="VerbatimChar"/>
+        </w:rPr>
+        <w:t xml:space="preserve">lms_institution</w:t>
+      </w:r>
+      <w:r>
+        <w:t xml:space="preserve">)</w:t>
+      </w:r>
+    </w:p>
+    <w:p>
+      <w:pPr>
+        <w:pStyle w:val="FirstParagraph"/>
+      </w:pPr>
+      <w:r>
+        <w:rPr>
+          <w:b/>
+          <w:bCs/>
+        </w:rPr>
+        <w:t xml:space="preserve">colleges</w:t>
+      </w:r>
+      <w:r>
+        <w:t xml:space="preserve"> </w:t>
+      </w:r>
+      <w:r>
+        <w:t xml:space="preserve">— id, tenant_id, name, address, timezone (default Asia/Kolkata), mou_ref, status, coordinator_user_id, passing_threshold (default 60), min_cohort_size (default 30), created_at.</w:t>
+      </w:r>
+      <w:r>
+        <w:t xml:space="preserve"> </w:t>
+      </w:r>
+      <w:r>
+        <w:rPr>
+          <w:b/>
+          <w:bCs/>
+        </w:rPr>
+        <w:t xml:space="preserve">branches</w:t>
+      </w:r>
+      <w:r>
+        <w:t xml:space="preserve"> </w:t>
+      </w:r>
+      <w:r>
+        <w:t xml:space="preserve">— id, college_id (FK), name, code, category (cse_allied / core); unique (college_id, code).</w:t>
+      </w:r>
+      <w:r>
+        <w:t xml:space="preserve"> </w:t>
+      </w:r>
+      <w:r>
+        <w:rPr>
+          <w:b/>
+          <w:bCs/>
+        </w:rPr>
+        <w:t xml:space="preserve">academic_years</w:t>
+      </w:r>
+      <w:r>
+        <w:t xml:space="preserve"> </w:t>
+      </w:r>
+      <w:r>
+        <w:t xml:space="preserve">— id, college_id (FK), year_no (1..4), start, end.</w:t>
+      </w:r>
+      <w:r>
+        <w:t xml:space="preserve"> </w:t>
+      </w:r>
+      <w:r>
+        <w:rPr>
+          <w:b/>
+          <w:bCs/>
+        </w:rPr>
+        <w:t xml:space="preserve">semesters</w:t>
+      </w:r>
+      <w:r>
+        <w:t xml:space="preserve"> </w:t>
+      </w:r>
+      <w:r>
+        <w:t xml:space="preserve">— id, academic_year_id (FK), type (odd / even), start, end.</w:t>
+      </w:r>
+      <w:r>
+        <w:t xml:space="preserve"> </w:t>
+      </w:r>
+      <w:r>
+        <w:rPr>
+          <w:b/>
+          <w:bCs/>
+        </w:rPr>
+        <w:t xml:space="preserve">cohorts</w:t>
+      </w:r>
+      <w:r>
+        <w:t xml:space="preserve"> </w:t>
+      </w:r>
+      <w:r>
+        <w:t xml:space="preserve">— id, college_id (FK), branch_id (FK), academic_year_id, section, year_no, size.</w:t>
+      </w:r>
+      <w:r>
+        <w:t xml:space="preserve"> </w:t>
+      </w:r>
+      <w:r>
+        <w:rPr>
+          <w:b/>
+          <w:bCs/>
+        </w:rPr>
+        <w:t xml:space="preserve">schedule_slots</w:t>
+      </w:r>
+      <w:r>
+        <w:t xml:space="preserve"> </w:t>
+      </w:r>
+      <w:r>
+        <w:t xml:space="preserve">— id, semester_id (FK), branch_id (FK), week_no, module_ref, start, end, trainer_user_id.</w:t>
+      </w:r>
+      <w:r>
+        <w:t xml:space="preserve"> </w:t>
+      </w:r>
+      <w:r>
+        <w:rPr>
+          <w:b/>
+          <w:bCs/>
+        </w:rPr>
+        <w:t xml:space="preserve">assignments</w:t>
+      </w:r>
+      <w:r>
+        <w:t xml:space="preserve"> </w:t>
+      </w:r>
+      <w:r>
+        <w:t xml:space="preserve">— id, college_id (FK), user_id, role (trainer / mentor / coordinator), scope.</w:t>
+      </w:r>
+    </w:p>
+    <w:bookmarkEnd w:id="134"/>
+    <w:bookmarkStart w:id="135" w:name="learner-schema-lms_learner"/>
+    <w:p>
+      <w:pPr>
+        <w:pStyle w:val="Heading2"/>
+      </w:pPr>
+      <w:r>
+        <w:t xml:space="preserve">16.3 learner (schema:</w:t>
+      </w:r>
+      <w:r>
+        <w:t xml:space="preserve"> </w:t>
+      </w:r>
+      <w:r>
+        <w:rPr>
+          <w:rStyle w:val="VerbatimChar"/>
+        </w:rPr>
+        <w:t xml:space="preserve">lms_learner</w:t>
+      </w:r>
+      <w:r>
+        <w:t xml:space="preserve">)</w:t>
+      </w:r>
+    </w:p>
+    <w:p>
+      <w:pPr>
+        <w:pStyle w:val="FirstParagraph"/>
+      </w:pPr>
+      <w:r>
+        <w:rPr>
+          <w:b/>
+          <w:bCs/>
+        </w:rPr>
+        <w:t xml:space="preserve">learners</w:t>
+      </w:r>
+      <w:r>
+        <w:t xml:space="preserve"> </w:t>
+      </w:r>
+      <w:r>
+        <w:t xml:space="preserve">— id, user_id, college_id, cohort_id, branch_id, roll_no, full_name, email, cgpa (Float), photo_file_id, status (active / paused / alumni), verified (Boolean), year_no, created_at; unique (college_id, roll_no).</w:t>
+      </w:r>
+      <w:r>
+        <w:t xml:space="preserve"> </w:t>
+      </w:r>
+      <w:r>
+        <w:rPr>
+          <w:b/>
+          <w:bCs/>
+        </w:rPr>
+        <w:t xml:space="preserve">enrollments</w:t>
+      </w:r>
+      <w:r>
+        <w:t xml:space="preserve"> </w:t>
+      </w:r>
+      <w:r>
+        <w:t xml:space="preserve">— id, learner_id (FK), academic_year_id, year_no, status, started_at.</w:t>
+      </w:r>
+      <w:r>
+        <w:t xml:space="preserve"> </w:t>
+      </w:r>
+      <w:r>
+        <w:rPr>
+          <w:b/>
+          <w:bCs/>
+        </w:rPr>
+        <w:t xml:space="preserve">stream_selection</w:t>
+      </w:r>
+      <w:r>
+        <w:t xml:space="preserve"> </w:t>
+      </w:r>
+      <w:r>
+        <w:t xml:space="preserve">— learner_id (PK/FK), stream (ai_ml / data_science / web / cybersecurity / cloud), rationale, mentor_user_id, decided_at.</w:t>
+      </w:r>
+      <w:r>
+        <w:t xml:space="preserve"> </w:t>
+      </w:r>
+      <w:r>
+        <w:rPr>
+          <w:b/>
+          <w:bCs/>
+        </w:rPr>
+        <w:t xml:space="preserve">skills</w:t>
+      </w:r>
+      <w:r>
+        <w:t xml:space="preserve"> </w:t>
+      </w:r>
+      <w:r>
+        <w:t xml:space="preserve">— id, learner_id (FK), skill, level, source.</w:t>
+      </w:r>
+      <w:r>
+        <w:t xml:space="preserve"> </w:t>
+      </w:r>
+      <w:r>
+        <w:rPr>
+          <w:b/>
+          <w:bCs/>
+        </w:rPr>
+        <w:t xml:space="preserve">projects</w:t>
+      </w:r>
+      <w:r>
+        <w:t xml:space="preserve"> </w:t>
+      </w:r>
+      <w:r>
+        <w:t xml:space="preserve">— id, learner_id (FK), title, description, repo_url.</w:t>
+      </w:r>
+      <w:r>
+        <w:t xml:space="preserve"> </w:t>
+      </w:r>
+      <w:r>
+        <w:rPr>
+          <w:b/>
+          <w:bCs/>
+        </w:rPr>
+        <w:t xml:space="preserve">imports</w:t>
+      </w:r>
+      <w:r>
+        <w:t xml:space="preserve"> </w:t>
+      </w:r>
+      <w:r>
+        <w:t xml:space="preserve">— id, college_id, status (previewed / committed), summary (JSON), created_at.</w:t>
+      </w:r>
+    </w:p>
+    <w:bookmarkEnd w:id="135"/>
+    <w:bookmarkStart w:id="136" w:name="curriculum-schema-lms_curriculum"/>
+    <w:p>
+      <w:pPr>
+        <w:pStyle w:val="Heading2"/>
+      </w:pPr>
+      <w:r>
+        <w:t xml:space="preserve">16.4 curriculum (schema:</w:t>
+      </w:r>
+      <w:r>
+        <w:t xml:space="preserve"> </w:t>
+      </w:r>
+      <w:r>
+        <w:rPr>
+          <w:rStyle w:val="VerbatimChar"/>
+        </w:rPr>
+        <w:t xml:space="preserve">lms_curriculum</w:t>
+      </w:r>
+      <w:r>
+        <w:t xml:space="preserve">)</w:t>
+      </w:r>
+    </w:p>
+    <w:p>
+      <w:pPr>
+        <w:pStyle w:val="FirstParagraph"/>
+      </w:pPr>
+      <w:r>
+        <w:rPr>
+          <w:b/>
+          <w:bCs/>
+        </w:rPr>
+        <w:t xml:space="preserve">curricula</w:t>
+      </w:r>
+      <w:r>
+        <w:t xml:space="preserve"> </w:t>
+      </w:r>
+      <w:r>
+        <w:t xml:space="preserve">— id, name, version, status (draft / published), created_at.</w:t>
+      </w:r>
+      <w:r>
+        <w:t xml:space="preserve"> </w:t>
+      </w:r>
+      <w:r>
+        <w:rPr>
+          <w:b/>
+          <w:bCs/>
+        </w:rPr>
+        <w:t xml:space="preserve">year_tracks</w:t>
+      </w:r>
+      <w:r>
+        <w:t xml:space="preserve"> </w:t>
+      </w:r>
+      <w:r>
+        <w:t xml:space="preserve">— id, curriculum_id (FK), year_no (1..4), theme, goal; unique (curriculum_id, year_no).</w:t>
+      </w:r>
+      <w:r>
+        <w:t xml:space="preserve"> </w:t>
+      </w:r>
+      <w:r>
+        <w:rPr>
+          <w:b/>
+          <w:bCs/>
+        </w:rPr>
+        <w:t xml:space="preserve">modules</w:t>
+      </w:r>
+      <w:r>
+        <w:t xml:space="preserve"> </w:t>
+      </w:r>
+      <w:r>
+        <w:t xml:space="preserve">— id, year_track_id (FK), title, order, branch_scope (all / cse_allied / core /</w:t>
+      </w:r>
+      <w:r>
+        <w:t xml:space="preserve"> </w:t>
+      </w:r>
+      <w:r>
+        <w:t xml:space="preserve">).</w:t>
+      </w:r>
+      <w:r>
+        <w:t xml:space="preserve"> </w:t>
+      </w:r>
+      <w:r>
+        <w:rPr>
+          <w:b/>
+          <w:bCs/>
+        </w:rPr>
+        <w:t xml:space="preserve">lessons</w:t>
+      </w:r>
+      <w:r>
+        <w:t xml:space="preserve"> </w:t>
+      </w:r>
+      <w:r>
+        <w:t xml:space="preserve">— id, module_id (FK), title, order, content_ref,</w:t>
+      </w:r>
+      <w:r>
+        <w:t xml:space="preserve"> </w:t>
+      </w:r>
+      <w:r>
+        <w:rPr>
+          <w:b/>
+          <w:bCs/>
+        </w:rPr>
+        <w:t xml:space="preserve">content (JSON)</w:t>
+      </w:r>
+      <w:r>
+        <w:t xml:space="preserve"> </w:t>
+      </w:r>
+      <w:r>
+        <w:t xml:space="preserve">— an ordered list of interactive blocks (</w:t>
+      </w:r>
+      <w:r>
+        <w:rPr>
+          <w:rStyle w:val="VerbatimChar"/>
+        </w:rPr>
+        <w:t xml:space="preserve">text</w:t>
+      </w:r>
+      <w:r>
+        <w:t xml:space="preserve">,</w:t>
+      </w:r>
+      <w:r>
+        <w:t xml:space="preserve"> </w:t>
+      </w:r>
+      <w:r>
+        <w:rPr>
+          <w:rStyle w:val="VerbatimChar"/>
+        </w:rPr>
+        <w:t xml:space="preserve">code</w:t>
+      </w:r>
+      <w:r>
+        <w:t xml:space="preserve">,</w:t>
+      </w:r>
+      <w:r>
+        <w:t xml:space="preserve"> </w:t>
+      </w:r>
+      <w:r>
+        <w:rPr>
+          <w:rStyle w:val="VerbatimChar"/>
+        </w:rPr>
+        <w:t xml:space="preserve">callout</w:t>
+      </w:r>
+      <w:r>
+        <w:t xml:space="preserve">,</w:t>
+      </w:r>
+      <w:r>
+        <w:t xml:space="preserve"> </w:t>
+      </w:r>
+      <w:r>
+        <w:rPr>
+          <w:rStyle w:val="VerbatimChar"/>
+        </w:rPr>
+        <w:t xml:space="preserve">check</w:t>
+      </w:r>
+      <w:r>
+        <w:t xml:space="preserve">), the</w:t>
+      </w:r>
+      <w:r>
+        <w:t xml:space="preserve"> </w:t>
+      </w:r>
+      <w:r>
+        <w:t xml:space="preserve">“living lesson”</w:t>
+      </w:r>
+      <w:r>
+        <w:t xml:space="preserve">.</w:t>
+      </w:r>
+      <w:r>
+        <w:t xml:space="preserve"> </w:t>
+      </w:r>
+      <w:r>
+        <w:rPr>
+          <w:b/>
+          <w:bCs/>
+        </w:rPr>
+        <w:t xml:space="preserve">objectives</w:t>
+      </w:r>
+      <w:r>
+        <w:t xml:space="preserve"> </w:t>
+      </w:r>
+      <w:r>
+        <w:t xml:space="preserve">— id, lesson_id (FK), statement, skill_tag.</w:t>
+      </w:r>
+      <w:r>
+        <w:t xml:space="preserve"> </w:t>
+      </w:r>
+      <w:r>
+        <w:rPr>
+          <w:b/>
+          <w:bCs/>
+        </w:rPr>
+        <w:t xml:space="preserve">outcome_checks</w:t>
+      </w:r>
+      <w:r>
+        <w:t xml:space="preserve"> </w:t>
+      </w:r>
+      <w:r>
+        <w:t xml:space="preserve">— id, year_track_id (FK), statement, criteria.</w:t>
+      </w:r>
+      <w:r>
+        <w:t xml:space="preserve"> </w:t>
+      </w:r>
+      <w:r>
+        <w:rPr>
+          <w:b/>
+          <w:bCs/>
+        </w:rPr>
+        <w:t xml:space="preserve">cohort_curriculum</w:t>
+      </w:r>
+      <w:r>
+        <w:t xml:space="preserve"> </w:t>
+      </w:r>
+      <w:r>
+        <w:t xml:space="preserve">— id, cohort_id, curriculum_id (FK), effective_from.</w:t>
+      </w:r>
+      <w:r>
+        <w:t xml:space="preserve"> </w:t>
+      </w:r>
+      <w:r>
+        <w:rPr>
+          <w:b/>
+          <w:bCs/>
+        </w:rPr>
+        <w:t xml:space="preserve">item_objective_map</w:t>
+      </w:r>
+      <w:r>
+        <w:t xml:space="preserve"> </w:t>
+      </w:r>
+      <w:r>
+        <w:t xml:space="preserve">— id, objective_id (FK), item_type (content / assessment), item_id.</w:t>
+      </w:r>
+    </w:p>
+    <w:bookmarkEnd w:id="136"/>
+    <w:bookmarkStart w:id="137" w:name="content-schema-lms_content"/>
+    <w:p>
+      <w:pPr>
+        <w:pStyle w:val="Heading2"/>
+      </w:pPr>
+      <w:r>
+        <w:t xml:space="preserve">16.5 content (schema:</w:t>
+      </w:r>
+      <w:r>
+        <w:t xml:space="preserve"> </w:t>
+      </w:r>
+      <w:r>
+        <w:rPr>
+          <w:rStyle w:val="VerbatimChar"/>
+        </w:rPr>
+        <w:t xml:space="preserve">lms_content</w:t>
+      </w:r>
+      <w:r>
+        <w:t xml:space="preserve">)</w:t>
+      </w:r>
+    </w:p>
+    <w:p>
+      <w:pPr>
+        <w:pStyle w:val="FirstParagraph"/>
+      </w:pPr>
+      <w:r>
+        <w:rPr>
+          <w:b/>
+          <w:bCs/>
+        </w:rPr>
+        <w:t xml:space="preserve">content_items</w:t>
+      </w:r>
+      <w:r>
+        <w:t xml:space="preserve"> </w:t>
+      </w:r>
+      <w:r>
+        <w:t xml:space="preserve">— id, lesson_id, title, type (video / pdf / slide / reading / interactive / link), file_id, url, duration_sec, difficulty, order, objectives (JSON), created_at.</w:t>
+      </w:r>
+      <w:r>
+        <w:t xml:space="preserve"> </w:t>
+      </w:r>
+      <w:r>
+        <w:rPr>
+          <w:b/>
+          <w:bCs/>
+        </w:rPr>
+        <w:t xml:space="preserve">gates</w:t>
+      </w:r>
+      <w:r>
+        <w:t xml:space="preserve"> </w:t>
+      </w:r>
+      <w:r>
+        <w:t xml:space="preserve">— id, content_item_id (FK), rule_type (default prereq_content), rule_config (JSON).</w:t>
+      </w:r>
+      <w:r>
+        <w:t xml:space="preserve"> </w:t>
+      </w:r>
+      <w:r>
+        <w:rPr>
+          <w:b/>
+          <w:bCs/>
+        </w:rPr>
+        <w:t xml:space="preserve">consumption</w:t>
+      </w:r>
+      <w:r>
+        <w:t xml:space="preserve"> </w:t>
+      </w:r>
+      <w:r>
+        <w:t xml:space="preserve">— id, learner_id, content_item_id, status (in_progress / completed), position_sec, updated_at; unique (learner_id, content_item_id).</w:t>
+      </w:r>
+    </w:p>
+    <w:bookmarkEnd w:id="137"/>
+    <w:bookmarkStart w:id="138" w:name="progress-schema-lms_progress"/>
+    <w:p>
+      <w:pPr>
+        <w:pStyle w:val="Heading2"/>
+      </w:pPr>
+      <w:r>
+        <w:t xml:space="preserve">16.6 progress (schema:</w:t>
+      </w:r>
+      <w:r>
+        <w:t xml:space="preserve"> </w:t>
+      </w:r>
+      <w:r>
+        <w:rPr>
+          <w:rStyle w:val="VerbatimChar"/>
+        </w:rPr>
+        <w:t xml:space="preserve">lms_progress</w:t>
+      </w:r>
+      <w:r>
+        <w:t xml:space="preserve">)</w:t>
+      </w:r>
+    </w:p>
+    <w:p>
+      <w:pPr>
+        <w:pStyle w:val="FirstParagraph"/>
+      </w:pPr>
+      <w:r>
+        <w:rPr>
+          <w:b/>
+          <w:bCs/>
+        </w:rPr>
+        <w:t xml:space="preserve">attendance</w:t>
+      </w:r>
+      <w:r>
+        <w:t xml:space="preserve"> </w:t>
+      </w:r>
+      <w:r>
+        <w:t xml:space="preserve">— id, learner_id, schedule_slot_id, status (present / absent / late), ts.</w:t>
+      </w:r>
+      <w:r>
+        <w:t xml:space="preserve"> </w:t>
+      </w:r>
+      <w:r>
+        <w:rPr>
+          <w:b/>
+          <w:bCs/>
+        </w:rPr>
+        <w:t xml:space="preserve">module_progress</w:t>
+      </w:r>
+      <w:r>
+        <w:t xml:space="preserve"> </w:t>
+      </w:r>
+      <w:r>
+        <w:t xml:space="preserve">— id, learner_id, module_id, completion_pct; unique (learner_id, module_id).</w:t>
+      </w:r>
+      <w:r>
+        <w:t xml:space="preserve"> </w:t>
+      </w:r>
+      <w:r>
+        <w:rPr>
+          <w:b/>
+          <w:bCs/>
+        </w:rPr>
+        <w:t xml:space="preserve">scorecard</w:t>
+      </w:r>
+      <w:r>
+        <w:t xml:space="preserve"> </w:t>
+      </w:r>
+      <w:r>
+        <w:t xml:space="preserve">— id, learner_id, year_no, communication, coding, aptitude, project (all Float), updated_at; unique (learner_id, year_no).</w:t>
+      </w:r>
+      <w:r>
+        <w:t xml:space="preserve"> </w:t>
+      </w:r>
+      <w:r>
+        <w:rPr>
+          <w:i/>
+          <w:iCs/>
+        </w:rPr>
+        <w:t xml:space="preserve">This is the per-learner four-dimension skill scorecard the Dashboard reads.</w:t>
+      </w:r>
+      <w:r>
+        <w:t xml:space="preserve"> </w:t>
+      </w:r>
+      <w:r>
+        <w:rPr>
+          <w:b/>
+          <w:bCs/>
+        </w:rPr>
+        <w:t xml:space="preserve">score_events</w:t>
+      </w:r>
+      <w:r>
+        <w:t xml:space="preserve"> </w:t>
+      </w:r>
+      <w:r>
+        <w:t xml:space="preserve">— id, learner_id, year_no, dimension, value, source, ref_id, ts.</w:t>
+      </w:r>
+      <w:r>
+        <w:t xml:space="preserve"> </w:t>
+      </w:r>
+      <w:r>
+        <w:rPr>
+          <w:b/>
+          <w:bCs/>
+        </w:rPr>
+        <w:t xml:space="preserve">year_status</w:t>
+      </w:r>
+      <w:r>
+        <w:t xml:space="preserve"> </w:t>
+      </w:r>
+      <w:r>
+        <w:t xml:space="preserve">— id, learner_id, year_no, criteria_met, attendance_pct, avg_score, computed_at; unique (learner_id, year_no).</w:t>
+      </w:r>
+    </w:p>
+    <w:bookmarkEnd w:id="138"/>
+    <w:bookmarkStart w:id="139" w:name="X243f8869d5f71e03ad55230fd36da36c2040e52"/>
+    <w:p>
+      <w:pPr>
+        <w:pStyle w:val="Heading2"/>
+      </w:pPr>
+      <w:r>
+        <w:t xml:space="preserve">16.7 assessment (schema:</w:t>
+      </w:r>
+      <w:r>
+        <w:t xml:space="preserve"> </w:t>
+      </w:r>
+      <w:r>
+        <w:rPr>
+          <w:rStyle w:val="VerbatimChar"/>
+        </w:rPr>
+        <w:t xml:space="preserve">lms_assessment</w:t>
+      </w:r>
+      <w:r>
+        <w:t xml:space="preserve">) — the hub service</w:t>
+      </w:r>
+    </w:p>
+    <w:p>
+      <w:pPr>
+        <w:pStyle w:val="FirstParagraph"/>
+      </w:pPr>
+      <w:r>
+        <w:rPr>
+          <w:b/>
+          <w:bCs/>
+        </w:rPr>
+        <w:t xml:space="preserve">assessments</w:t>
+      </w:r>
+      <w:r>
+        <w:t xml:space="preserve"> </w:t>
+      </w:r>
+      <w:r>
+        <w:t xml:space="preserve">— id, title, year_no, type (quiz / aptitude / coding / rubric), time_limit_min, attempts_allowed, passing_pct, negative_marking, dimension, objectives (JSON),</w:t>
+      </w:r>
+      <w:r>
+        <w:t xml:space="preserve"> </w:t>
+      </w:r>
+      <w:r>
+        <w:rPr>
+          <w:b/>
+          <w:bCs/>
+        </w:rPr>
+        <w:t xml:space="preserve">proctored</w:t>
+      </w:r>
+      <w:r>
+        <w:t xml:space="preserve"> </w:t>
+      </w:r>
+      <w:r>
+        <w:t xml:space="preserve">(Boolean),</w:t>
+      </w:r>
+      <w:r>
+        <w:t xml:space="preserve"> </w:t>
+      </w:r>
+      <w:r>
+        <w:rPr>
+          <w:b/>
+          <w:bCs/>
+        </w:rPr>
+        <w:t xml:space="preserve">shuffle</w:t>
+      </w:r>
+      <w:r>
+        <w:t xml:space="preserve"> </w:t>
+      </w:r>
+      <w:r>
+        <w:t xml:space="preserve">(Boolean), created_at.</w:t>
+      </w:r>
+      <w:r>
+        <w:t xml:space="preserve"> </w:t>
+      </w:r>
+      <w:r>
+        <w:rPr>
+          <w:b/>
+          <w:bCs/>
+        </w:rPr>
+        <w:t xml:space="preserve">assessment_items</w:t>
+      </w:r>
+      <w:r>
+        <w:t xml:space="preserve"> </w:t>
+      </w:r>
+      <w:r>
+        <w:t xml:space="preserve">— id, assessment_id (FK), item_type (mcq / multi / subjective), prompt, options (JSON), correct (JSON), weight, rubric_hint, order,</w:t>
+      </w:r>
+      <w:r>
+        <w:t xml:space="preserve"> </w:t>
+      </w:r>
+      <w:r>
+        <w:rPr>
+          <w:b/>
+          <w:bCs/>
+        </w:rPr>
+        <w:t xml:space="preserve">difficulty</w:t>
+      </w:r>
+      <w:r>
+        <w:t xml:space="preserve"> </w:t>
+      </w:r>
+      <w:r>
+        <w:t xml:space="preserve">(easy / medium / hard — drives the adaptive drill).</w:t>
+      </w:r>
+      <w:r>
+        <w:t xml:space="preserve"> </w:t>
+      </w:r>
+      <w:r>
+        <w:rPr>
+          <w:b/>
+          <w:bCs/>
+        </w:rPr>
+        <w:t xml:space="preserve">attempts</w:t>
+      </w:r>
+      <w:r>
+        <w:t xml:space="preserve"> </w:t>
+      </w:r>
+      <w:r>
+        <w:t xml:space="preserve">— id, assessment_id, learner_id, status (in_progress / submitted / graded), score, max_score, percentage, passed, started_at, submitted_at.</w:t>
+      </w:r>
+      <w:r>
+        <w:t xml:space="preserve"> </w:t>
+      </w:r>
+      <w:r>
+        <w:rPr>
+          <w:b/>
+          <w:bCs/>
+        </w:rPr>
+        <w:t xml:space="preserve">answers</w:t>
+      </w:r>
+      <w:r>
+        <w:t xml:space="preserve"> </w:t>
+      </w:r>
+      <w:r>
+        <w:t xml:space="preserve">— id, attempt_id (FK), item_id, response (JSON), auto_score, final_score, needs_grade, grader_user_id, max_score.</w:t>
+      </w:r>
+      <w:r>
+        <w:t xml:space="preserve"> </w:t>
+      </w:r>
+      <w:r>
+        <w:rPr>
+          <w:b/>
+          <w:bCs/>
+        </w:rPr>
+        <w:t xml:space="preserve">review_items</w:t>
+      </w:r>
+      <w:r>
+        <w:t xml:space="preserve"> </w:t>
+      </w:r>
+      <w:r>
+        <w:t xml:space="preserve">(spaced review) — id, learner_id, skill, source (written / coding), interval_days, ease, review_count, last_mastery, last_reviewed_at, due_at (indexed), created_at; unique (learner_id, skill). SM-2-style forgetting curve.</w:t>
+      </w:r>
+      <w:r>
+        <w:t xml:space="preserve"> </w:t>
+      </w:r>
+      <w:r>
+        <w:rPr>
+          <w:b/>
+          <w:bCs/>
+        </w:rPr>
+        <w:t xml:space="preserve">drill_sessions</w:t>
+      </w:r>
+      <w:r>
+        <w:t xml:space="preserve"> </w:t>
+      </w:r>
+      <w:r>
+        <w:t xml:space="preserve">(Flow drill) — id, learner_id, topic, level (0/1/2), served (JSON), pending_item_id, pending_q (JSON, server-authoritative), pending_since, correct_count, total_count, fast_count, target, status (active / done), started_at.</w:t>
+      </w:r>
+      <w:r>
+        <w:t xml:space="preserve"> </w:t>
+      </w:r>
+      <w:r>
+        <w:rPr>
+          <w:b/>
+          <w:bCs/>
+        </w:rPr>
+        <w:t xml:space="preserve">practice_worlds</w:t>
+      </w:r>
+      <w:r>
+        <w:t xml:space="preserve"> </w:t>
+      </w:r>
+      <w:r>
+        <w:t xml:space="preserve">— id, title, role, skill, difficulty, summary, steps (JSON), pass_pct, created_at.</w:t>
+      </w:r>
+      <w:r>
+        <w:t xml:space="preserve"> </w:t>
+      </w:r>
+      <w:r>
+        <w:rPr>
+          <w:b/>
+          <w:bCs/>
+        </w:rPr>
+        <w:t xml:space="preserve">world_runs</w:t>
+      </w:r>
+      <w:r>
+        <w:t xml:space="preserve"> </w:t>
+      </w:r>
+      <w:r>
+        <w:t xml:space="preserve">— id, world_id, learner_id, step_index, answers (JSON), correct_count, score, status (in_progress / completed), started_at.</w:t>
+      </w:r>
+      <w:r>
+        <w:t xml:space="preserve"> </w:t>
+      </w:r>
+      <w:r>
+        <w:rPr>
+          <w:b/>
+          <w:bCs/>
+        </w:rPr>
+        <w:t xml:space="preserve">generated_lessons</w:t>
+      </w:r>
+      <w:r>
+        <w:t xml:space="preserve"> </w:t>
+      </w:r>
+      <w:r>
+        <w:t xml:space="preserve">— id, learner_id, topic, lesson (JSON blocks), generated (AI vs fallback), created_at; unique (learner_id, topic).</w:t>
+      </w:r>
+      <w:r>
+        <w:t xml:space="preserve"> </w:t>
+      </w:r>
+      <w:r>
+        <w:rPr>
+          <w:b/>
+          <w:bCs/>
+        </w:rPr>
+        <w:t xml:space="preserve">teach_sessions</w:t>
+      </w:r>
+      <w:r>
+        <w:t xml:space="preserve"> </w:t>
+      </w:r>
+      <w:r>
+        <w:t xml:space="preserve">(Peer Mesh) — id, topic, teacher_id, learner_id (seeker), requested_by, status (requested / accepted / declined / completed), note, created_at.</w:t>
+      </w:r>
+      <w:r>
+        <w:t xml:space="preserve"> </w:t>
+      </w:r>
+      <w:r>
+        <w:rPr>
+          <w:b/>
+          <w:bCs/>
+        </w:rPr>
+        <w:t xml:space="preserve">wallet_credentials</w:t>
+      </w:r>
+      <w:r>
+        <w:t xml:space="preserve"> </w:t>
+      </w:r>
+      <w:r>
+        <w:t xml:space="preserve">— id, learner_id (unique), verify_id (unique), subject_name, payload (JSON competence snapshot), signature (signed JWT), revoked, issued_at.</w:t>
+      </w:r>
+      <w:r>
+        <w:t xml:space="preserve"> </w:t>
+      </w:r>
+      <w:r>
+        <w:rPr>
+          <w:b/>
+          <w:bCs/>
+        </w:rPr>
+        <w:t xml:space="preserve">career_roles</w:t>
+      </w:r>
+      <w:r>
+        <w:t xml:space="preserve"> </w:t>
+      </w:r>
+      <w:r>
+        <w:t xml:space="preserve">— id, title, description, required_skills (JSON: name + weight), created_at.</w:t>
+      </w:r>
+      <w:r>
+        <w:t xml:space="preserve"> </w:t>
+      </w:r>
+      <w:r>
+        <w:rPr>
+          <w:b/>
+          <w:bCs/>
+        </w:rPr>
+        <w:t xml:space="preserve">study_plans</w:t>
+      </w:r>
+      <w:r>
+        <w:t xml:space="preserve"> </w:t>
+      </w:r>
+      <w:r>
+        <w:t xml:space="preserve">— learner_id (PK), plan (JSON), weakest, profile_sig (regenerate-on-change signature), completed_days (JSON), generated_at, last_nudged_at, nudge_count.</w:t>
+      </w:r>
+    </w:p>
+    <w:bookmarkEnd w:id="139"/>
+    <w:bookmarkStart w:id="140" w:name="gamification-schema-lms_gamification"/>
+    <w:p>
+      <w:pPr>
+        <w:pStyle w:val="Heading2"/>
+      </w:pPr>
+      <w:r>
+        <w:t xml:space="preserve">16.8 gamification (schema:</w:t>
+      </w:r>
+      <w:r>
+        <w:t xml:space="preserve"> </w:t>
+      </w:r>
+      <w:r>
+        <w:rPr>
+          <w:rStyle w:val="VerbatimChar"/>
+        </w:rPr>
+        <w:t xml:space="preserve">lms_gamification</w:t>
+      </w:r>
+      <w:r>
+        <w:t xml:space="preserve">)</w:t>
+      </w:r>
+    </w:p>
+    <w:p>
+      <w:pPr>
+        <w:pStyle w:val="FirstParagraph"/>
+      </w:pPr>
+      <w:r>
+        <w:rPr>
+          <w:b/>
+          <w:bCs/>
+        </w:rPr>
+        <w:t xml:space="preserve">xp_ledger</w:t>
+      </w:r>
+      <w:r>
+        <w:t xml:space="preserve"> </w:t>
+      </w:r>
+      <w:r>
+        <w:t xml:space="preserve">— id, learner_id, action, points, source_event_id, ts; unique (learner_id, source_event_id) for idempotent awards.</w:t>
+      </w:r>
+      <w:r>
+        <w:t xml:space="preserve"> </w:t>
+      </w:r>
+      <w:r>
+        <w:rPr>
+          <w:b/>
+          <w:bCs/>
+        </w:rPr>
+        <w:t xml:space="preserve">levels</w:t>
+      </w:r>
+      <w:r>
+        <w:t xml:space="preserve"> </w:t>
+      </w:r>
+      <w:r>
+        <w:t xml:space="preserve">— learner_id (PK), total_xp, level, display_name, updated_at.</w:t>
+      </w:r>
+      <w:r>
+        <w:t xml:space="preserve"> </w:t>
+      </w:r>
+      <w:r>
+        <w:rPr>
+          <w:b/>
+          <w:bCs/>
+        </w:rPr>
+        <w:t xml:space="preserve">badges</w:t>
+      </w:r>
+      <w:r>
+        <w:t xml:space="preserve"> </w:t>
+      </w:r>
+      <w:r>
+        <w:t xml:space="preserve">— id, code (unique), name, description, icon.</w:t>
+      </w:r>
+      <w:r>
+        <w:t xml:space="preserve"> </w:t>
+      </w:r>
+      <w:r>
+        <w:rPr>
+          <w:b/>
+          <w:bCs/>
+        </w:rPr>
+        <w:t xml:space="preserve">learner_badges</w:t>
+      </w:r>
+      <w:r>
+        <w:t xml:space="preserve"> </w:t>
+      </w:r>
+      <w:r>
+        <w:t xml:space="preserve">— id, learner_id, badge_code, earned_at; unique (learner_id, badge_code).</w:t>
+      </w:r>
+      <w:r>
+        <w:t xml:space="preserve"> </w:t>
+      </w:r>
+      <w:r>
+        <w:rPr>
+          <w:b/>
+          <w:bCs/>
+        </w:rPr>
+        <w:t xml:space="preserve">streaks</w:t>
+      </w:r>
+      <w:r>
+        <w:t xml:space="preserve"> </w:t>
+      </w:r>
+      <w:r>
+        <w:t xml:space="preserve">— learner_id (PK), current, longest, last_active_day, freezes.</w:t>
+      </w:r>
+    </w:p>
+    <w:bookmarkEnd w:id="140"/>
+    <w:bookmarkStart w:id="141" w:name="certification-schema-lms_certification"/>
+    <w:p>
+      <w:pPr>
+        <w:pStyle w:val="Heading2"/>
+      </w:pPr>
+      <w:r>
+        <w:t xml:space="preserve">16.9 certification (schema:</w:t>
+      </w:r>
+      <w:r>
+        <w:t xml:space="preserve"> </w:t>
+      </w:r>
+      <w:r>
+        <w:rPr>
+          <w:rStyle w:val="VerbatimChar"/>
+        </w:rPr>
+        <w:t xml:space="preserve">lms_certification</w:t>
+      </w:r>
+      <w:r>
+        <w:t xml:space="preserve">)</w:t>
+      </w:r>
+    </w:p>
+    <w:p>
+      <w:pPr>
+        <w:pStyle w:val="FirstParagraph"/>
+      </w:pPr>
+      <w:r>
+        <w:rPr>
+          <w:b/>
+          <w:bCs/>
+        </w:rPr>
+        <w:t xml:space="preserve">templates</w:t>
+      </w:r>
+      <w:r>
+        <w:t xml:space="preserve"> </w:t>
+      </w:r>
+      <w:r>
+        <w:t xml:space="preserve">— id, year_no (unique), name, signatories, version.</w:t>
+      </w:r>
+      <w:r>
+        <w:t xml:space="preserve"> </w:t>
+      </w:r>
+      <w:r>
+        <w:rPr>
+          <w:b/>
+          <w:bCs/>
+        </w:rPr>
+        <w:t xml:space="preserve">certificates</w:t>
+      </w:r>
+      <w:r>
+        <w:t xml:space="preserve"> </w:t>
+      </w:r>
+      <w:r>
+        <w:t xml:space="preserve">— id, learner_id, year_no, template_id, cert_no (unique), cert_name,</w:t>
+      </w:r>
+      <w:r>
+        <w:t xml:space="preserve"> </w:t>
+      </w:r>
+      <w:r>
+        <w:rPr>
+          <w:b/>
+          <w:bCs/>
+        </w:rPr>
+        <w:t xml:space="preserve">verify_id</w:t>
+      </w:r>
+      <w:r>
+        <w:t xml:space="preserve"> </w:t>
+      </w:r>
+      <w:r>
+        <w:t xml:space="preserve">(unique, readable e.g. </w:t>
+      </w:r>
+      <w:r>
+        <w:rPr>
+          <w:rStyle w:val="VerbatimChar"/>
+        </w:rPr>
+        <w:t xml:space="preserve">LARE-VER-####</w:t>
+      </w:r>
+      <w:r>
+        <w:t xml:space="preserve">), file_id, status (issued / revoked), ppo_tag, holder_name, issued_at; unique (learner_id, year_no).</w:t>
+      </w:r>
+      <w:r>
+        <w:t xml:space="preserve"> </w:t>
+      </w:r>
+      <w:r>
+        <w:rPr>
+          <w:b/>
+          <w:bCs/>
+        </w:rPr>
+        <w:t xml:space="preserve">revocations</w:t>
+      </w:r>
+      <w:r>
+        <w:t xml:space="preserve"> </w:t>
+      </w:r>
+      <w:r>
+        <w:t xml:space="preserve">— id, certificate_id (FK), reason, revoked_by, ts.</w:t>
+      </w:r>
+    </w:p>
+    <w:bookmarkEnd w:id="141"/>
+    <w:bookmarkStart w:id="142" w:name="coding-schema-drive_coding"/>
+    <w:p>
+      <w:pPr>
+        <w:pStyle w:val="Heading2"/>
+      </w:pPr>
+      <w:r>
+        <w:t xml:space="preserve">16.10 coding (schema:</w:t>
+      </w:r>
+      <w:r>
+        <w:t xml:space="preserve"> </w:t>
+      </w:r>
+      <w:r>
+        <w:rPr>
+          <w:rStyle w:val="VerbatimChar"/>
+        </w:rPr>
+        <w:t xml:space="preserve">drive_coding</w:t>
+      </w:r>
+      <w:r>
+        <w:t xml:space="preserve">)</w:t>
+      </w:r>
+    </w:p>
+    <w:p>
+      <w:pPr>
+        <w:pStyle w:val="FirstParagraph"/>
+      </w:pPr>
+      <w:r>
+        <w:rPr>
+          <w:b/>
+          <w:bCs/>
+        </w:rPr>
+        <w:t xml:space="preserve">problems</w:t>
+      </w:r>
+      <w:r>
+        <w:t xml:space="preserve"> </w:t>
+      </w:r>
+      <w:r>
+        <w:t xml:space="preserve">— id, title, statement, languages (JSON), time_limit_sec, memory_limit_mb, sample_cases (JSON, visible), hidden_cases (JSON, hidden), max_score,</w:t>
+      </w:r>
+      <w:r>
+        <w:t xml:space="preserve"> </w:t>
+      </w:r>
+      <w:r>
+        <w:rPr>
+          <w:b/>
+          <w:bCs/>
+        </w:rPr>
+        <w:t xml:space="preserve">skill</w:t>
+      </w:r>
+      <w:r>
+        <w:t xml:space="preserve">,</w:t>
+      </w:r>
+      <w:r>
+        <w:t xml:space="preserve"> </w:t>
+      </w:r>
+      <w:r>
+        <w:rPr>
+          <w:b/>
+          <w:bCs/>
+        </w:rPr>
+        <w:t xml:space="preserve">difficulty</w:t>
+      </w:r>
+      <w:r>
+        <w:t xml:space="preserve">,</w:t>
+      </w:r>
+      <w:r>
+        <w:t xml:space="preserve"> </w:t>
+      </w:r>
+      <w:r>
+        <w:rPr>
+          <w:b/>
+          <w:bCs/>
+        </w:rPr>
+        <w:t xml:space="preserve">practice</w:t>
+      </w:r>
+      <w:r>
+        <w:t xml:space="preserve"> </w:t>
+      </w:r>
+      <w:r>
+        <w:t xml:space="preserve">(Boolean — only practice=true problems appear in the LARE Learn practice bank).</w:t>
+      </w:r>
+      <w:r>
+        <w:t xml:space="preserve"> </w:t>
+      </w:r>
+      <w:r>
+        <w:rPr>
+          <w:b/>
+          <w:bCs/>
+        </w:rPr>
+        <w:t xml:space="preserve">coding_sessions</w:t>
+      </w:r>
+      <w:r>
+        <w:t xml:space="preserve"> </w:t>
+      </w:r>
+      <w:r>
+        <w:t xml:space="preserve">— id, problem_id, candidate_id, exam_session_id,</w:t>
+      </w:r>
+      <w:r>
+        <w:t xml:space="preserve"> </w:t>
+      </w:r>
+      <w:r>
+        <w:rPr>
+          <w:b/>
+          <w:bCs/>
+        </w:rPr>
+        <w:t xml:space="preserve">kind</w:t>
+      </w:r>
+      <w:r>
+        <w:t xml:space="preserve"> </w:t>
+      </w:r>
+      <w:r>
+        <w:t xml:space="preserve">(exam / practice), language, draft_code, status (open / submitted), updated_at.</w:t>
+      </w:r>
+      <w:r>
+        <w:t xml:space="preserve"> </w:t>
+      </w:r>
+      <w:r>
+        <w:rPr>
+          <w:b/>
+          <w:bCs/>
+        </w:rPr>
+        <w:t xml:space="preserve">coding_submissions</w:t>
+      </w:r>
+      <w:r>
+        <w:t xml:space="preserve"> </w:t>
+      </w:r>
+      <w:r>
+        <w:t xml:space="preserve">— id, coding_session_id, code, score, cases_passed, total_cases, detail (JSON per-hidden-case pass/fail, no expected leaked), submitted_at.</w:t>
+      </w:r>
+      <w:r>
+        <w:t xml:space="preserve"> </w:t>
+      </w:r>
+      <w:r>
+        <w:rPr>
+          <w:b/>
+          <w:bCs/>
+        </w:rPr>
+        <w:t xml:space="preserve">coding_vivas</w:t>
+      </w:r>
+      <w:r>
+        <w:t xml:space="preserve"> </w:t>
+      </w:r>
+      <w:r>
+        <w:t xml:space="preserve">— id, coding_session_id, problem_id, candidate_id, question, answer, score (0..100), passed, verdict, ai_generated, status (asked / graded), created_at.</w:t>
+      </w:r>
+    </w:p>
+    <w:p>
+      <w:r>
+        <w:br w:type="page"/>
+      </w:r>
+    </w:p>
+    <w:bookmarkEnd w:id="142"/>
+    <w:bookmarkEnd w:id="143"/>
+    <w:bookmarkStart w:id="160" w:name="data-dictionary-hire-platform-services"/>
+    <w:p>
+      <w:pPr>
+        <w:pStyle w:val="Heading1"/>
+      </w:pPr>
+      <w:r>
+        <w:t xml:space="preserve">17. Data Dictionary — Hire &amp; Platform Services</w:t>
+      </w:r>
+    </w:p>
+    <w:p>
+      <w:pPr>
+        <w:pStyle w:val="FirstParagraph"/>
+      </w:pPr>
+      <w:r>
+        <w:t xml:space="preserve">Source: each service’s</w:t>
+      </w:r>
+      <w:r>
+        <w:t xml:space="preserve"> </w:t>
+      </w:r>
+      <w:r>
+        <w:rPr>
+          <w:rStyle w:val="VerbatimChar"/>
+        </w:rPr>
+        <w:t xml:space="preserve">models.py</w:t>
+      </w:r>
+      <w:r>
+        <w:t xml:space="preserve">. Conventions as in section 16.</w:t>
+      </w:r>
+    </w:p>
+    <w:bookmarkStart w:id="144" w:name="candidate-schema-drive_candidate"/>
+    <w:p>
+      <w:pPr>
+        <w:pStyle w:val="Heading2"/>
+      </w:pPr>
+      <w:r>
+        <w:t xml:space="preserve">17.1 candidate (schema:</w:t>
+      </w:r>
+      <w:r>
+        <w:t xml:space="preserve"> </w:t>
+      </w:r>
+      <w:r>
+        <w:rPr>
+          <w:rStyle w:val="VerbatimChar"/>
+        </w:rPr>
+        <w:t xml:space="preserve">drive_candidate</w:t>
+      </w:r>
+      <w:r>
+        <w:t xml:space="preserve">)</w:t>
+      </w:r>
+    </w:p>
+    <w:p>
+      <w:pPr>
+        <w:pStyle w:val="FirstParagraph"/>
+      </w:pPr>
+      <w:r>
+        <w:rPr>
+          <w:b/>
+          <w:bCs/>
+        </w:rPr>
+        <w:t xml:space="preserve">candidates</w:t>
+      </w:r>
+      <w:r>
+        <w:t xml:space="preserve"> </w:t>
+      </w:r>
+      <w:r>
+        <w:t xml:space="preserve">— id, user_id (unique), learner_id, college_id, full_name, first_name, last_name, roll_number, student_id (unique — issued by the public Attend flow), email, phone, branch, cgpa, photo_file_id, resume_file_id, created_at.</w:t>
+      </w:r>
+      <w:r>
+        <w:t xml:space="preserve"> </w:t>
+      </w:r>
+      <w:r>
+        <w:rPr>
+          <w:b/>
+          <w:bCs/>
+        </w:rPr>
+        <w:t xml:space="preserve">education</w:t>
+      </w:r>
+      <w:r>
+        <w:t xml:space="preserve"> </w:t>
+      </w:r>
+      <w:r>
+        <w:t xml:space="preserve">— id, candidate_id (FK), degree, institution, year, score.</w:t>
+      </w:r>
+      <w:r>
+        <w:t xml:space="preserve"> </w:t>
+      </w:r>
+      <w:r>
+        <w:rPr>
+          <w:b/>
+          <w:bCs/>
+        </w:rPr>
+        <w:t xml:space="preserve">skills</w:t>
+      </w:r>
+      <w:r>
+        <w:t xml:space="preserve"> </w:t>
+      </w:r>
+      <w:r>
+        <w:t xml:space="preserve">— id, candidate_id (FK), skill, level.</w:t>
+      </w:r>
+      <w:r>
+        <w:t xml:space="preserve"> </w:t>
+      </w:r>
+      <w:r>
+        <w:rPr>
+          <w:b/>
+          <w:bCs/>
+        </w:rPr>
+        <w:t xml:space="preserve">projects</w:t>
+      </w:r>
+      <w:r>
+        <w:t xml:space="preserve"> </w:t>
+      </w:r>
+      <w:r>
+        <w:t xml:space="preserve">— id, candidate_id (FK), title, description, repo_url.</w:t>
+      </w:r>
+      <w:r>
+        <w:t xml:space="preserve"> </w:t>
+      </w:r>
+      <w:r>
+        <w:rPr>
+          <w:b/>
+          <w:bCs/>
+        </w:rPr>
+        <w:t xml:space="preserve">applications</w:t>
+      </w:r>
+      <w:r>
+        <w:t xml:space="preserve"> </w:t>
+      </w:r>
+      <w:r>
+        <w:t xml:space="preserve">— id, candidate_id (FK), drive_id, drive_role_id, status, eligibility_snapshot (JSON), applied_at; unique (candidate_id, drive_id).</w:t>
+      </w:r>
+    </w:p>
+    <w:bookmarkEnd w:id="144"/>
+    <w:bookmarkStart w:id="145" w:name="drive-schema-drive_core"/>
+    <w:p>
+      <w:pPr>
+        <w:pStyle w:val="Heading2"/>
+      </w:pPr>
+      <w:r>
+        <w:t xml:space="preserve">17.2 drive (schema:</w:t>
+      </w:r>
+      <w:r>
+        <w:t xml:space="preserve"> </w:t>
+      </w:r>
+      <w:r>
+        <w:rPr>
+          <w:rStyle w:val="VerbatimChar"/>
+        </w:rPr>
+        <w:t xml:space="preserve">drive_core</w:t>
+      </w:r>
+      <w:r>
+        <w:t xml:space="preserve">)</w:t>
+      </w:r>
+    </w:p>
+    <w:p>
+      <w:pPr>
+        <w:pStyle w:val="FirstParagraph"/>
+      </w:pPr>
+      <w:r>
+        <w:rPr>
+          <w:b/>
+          <w:bCs/>
+        </w:rPr>
+        <w:t xml:space="preserve">drives</w:t>
+      </w:r>
+      <w:r>
+        <w:t xml:space="preserve"> </w:t>
+      </w:r>
+      <w:r>
+        <w:t xml:space="preserve">— id, company_id, company_name, title, status (draft / open / closed), reporting_time, venue, contact_email (candidate mail From/Reply-To), schedule (JSON: registration_deadline, exam_date, interview_date, joining_date), created_by, created_at.</w:t>
+      </w:r>
+      <w:r>
+        <w:t xml:space="preserve"> </w:t>
+      </w:r>
+      <w:r>
+        <w:rPr>
+          <w:b/>
+          <w:bCs/>
+        </w:rPr>
+        <w:t xml:space="preserve">drive_roles</w:t>
+      </w:r>
+      <w:r>
+        <w:t xml:space="preserve"> </w:t>
+      </w:r>
+      <w:r>
+        <w:t xml:space="preserve">— id, drive_id (FK), title, ctc, positions, description,</w:t>
+      </w:r>
+      <w:r>
+        <w:t xml:space="preserve"> </w:t>
+      </w:r>
+      <w:r>
+        <w:rPr>
+          <w:b/>
+          <w:bCs/>
+        </w:rPr>
+        <w:t xml:space="preserve">skills</w:t>
+      </w:r>
+      <w:r>
+        <w:t xml:space="preserve"> </w:t>
+      </w:r>
+      <w:r>
+        <w:t xml:space="preserve">(JSON name+weight — drives Matched Opportunities).</w:t>
+      </w:r>
+      <w:r>
+        <w:t xml:space="preserve"> </w:t>
+      </w:r>
+      <w:r>
+        <w:rPr>
+          <w:b/>
+          <w:bCs/>
+        </w:rPr>
+        <w:t xml:space="preserve">eligibility_rules</w:t>
+      </w:r>
+      <w:r>
+        <w:t xml:space="preserve"> </w:t>
+      </w:r>
+      <w:r>
+        <w:t xml:space="preserve">— id, drive_id (FK), rule (JSON: min_cgpa, branches, max_backlogs, min_lms_score).</w:t>
+      </w:r>
+      <w:r>
+        <w:t xml:space="preserve"> </w:t>
+      </w:r>
+      <w:r>
+        <w:rPr>
+          <w:b/>
+          <w:bCs/>
+        </w:rPr>
+        <w:t xml:space="preserve">rounds</w:t>
+      </w:r>
+      <w:r>
+        <w:t xml:space="preserve"> </w:t>
+      </w:r>
+      <w:r>
+        <w:t xml:space="preserve">— id, drive_id (FK), order, type (aptitude / technical / verbal / coding / interview), label, optional (Boolean), config (JSON), service_ref.</w:t>
+      </w:r>
+      <w:r>
+        <w:t xml:space="preserve"> </w:t>
+      </w:r>
+      <w:r>
+        <w:rPr>
+          <w:b/>
+          <w:bCs/>
+        </w:rPr>
+        <w:t xml:space="preserve">registrations</w:t>
+      </w:r>
+      <w:r>
+        <w:t xml:space="preserve"> </w:t>
+      </w:r>
+      <w:r>
+        <w:t xml:space="preserve">— id, drive_id (FK), candidate_id, status (applied → shortlisted → in_round → selected/rejected), current_round, eligible (yes / no / unknown), joining_status (offer_accepted → docs_verified → joined); unique (drive_id, candidate_id).</w:t>
+      </w:r>
+      <w:r>
+        <w:t xml:space="preserve"> </w:t>
+      </w:r>
+      <w:r>
+        <w:rPr>
+          <w:b/>
+          <w:bCs/>
+        </w:rPr>
+        <w:t xml:space="preserve">round_scores</w:t>
+      </w:r>
+      <w:r>
+        <w:t xml:space="preserve"> </w:t>
+      </w:r>
+      <w:r>
+        <w:t xml:space="preserve">— id, drive_id (FK), round_order, candidate_id, marks, max_marks, remarks, cleared, referred (admin-added), entered_by, coding_attempted, coding_correct, coding_total, updated_at; unique (drive_id, round_order, candidate_id).</w:t>
+      </w:r>
+      <w:r>
+        <w:t xml:space="preserve"> </w:t>
+      </w:r>
+      <w:r>
+        <w:rPr>
+          <w:b/>
+          <w:bCs/>
+        </w:rPr>
+        <w:t xml:space="preserve">seat_allocations</w:t>
+      </w:r>
+      <w:r>
+        <w:t xml:space="preserve"> </w:t>
+      </w:r>
+      <w:r>
+        <w:t xml:space="preserve">— id, drive_id (FK), candidate_id, lab, system_no, seat_no; unique (drive_id, candidate_id).</w:t>
+      </w:r>
+      <w:r>
+        <w:t xml:space="preserve"> </w:t>
+      </w:r>
+      <w:r>
+        <w:rPr>
+          <w:b/>
+          <w:bCs/>
+        </w:rPr>
+        <w:t xml:space="preserve">application_forms</w:t>
+      </w:r>
+      <w:r>
+        <w:t xml:space="preserve"> </w:t>
+      </w:r>
+      <w:r>
+        <w:t xml:space="preserve">— drive_id (PK/FK), fields (JSON schema).</w:t>
+      </w:r>
+      <w:r>
+        <w:t xml:space="preserve"> </w:t>
+      </w:r>
+      <w:r>
+        <w:rPr>
+          <w:b/>
+          <w:bCs/>
+        </w:rPr>
+        <w:t xml:space="preserve">form_submissions</w:t>
+      </w:r>
+      <w:r>
+        <w:t xml:space="preserve"> </w:t>
+      </w:r>
+      <w:r>
+        <w:t xml:space="preserve">— id, drive_id (FK), candidate_id, answers (JSON), submitted_at; unique (drive_id, candidate_id).</w:t>
+      </w:r>
+      <w:r>
+        <w:t xml:space="preserve"> </w:t>
+      </w:r>
+      <w:r>
+        <w:rPr>
+          <w:b/>
+          <w:bCs/>
+        </w:rPr>
+        <w:t xml:space="preserve">ppo_config</w:t>
+      </w:r>
+      <w:r>
+        <w:t xml:space="preserve"> </w:t>
+      </w:r>
+      <w:r>
+        <w:t xml:space="preserve">— drive_id (PK/FK), eligibility (JSON), stages (JSON), conversion_criteria (JSON).</w:t>
+      </w:r>
+    </w:p>
+    <w:bookmarkEnd w:id="145"/>
+    <w:bookmarkStart w:id="146" w:name="questionbank-schema-drive_questionbank"/>
+    <w:p>
+      <w:pPr>
+        <w:pStyle w:val="Heading2"/>
+      </w:pPr>
+      <w:r>
+        <w:t xml:space="preserve">17.3 questionbank (schema:</w:t>
+      </w:r>
+      <w:r>
+        <w:t xml:space="preserve"> </w:t>
+      </w:r>
+      <w:r>
+        <w:rPr>
+          <w:rStyle w:val="VerbatimChar"/>
+        </w:rPr>
+        <w:t xml:space="preserve">drive_questionbank</w:t>
+      </w:r>
+      <w:r>
+        <w:t xml:space="preserve">)</w:t>
+      </w:r>
+    </w:p>
+    <w:p>
+      <w:pPr>
+        <w:pStyle w:val="FirstParagraph"/>
+      </w:pPr>
+      <w:r>
+        <w:rPr>
+          <w:b/>
+          <w:bCs/>
+        </w:rPr>
+        <w:t xml:space="preserve">questions</w:t>
+      </w:r>
+      <w:r>
+        <w:t xml:space="preserve"> </w:t>
+      </w:r>
+      <w:r>
+        <w:t xml:space="preserve">— id, type (mcq / multi / fill_blank / match / true_false / coding / sql / output), category (aptitude / technical / verbal / programming), difficulty, tags (JSON), stem, options (JSON), answer_key (JSON — never exposed to clients), explanation, weight, version, status (draft / active / retired), author_id, created_at.</w:t>
+      </w:r>
+      <w:r>
+        <w:t xml:space="preserve"> </w:t>
+      </w:r>
+      <w:r>
+        <w:rPr>
+          <w:b/>
+          <w:bCs/>
+        </w:rPr>
+        <w:t xml:space="preserve">blueprints</w:t>
+      </w:r>
+      <w:r>
+        <w:t xml:space="preserve"> </w:t>
+      </w:r>
+      <w:r>
+        <w:t xml:space="preserve">— id, name, spec (JSON: category + difficulty + count rows for paper generation).</w:t>
+      </w:r>
+    </w:p>
+    <w:bookmarkEnd w:id="146"/>
+    <w:bookmarkStart w:id="147" w:name="exam-schema-drive_exam"/>
+    <w:p>
+      <w:pPr>
+        <w:pStyle w:val="Heading2"/>
+      </w:pPr>
+      <w:r>
+        <w:t xml:space="preserve">17.4 exam (schema:</w:t>
+      </w:r>
+      <w:r>
+        <w:t xml:space="preserve"> </w:t>
+      </w:r>
+      <w:r>
+        <w:rPr>
+          <w:rStyle w:val="VerbatimChar"/>
+        </w:rPr>
+        <w:t xml:space="preserve">drive_exam</w:t>
+      </w:r>
+      <w:r>
+        <w:t xml:space="preserve">)</w:t>
+      </w:r>
+    </w:p>
+    <w:p>
+      <w:pPr>
+        <w:pStyle w:val="FirstParagraph"/>
+      </w:pPr>
+      <w:r>
+        <w:rPr>
+          <w:b/>
+          <w:bCs/>
+        </w:rPr>
+        <w:t xml:space="preserve">exams</w:t>
+      </w:r>
+      <w:r>
+        <w:t xml:space="preserve"> </w:t>
+      </w:r>
+      <w:r>
+        <w:t xml:space="preserve">— id, drive_id, round_id, title, total_time_min, negative_marking, nav_rule (free / linear), sections (JSON: sections → questions), window_start, window_end.</w:t>
+      </w:r>
+      <w:r>
+        <w:t xml:space="preserve"> </w:t>
+      </w:r>
+      <w:r>
+        <w:rPr>
+          <w:b/>
+          <w:bCs/>
+        </w:rPr>
+        <w:t xml:space="preserve">exam_sessions</w:t>
+      </w:r>
+      <w:r>
+        <w:t xml:space="preserve"> </w:t>
+      </w:r>
+      <w:r>
+        <w:t xml:space="preserve">— id, exam_id, candidate_id, status (in_progress / submitted / expired), started_at, submitted_at, section_state (JSON lock map), auto_submitted; unique (exam_id, candidate_id).</w:t>
+      </w:r>
+      <w:r>
+        <w:t xml:space="preserve"> </w:t>
+      </w:r>
+      <w:r>
+        <w:rPr>
+          <w:b/>
+          <w:bCs/>
+        </w:rPr>
+        <w:t xml:space="preserve">exam_answers</w:t>
+      </w:r>
+      <w:r>
+        <w:t xml:space="preserve"> </w:t>
+      </w:r>
+      <w:r>
+        <w:t xml:space="preserve">— id, session_id, question_id, response (JSON), updated_at; unique (session_id, question_id). Latest-answer-per-question for resume; durable history lives in Submission.</w:t>
+      </w:r>
+    </w:p>
+    <w:bookmarkEnd w:id="147"/>
+    <w:bookmarkStart w:id="148" w:name="X47e18960d6776de2f7e19cc35d798c00ea08387"/>
+    <w:p>
+      <w:pPr>
+        <w:pStyle w:val="Heading2"/>
+      </w:pPr>
+      <w:r>
+        <w:t xml:space="preserve">17.5 submission (schema:</w:t>
+      </w:r>
+      <w:r>
+        <w:t xml:space="preserve"> </w:t>
+      </w:r>
+      <w:r>
+        <w:rPr>
+          <w:rStyle w:val="VerbatimChar"/>
+        </w:rPr>
+        <w:t xml:space="preserve">drive_submission</w:t>
+      </w:r>
+      <w:r>
+        <w:t xml:space="preserve">) — no accepted-answer loss</w:t>
+      </w:r>
+    </w:p>
+    <w:p>
+      <w:pPr>
+        <w:pStyle w:val="FirstParagraph"/>
+      </w:pPr>
+      <w:r>
+        <w:rPr>
+          <w:b/>
+          <w:bCs/>
+        </w:rPr>
+        <w:t xml:space="preserve">answers</w:t>
+      </w:r>
+      <w:r>
+        <w:t xml:space="preserve"> </w:t>
+      </w:r>
+      <w:r>
+        <w:t xml:space="preserve">(append-only) — id, session_id, question_id, response (JSON), source (autosave / final), client_seq, ts. Every write is a new row.</w:t>
+      </w:r>
+      <w:r>
+        <w:t xml:space="preserve"> </w:t>
+      </w:r>
+      <w:r>
+        <w:rPr>
+          <w:b/>
+          <w:bCs/>
+        </w:rPr>
+        <w:t xml:space="preserve">answer_latest</w:t>
+      </w:r>
+      <w:r>
+        <w:t xml:space="preserve"> </w:t>
+      </w:r>
+      <w:r>
+        <w:t xml:space="preserve">— id, session_id, question_id, response, client_seq, updated_at; unique (session_id, question_id). Materialized last-write-wins.</w:t>
+      </w:r>
+      <w:r>
+        <w:t xml:space="preserve"> </w:t>
+      </w:r>
+      <w:r>
+        <w:rPr>
+          <w:b/>
+          <w:bCs/>
+        </w:rPr>
+        <w:t xml:space="preserve">time_spent</w:t>
+      </w:r>
+      <w:r>
+        <w:t xml:space="preserve"> </w:t>
+      </w:r>
+      <w:r>
+        <w:t xml:space="preserve">— id, session_id, question_id, seconds; unique (session_id, question_id).</w:t>
+      </w:r>
+      <w:r>
+        <w:t xml:space="preserve"> </w:t>
+      </w:r>
+      <w:r>
+        <w:rPr>
+          <w:b/>
+          <w:bCs/>
+        </w:rPr>
+        <w:t xml:space="preserve">final_submissions</w:t>
+      </w:r>
+      <w:r>
+        <w:t xml:space="preserve"> </w:t>
+      </w:r>
+      <w:r>
+        <w:t xml:space="preserve">— id, session_id, snapshot (JSON), answer_count, submitted_at, finalized; unique (session_id). Immutable final snapshot.</w:t>
+      </w:r>
+    </w:p>
+    <w:bookmarkEnd w:id="148"/>
+    <w:bookmarkStart w:id="149" w:name="anticheat-schema-drive_anticheat"/>
+    <w:p>
+      <w:pPr>
+        <w:pStyle w:val="Heading2"/>
+      </w:pPr>
+      <w:r>
+        <w:t xml:space="preserve">17.6 anticheat (schema:</w:t>
+      </w:r>
+      <w:r>
+        <w:t xml:space="preserve"> </w:t>
+      </w:r>
+      <w:r>
+        <w:rPr>
+          <w:rStyle w:val="VerbatimChar"/>
+        </w:rPr>
+        <w:t xml:space="preserve">drive_anticheat</w:t>
+      </w:r>
+      <w:r>
+        <w:t xml:space="preserve">)</w:t>
+      </w:r>
+    </w:p>
+    <w:p>
+      <w:pPr>
+        <w:pStyle w:val="FirstParagraph"/>
+      </w:pPr>
+      <w:r>
+        <w:rPr>
+          <w:b/>
+          <w:bCs/>
+        </w:rPr>
+        <w:t xml:space="preserve">proctor_sessions</w:t>
+      </w:r>
+      <w:r>
+        <w:t xml:space="preserve"> </w:t>
+      </w:r>
+      <w:r>
+        <w:t xml:space="preserve">— id, exam_session_id (unique), candidate_id, drive_id, fingerprint, ip, browser, violation_score, status (active / flagged / auto_submitted), started_at.</w:t>
+      </w:r>
+      <w:r>
+        <w:t xml:space="preserve"> </w:t>
+      </w:r>
+      <w:r>
+        <w:rPr>
+          <w:b/>
+          <w:bCs/>
+        </w:rPr>
+        <w:t xml:space="preserve">events</w:t>
+      </w:r>
+      <w:r>
+        <w:t xml:space="preserve"> </w:t>
+      </w:r>
+      <w:r>
+        <w:t xml:space="preserve">— id, proctor_session_id, type, weight, ip, browser, device, meta (JSON), ts. Focus/tab/visibility/copy-paste events; accumulated weight drives the violation score and auto-submit.</w:t>
+      </w:r>
+    </w:p>
+    <w:bookmarkEnd w:id="149"/>
+    <w:bookmarkStart w:id="150" w:name="evaluation-schema-drive_evaluation"/>
+    <w:p>
+      <w:pPr>
+        <w:pStyle w:val="Heading2"/>
+      </w:pPr>
+      <w:r>
+        <w:t xml:space="preserve">17.7 evaluation (schema:</w:t>
+      </w:r>
+      <w:r>
+        <w:t xml:space="preserve"> </w:t>
+      </w:r>
+      <w:r>
+        <w:rPr>
+          <w:rStyle w:val="VerbatimChar"/>
+        </w:rPr>
+        <w:t xml:space="preserve">drive_evaluation</w:t>
+      </w:r>
+      <w:r>
+        <w:t xml:space="preserve">)</w:t>
+      </w:r>
+    </w:p>
+    <w:p>
+      <w:pPr>
+        <w:pStyle w:val="FirstParagraph"/>
+      </w:pPr>
+      <w:r>
+        <w:rPr>
+          <w:b/>
+          <w:bCs/>
+        </w:rPr>
+        <w:t xml:space="preserve">answer_keys</w:t>
+      </w:r>
+      <w:r>
+        <w:t xml:space="preserve"> </w:t>
+      </w:r>
+      <w:r>
+        <w:t xml:space="preserve">— exam_id (PK), items (JSON: question_id + type + correct + weight; correct never exposed), passing_pct, negative_marking.</w:t>
+      </w:r>
+      <w:r>
+        <w:t xml:space="preserve"> </w:t>
+      </w:r>
+      <w:r>
+        <w:rPr>
+          <w:b/>
+          <w:bCs/>
+        </w:rPr>
+        <w:t xml:space="preserve">evaluations</w:t>
+      </w:r>
+      <w:r>
+        <w:t xml:space="preserve"> </w:t>
+      </w:r>
+      <w:r>
+        <w:t xml:space="preserve">— id, exam_id, session_id, candidate_id, total, max_score, percentage, accuracy, passed, version, needs_review (system-error coding items held for manual review, never auto-zeroed), question_scores (JSON), created_at; unique (session_id).</w:t>
+      </w:r>
+      <w:r>
+        <w:t xml:space="preserve"> </w:t>
+      </w:r>
+      <w:r>
+        <w:rPr>
+          <w:b/>
+          <w:bCs/>
+        </w:rPr>
+        <w:t xml:space="preserve">ranks</w:t>
+      </w:r>
+      <w:r>
+        <w:t xml:space="preserve"> </w:t>
+      </w:r>
+      <w:r>
+        <w:t xml:space="preserve">— id, exam_id, candidate_id, rank, percentage, tie_break; unique (exam_id, candidate_id).</w:t>
+      </w:r>
+    </w:p>
+    <w:bookmarkEnd w:id="150"/>
+    <w:bookmarkStart w:id="151" w:name="interview-schema-drive_interview"/>
+    <w:p>
+      <w:pPr>
+        <w:pStyle w:val="Heading2"/>
+      </w:pPr>
+      <w:r>
+        <w:t xml:space="preserve">17.8 interview (schema:</w:t>
+      </w:r>
+      <w:r>
+        <w:t xml:space="preserve"> </w:t>
+      </w:r>
+      <w:r>
+        <w:rPr>
+          <w:rStyle w:val="VerbatimChar"/>
+        </w:rPr>
+        <w:t xml:space="preserve">drive_interview</w:t>
+      </w:r>
+      <w:r>
+        <w:t xml:space="preserve">)</w:t>
+      </w:r>
+    </w:p>
+    <w:p>
+      <w:pPr>
+        <w:pStyle w:val="FirstParagraph"/>
+      </w:pPr>
+      <w:r>
+        <w:rPr>
+          <w:b/>
+          <w:bCs/>
+        </w:rPr>
+        <w:t xml:space="preserve">interviews</w:t>
+      </w:r>
+      <w:r>
+        <w:t xml:space="preserve"> </w:t>
+      </w:r>
+      <w:r>
+        <w:t xml:space="preserve">— id, drive_id, round_id, candidate_id, stage (technical / hr / ppo), mode (online / in_person), link, slot, interviewer_id, status (scheduled / completed), decision (select / reject / hold / next_round), decision_reason, avg_rating, created_at.</w:t>
+      </w:r>
+      <w:r>
+        <w:t xml:space="preserve"> </w:t>
+      </w:r>
+      <w:r>
+        <w:rPr>
+          <w:b/>
+          <w:bCs/>
+        </w:rPr>
+        <w:t xml:space="preserve">ratings</w:t>
+      </w:r>
+      <w:r>
+        <w:t xml:space="preserve"> </w:t>
+      </w:r>
+      <w:r>
+        <w:t xml:space="preserve">— id, interview_id (FK), interviewer_id, competency (technical / communication / problem_solving / culture), score (1..5), remark.</w:t>
+      </w:r>
+    </w:p>
+    <w:bookmarkEnd w:id="151"/>
+    <w:bookmarkStart w:id="152" w:name="result-schema-drive_result"/>
+    <w:p>
+      <w:pPr>
+        <w:pStyle w:val="Heading2"/>
+      </w:pPr>
+      <w:r>
+        <w:t xml:space="preserve">17.9 result (schema:</w:t>
+      </w:r>
+      <w:r>
+        <w:t xml:space="preserve"> </w:t>
+      </w:r>
+      <w:r>
+        <w:rPr>
+          <w:rStyle w:val="VerbatimChar"/>
+        </w:rPr>
+        <w:t xml:space="preserve">drive_result</w:t>
+      </w:r>
+      <w:r>
+        <w:t xml:space="preserve">)</w:t>
+      </w:r>
+    </w:p>
+    <w:p>
+      <w:pPr>
+        <w:pStyle w:val="FirstParagraph"/>
+      </w:pPr>
+      <w:r>
+        <w:rPr>
+          <w:b/>
+          <w:bCs/>
+        </w:rPr>
+        <w:t xml:space="preserve">results</w:t>
+      </w:r>
+      <w:r>
+        <w:t xml:space="preserve"> </w:t>
+      </w:r>
+      <w:r>
+        <w:t xml:space="preserve">— id, drive_id, candidate_id, final_score, rank, outcome (pass / fail / shortlist / selected), status (draft / published), published_at; unique (drive_id, candidate_id).</w:t>
+      </w:r>
+      <w:r>
+        <w:t xml:space="preserve"> </w:t>
+      </w:r>
+      <w:r>
+        <w:rPr>
+          <w:b/>
+          <w:bCs/>
+        </w:rPr>
+        <w:t xml:space="preserve">offers</w:t>
+      </w:r>
+      <w:r>
+        <w:t xml:space="preserve"> </w:t>
+      </w:r>
+      <w:r>
+        <w:t xml:space="preserve">— id, drive_id, candidate_id, role_id, type (offer / ppo), company_name, role_title, ctc, letter_file_id, verify_id (unique — public offer verify), status (issued / accepted / declined), issued_at.</w:t>
+      </w:r>
+    </w:p>
+    <w:bookmarkEnd w:id="152"/>
+    <w:bookmarkStart w:id="153" w:name="notification-schema-shared_notify"/>
+    <w:p>
+      <w:pPr>
+        <w:pStyle w:val="Heading2"/>
+      </w:pPr>
+      <w:r>
+        <w:t xml:space="preserve">17.10 notification (schema:</w:t>
+      </w:r>
+      <w:r>
+        <w:t xml:space="preserve"> </w:t>
+      </w:r>
+      <w:r>
+        <w:rPr>
+          <w:rStyle w:val="VerbatimChar"/>
+        </w:rPr>
+        <w:t xml:space="preserve">shared_notify</w:t>
+      </w:r>
+      <w:r>
+        <w:t xml:space="preserve">)</w:t>
+      </w:r>
+    </w:p>
+    <w:p>
+      <w:pPr>
+        <w:pStyle w:val="FirstParagraph"/>
+      </w:pPr>
+      <w:r>
+        <w:rPr>
+          <w:b/>
+          <w:bCs/>
+        </w:rPr>
+        <w:t xml:space="preserve">templates</w:t>
+      </w:r>
+      <w:r>
+        <w:t xml:space="preserve"> </w:t>
+      </w:r>
+      <w:r>
+        <w:t xml:space="preserve">— id, key, channel (email / inapp / sms / whatsapp), locale, subject, body, version, active, critical (bypasses channel prefs); unique (key, channel, locale).</w:t>
+      </w:r>
+      <w:r>
+        <w:t xml:space="preserve"> </w:t>
+      </w:r>
+      <w:r>
+        <w:rPr>
+          <w:b/>
+          <w:bCs/>
+        </w:rPr>
+        <w:t xml:space="preserve">notifications</w:t>
+      </w:r>
+      <w:r>
+        <w:t xml:space="preserve"> </w:t>
+      </w:r>
+      <w:r>
+        <w:t xml:space="preserve">— id, user_id, template_key, channel, payload (JSON), subject, body, status (queued / sent / suppressed / failed / not_configured), dedupe_key, read_at, created_at, sent_at.</w:t>
+      </w:r>
+      <w:r>
+        <w:t xml:space="preserve"> </w:t>
+      </w:r>
+      <w:r>
+        <w:rPr>
+          <w:b/>
+          <w:bCs/>
+        </w:rPr>
+        <w:t xml:space="preserve">preferences</w:t>
+      </w:r>
+      <w:r>
+        <w:t xml:space="preserve"> </w:t>
+      </w:r>
+      <w:r>
+        <w:t xml:space="preserve">— id, user_id, channel, enabled; unique (user_id, channel).</w:t>
+      </w:r>
+    </w:p>
+    <w:bookmarkEnd w:id="153"/>
+    <w:bookmarkStart w:id="154" w:name="files-schema-shared_files"/>
+    <w:p>
+      <w:pPr>
+        <w:pStyle w:val="Heading2"/>
+      </w:pPr>
+      <w:r>
+        <w:t xml:space="preserve">17.11 files (schema:</w:t>
+      </w:r>
+      <w:r>
+        <w:t xml:space="preserve"> </w:t>
+      </w:r>
+      <w:r>
+        <w:rPr>
+          <w:rStyle w:val="VerbatimChar"/>
+        </w:rPr>
+        <w:t xml:space="preserve">shared_files</w:t>
+      </w:r>
+      <w:r>
+        <w:t xml:space="preserve">)</w:t>
+      </w:r>
+    </w:p>
+    <w:p>
+      <w:pPr>
+        <w:pStyle w:val="FirstParagraph"/>
+      </w:pPr>
+      <w:r>
+        <w:rPr>
+          <w:b/>
+          <w:bCs/>
+        </w:rPr>
+        <w:t xml:space="preserve">files</w:t>
+      </w:r>
+      <w:r>
+        <w:t xml:space="preserve"> </w:t>
+      </w:r>
+      <w:r>
+        <w:t xml:space="preserve">— id, owner_user_id, purpose, bucket, object_key (random uuid — no user-controlled paths), filename, mime, size, status (pending / ready / scan_failed / deleted), scan_result, entity_type, entity_id, created_at.</w:t>
+      </w:r>
+    </w:p>
+    <w:bookmarkEnd w:id="154"/>
+    <w:bookmarkStart w:id="155" w:name="analytics-schema-shared_analytics"/>
+    <w:p>
+      <w:pPr>
+        <w:pStyle w:val="Heading2"/>
+      </w:pPr>
+      <w:r>
+        <w:t xml:space="preserve">17.12 analytics (schema:</w:t>
+      </w:r>
+      <w:r>
+        <w:t xml:space="preserve"> </w:t>
+      </w:r>
+      <w:r>
+        <w:rPr>
+          <w:rStyle w:val="VerbatimChar"/>
+        </w:rPr>
+        <w:t xml:space="preserve">shared_analytics</w:t>
+      </w:r>
+      <w:r>
+        <w:t xml:space="preserve">)</w:t>
+      </w:r>
+    </w:p>
+    <w:p>
+      <w:pPr>
+        <w:pStyle w:val="FirstParagraph"/>
+      </w:pPr>
+      <w:r>
+        <w:rPr>
+          <w:b/>
+          <w:bCs/>
+        </w:rPr>
+        <w:t xml:space="preserve">dashboard_layouts</w:t>
+      </w:r>
+      <w:r>
+        <w:t xml:space="preserve"> </w:t>
+      </w:r>
+      <w:r>
+        <w:t xml:space="preserve">— user_id (PK), widgets (JSON: id, type, w, h, x, y, config).</w:t>
+      </w:r>
+      <w:r>
+        <w:t xml:space="preserve"> </w:t>
+      </w:r>
+      <w:r>
+        <w:rPr>
+          <w:b/>
+          <w:bCs/>
+        </w:rPr>
+        <w:t xml:space="preserve">facts</w:t>
+      </w:r>
+      <w:r>
+        <w:t xml:space="preserve"> </w:t>
+      </w:r>
+      <w:r>
+        <w:t xml:space="preserve">— id, kind (learner / college / drive), college_id, cohort_id, learner_id, drive_id, metric, value, ts. Append-only fact store fed by domain events; read-side aggregations computed on demand.</w:t>
+      </w:r>
+    </w:p>
+    <w:bookmarkEnd w:id="155"/>
+    <w:bookmarkStart w:id="156" w:name="audit-schema-shared_audit-tamper-evident"/>
+    <w:p>
+      <w:pPr>
+        <w:pStyle w:val="Heading2"/>
+      </w:pPr>
+      <w:r>
+        <w:t xml:space="preserve">17.13 audit (schema:</w:t>
+      </w:r>
+      <w:r>
+        <w:t xml:space="preserve"> </w:t>
+      </w:r>
+      <w:r>
+        <w:rPr>
+          <w:rStyle w:val="VerbatimChar"/>
+        </w:rPr>
+        <w:t xml:space="preserve">shared_audit</w:t>
+      </w:r>
+      <w:r>
+        <w:t xml:space="preserve">) — tamper-evident</w:t>
+      </w:r>
+    </w:p>
+    <w:p>
+      <w:pPr>
+        <w:pStyle w:val="FirstParagraph"/>
+      </w:pPr>
+      <w:r>
+        <w:rPr>
+          <w:b/>
+          <w:bCs/>
+        </w:rPr>
+        <w:t xml:space="preserve">audit_logs</w:t>
+      </w:r>
+      <w:r>
+        <w:t xml:space="preserve"> </w:t>
+      </w:r>
+      <w:r>
+        <w:t xml:space="preserve">(append-only, hash-chained) — id, partition_key, seq, ts, actor_type (user / service), actor_id, action, entity_type, entity_id, meta (JSON), ip, device, correlation_id, prev_hash, hash; unique (partition_key, seq). Each row’s</w:t>
+      </w:r>
+      <w:r>
+        <w:t xml:space="preserve"> </w:t>
+      </w:r>
+      <w:r>
+        <w:rPr>
+          <w:rStyle w:val="VerbatimChar"/>
+        </w:rPr>
+        <w:t xml:space="preserve">hash</w:t>
+      </w:r>
+      <w:r>
+        <w:t xml:space="preserve"> </w:t>
+      </w:r>
+      <w:r>
+        <w:t xml:space="preserve">chains from</w:t>
+      </w:r>
+      <w:r>
+        <w:t xml:space="preserve"> </w:t>
+      </w:r>
+      <w:r>
+        <w:rPr>
+          <w:rStyle w:val="VerbatimChar"/>
+        </w:rPr>
+        <w:t xml:space="preserve">prev_hash</w:t>
+      </w:r>
+      <w:r>
+        <w:t xml:space="preserve"> </w:t>
+      </w:r>
+      <w:r>
+        <w:t xml:space="preserve">— tampering breaks the chain.</w:t>
+      </w:r>
+      <w:r>
+        <w:t xml:space="preserve"> </w:t>
+      </w:r>
+      <w:r>
+        <w:rPr>
+          <w:b/>
+          <w:bCs/>
+        </w:rPr>
+        <w:t xml:space="preserve">activity_logs</w:t>
+      </w:r>
+      <w:r>
+        <w:t xml:space="preserve"> </w:t>
+      </w:r>
+      <w:r>
+        <w:t xml:space="preserve">— id, user_id, session_id, event, context (JSON), ts. Higher-volume UX/proctor stream (not chained).</w:t>
+      </w:r>
+    </w:p>
+    <w:bookmarkEnd w:id="156"/>
+    <w:bookmarkStart w:id="157" w:name="ai_tutor-schema-shared_ai_tutor"/>
+    <w:p>
+      <w:pPr>
+        <w:pStyle w:val="Heading2"/>
+      </w:pPr>
+      <w:r>
+        <w:t xml:space="preserve">17.14 ai_tutor (schema:</w:t>
+      </w:r>
+      <w:r>
+        <w:t xml:space="preserve"> </w:t>
+      </w:r>
+      <w:r>
+        <w:rPr>
+          <w:rStyle w:val="VerbatimChar"/>
+        </w:rPr>
+        <w:t xml:space="preserve">shared_ai_tutor</w:t>
+      </w:r>
+      <w:r>
+        <w:t xml:space="preserve">)</w:t>
+      </w:r>
+    </w:p>
+    <w:p>
+      <w:pPr>
+        <w:pStyle w:val="FirstParagraph"/>
+      </w:pPr>
+      <w:r>
+        <w:rPr>
+          <w:b/>
+          <w:bCs/>
+        </w:rPr>
+        <w:t xml:space="preserve">tutor_sessions</w:t>
+      </w:r>
+      <w:r>
+        <w:t xml:space="preserve"> </w:t>
+      </w:r>
+      <w:r>
+        <w:t xml:space="preserve">— id, learner_id, title, created_at.</w:t>
+      </w:r>
+      <w:r>
+        <w:t xml:space="preserve"> </w:t>
+      </w:r>
+      <w:r>
+        <w:rPr>
+          <w:b/>
+          <w:bCs/>
+        </w:rPr>
+        <w:t xml:space="preserve">tutor_messages</w:t>
+      </w:r>
+      <w:r>
+        <w:t xml:space="preserve"> </w:t>
+      </w:r>
+      <w:r>
+        <w:t xml:space="preserve">— id, session_id (FK), role (user / assistant), content (Text), created_at.</w:t>
+      </w:r>
+    </w:p>
+    <w:bookmarkEnd w:id="157"/>
+    <w:bookmarkStart w:id="158" w:name="Xea9ff869d78a7bc18012f499386b2ff60209209"/>
+    <w:p>
+      <w:pPr>
+        <w:pStyle w:val="Heading2"/>
+      </w:pPr>
+      <w:r>
+        <w:t xml:space="preserve">17.15 ai_orchestration (schema:</w:t>
+      </w:r>
+      <w:r>
+        <w:t xml:space="preserve"> </w:t>
+      </w:r>
+      <w:r>
+        <w:rPr>
+          <w:rStyle w:val="VerbatimChar"/>
+        </w:rPr>
+        <w:t xml:space="preserve">shared_ai_orchestration</w:t>
+      </w:r>
+      <w:r>
+        <w:t xml:space="preserve">)</w:t>
+      </w:r>
+    </w:p>
+    <w:p>
+      <w:pPr>
+        <w:pStyle w:val="FirstParagraph"/>
+      </w:pPr>
+      <w:r>
+        <w:rPr>
+          <w:b/>
+          <w:bCs/>
+        </w:rPr>
+        <w:t xml:space="preserve">ai_calls</w:t>
+      </w:r>
+      <w:r>
+        <w:t xml:space="preserve"> </w:t>
+      </w:r>
+      <w:r>
+        <w:t xml:space="preserve">(governed-AI audit) — id, prompt_key, purpose, actor_id, model, mode (live / stub), input_tokens, output_tokens, latency_ms, status, preview, created_at. Every AI call is logged for usage/latency/cost governance.</w:t>
+      </w:r>
+    </w:p>
+    <w:bookmarkEnd w:id="158"/>
+    <w:bookmarkStart w:id="159" w:name="organization-schema-shared_organization"/>
+    <w:p>
+      <w:pPr>
+        <w:pStyle w:val="Heading2"/>
+      </w:pPr>
+      <w:r>
+        <w:t xml:space="preserve">17.16 organization (schema:</w:t>
+      </w:r>
+      <w:r>
+        <w:t xml:space="preserve"> </w:t>
+      </w:r>
+      <w:r>
+        <w:rPr>
+          <w:rStyle w:val="VerbatimChar"/>
+        </w:rPr>
+        <w:t xml:space="preserve">shared_organization</w:t>
+      </w:r>
+      <w:r>
+        <w:t xml:space="preserve">)</w:t>
+      </w:r>
+    </w:p>
+    <w:p>
+      <w:pPr>
+        <w:pStyle w:val="FirstParagraph"/>
+      </w:pPr>
+      <w:r>
+        <w:rPr>
+          <w:b/>
+          <w:bCs/>
+        </w:rPr>
+        <w:t xml:space="preserve">organizations</w:t>
+      </w:r>
+      <w:r>
+        <w:t xml:space="preserve"> </w:t>
+      </w:r>
+      <w:r>
+        <w:t xml:space="preserve">(soft-delete) — id, tenant_id (unique), name, slug (unique), custom_domain (unique), timezone, branding (JSON), smtp_config (JSON — secrets in vault), security_policy (JSON: password_min_len, mfa_required, session_timeout_min, allowed_login_attempts), feature_overrides (JSON), created_at. Companies and colleges reference an org via</w:t>
+      </w:r>
+      <w:r>
+        <w:t xml:space="preserve"> </w:t>
+      </w:r>
+      <w:r>
+        <w:rPr>
+          <w:rStyle w:val="VerbatimChar"/>
+        </w:rPr>
+        <w:t xml:space="preserve">tenant_id</w:t>
+      </w:r>
+      <w:r>
+        <w:t xml:space="preserve">.</w:t>
+      </w:r>
+    </w:p>
+    <w:p>
+      <w:r>
         <w:pict>
           <v:rect style="width:0;height:1.5pt" o:hralign="center" o:hrstd="t" o:hr="t"/>
         </w:pict>
@@ -21701,8 +24853,8 @@
         <w:t xml:space="preserve">End of document. Prepared for LARE Cloud Solutions - a unit of LARE Consulting &amp; Technology Pvt. Ltd.</w:t>
       </w:r>
     </w:p>
-    <w:bookmarkEnd w:id="131"/>
-    <w:bookmarkEnd w:id="132"/>
+    <w:bookmarkEnd w:id="159"/>
+    <w:bookmarkEnd w:id="160"/>
     <w:sectPr>
       <w:footnotePr>
         <w:numRestart w:val="eachSect"/>

</xml_diff>

<commit_message>
docs: add full API request/response reference (section 18)
Co-Authored-By: Claude Opus 4.8 <noreply@anthropic.com>
</commit_message>
<xml_diff>
--- a/docs/LARE-Documentation.docx
+++ b/docs/LARE-Documentation.docx
@@ -24836,6 +24836,3742 @@
     </w:p>
     <w:p>
       <w:r>
+        <w:br w:type="page"/>
+      </w:r>
+    </w:p>
+    <w:bookmarkEnd w:id="159"/>
+    <w:bookmarkEnd w:id="160"/>
+    <w:bookmarkStart w:id="172" w:name="api-request-response-reference"/>
+    <w:p>
+      <w:pPr>
+        <w:pStyle w:val="Heading1"/>
+      </w:pPr>
+      <w:r>
+        <w:t xml:space="preserve">18. API Request / Response Reference</w:t>
+      </w:r>
+    </w:p>
+    <w:p>
+      <w:pPr>
+        <w:pStyle w:val="FirstParagraph"/>
+      </w:pPr>
+      <w:r>
+        <w:t xml:space="preserve">Every response is the envelope</w:t>
+      </w:r>
+      <w:r>
+        <w:t xml:space="preserve"> </w:t>
+      </w:r>
+      <w:r>
+        <w:rPr>
+          <w:rStyle w:val="VerbatimChar"/>
+        </w:rPr>
+        <w:t xml:space="preserve">{ "data": ..., "meta": {...}, "errors": [...] }</w:t>
+      </w:r>
+      <w:r>
+        <w:t xml:space="preserve">. The client returns</w:t>
+      </w:r>
+      <w:r>
+        <w:t xml:space="preserve"> </w:t>
+      </w:r>
+      <w:r>
+        <w:rPr>
+          <w:rStyle w:val="VerbatimChar"/>
+        </w:rPr>
+        <w:t xml:space="preserve">data</w:t>
+      </w:r>
+      <w:r>
+        <w:t xml:space="preserve"> </w:t>
+      </w:r>
+      <w:r>
+        <w:t xml:space="preserve">on success and throws</w:t>
+      </w:r>
+      <w:r>
+        <w:t xml:space="preserve"> </w:t>
+      </w:r>
+      <w:r>
+        <w:rPr>
+          <w:rStyle w:val="VerbatimChar"/>
+        </w:rPr>
+        <w:t xml:space="preserve">ApiError(code, status, details)</w:t>
+      </w:r>
+      <w:r>
+        <w:t xml:space="preserve"> </w:t>
+      </w:r>
+      <w:r>
+        <w:t xml:space="preserve">on a non-2xx (the first</w:t>
+      </w:r>
+      <w:r>
+        <w:t xml:space="preserve"> </w:t>
+      </w:r>
+      <w:r>
+        <w:rPr>
+          <w:rStyle w:val="VerbatimChar"/>
+        </w:rPr>
+        <w:t xml:space="preserve">errors[]</w:t>
+      </w:r>
+      <w:r>
+        <w:t xml:space="preserve"> </w:t>
+      </w:r>
+      <w:r>
+        <w:t xml:space="preserve">entry). Below,</w:t>
+      </w:r>
+      <w:r>
+        <w:t xml:space="preserve"> </w:t>
+      </w:r>
+      <w:r>
+        <w:rPr>
+          <w:b/>
+          <w:bCs/>
+        </w:rPr>
+        <w:t xml:space="preserve">Request</w:t>
+      </w:r>
+      <w:r>
+        <w:t xml:space="preserve"> </w:t>
+      </w:r>
+      <w:r>
+        <w:t xml:space="preserve">shows the JSON body (for POST/PUT);</w:t>
+      </w:r>
+      <w:r>
+        <w:t xml:space="preserve"> </w:t>
+      </w:r>
+      <w:r>
+        <w:rPr>
+          <w:b/>
+          <w:bCs/>
+        </w:rPr>
+        <w:t xml:space="preserve">Response</w:t>
+      </w:r>
+      <w:r>
+        <w:t xml:space="preserve"> </w:t>
+      </w:r>
+      <w:r>
+        <w:t xml:space="preserve">shows a representative</w:t>
+      </w:r>
+      <w:r>
+        <w:t xml:space="preserve"> </w:t>
+      </w:r>
+      <w:r>
+        <w:rPr>
+          <w:rStyle w:val="VerbatimChar"/>
+        </w:rPr>
+        <w:t xml:space="preserve">data</w:t>
+      </w:r>
+      <w:r>
+        <w:t xml:space="preserve"> </w:t>
+      </w:r>
+      <w:r>
+        <w:t xml:space="preserve">payload (field names are taken from the service models). All authenticated calls send</w:t>
+      </w:r>
+      <w:r>
+        <w:t xml:space="preserve"> </w:t>
+      </w:r>
+      <w:r>
+        <w:rPr>
+          <w:rStyle w:val="VerbatimChar"/>
+        </w:rPr>
+        <w:t xml:space="preserve">Authorization: Bearer &lt;access&gt;</w:t>
+      </w:r>
+      <w:r>
+        <w:t xml:space="preserve">.</w:t>
+      </w:r>
+    </w:p>
+    <w:p>
+      <w:pPr>
+        <w:pStyle w:val="BodyText"/>
+      </w:pPr>
+      <w:r>
+        <w:t xml:space="preserve">Error example (any endpoint):</w:t>
+      </w:r>
+    </w:p>
+    <w:p>
+      <w:pPr>
+        <w:pStyle w:val="SourceCode"/>
+      </w:pPr>
+      <w:r>
+        <w:rPr>
+          <w:rStyle w:val="VerbatimChar"/>
+        </w:rPr>
+        <w:t xml:space="preserve">{ "data": null, "meta": {}, "errors": [ { "code": "forbidden", "message": "Not allowed", "details": {} } ] }</w:t>
+      </w:r>
+    </w:p>
+    <w:bookmarkStart w:id="161" w:name="auth"/>
+    <w:p>
+      <w:pPr>
+        <w:pStyle w:val="Heading2"/>
+      </w:pPr>
+      <w:r>
+        <w:t xml:space="preserve">18.1 Auth</w:t>
+      </w:r>
+    </w:p>
+    <w:p>
+      <w:pPr>
+        <w:pStyle w:val="FirstParagraph"/>
+      </w:pPr>
+      <w:r>
+        <w:rPr>
+          <w:b/>
+          <w:bCs/>
+        </w:rPr>
+        <w:t xml:space="preserve">POST /auth/v1/register</w:t>
+      </w:r>
+    </w:p>
+    <w:p>
+      <w:pPr>
+        <w:pStyle w:val="SourceCode"/>
+      </w:pPr>
+      <w:r>
+        <w:rPr>
+          <w:rStyle w:val="VerbatimChar"/>
+        </w:rPr>
+        <w:t xml:space="preserve">Request:  { "email": "asha@aditya.edu", "password": "StrongP@ss1", "full_name": "Asha Rao" }</w:t>
+      </w:r>
+      <w:r>
+        <w:br/>
+      </w:r>
+      <w:r>
+        <w:rPr>
+          <w:rStyle w:val="VerbatimChar"/>
+        </w:rPr>
+        <w:t xml:space="preserve">Response: { "id": "usr_...", "email": "asha@aditya.edu", "full_name": "Asha Rao", "email_verified": false }</w:t>
+      </w:r>
+    </w:p>
+    <w:p>
+      <w:pPr>
+        <w:pStyle w:val="FirstParagraph"/>
+      </w:pPr>
+      <w:r>
+        <w:rPr>
+          <w:b/>
+          <w:bCs/>
+        </w:rPr>
+        <w:t xml:space="preserve">POST /auth/v1/login</w:t>
+      </w:r>
+    </w:p>
+    <w:p>
+      <w:pPr>
+        <w:pStyle w:val="SourceCode"/>
+      </w:pPr>
+      <w:r>
+        <w:rPr>
+          <w:rStyle w:val="VerbatimChar"/>
+        </w:rPr>
+        <w:t xml:space="preserve">Request:  { "email": "asha@aditya.edu", "password": "StrongP@ss1", "device": "web" }</w:t>
+      </w:r>
+      <w:r>
+        <w:br/>
+      </w:r>
+      <w:r>
+        <w:rPr>
+          <w:rStyle w:val="VerbatimChar"/>
+        </w:rPr>
+        <w:t xml:space="preserve">Response: { "access_token": "eyJ...", "refresh_token": "eyJ...", "token_type": "Bearer", "expires_in": 900 }</w:t>
+      </w:r>
+    </w:p>
+    <w:p>
+      <w:pPr>
+        <w:pStyle w:val="FirstParagraph"/>
+      </w:pPr>
+      <w:r>
+        <w:rPr>
+          <w:b/>
+          <w:bCs/>
+        </w:rPr>
+        <w:t xml:space="preserve">POST /auth/v1/refresh</w:t>
+      </w:r>
+      <w:r>
+        <w:t xml:space="preserve"> </w:t>
+      </w:r>
+      <w:r>
+        <w:t xml:space="preserve">—</w:t>
+      </w:r>
+      <w:r>
+        <w:t xml:space="preserve"> </w:t>
+      </w:r>
+      <w:r>
+        <w:rPr>
+          <w:rStyle w:val="VerbatimChar"/>
+        </w:rPr>
+        <w:t xml:space="preserve">{ "refresh_token": "eyJ..." }</w:t>
+      </w:r>
+      <w:r>
+        <w:t xml:space="preserve"> </w:t>
+      </w:r>
+      <w:r>
+        <w:t xml:space="preserve">→</w:t>
+      </w:r>
+      <w:r>
+        <w:t xml:space="preserve"> </w:t>
+      </w:r>
+      <w:r>
+        <w:rPr>
+          <w:rStyle w:val="VerbatimChar"/>
+        </w:rPr>
+        <w:t xml:space="preserve">{ "access_token": "eyJ...", "refresh_token": "eyJ..." }</w:t>
+      </w:r>
+      <w:r>
+        <w:t xml:space="preserve">.</w:t>
+      </w:r>
+      <w:r>
+        <w:t xml:space="preserve"> </w:t>
+      </w:r>
+      <w:r>
+        <w:rPr>
+          <w:b/>
+          <w:bCs/>
+        </w:rPr>
+        <w:t xml:space="preserve">POST /auth/v1/otp/request</w:t>
+      </w:r>
+      <w:r>
+        <w:t xml:space="preserve"> </w:t>
+      </w:r>
+      <w:r>
+        <w:t xml:space="preserve">—</w:t>
+      </w:r>
+      <w:r>
+        <w:t xml:space="preserve"> </w:t>
+      </w:r>
+      <w:r>
+        <w:rPr>
+          <w:rStyle w:val="VerbatimChar"/>
+        </w:rPr>
+        <w:t xml:space="preserve">{ "email": "..." }</w:t>
+      </w:r>
+      <w:r>
+        <w:t xml:space="preserve"> </w:t>
+      </w:r>
+      <w:r>
+        <w:t xml:space="preserve">→</w:t>
+      </w:r>
+      <w:r>
+        <w:t xml:space="preserve"> </w:t>
+      </w:r>
+      <w:r>
+        <w:rPr>
+          <w:rStyle w:val="VerbatimChar"/>
+        </w:rPr>
+        <w:t xml:space="preserve">{ "sent": true }</w:t>
+      </w:r>
+      <w:r>
+        <w:t xml:space="preserve">.</w:t>
+      </w:r>
+      <w:r>
+        <w:t xml:space="preserve"> </w:t>
+      </w:r>
+      <w:r>
+        <w:rPr>
+          <w:b/>
+          <w:bCs/>
+        </w:rPr>
+        <w:t xml:space="preserve">POST /auth/v1/otp/verify</w:t>
+      </w:r>
+      <w:r>
+        <w:t xml:space="preserve"> </w:t>
+      </w:r>
+      <w:r>
+        <w:t xml:space="preserve">—</w:t>
+      </w:r>
+      <w:r>
+        <w:t xml:space="preserve"> </w:t>
+      </w:r>
+      <w:r>
+        <w:rPr>
+          <w:rStyle w:val="VerbatimChar"/>
+        </w:rPr>
+        <w:t xml:space="preserve">{ "email","code","device" }</w:t>
+      </w:r>
+      <w:r>
+        <w:t xml:space="preserve"> </w:t>
+      </w:r>
+      <w:r>
+        <w:t xml:space="preserve">→ tokens.</w:t>
+      </w:r>
+      <w:r>
+        <w:t xml:space="preserve"> </w:t>
+      </w:r>
+      <w:r>
+        <w:rPr>
+          <w:b/>
+          <w:bCs/>
+        </w:rPr>
+        <w:t xml:space="preserve">GET /auth/v1/me</w:t>
+      </w:r>
+      <w:r>
+        <w:t xml:space="preserve"> </w:t>
+      </w:r>
+      <w:r>
+        <w:t xml:space="preserve">→</w:t>
+      </w:r>
+      <w:r>
+        <w:t xml:space="preserve"> </w:t>
+      </w:r>
+      <w:r>
+        <w:rPr>
+          <w:rStyle w:val="VerbatimChar"/>
+        </w:rPr>
+        <w:t xml:space="preserve">{ "id","email","full_name","roles":["student"],"tenant_id":"lare","email_verified":true }</w:t>
+      </w:r>
+      <w:r>
+        <w:t xml:space="preserve">.</w:t>
+      </w:r>
+    </w:p>
+    <w:bookmarkEnd w:id="161"/>
+    <w:bookmarkStart w:id="162" w:name="lare-learn-dashboard-data"/>
+    <w:p>
+      <w:pPr>
+        <w:pStyle w:val="Heading2"/>
+      </w:pPr>
+      <w:r>
+        <w:t xml:space="preserve">18.2 LARE Learn — dashboard data</w:t>
+      </w:r>
+    </w:p>
+    <w:p>
+      <w:pPr>
+        <w:pStyle w:val="FirstParagraph"/>
+      </w:pPr>
+      <w:r>
+        <w:rPr>
+          <w:b/>
+          <w:bCs/>
+        </w:rPr>
+        <w:t xml:space="preserve">GET /lms/v1/gamification/{learnerId}</w:t>
+      </w:r>
+    </w:p>
+    <w:p>
+      <w:pPr>
+        <w:pStyle w:val="SourceCode"/>
+      </w:pPr>
+      <w:r>
+        <w:rPr>
+          <w:rStyle w:val="VerbatimChar"/>
+        </w:rPr>
+        <w:t xml:space="preserve">Response: { "learner_id":"lrn_1","total_xp":1840,"level":3,"next_level_at":2000,</w:t>
+      </w:r>
+      <w:r>
+        <w:br/>
+      </w:r>
+      <w:r>
+        <w:rPr>
+          <w:rStyle w:val="VerbatimChar"/>
+        </w:rPr>
+        <w:t xml:space="preserve">            "xp_to_next":160,"badges":["streak_7","dsa_i"],"streak":{"current":6,"longest":11} }</w:t>
+      </w:r>
+    </w:p>
+    <w:p>
+      <w:pPr>
+        <w:pStyle w:val="FirstParagraph"/>
+      </w:pPr>
+      <w:r>
+        <w:rPr>
+          <w:b/>
+          <w:bCs/>
+        </w:rPr>
+        <w:t xml:space="preserve">GET /lms/v1/gamification/leaderboard/global</w:t>
+      </w:r>
+      <w:r>
+        <w:t xml:space="preserve"> </w:t>
+      </w:r>
+      <w:r>
+        <w:t xml:space="preserve">→</w:t>
+      </w:r>
+      <w:r>
+        <w:t xml:space="preserve"> </w:t>
+      </w:r>
+      <w:r>
+        <w:rPr>
+          <w:rStyle w:val="VerbatimChar"/>
+        </w:rPr>
+        <w:t xml:space="preserve">[ { "rank":1,"display_name":"Ravi K.","total_xp":6120,"level":5 }, ... ]</w:t>
+      </w:r>
+      <w:r>
+        <w:t xml:space="preserve">.</w:t>
+      </w:r>
+      <w:r>
+        <w:t xml:space="preserve"> </w:t>
+      </w:r>
+      <w:r>
+        <w:rPr>
+          <w:b/>
+          <w:bCs/>
+        </w:rPr>
+        <w:t xml:space="preserve">GET /lms/v1/progress/{learnerId}/scorecard</w:t>
+      </w:r>
+      <w:r>
+        <w:t xml:space="preserve"> </w:t>
+      </w:r>
+      <w:r>
+        <w:t xml:space="preserve">→</w:t>
+      </w:r>
+      <w:r>
+        <w:t xml:space="preserve"> </w:t>
+      </w:r>
+      <w:r>
+        <w:rPr>
+          <w:rStyle w:val="VerbatimChar"/>
+        </w:rPr>
+        <w:t xml:space="preserve">[ { "year_no":2,"communication":72,"coding":84,"aptitude":78,"project":65 } ]</w:t>
+      </w:r>
+      <w:r>
+        <w:t xml:space="preserve">.</w:t>
+      </w:r>
+      <w:r>
+        <w:t xml:space="preserve"> </w:t>
+      </w:r>
+      <w:r>
+        <w:rPr>
+          <w:b/>
+          <w:bCs/>
+        </w:rPr>
+        <w:t xml:space="preserve">GET /lms/v1/progress/{learnerId}</w:t>
+      </w:r>
+      <w:r>
+        <w:t xml:space="preserve"> </w:t>
+      </w:r>
+      <w:r>
+        <w:t xml:space="preserve">→</w:t>
+      </w:r>
+      <w:r>
+        <w:t xml:space="preserve"> </w:t>
+      </w:r>
+      <w:r>
+        <w:rPr>
+          <w:rStyle w:val="VerbatimChar"/>
+        </w:rPr>
+        <w:t xml:space="preserve">{ "modules":[{ "module_id":"...","completion_pct":80 }],"year_status":{...} }</w:t>
+      </w:r>
+      <w:r>
+        <w:t xml:space="preserve">.</w:t>
+      </w:r>
+    </w:p>
+    <w:bookmarkEnd w:id="162"/>
+    <w:bookmarkStart w:id="163" w:name="lare-learn-curriculum-content"/>
+    <w:p>
+      <w:pPr>
+        <w:pStyle w:val="Heading2"/>
+      </w:pPr>
+      <w:r>
+        <w:t xml:space="preserve">18.3 LARE Learn — curriculum &amp; content</w:t>
+      </w:r>
+    </w:p>
+    <w:p>
+      <w:pPr>
+        <w:pStyle w:val="FirstParagraph"/>
+      </w:pPr>
+      <w:r>
+        <w:rPr>
+          <w:b/>
+          <w:bCs/>
+        </w:rPr>
+        <w:t xml:space="preserve">GET /lms/v1/curricula</w:t>
+      </w:r>
+      <w:r>
+        <w:t xml:space="preserve"> </w:t>
+      </w:r>
+      <w:r>
+        <w:t xml:space="preserve">→</w:t>
+      </w:r>
+      <w:r>
+        <w:t xml:space="preserve"> </w:t>
+      </w:r>
+      <w:r>
+        <w:rPr>
+          <w:rStyle w:val="VerbatimChar"/>
+        </w:rPr>
+        <w:t xml:space="preserve">[ { "id":"cur_1","name":"LARE 4-Year Programme","version":1,"status":"published" } ]</w:t>
+      </w:r>
+      <w:r>
+        <w:t xml:space="preserve">.</w:t>
+      </w:r>
+      <w:r>
+        <w:t xml:space="preserve"> </w:t>
+      </w:r>
+      <w:r>
+        <w:rPr>
+          <w:b/>
+          <w:bCs/>
+        </w:rPr>
+        <w:t xml:space="preserve">GET /lms/v1/curricula/{id}/tree</w:t>
+      </w:r>
+      <w:r>
+        <w:t xml:space="preserve"> </w:t>
+      </w:r>
+      <w:r>
+        <w:t xml:space="preserve">→ nested</w:t>
+      </w:r>
+      <w:r>
+        <w:t xml:space="preserve"> </w:t>
+      </w:r>
+      <w:r>
+        <w:rPr>
+          <w:rStyle w:val="VerbatimChar"/>
+        </w:rPr>
+        <w:t xml:space="preserve">{ "name","status","years":[ { "year_no","theme","modules":[ { "title","branch_scope","lessons":[ { "id","title","objectives":[...] } ] } ] } ] }</w:t>
+      </w:r>
+      <w:r>
+        <w:t xml:space="preserve">.</w:t>
+      </w:r>
+      <w:r>
+        <w:t xml:space="preserve"> </w:t>
+      </w:r>
+      <w:r>
+        <w:rPr>
+          <w:b/>
+          <w:bCs/>
+        </w:rPr>
+        <w:t xml:space="preserve">GET /lms/v1/content/playlist?learner_id=…</w:t>
+      </w:r>
+      <w:r>
+        <w:t xml:space="preserve"> </w:t>
+      </w:r>
+      <w:r>
+        <w:t xml:space="preserve">→</w:t>
+      </w:r>
+      <w:r>
+        <w:t xml:space="preserve"> </w:t>
+      </w:r>
+      <w:r>
+        <w:rPr>
+          <w:rStyle w:val="VerbatimChar"/>
+        </w:rPr>
+        <w:t xml:space="preserve">[ { "id","title","type":"video","duration_sec":600,"difficulty":"easy","unlocked":true,"status":"in_progress" } ]</w:t>
+      </w:r>
+      <w:r>
+        <w:t xml:space="preserve">.</w:t>
+      </w:r>
+      <w:r>
+        <w:t xml:space="preserve"> </w:t>
+      </w:r>
+      <w:r>
+        <w:rPr>
+          <w:b/>
+          <w:bCs/>
+        </w:rPr>
+        <w:t xml:space="preserve">POST /lms/v1/content/{id}/progress</w:t>
+      </w:r>
+      <w:r>
+        <w:t xml:space="preserve"> </w:t>
+      </w:r>
+      <w:r>
+        <w:t xml:space="preserve">—</w:t>
+      </w:r>
+      <w:r>
+        <w:t xml:space="preserve"> </w:t>
+      </w:r>
+      <w:r>
+        <w:rPr>
+          <w:rStyle w:val="VerbatimChar"/>
+        </w:rPr>
+        <w:t xml:space="preserve">{ "learner_id","position_sec":320,"completed":false }</w:t>
+      </w:r>
+      <w:r>
+        <w:t xml:space="preserve"> </w:t>
+      </w:r>
+      <w:r>
+        <w:t xml:space="preserve">→</w:t>
+      </w:r>
+      <w:r>
+        <w:t xml:space="preserve"> </w:t>
+      </w:r>
+      <w:r>
+        <w:rPr>
+          <w:rStyle w:val="VerbatimChar"/>
+        </w:rPr>
+        <w:t xml:space="preserve">{ "status":"in_progress","position_sec":320 }</w:t>
+      </w:r>
+      <w:r>
+        <w:t xml:space="preserve">.</w:t>
+      </w:r>
+    </w:p>
+    <w:bookmarkEnd w:id="163"/>
+    <w:bookmarkStart w:id="164" w:name="lare-learn-assessments-take-flow"/>
+    <w:p>
+      <w:pPr>
+        <w:pStyle w:val="Heading2"/>
+      </w:pPr>
+      <w:r>
+        <w:t xml:space="preserve">18.4 LARE Learn — assessments &amp; take-flow</w:t>
+      </w:r>
+    </w:p>
+    <w:p>
+      <w:pPr>
+        <w:pStyle w:val="FirstParagraph"/>
+      </w:pPr>
+      <w:r>
+        <w:rPr>
+          <w:b/>
+          <w:bCs/>
+        </w:rPr>
+        <w:t xml:space="preserve">GET /lms/v1/assessments</w:t>
+      </w:r>
+      <w:r>
+        <w:t xml:space="preserve"> </w:t>
+      </w:r>
+      <w:r>
+        <w:t xml:space="preserve">→</w:t>
+      </w:r>
+      <w:r>
+        <w:t xml:space="preserve"> </w:t>
+      </w:r>
+      <w:r>
+        <w:rPr>
+          <w:rStyle w:val="VerbatimChar"/>
+        </w:rPr>
+        <w:t xml:space="preserve">[ { "id","title","type":"quiz","passing_pct":60,"time_limit_min":20,"proctored":true,"shuffle":true } ]</w:t>
+      </w:r>
+      <w:r>
+        <w:t xml:space="preserve">.</w:t>
+      </w:r>
+      <w:r>
+        <w:t xml:space="preserve"> </w:t>
+      </w:r>
+      <w:r>
+        <w:rPr>
+          <w:b/>
+          <w:bCs/>
+        </w:rPr>
+        <w:t xml:space="preserve">GET /lms/v1/assessments/{aid}</w:t>
+      </w:r>
+      <w:r>
+        <w:t xml:space="preserve"> </w:t>
+      </w:r>
+      <w:r>
+        <w:t xml:space="preserve">→</w:t>
+      </w:r>
+      <w:r>
+        <w:t xml:space="preserve"> </w:t>
+      </w:r>
+      <w:r>
+        <w:rPr>
+          <w:rStyle w:val="VerbatimChar"/>
+        </w:rPr>
+        <w:t xml:space="preserve">{ "id","title","pass_pct":60,"duration_min":20,"items":[ { "id","type":"mcq","stem","weight":1,"options":[{"id":"a","text":"O(n)"}] } ] }</w:t>
+      </w:r>
+      <w:r>
+        <w:t xml:space="preserve"> </w:t>
+      </w:r>
+      <w:r>
+        <w:t xml:space="preserve">(answer keys never included).</w:t>
+      </w:r>
+      <w:r>
+        <w:t xml:space="preserve"> </w:t>
+      </w:r>
+      <w:r>
+        <w:rPr>
+          <w:b/>
+          <w:bCs/>
+        </w:rPr>
+        <w:t xml:space="preserve">POST /lms/v1/assessments/{aid}/attempts</w:t>
+      </w:r>
+      <w:r>
+        <w:t xml:space="preserve"> </w:t>
+      </w:r>
+      <w:r>
+        <w:t xml:space="preserve">—</w:t>
+      </w:r>
+      <w:r>
+        <w:t xml:space="preserve"> </w:t>
+      </w:r>
+      <w:r>
+        <w:rPr>
+          <w:rStyle w:val="VerbatimChar"/>
+        </w:rPr>
+        <w:t xml:space="preserve">{ "learner_id":"lrn_1" }</w:t>
+      </w:r>
+      <w:r>
+        <w:t xml:space="preserve"> </w:t>
+      </w:r>
+      <w:r>
+        <w:t xml:space="preserve">→</w:t>
+      </w:r>
+      <w:r>
+        <w:t xml:space="preserve"> </w:t>
+      </w:r>
+      <w:r>
+        <w:rPr>
+          <w:rStyle w:val="VerbatimChar"/>
+        </w:rPr>
+        <w:t xml:space="preserve">{ "attempt_id":"att_1","status":"in_progress","started_at":"..." }</w:t>
+      </w:r>
+      <w:r>
+        <w:t xml:space="preserve">.</w:t>
+      </w:r>
+      <w:r>
+        <w:t xml:space="preserve"> </w:t>
+      </w:r>
+      <w:r>
+        <w:rPr>
+          <w:b/>
+          <w:bCs/>
+        </w:rPr>
+        <w:t xml:space="preserve">POST /lms/v1/attempts/{attemptId}/submit</w:t>
+      </w:r>
+      <w:r>
+        <w:t xml:space="preserve"> </w:t>
+      </w:r>
+      <w:r>
+        <w:t xml:space="preserve">—</w:t>
+      </w:r>
+      <w:r>
+        <w:t xml:space="preserve"> </w:t>
+      </w:r>
+      <w:r>
+        <w:rPr>
+          <w:rStyle w:val="VerbatimChar"/>
+        </w:rPr>
+        <w:t xml:space="preserve">{ "answers":{ "item_1":{"option":"b"} } }</w:t>
+      </w:r>
+      <w:r>
+        <w:t xml:space="preserve"> </w:t>
+      </w:r>
+      <w:r>
+        <w:t xml:space="preserve">→</w:t>
+      </w:r>
+      <w:r>
+        <w:t xml:space="preserve"> </w:t>
+      </w:r>
+      <w:r>
+        <w:rPr>
+          <w:rStyle w:val="VerbatimChar"/>
+        </w:rPr>
+        <w:t xml:space="preserve">{ "score":8,"max_score":10,"percentage":80,"passed":true }</w:t>
+      </w:r>
+      <w:r>
+        <w:t xml:space="preserve">.</w:t>
+      </w:r>
+    </w:p>
+    <w:bookmarkEnd w:id="164"/>
+    <w:bookmarkStart w:id="165" w:name="X8198a7719c14f04d8b64d3cd4af01157c33957c"/>
+    <w:p>
+      <w:pPr>
+        <w:pStyle w:val="Heading2"/>
+      </w:pPr>
+      <w:r>
+        <w:t xml:space="preserve">18.5 LARE Learn — Cognitive Twin, coach, reviews, careers</w:t>
+      </w:r>
+    </w:p>
+    <w:p>
+      <w:pPr>
+        <w:pStyle w:val="FirstParagraph"/>
+      </w:pPr>
+      <w:r>
+        <w:rPr>
+          <w:b/>
+          <w:bCs/>
+        </w:rPr>
+        <w:t xml:space="preserve">GET /lms/v1/assessments/twin/{learnerId}</w:t>
+      </w:r>
+      <w:r>
+        <w:t xml:space="preserve"> </w:t>
+      </w:r>
+      <w:r>
+        <w:t xml:space="preserve">→</w:t>
+      </w:r>
+      <w:r>
+        <w:t xml:space="preserve"> </w:t>
+      </w:r>
+      <w:r>
+        <w:rPr>
+          <w:rStyle w:val="VerbatimChar"/>
+        </w:rPr>
+        <w:t xml:space="preserve">{ "learner_id","dimensions":{"coding":72,"aptitude":61,"communication":55,"project":48},"weakest":"project","sources":{"written":..,"coding":..} }</w:t>
+      </w:r>
+      <w:r>
+        <w:t xml:space="preserve">.</w:t>
+      </w:r>
+      <w:r>
+        <w:t xml:space="preserve"> </w:t>
+      </w:r>
+      <w:r>
+        <w:rPr>
+          <w:b/>
+          <w:bCs/>
+        </w:rPr>
+        <w:t xml:space="preserve">GET /lms/v1/assessments/coach/{learnerId}?force=1</w:t>
+      </w:r>
+      <w:r>
+        <w:t xml:space="preserve"> </w:t>
+      </w:r>
+      <w:r>
+        <w:t xml:space="preserve">→</w:t>
+      </w:r>
+      <w:r>
+        <w:t xml:space="preserve"> </w:t>
+      </w:r>
+      <w:r>
+        <w:rPr>
+          <w:rStyle w:val="VerbatimChar"/>
+        </w:rPr>
+        <w:t xml:space="preserve">{ "weakest":"aptitude","plan":{"days":[{"day":"Day 1","focus":"...","tasks":[...]}]},"completed_days":["Day 1"] }</w:t>
+      </w:r>
+      <w:r>
+        <w:t xml:space="preserve">.</w:t>
+      </w:r>
+      <w:r>
+        <w:t xml:space="preserve"> </w:t>
+      </w:r>
+      <w:r>
+        <w:rPr>
+          <w:b/>
+          <w:bCs/>
+        </w:rPr>
+        <w:t xml:space="preserve">POST /lms/v1/assessments/coach/{learnerId}/progress</w:t>
+      </w:r>
+      <w:r>
+        <w:t xml:space="preserve"> </w:t>
+      </w:r>
+      <w:r>
+        <w:t xml:space="preserve">—</w:t>
+      </w:r>
+      <w:r>
+        <w:t xml:space="preserve"> </w:t>
+      </w:r>
+      <w:r>
+        <w:rPr>
+          <w:rStyle w:val="VerbatimChar"/>
+        </w:rPr>
+        <w:t xml:space="preserve">{ "day":"Day 1","done":true }</w:t>
+      </w:r>
+      <w:r>
+        <w:t xml:space="preserve"> </w:t>
+      </w:r>
+      <w:r>
+        <w:t xml:space="preserve">→</w:t>
+      </w:r>
+      <w:r>
+        <w:t xml:space="preserve"> </w:t>
+      </w:r>
+      <w:r>
+        <w:rPr>
+          <w:rStyle w:val="VerbatimChar"/>
+        </w:rPr>
+        <w:t xml:space="preserve">{ "completed_days":["Day 1"] }</w:t>
+      </w:r>
+      <w:r>
+        <w:t xml:space="preserve">.</w:t>
+      </w:r>
+      <w:r>
+        <w:t xml:space="preserve"> </w:t>
+      </w:r>
+      <w:r>
+        <w:rPr>
+          <w:b/>
+          <w:bCs/>
+        </w:rPr>
+        <w:t xml:space="preserve">POST /lms/v1/assessments/nudge/{learnerId}</w:t>
+      </w:r>
+      <w:r>
+        <w:t xml:space="preserve"> </w:t>
+      </w:r>
+      <w:r>
+        <w:t xml:space="preserve">→</w:t>
+      </w:r>
+      <w:r>
+        <w:t xml:space="preserve"> </w:t>
+      </w:r>
+      <w:r>
+        <w:rPr>
+          <w:rStyle w:val="VerbatimChar"/>
+        </w:rPr>
+        <w:t xml:space="preserve">{ "sent":true,"channel":["inapp","email"],"weakest":"aptitude" }</w:t>
+      </w:r>
+      <w:r>
+        <w:t xml:space="preserve">.</w:t>
+      </w:r>
+      <w:r>
+        <w:t xml:space="preserve"> </w:t>
+      </w:r>
+      <w:r>
+        <w:rPr>
+          <w:b/>
+          <w:bCs/>
+        </w:rPr>
+        <w:t xml:space="preserve">GET /lms/v1/reviews/{learnerId}</w:t>
+      </w:r>
+      <w:r>
+        <w:t xml:space="preserve"> </w:t>
+      </w:r>
+      <w:r>
+        <w:t xml:space="preserve">→</w:t>
+      </w:r>
+      <w:r>
+        <w:t xml:space="preserve"> </w:t>
+      </w:r>
+      <w:r>
+        <w:rPr>
+          <w:rStyle w:val="VerbatimChar"/>
+        </w:rPr>
+        <w:t xml:space="preserve">[ { "id","skill":"SQL Joins","source":"written","due_at":"...","interval_days":3,"last_mastery":40 } ]</w:t>
+      </w:r>
+      <w:r>
+        <w:t xml:space="preserve">.</w:t>
+      </w:r>
+      <w:r>
+        <w:t xml:space="preserve"> </w:t>
+      </w:r>
+      <w:r>
+        <w:rPr>
+          <w:b/>
+          <w:bCs/>
+        </w:rPr>
+        <w:t xml:space="preserve">POST /lms/v1/reviews/{learnerId}/review</w:t>
+      </w:r>
+      <w:r>
+        <w:t xml:space="preserve"> </w:t>
+      </w:r>
+      <w:r>
+        <w:t xml:space="preserve">—</w:t>
+      </w:r>
+      <w:r>
+        <w:t xml:space="preserve"> </w:t>
+      </w:r>
+      <w:r>
+        <w:rPr>
+          <w:rStyle w:val="VerbatimChar"/>
+        </w:rPr>
+        <w:t xml:space="preserve">{ "skill":"SQL Joins","outcome":"good" }</w:t>
+      </w:r>
+      <w:r>
+        <w:t xml:space="preserve"> </w:t>
+      </w:r>
+      <w:r>
+        <w:t xml:space="preserve">→</w:t>
+      </w:r>
+      <w:r>
+        <w:t xml:space="preserve"> </w:t>
+      </w:r>
+      <w:r>
+        <w:rPr>
+          <w:rStyle w:val="VerbatimChar"/>
+        </w:rPr>
+        <w:t xml:space="preserve">{ "skill":"SQL Joins","interval_days":7,"ease":2.2,"due_at":"..." }</w:t>
+      </w:r>
+      <w:r>
+        <w:t xml:space="preserve">.</w:t>
+      </w:r>
+      <w:r>
+        <w:t xml:space="preserve"> </w:t>
+      </w:r>
+      <w:r>
+        <w:rPr>
+          <w:b/>
+          <w:bCs/>
+        </w:rPr>
+        <w:t xml:space="preserve">GET /lms/v1/careers</w:t>
+      </w:r>
+      <w:r>
+        <w:t xml:space="preserve"> </w:t>
+      </w:r>
+      <w:r>
+        <w:t xml:space="preserve">→</w:t>
+      </w:r>
+      <w:r>
+        <w:t xml:space="preserve"> </w:t>
+      </w:r>
+      <w:r>
+        <w:rPr>
+          <w:rStyle w:val="VerbatimChar"/>
+        </w:rPr>
+        <w:t xml:space="preserve">[ { "id","title":"Data Analyst","required_skills":[{"name":"SQL","weight":2}] } ]</w:t>
+      </w:r>
+      <w:r>
+        <w:t xml:space="preserve">.</w:t>
+      </w:r>
+      <w:r>
+        <w:t xml:space="preserve"> </w:t>
+      </w:r>
+      <w:r>
+        <w:rPr>
+          <w:b/>
+          <w:bCs/>
+        </w:rPr>
+        <w:t xml:space="preserve">GET /lms/v1/careers/readiness/{learnerId}</w:t>
+      </w:r>
+      <w:r>
+        <w:t xml:space="preserve"> </w:t>
+      </w:r>
+      <w:r>
+        <w:t xml:space="preserve">→</w:t>
+      </w:r>
+      <w:r>
+        <w:t xml:space="preserve"> </w:t>
+      </w:r>
+      <w:r>
+        <w:rPr>
+          <w:rStyle w:val="VerbatimChar"/>
+        </w:rPr>
+        <w:t xml:space="preserve">[ { "role":"Data Analyst","readiness":68,"gaps":["Statistics"] } ]</w:t>
+      </w:r>
+      <w:r>
+        <w:t xml:space="preserve">.</w:t>
+      </w:r>
+    </w:p>
+    <w:bookmarkEnd w:id="165"/>
+    <w:bookmarkStart w:id="166" w:name="Xadcfb3da817d87aac91faf347f8a599168025d8"/>
+    <w:p>
+      <w:pPr>
+        <w:pStyle w:val="Heading2"/>
+      </w:pPr>
+      <w:r>
+        <w:t xml:space="preserve">18.6 LARE Learn — practice, drill, worlds, mesh, lessons, wallet</w:t>
+      </w:r>
+    </w:p>
+    <w:p>
+      <w:pPr>
+        <w:pStyle w:val="FirstParagraph"/>
+      </w:pPr>
+      <w:r>
+        <w:rPr>
+          <w:b/>
+          <w:bCs/>
+        </w:rPr>
+        <w:t xml:space="preserve">GET /lms/v1/practice/problems?skill=Arrays</w:t>
+      </w:r>
+      <w:r>
+        <w:t xml:space="preserve"> </w:t>
+      </w:r>
+      <w:r>
+        <w:t xml:space="preserve">→</w:t>
+      </w:r>
+      <w:r>
+        <w:t xml:space="preserve"> </w:t>
+      </w:r>
+      <w:r>
+        <w:rPr>
+          <w:rStyle w:val="VerbatimChar"/>
+        </w:rPr>
+        <w:t xml:space="preserve">[ { "id","title","skill":"Arrays","difficulty":"easy","languages":["python","java"] } ]</w:t>
+      </w:r>
+      <w:r>
+        <w:t xml:space="preserve">.</w:t>
+      </w:r>
+      <w:r>
+        <w:t xml:space="preserve"> </w:t>
+      </w:r>
+      <w:r>
+        <w:rPr>
+          <w:b/>
+          <w:bCs/>
+        </w:rPr>
+        <w:t xml:space="preserve">POST /lms/v1/practice/session</w:t>
+      </w:r>
+      <w:r>
+        <w:t xml:space="preserve"> </w:t>
+      </w:r>
+      <w:r>
+        <w:t xml:space="preserve">—</w:t>
+      </w:r>
+      <w:r>
+        <w:t xml:space="preserve"> </w:t>
+      </w:r>
+      <w:r>
+        <w:rPr>
+          <w:rStyle w:val="VerbatimChar"/>
+        </w:rPr>
+        <w:t xml:space="preserve">{ "problem_id","language":"python" }</w:t>
+      </w:r>
+      <w:r>
+        <w:t xml:space="preserve"> </w:t>
+      </w:r>
+      <w:r>
+        <w:t xml:space="preserve">→</w:t>
+      </w:r>
+      <w:r>
+        <w:t xml:space="preserve"> </w:t>
+      </w:r>
+      <w:r>
+        <w:rPr>
+          <w:rStyle w:val="VerbatimChar"/>
+        </w:rPr>
+        <w:t xml:space="preserve">{ "session_id","starter":"...","sample_cases":[{"input","expected"}] }</w:t>
+      </w:r>
+      <w:r>
+        <w:t xml:space="preserve">.</w:t>
+      </w:r>
+      <w:r>
+        <w:t xml:space="preserve"> </w:t>
+      </w:r>
+      <w:r>
+        <w:rPr>
+          <w:b/>
+          <w:bCs/>
+        </w:rPr>
+        <w:t xml:space="preserve">POST /lms/v1/practice/{sid}/run</w:t>
+      </w:r>
+      <w:r>
+        <w:t xml:space="preserve"> </w:t>
+      </w:r>
+      <w:r>
+        <w:t xml:space="preserve">—</w:t>
+      </w:r>
+      <w:r>
+        <w:t xml:space="preserve"> </w:t>
+      </w:r>
+      <w:r>
+        <w:rPr>
+          <w:rStyle w:val="VerbatimChar"/>
+        </w:rPr>
+        <w:t xml:space="preserve">{ "code":"..." }</w:t>
+      </w:r>
+      <w:r>
+        <w:t xml:space="preserve"> </w:t>
+      </w:r>
+      <w:r>
+        <w:t xml:space="preserve">→</w:t>
+      </w:r>
+      <w:r>
+        <w:t xml:space="preserve"> </w:t>
+      </w:r>
+      <w:r>
+        <w:rPr>
+          <w:rStyle w:val="VerbatimChar"/>
+        </w:rPr>
+        <w:t xml:space="preserve">{ "results":[{"input","expected","got","passed":true}] }</w:t>
+      </w:r>
+      <w:r>
+        <w:t xml:space="preserve">.</w:t>
+      </w:r>
+      <w:r>
+        <w:t xml:space="preserve"> </w:t>
+      </w:r>
+      <w:r>
+        <w:rPr>
+          <w:b/>
+          <w:bCs/>
+        </w:rPr>
+        <w:t xml:space="preserve">POST /lms/v1/practice/{sid}/submit</w:t>
+      </w:r>
+      <w:r>
+        <w:t xml:space="preserve"> </w:t>
+      </w:r>
+      <w:r>
+        <w:t xml:space="preserve">—</w:t>
+      </w:r>
+      <w:r>
+        <w:t xml:space="preserve"> </w:t>
+      </w:r>
+      <w:r>
+        <w:rPr>
+          <w:rStyle w:val="VerbatimChar"/>
+        </w:rPr>
+        <w:t xml:space="preserve">{ "code":"..." }</w:t>
+      </w:r>
+      <w:r>
+        <w:t xml:space="preserve"> </w:t>
+      </w:r>
+      <w:r>
+        <w:t xml:space="preserve">→</w:t>
+      </w:r>
+      <w:r>
+        <w:t xml:space="preserve"> </w:t>
+      </w:r>
+      <w:r>
+        <w:rPr>
+          <w:rStyle w:val="VerbatimChar"/>
+        </w:rPr>
+        <w:t xml:space="preserve">{ "score":100,"cases_passed":8,"total_cases":8 }</w:t>
+      </w:r>
+      <w:r>
+        <w:t xml:space="preserve">.</w:t>
+      </w:r>
+      <w:r>
+        <w:t xml:space="preserve"> </w:t>
+      </w:r>
+      <w:r>
+        <w:rPr>
+          <w:b/>
+          <w:bCs/>
+        </w:rPr>
+        <w:t xml:space="preserve">GET /lms/v1/practice/skills/{learnerId}</w:t>
+      </w:r>
+      <w:r>
+        <w:t xml:space="preserve"> </w:t>
+      </w:r>
+      <w:r>
+        <w:t xml:space="preserve">→</w:t>
+      </w:r>
+      <w:r>
+        <w:t xml:space="preserve"> </w:t>
+      </w:r>
+      <w:r>
+        <w:rPr>
+          <w:rStyle w:val="VerbatimChar"/>
+        </w:rPr>
+        <w:t xml:space="preserve">[ { "skill":"Arrays","mastery":74,"solved":6 } ]</w:t>
+      </w:r>
+      <w:r>
+        <w:t xml:space="preserve">.</w:t>
+      </w:r>
+      <w:r>
+        <w:t xml:space="preserve"> </w:t>
+      </w:r>
+      <w:r>
+        <w:rPr>
+          <w:b/>
+          <w:bCs/>
+        </w:rPr>
+        <w:t xml:space="preserve">POST /lms/v1/practice/{sid}/viva</w:t>
+      </w:r>
+      <w:r>
+        <w:t xml:space="preserve"> </w:t>
+      </w:r>
+      <w:r>
+        <w:t xml:space="preserve">→</w:t>
+      </w:r>
+      <w:r>
+        <w:t xml:space="preserve"> </w:t>
+      </w:r>
+      <w:r>
+        <w:rPr>
+          <w:rStyle w:val="VerbatimChar"/>
+        </w:rPr>
+        <w:t xml:space="preserve">{ "viva_id","question":"Why does your two-pointer stop when l&gt;=r?" }</w:t>
+      </w:r>
+      <w:r>
+        <w:t xml:space="preserve">.</w:t>
+      </w:r>
+      <w:r>
+        <w:t xml:space="preserve"> </w:t>
+      </w:r>
+      <w:r>
+        <w:rPr>
+          <w:b/>
+          <w:bCs/>
+        </w:rPr>
+        <w:t xml:space="preserve">POST /lms/v1/practice/viva/{vivaId}</w:t>
+      </w:r>
+      <w:r>
+        <w:t xml:space="preserve"> </w:t>
+      </w:r>
+      <w:r>
+        <w:t xml:space="preserve">—</w:t>
+      </w:r>
+      <w:r>
+        <w:t xml:space="preserve"> </w:t>
+      </w:r>
+      <w:r>
+        <w:rPr>
+          <w:rStyle w:val="VerbatimChar"/>
+        </w:rPr>
+        <w:t xml:space="preserve">{ "answer":"..." }</w:t>
+      </w:r>
+      <w:r>
+        <w:t xml:space="preserve"> </w:t>
+      </w:r>
+      <w:r>
+        <w:t xml:space="preserve">→</w:t>
+      </w:r>
+      <w:r>
+        <w:t xml:space="preserve"> </w:t>
+      </w:r>
+      <w:r>
+        <w:rPr>
+          <w:rStyle w:val="VerbatimChar"/>
+        </w:rPr>
+        <w:t xml:space="preserve">{ "score":85,"passed":true,"verdict":"Solid understanding of the invariant." }</w:t>
+      </w:r>
+      <w:r>
+        <w:t xml:space="preserve">.</w:t>
+      </w:r>
+      <w:r>
+        <w:t xml:space="preserve"> </w:t>
+      </w:r>
+      <w:r>
+        <w:rPr>
+          <w:b/>
+          <w:bCs/>
+        </w:rPr>
+        <w:t xml:space="preserve">POST /lms/v1/drill/start</w:t>
+      </w:r>
+      <w:r>
+        <w:t xml:space="preserve"> </w:t>
+      </w:r>
+      <w:r>
+        <w:t xml:space="preserve">—</w:t>
+      </w:r>
+      <w:r>
+        <w:t xml:space="preserve"> </w:t>
+      </w:r>
+      <w:r>
+        <w:rPr>
+          <w:rStyle w:val="VerbatimChar"/>
+        </w:rPr>
+        <w:t xml:space="preserve">{ "topic":"aptitude","target":8 }</w:t>
+      </w:r>
+      <w:r>
+        <w:t xml:space="preserve"> </w:t>
+      </w:r>
+      <w:r>
+        <w:t xml:space="preserve">→</w:t>
+      </w:r>
+      <w:r>
+        <w:t xml:space="preserve"> </w:t>
+      </w:r>
+      <w:r>
+        <w:rPr>
+          <w:rStyle w:val="VerbatimChar"/>
+        </w:rPr>
+        <w:t xml:space="preserve">{ "drill_id","level":1,"question":{"id","prompt","options":[...]} }</w:t>
+      </w:r>
+      <w:r>
+        <w:t xml:space="preserve">.</w:t>
+      </w:r>
+      <w:r>
+        <w:t xml:space="preserve"> </w:t>
+      </w:r>
+      <w:r>
+        <w:rPr>
+          <w:b/>
+          <w:bCs/>
+        </w:rPr>
+        <w:t xml:space="preserve">POST /lms/v1/drill/{drillId}/answer</w:t>
+      </w:r>
+      <w:r>
+        <w:t xml:space="preserve"> </w:t>
+      </w:r>
+      <w:r>
+        <w:t xml:space="preserve">—</w:t>
+      </w:r>
+      <w:r>
+        <w:t xml:space="preserve"> </w:t>
+      </w:r>
+      <w:r>
+        <w:rPr>
+          <w:rStyle w:val="VerbatimChar"/>
+        </w:rPr>
+        <w:t xml:space="preserve">{ "item_id","option":"b","elapsed_ms":4200 }</w:t>
+      </w:r>
+      <w:r>
+        <w:t xml:space="preserve"> </w:t>
+      </w:r>
+      <w:r>
+        <w:t xml:space="preserve">→</w:t>
+      </w:r>
+      <w:r>
+        <w:t xml:space="preserve"> </w:t>
+      </w:r>
+      <w:r>
+        <w:rPr>
+          <w:rStyle w:val="VerbatimChar"/>
+        </w:rPr>
+        <w:t xml:space="preserve">{ "correct":true,"level":2,"progress":{"correct":3,"total":4},"next":{...}|null }</w:t>
+      </w:r>
+      <w:r>
+        <w:t xml:space="preserve">.</w:t>
+      </w:r>
+      <w:r>
+        <w:t xml:space="preserve"> </w:t>
+      </w:r>
+      <w:r>
+        <w:rPr>
+          <w:b/>
+          <w:bCs/>
+        </w:rPr>
+        <w:t xml:space="preserve">GET /lms/v1/worlds</w:t>
+      </w:r>
+      <w:r>
+        <w:t xml:space="preserve"> </w:t>
+      </w:r>
+      <w:r>
+        <w:t xml:space="preserve">→</w:t>
+      </w:r>
+      <w:r>
+        <w:t xml:space="preserve"> </w:t>
+      </w:r>
+      <w:r>
+        <w:rPr>
+          <w:rStyle w:val="VerbatimChar"/>
+        </w:rPr>
+        <w:t xml:space="preserve">[ { "id","title":"Backend On-Call","role","skill","difficulty","pass_pct":60 } ]</w:t>
+      </w:r>
+      <w:r>
+        <w:t xml:space="preserve">.</w:t>
+      </w:r>
+      <w:r>
+        <w:t xml:space="preserve"> </w:t>
+      </w:r>
+      <w:r>
+        <w:rPr>
+          <w:b/>
+          <w:bCs/>
+        </w:rPr>
+        <w:t xml:space="preserve">POST /lms/v1/worlds/{worldId}/start</w:t>
+      </w:r>
+      <w:r>
+        <w:t xml:space="preserve"> </w:t>
+      </w:r>
+      <w:r>
+        <w:t xml:space="preserve">→</w:t>
+      </w:r>
+      <w:r>
+        <w:t xml:space="preserve"> </w:t>
+      </w:r>
+      <w:r>
+        <w:rPr>
+          <w:rStyle w:val="VerbatimChar"/>
+        </w:rPr>
+        <w:t xml:space="preserve">{ "run_id","step_index":0,"step":{"id","situation","prompt","options":[...]} }</w:t>
+      </w:r>
+      <w:r>
+        <w:t xml:space="preserve">.</w:t>
+      </w:r>
+      <w:r>
+        <w:t xml:space="preserve"> </w:t>
+      </w:r>
+      <w:r>
+        <w:rPr>
+          <w:b/>
+          <w:bCs/>
+        </w:rPr>
+        <w:t xml:space="preserve">POST /lms/v1/worlds/runs/{runId}/answer</w:t>
+      </w:r>
+      <w:r>
+        <w:t xml:space="preserve"> </w:t>
+      </w:r>
+      <w:r>
+        <w:t xml:space="preserve">—</w:t>
+      </w:r>
+      <w:r>
+        <w:t xml:space="preserve"> </w:t>
+      </w:r>
+      <w:r>
+        <w:rPr>
+          <w:rStyle w:val="VerbatimChar"/>
+        </w:rPr>
+        <w:t xml:space="preserve">{ "step_id","choice":"b" }</w:t>
+      </w:r>
+      <w:r>
+        <w:t xml:space="preserve"> </w:t>
+      </w:r>
+      <w:r>
+        <w:t xml:space="preserve">→</w:t>
+      </w:r>
+      <w:r>
+        <w:t xml:space="preserve"> </w:t>
+      </w:r>
+      <w:r>
+        <w:rPr>
+          <w:rStyle w:val="VerbatimChar"/>
+        </w:rPr>
+        <w:t xml:space="preserve">{ "correct":true,"score":50,"status":"in_progress","next":{...}|null }</w:t>
+      </w:r>
+      <w:r>
+        <w:t xml:space="preserve">.</w:t>
+      </w:r>
+      <w:r>
+        <w:t xml:space="preserve"> </w:t>
+      </w:r>
+      <w:r>
+        <w:rPr>
+          <w:b/>
+          <w:bCs/>
+        </w:rPr>
+        <w:t xml:space="preserve">GET /lms/v1/mesh/{learnerId}</w:t>
+      </w:r>
+      <w:r>
+        <w:t xml:space="preserve"> </w:t>
+      </w:r>
+      <w:r>
+        <w:t xml:space="preserve">→</w:t>
+      </w:r>
+      <w:r>
+        <w:t xml:space="preserve"> </w:t>
+      </w:r>
+      <w:r>
+        <w:rPr>
+          <w:rStyle w:val="VerbatimChar"/>
+        </w:rPr>
+        <w:t xml:space="preserve">{ "get_help":[{"topic":"Recursion","my_mastery":40,"mentors":[{"id","name","mastery":100}]}],"can_teach":[{"topic","my_mastery","seekers":2}] }</w:t>
+      </w:r>
+      <w:r>
+        <w:t xml:space="preserve">.</w:t>
+      </w:r>
+      <w:r>
+        <w:t xml:space="preserve"> </w:t>
+      </w:r>
+      <w:r>
+        <w:rPr>
+          <w:b/>
+          <w:bCs/>
+        </w:rPr>
+        <w:t xml:space="preserve">GET /lms/v1/mesh/{learnerId}/sessions</w:t>
+      </w:r>
+      <w:r>
+        <w:t xml:space="preserve"> </w:t>
+      </w:r>
+      <w:r>
+        <w:t xml:space="preserve">→</w:t>
+      </w:r>
+      <w:r>
+        <w:t xml:space="preserve"> </w:t>
+      </w:r>
+      <w:r>
+        <w:rPr>
+          <w:rStyle w:val="VerbatimChar"/>
+        </w:rPr>
+        <w:t xml:space="preserve">{ "as_mentor":[...],"as_learner":[{"id","topic","teacher_id","teacher_name","status":"requested"}] }</w:t>
+      </w:r>
+      <w:r>
+        <w:t xml:space="preserve">.</w:t>
+      </w:r>
+      <w:r>
+        <w:t xml:space="preserve"> </w:t>
+      </w:r>
+      <w:r>
+        <w:rPr>
+          <w:b/>
+          <w:bCs/>
+        </w:rPr>
+        <w:t xml:space="preserve">POST /lms/v1/mesh/request</w:t>
+      </w:r>
+      <w:r>
+        <w:t xml:space="preserve"> </w:t>
+      </w:r>
+      <w:r>
+        <w:t xml:space="preserve">—</w:t>
+      </w:r>
+      <w:r>
+        <w:t xml:space="preserve"> </w:t>
+      </w:r>
+      <w:r>
+        <w:rPr>
+          <w:rStyle w:val="VerbatimChar"/>
+        </w:rPr>
+        <w:t xml:space="preserve">{ "topic","mentor_id","note":null }</w:t>
+      </w:r>
+      <w:r>
+        <w:t xml:space="preserve"> </w:t>
+      </w:r>
+      <w:r>
+        <w:t xml:space="preserve">→</w:t>
+      </w:r>
+      <w:r>
+        <w:t xml:space="preserve"> </w:t>
+      </w:r>
+      <w:r>
+        <w:rPr>
+          <w:rStyle w:val="VerbatimChar"/>
+        </w:rPr>
+        <w:t xml:space="preserve">{ "id","status":"requested" }</w:t>
+      </w:r>
+      <w:r>
+        <w:t xml:space="preserve">.</w:t>
+      </w:r>
+      <w:r>
+        <w:t xml:space="preserve"> </w:t>
+      </w:r>
+      <w:r>
+        <w:rPr>
+          <w:b/>
+          <w:bCs/>
+        </w:rPr>
+        <w:t xml:space="preserve">POST /lms/v1/micro-lessons/{learnerId}/generate</w:t>
+      </w:r>
+      <w:r>
+        <w:t xml:space="preserve"> </w:t>
+      </w:r>
+      <w:r>
+        <w:t xml:space="preserve">—</w:t>
+      </w:r>
+      <w:r>
+        <w:t xml:space="preserve"> </w:t>
+      </w:r>
+      <w:r>
+        <w:rPr>
+          <w:rStyle w:val="VerbatimChar"/>
+        </w:rPr>
+        <w:t xml:space="preserve">{ "topic":"SQL Joins","force":false }</w:t>
+      </w:r>
+      <w:r>
+        <w:t xml:space="preserve"> </w:t>
+      </w:r>
+      <w:r>
+        <w:t xml:space="preserve">→</w:t>
+      </w:r>
+      <w:r>
+        <w:t xml:space="preserve"> </w:t>
+      </w:r>
+      <w:r>
+        <w:rPr>
+          <w:rStyle w:val="VerbatimChar"/>
+        </w:rPr>
+        <w:t xml:space="preserve">{ "id","topic","lesson":{"blocks":[{"type":"text","html":"..."},{"type":"code","language":"sql","code":"..."}]},"generated":true }</w:t>
+      </w:r>
+      <w:r>
+        <w:t xml:space="preserve">.</w:t>
+      </w:r>
+      <w:r>
+        <w:t xml:space="preserve"> </w:t>
+      </w:r>
+      <w:r>
+        <w:rPr>
+          <w:b/>
+          <w:bCs/>
+        </w:rPr>
+        <w:t xml:space="preserve">GET /lms/v1/micro-lessons/{learnerId}</w:t>
+      </w:r>
+      <w:r>
+        <w:t xml:space="preserve"> </w:t>
+      </w:r>
+      <w:r>
+        <w:t xml:space="preserve">→</w:t>
+      </w:r>
+      <w:r>
+        <w:t xml:space="preserve"> </w:t>
+      </w:r>
+      <w:r>
+        <w:rPr>
+          <w:rStyle w:val="VerbatimChar"/>
+        </w:rPr>
+        <w:t xml:space="preserve">[ { "id","topic","created_at" } ]</w:t>
+      </w:r>
+      <w:r>
+        <w:t xml:space="preserve">.</w:t>
+      </w:r>
+      <w:r>
+        <w:t xml:space="preserve"> </w:t>
+      </w:r>
+      <w:r>
+        <w:rPr>
+          <w:b/>
+          <w:bCs/>
+        </w:rPr>
+        <w:t xml:space="preserve">POST /lms/v1/micro-lessons/author-blocks</w:t>
+      </w:r>
+      <w:r>
+        <w:t xml:space="preserve"> </w:t>
+      </w:r>
+      <w:r>
+        <w:t xml:space="preserve">—</w:t>
+      </w:r>
+      <w:r>
+        <w:t xml:space="preserve"> </w:t>
+      </w:r>
+      <w:r>
+        <w:rPr>
+          <w:rStyle w:val="VerbatimChar"/>
+        </w:rPr>
+        <w:t xml:space="preserve">{ "topic":"SQL Joins" }</w:t>
+      </w:r>
+      <w:r>
+        <w:t xml:space="preserve"> </w:t>
+      </w:r>
+      <w:r>
+        <w:t xml:space="preserve">→</w:t>
+      </w:r>
+      <w:r>
+        <w:t xml:space="preserve"> </w:t>
+      </w:r>
+      <w:r>
+        <w:rPr>
+          <w:rStyle w:val="VerbatimChar"/>
+        </w:rPr>
+        <w:t xml:space="preserve">{ "blocks":[ ... ] }</w:t>
+      </w:r>
+      <w:r>
+        <w:t xml:space="preserve"> </w:t>
+      </w:r>
+      <w:r>
+        <w:t xml:space="preserve">(for Curriculum Studio insert).</w:t>
+      </w:r>
+      <w:r>
+        <w:t xml:space="preserve"> </w:t>
+      </w:r>
+      <w:r>
+        <w:rPr>
+          <w:b/>
+          <w:bCs/>
+        </w:rPr>
+        <w:t xml:space="preserve">GET /lms/v1/wallet/{learnerId}</w:t>
+      </w:r>
+      <w:r>
+        <w:t xml:space="preserve"> </w:t>
+      </w:r>
+      <w:r>
+        <w:t xml:space="preserve">→</w:t>
+      </w:r>
+      <w:r>
+        <w:t xml:space="preserve"> </w:t>
+      </w:r>
+      <w:r>
+        <w:rPr>
+          <w:rStyle w:val="VerbatimChar"/>
+        </w:rPr>
+        <w:t xml:space="preserve">{ "verify_id":"LARE-W-8F2A","subject_name":"Asha Rao","payload":{"claims":[...]},"revoked":false,"issued_at":"..." }</w:t>
+      </w:r>
+      <w:r>
+        <w:t xml:space="preserve">.</w:t>
+      </w:r>
+      <w:r>
+        <w:t xml:space="preserve"> </w:t>
+      </w:r>
+      <w:r>
+        <w:rPr>
+          <w:b/>
+          <w:bCs/>
+        </w:rPr>
+        <w:t xml:space="preserve">POST /lms/v1/wallet/{learnerId}/issue</w:t>
+      </w:r>
+      <w:r>
+        <w:t xml:space="preserve"> </w:t>
+      </w:r>
+      <w:r>
+        <w:t xml:space="preserve">→ the wallet object above (re-issue refreshes in place).</w:t>
+      </w:r>
+      <w:r>
+        <w:t xml:space="preserve"> </w:t>
+      </w:r>
+      <w:r>
+        <w:rPr>
+          <w:b/>
+          <w:bCs/>
+        </w:rPr>
+        <w:t xml:space="preserve">GET /verify/wallet/{verifyId}</w:t>
+      </w:r>
+      <w:r>
+        <w:t xml:space="preserve"> </w:t>
+      </w:r>
+      <w:r>
+        <w:t xml:space="preserve">(public) →</w:t>
+      </w:r>
+      <w:r>
+        <w:t xml:space="preserve"> </w:t>
+      </w:r>
+      <w:r>
+        <w:rPr>
+          <w:rStyle w:val="VerbatimChar"/>
+        </w:rPr>
+        <w:t xml:space="preserve">{ "valid":true,"subject_name","issued_at","claims":[...] }</w:t>
+      </w:r>
+      <w:r>
+        <w:t xml:space="preserve">.</w:t>
+      </w:r>
+    </w:p>
+    <w:bookmarkEnd w:id="166"/>
+    <w:bookmarkStart w:id="167" w:name="lare-learn-certification-authoring"/>
+    <w:p>
+      <w:pPr>
+        <w:pStyle w:val="Heading2"/>
+      </w:pPr>
+      <w:r>
+        <w:t xml:space="preserve">18.7 LARE Learn — certification &amp; authoring</w:t>
+      </w:r>
+    </w:p>
+    <w:p>
+      <w:pPr>
+        <w:pStyle w:val="FirstParagraph"/>
+      </w:pPr>
+      <w:r>
+        <w:rPr>
+          <w:b/>
+          <w:bCs/>
+        </w:rPr>
+        <w:t xml:space="preserve">GET /lms/v1/certificates/for/{learnerId}</w:t>
+      </w:r>
+      <w:r>
+        <w:t xml:space="preserve"> </w:t>
+      </w:r>
+      <w:r>
+        <w:t xml:space="preserve">→</w:t>
+      </w:r>
+      <w:r>
+        <w:t xml:space="preserve"> </w:t>
+      </w:r>
+      <w:r>
+        <w:rPr>
+          <w:rStyle w:val="VerbatimChar"/>
+        </w:rPr>
+        <w:t xml:space="preserve">[ { "id","year_no":1,"cert_name":"Foundation","cert_no":"LARE-Y1-000042","status":"issued","verify_id":"LARE-VER-0042","ppo_tag":false,"holder_name":"Asha Rao","issued_at":"..." } ]</w:t>
+      </w:r>
+      <w:r>
+        <w:t xml:space="preserve">.</w:t>
+      </w:r>
+      <w:r>
+        <w:t xml:space="preserve"> </w:t>
+      </w:r>
+      <w:r>
+        <w:rPr>
+          <w:b/>
+          <w:bCs/>
+        </w:rPr>
+        <w:t xml:space="preserve">GET /lms/v1/certificates/{id}/pdf</w:t>
+      </w:r>
+      <w:r>
+        <w:t xml:space="preserve"> </w:t>
+      </w:r>
+      <w:r>
+        <w:t xml:space="preserve">→ binary PDF (Content-Disposition attachment).</w:t>
+      </w:r>
+      <w:r>
+        <w:t xml:space="preserve"> </w:t>
+      </w:r>
+      <w:r>
+        <w:rPr>
+          <w:b/>
+          <w:bCs/>
+        </w:rPr>
+        <w:t xml:space="preserve">GET /verify/{verifyId}</w:t>
+      </w:r>
+      <w:r>
+        <w:t xml:space="preserve"> </w:t>
+      </w:r>
+      <w:r>
+        <w:t xml:space="preserve">(public) →</w:t>
+      </w:r>
+      <w:r>
+        <w:t xml:space="preserve"> </w:t>
+      </w:r>
+      <w:r>
+        <w:rPr>
+          <w:rStyle w:val="VerbatimChar"/>
+        </w:rPr>
+        <w:t xml:space="preserve">{ "valid":true,"holder_name","cert_name","issued_at","cert_no" }</w:t>
+      </w:r>
+      <w:r>
+        <w:t xml:space="preserve">.</w:t>
+      </w:r>
+      <w:r>
+        <w:t xml:space="preserve"> </w:t>
+      </w:r>
+      <w:r>
+        <w:rPr>
+          <w:b/>
+          <w:bCs/>
+        </w:rPr>
+        <w:t xml:space="preserve">POST /lms/v1/lessons/{lid}/content</w:t>
+      </w:r>
+      <w:r>
+        <w:t xml:space="preserve"> </w:t>
+      </w:r>
+      <w:r>
+        <w:t xml:space="preserve">—</w:t>
+      </w:r>
+      <w:r>
+        <w:t xml:space="preserve"> </w:t>
+      </w:r>
+      <w:r>
+        <w:rPr>
+          <w:rStyle w:val="VerbatimChar"/>
+        </w:rPr>
+        <w:t xml:space="preserve">{ "content":[ {"type":"text","html":"..."}, {"type":"check","question":"...","options":[...],"answer":"a"} ] }</w:t>
+      </w:r>
+      <w:r>
+        <w:t xml:space="preserve"> </w:t>
+      </w:r>
+      <w:r>
+        <w:t xml:space="preserve">→</w:t>
+      </w:r>
+      <w:r>
+        <w:t xml:space="preserve"> </w:t>
+      </w:r>
+      <w:r>
+        <w:rPr>
+          <w:rStyle w:val="VerbatimChar"/>
+        </w:rPr>
+        <w:t xml:space="preserve">{ "id","content":[...] }</w:t>
+      </w:r>
+      <w:r>
+        <w:t xml:space="preserve">.</w:t>
+      </w:r>
+      <w:r>
+        <w:t xml:space="preserve"> </w:t>
+      </w:r>
+      <w:r>
+        <w:rPr>
+          <w:b/>
+          <w:bCs/>
+        </w:rPr>
+        <w:t xml:space="preserve">POST /lms/v1/lessons/{lid}/check</w:t>
+      </w:r>
+      <w:r>
+        <w:t xml:space="preserve"> </w:t>
+      </w:r>
+      <w:r>
+        <w:t xml:space="preserve">—</w:t>
+      </w:r>
+      <w:r>
+        <w:t xml:space="preserve"> </w:t>
+      </w:r>
+      <w:r>
+        <w:rPr>
+          <w:rStyle w:val="VerbatimChar"/>
+        </w:rPr>
+        <w:t xml:space="preserve">{ "block_id","choice":"a" }</w:t>
+      </w:r>
+      <w:r>
+        <w:t xml:space="preserve"> </w:t>
+      </w:r>
+      <w:r>
+        <w:t xml:space="preserve">→</w:t>
+      </w:r>
+      <w:r>
+        <w:t xml:space="preserve"> </w:t>
+      </w:r>
+      <w:r>
+        <w:rPr>
+          <w:rStyle w:val="VerbatimChar"/>
+        </w:rPr>
+        <w:t xml:space="preserve">{ "correct":true,"explain":"..." }</w:t>
+      </w:r>
+      <w:r>
+        <w:t xml:space="preserve"> </w:t>
+      </w:r>
+      <w:r>
+        <w:t xml:space="preserve">(also records practice into the review schedule).</w:t>
+      </w:r>
+      <w:r>
+        <w:t xml:space="preserve"> </w:t>
+      </w:r>
+      <w:r>
+        <w:rPr>
+          <w:b/>
+          <w:bCs/>
+        </w:rPr>
+        <w:t xml:space="preserve">POST /lms/v1/learners/import</w:t>
+      </w:r>
+      <w:r>
+        <w:t xml:space="preserve"> </w:t>
+      </w:r>
+      <w:r>
+        <w:t xml:space="preserve">—</w:t>
+      </w:r>
+      <w:r>
+        <w:t xml:space="preserve"> </w:t>
+      </w:r>
+      <w:r>
+        <w:rPr>
+          <w:rStyle w:val="VerbatimChar"/>
+        </w:rPr>
+        <w:t xml:space="preserve">{ "college_id","rows":[{"roll_no","full_name","email","branch"}] }</w:t>
+      </w:r>
+      <w:r>
+        <w:t xml:space="preserve"> </w:t>
+      </w:r>
+      <w:r>
+        <w:t xml:space="preserve">→</w:t>
+      </w:r>
+      <w:r>
+        <w:t xml:space="preserve"> </w:t>
+      </w:r>
+      <w:r>
+        <w:rPr>
+          <w:rStyle w:val="VerbatimChar"/>
+        </w:rPr>
+        <w:t xml:space="preserve">{ "import_id","status":"previewed","summary":{"new":30,"dupes":0} }</w:t>
+      </w:r>
+      <w:r>
+        <w:t xml:space="preserve">.</w:t>
+      </w:r>
+    </w:p>
+    <w:bookmarkEnd w:id="167"/>
+    <w:bookmarkStart w:id="168" w:name="lare-hire-candidate-drives"/>
+    <w:p>
+      <w:pPr>
+        <w:pStyle w:val="Heading2"/>
+      </w:pPr>
+      <w:r>
+        <w:t xml:space="preserve">18.8 LARE Hire — candidate &amp; drives</w:t>
+      </w:r>
+    </w:p>
+    <w:p>
+      <w:pPr>
+        <w:pStyle w:val="FirstParagraph"/>
+      </w:pPr>
+      <w:r>
+        <w:rPr>
+          <w:b/>
+          <w:bCs/>
+        </w:rPr>
+        <w:t xml:space="preserve">GET /drive/v1/drives?status=open</w:t>
+      </w:r>
+      <w:r>
+        <w:t xml:space="preserve"> </w:t>
+      </w:r>
+      <w:r>
+        <w:t xml:space="preserve">→</w:t>
+      </w:r>
+      <w:r>
+        <w:t xml:space="preserve"> </w:t>
+      </w:r>
+      <w:r>
+        <w:rPr>
+          <w:rStyle w:val="VerbatimChar"/>
+        </w:rPr>
+        <w:t xml:space="preserve">[ { "id","company_name","title","status":"open","venue","reporting_time" } ]</w:t>
+      </w:r>
+      <w:r>
+        <w:t xml:space="preserve">.</w:t>
+      </w:r>
+      <w:r>
+        <w:t xml:space="preserve"> </w:t>
+      </w:r>
+      <w:r>
+        <w:rPr>
+          <w:b/>
+          <w:bCs/>
+        </w:rPr>
+        <w:t xml:space="preserve">GET /drive/v1/drives/{id}</w:t>
+      </w:r>
+      <w:r>
+        <w:t xml:space="preserve"> </w:t>
+      </w:r>
+      <w:r>
+        <w:t xml:space="preserve">→</w:t>
+      </w:r>
+      <w:r>
+        <w:t xml:space="preserve"> </w:t>
+      </w:r>
+      <w:r>
+        <w:rPr>
+          <w:rStyle w:val="VerbatimChar"/>
+        </w:rPr>
+        <w:t xml:space="preserve">{ "id","company_name","title","status","roles":[{"id","title","ctc","positions"}],"rounds":[{"id","order","type"}] }</w:t>
+      </w:r>
+      <w:r>
+        <w:t xml:space="preserve">.</w:t>
+      </w:r>
+      <w:r>
+        <w:t xml:space="preserve"> </w:t>
+      </w:r>
+      <w:r>
+        <w:rPr>
+          <w:b/>
+          <w:bCs/>
+        </w:rPr>
+        <w:t xml:space="preserve">POST /drive/v1/attend</w:t>
+      </w:r>
+      <w:r>
+        <w:t xml:space="preserve"> </w:t>
+      </w:r>
+      <w:r>
+        <w:t xml:space="preserve">(public) —</w:t>
+      </w:r>
+      <w:r>
+        <w:t xml:space="preserve"> </w:t>
+      </w:r>
+      <w:r>
+        <w:rPr>
+          <w:rStyle w:val="VerbatimChar"/>
+        </w:rPr>
+        <w:t xml:space="preserve">{ "drive_code","first_name","last_name","roll_number","email","phone","branch","cgpa" }</w:t>
+      </w:r>
+      <w:r>
+        <w:t xml:space="preserve"> </w:t>
+      </w:r>
+      <w:r>
+        <w:t xml:space="preserve">→</w:t>
+      </w:r>
+      <w:r>
+        <w:t xml:space="preserve"> </w:t>
+      </w:r>
+      <w:r>
+        <w:rPr>
+          <w:rStyle w:val="VerbatimChar"/>
+        </w:rPr>
+        <w:t xml:space="preserve">{ "student_id":"S-4821","drive":{...},"access_token","refresh_token" }</w:t>
+      </w:r>
+      <w:r>
+        <w:t xml:space="preserve">.</w:t>
+      </w:r>
+      <w:r>
+        <w:t xml:space="preserve"> </w:t>
+      </w:r>
+      <w:r>
+        <w:rPr>
+          <w:b/>
+          <w:bCs/>
+        </w:rPr>
+        <w:t xml:space="preserve">POST /drive/v1/candidate/apply</w:t>
+      </w:r>
+      <w:r>
+        <w:t xml:space="preserve"> </w:t>
+      </w:r>
+      <w:r>
+        <w:t xml:space="preserve">—</w:t>
+      </w:r>
+      <w:r>
+        <w:t xml:space="preserve"> </w:t>
+      </w:r>
+      <w:r>
+        <w:rPr>
+          <w:rStyle w:val="VerbatimChar"/>
+        </w:rPr>
+        <w:t xml:space="preserve">{ "drive_id","drive_role_id" }</w:t>
+      </w:r>
+      <w:r>
+        <w:t xml:space="preserve"> </w:t>
+      </w:r>
+      <w:r>
+        <w:t xml:space="preserve">→</w:t>
+      </w:r>
+      <w:r>
+        <w:t xml:space="preserve"> </w:t>
+      </w:r>
+      <w:r>
+        <w:rPr>
+          <w:rStyle w:val="VerbatimChar"/>
+        </w:rPr>
+        <w:t xml:space="preserve">{ "application_id","status":"applied" }</w:t>
+      </w:r>
+      <w:r>
+        <w:t xml:space="preserve">.</w:t>
+      </w:r>
+      <w:r>
+        <w:t xml:space="preserve"> </w:t>
+      </w:r>
+      <w:r>
+        <w:rPr>
+          <w:b/>
+          <w:bCs/>
+        </w:rPr>
+        <w:t xml:space="preserve">GET /drive/v1/candidate/profile</w:t>
+      </w:r>
+      <w:r>
+        <w:t xml:space="preserve"> </w:t>
+      </w:r>
+      <w:r>
+        <w:t xml:space="preserve">→</w:t>
+      </w:r>
+      <w:r>
+        <w:t xml:space="preserve"> </w:t>
+      </w:r>
+      <w:r>
+        <w:rPr>
+          <w:rStyle w:val="VerbatimChar"/>
+        </w:rPr>
+        <w:t xml:space="preserve">{ "full_name","email","phone","branch","cgpa","completeness":100,"education":[...],"skills":[...],"projects":[...] }</w:t>
+      </w:r>
+      <w:r>
+        <w:t xml:space="preserve">.</w:t>
+      </w:r>
+      <w:r>
+        <w:t xml:space="preserve"> </w:t>
+      </w:r>
+      <w:r>
+        <w:rPr>
+          <w:b/>
+          <w:bCs/>
+        </w:rPr>
+        <w:t xml:space="preserve">PUT /drive/v1/candidate/profile</w:t>
+      </w:r>
+      <w:r>
+        <w:t xml:space="preserve"> </w:t>
+      </w:r>
+      <w:r>
+        <w:t xml:space="preserve">—</w:t>
+      </w:r>
+      <w:r>
+        <w:t xml:space="preserve"> </w:t>
+      </w:r>
+      <w:r>
+        <w:rPr>
+          <w:rStyle w:val="VerbatimChar"/>
+        </w:rPr>
+        <w:t xml:space="preserve">{ "full_name","email","phone","branch","cgpa" }</w:t>
+      </w:r>
+      <w:r>
+        <w:t xml:space="preserve"> </w:t>
+      </w:r>
+      <w:r>
+        <w:t xml:space="preserve">→ updated profile.</w:t>
+      </w:r>
+      <w:r>
+        <w:t xml:space="preserve"> </w:t>
+      </w:r>
+      <w:r>
+        <w:rPr>
+          <w:b/>
+          <w:bCs/>
+        </w:rPr>
+        <w:t xml:space="preserve">GET /drive/v1/opportunities?candidate_id=…</w:t>
+      </w:r>
+      <w:r>
+        <w:t xml:space="preserve"> </w:t>
+      </w:r>
+      <w:r>
+        <w:t xml:space="preserve">→</w:t>
+      </w:r>
+      <w:r>
+        <w:t xml:space="preserve"> </w:t>
+      </w:r>
+      <w:r>
+        <w:rPr>
+          <w:rStyle w:val="VerbatimChar"/>
+        </w:rPr>
+        <w:t xml:space="preserve">[ { "drive_id","title","company_name","role":"SWE","match_pct":82,"matched_skills":["Python","SQL"] } ]</w:t>
+      </w:r>
+      <w:r>
+        <w:t xml:space="preserve">.</w:t>
+      </w:r>
+      <w:r>
+        <w:t xml:space="preserve"> </w:t>
+      </w:r>
+      <w:r>
+        <w:rPr>
+          <w:b/>
+          <w:bCs/>
+        </w:rPr>
+        <w:t xml:space="preserve">GET /drive/v1/evaluations/twin/{candidateId}</w:t>
+      </w:r>
+      <w:r>
+        <w:t xml:space="preserve"> </w:t>
+      </w:r>
+      <w:r>
+        <w:t xml:space="preserve">→</w:t>
+      </w:r>
+      <w:r>
+        <w:t xml:space="preserve"> </w:t>
+      </w:r>
+      <w:r>
+        <w:rPr>
+          <w:rStyle w:val="VerbatimChar"/>
+        </w:rPr>
+        <w:t xml:space="preserve">{ "candidate_id","verified_skills":[{"skill":"DSA","level":"strong","evidence":"drive-exam"}] }</w:t>
+      </w:r>
+      <w:r>
+        <w:t xml:space="preserve">.</w:t>
+      </w:r>
+    </w:p>
+    <w:bookmarkEnd w:id="168"/>
+    <w:bookmarkStart w:id="169" w:name="X5cdac875f94e82b7e4770ae9d81f5aa596c32a4"/>
+    <w:p>
+      <w:pPr>
+        <w:pStyle w:val="Heading2"/>
+      </w:pPr>
+      <w:r>
+        <w:t xml:space="preserve">18.9 LARE Hire — exam take-flow, coding, proctoring</w:t>
+      </w:r>
+    </w:p>
+    <w:p>
+      <w:pPr>
+        <w:pStyle w:val="FirstParagraph"/>
+      </w:pPr>
+      <w:r>
+        <w:rPr>
+          <w:b/>
+          <w:bCs/>
+        </w:rPr>
+        <w:t xml:space="preserve">GET /drive/v1/exams/{examId}</w:t>
+      </w:r>
+      <w:r>
+        <w:t xml:space="preserve"> </w:t>
+      </w:r>
+      <w:r>
+        <w:t xml:space="preserve">→</w:t>
+      </w:r>
+      <w:r>
+        <w:t xml:space="preserve"> </w:t>
+      </w:r>
+      <w:r>
+        <w:rPr>
+          <w:rStyle w:val="VerbatimChar"/>
+        </w:rPr>
+        <w:t xml:space="preserve">{ "id","title","total_time_min":60,"nav_rule":"free","sections":[{"id","title","time_limit_min"}] }</w:t>
+      </w:r>
+      <w:r>
+        <w:t xml:space="preserve">.</w:t>
+      </w:r>
+      <w:r>
+        <w:t xml:space="preserve"> </w:t>
+      </w:r>
+      <w:r>
+        <w:rPr>
+          <w:b/>
+          <w:bCs/>
+        </w:rPr>
+        <w:t xml:space="preserve">GET /drive/v1/exams/{examId}/paper</w:t>
+      </w:r>
+      <w:r>
+        <w:t xml:space="preserve"> </w:t>
+      </w:r>
+      <w:r>
+        <w:t xml:space="preserve">→</w:t>
+      </w:r>
+      <w:r>
+        <w:t xml:space="preserve"> </w:t>
+      </w:r>
+      <w:r>
+        <w:rPr>
+          <w:rStyle w:val="VerbatimChar"/>
+        </w:rPr>
+        <w:t xml:space="preserve">{ "sections":[{ "id","title","questions":[{"id","type","stem","options":[{"id","text"}],"weight"}] }] }</w:t>
+      </w:r>
+      <w:r>
+        <w:t xml:space="preserve"> </w:t>
+      </w:r>
+      <w:r>
+        <w:t xml:space="preserve">(no answer keys).</w:t>
+      </w:r>
+      <w:r>
+        <w:t xml:space="preserve"> </w:t>
+      </w:r>
+      <w:r>
+        <w:rPr>
+          <w:b/>
+          <w:bCs/>
+        </w:rPr>
+        <w:t xml:space="preserve">POST /drive/v1/exams/{examId}/start</w:t>
+      </w:r>
+      <w:r>
+        <w:t xml:space="preserve"> </w:t>
+      </w:r>
+      <w:r>
+        <w:t xml:space="preserve">—</w:t>
+      </w:r>
+      <w:r>
+        <w:t xml:space="preserve"> </w:t>
+      </w:r>
+      <w:r>
+        <w:rPr>
+          <w:rStyle w:val="VerbatimChar"/>
+        </w:rPr>
+        <w:t xml:space="preserve">{ "candidate_id" }</w:t>
+      </w:r>
+      <w:r>
+        <w:t xml:space="preserve"> </w:t>
+      </w:r>
+      <w:r>
+        <w:t xml:space="preserve">→</w:t>
+      </w:r>
+      <w:r>
+        <w:t xml:space="preserve"> </w:t>
+      </w:r>
+      <w:r>
+        <w:rPr>
+          <w:rStyle w:val="VerbatimChar"/>
+        </w:rPr>
+        <w:t xml:space="preserve">{ "session_id","started_at","section_state":{} }</w:t>
+      </w:r>
+      <w:r>
+        <w:t xml:space="preserve">.</w:t>
+      </w:r>
+      <w:r>
+        <w:t xml:space="preserve"> </w:t>
+      </w:r>
+      <w:r>
+        <w:rPr>
+          <w:b/>
+          <w:bCs/>
+        </w:rPr>
+        <w:t xml:space="preserve">GET /drive/v1/exam-sessions/{sid}/state</w:t>
+      </w:r>
+      <w:r>
+        <w:t xml:space="preserve"> </w:t>
+      </w:r>
+      <w:r>
+        <w:t xml:space="preserve">→</w:t>
+      </w:r>
+      <w:r>
+        <w:t xml:space="preserve"> </w:t>
+      </w:r>
+      <w:r>
+        <w:rPr>
+          <w:rStyle w:val="VerbatimChar"/>
+        </w:rPr>
+        <w:t xml:space="preserve">{ "status":"in_progress","answers":{"q1":{"option":"b"}},"section_state":{...},"remaining_sec":2400 }</w:t>
+      </w:r>
+      <w:r>
+        <w:t xml:space="preserve">.</w:t>
+      </w:r>
+      <w:r>
+        <w:t xml:space="preserve"> </w:t>
+      </w:r>
+      <w:r>
+        <w:rPr>
+          <w:b/>
+          <w:bCs/>
+        </w:rPr>
+        <w:t xml:space="preserve">POST /drive/v1/exam-sessions/{sid}/save</w:t>
+      </w:r>
+      <w:r>
+        <w:t xml:space="preserve"> </w:t>
+      </w:r>
+      <w:r>
+        <w:t xml:space="preserve">—</w:t>
+      </w:r>
+      <w:r>
+        <w:t xml:space="preserve"> </w:t>
+      </w:r>
+      <w:r>
+        <w:rPr>
+          <w:rStyle w:val="VerbatimChar"/>
+        </w:rPr>
+        <w:t xml:space="preserve">{ "answers":{ "q1":{"option":"b"} } }</w:t>
+      </w:r>
+      <w:r>
+        <w:t xml:space="preserve"> </w:t>
+      </w:r>
+      <w:r>
+        <w:t xml:space="preserve">→</w:t>
+      </w:r>
+      <w:r>
+        <w:t xml:space="preserve"> </w:t>
+      </w:r>
+      <w:r>
+        <w:rPr>
+          <w:rStyle w:val="VerbatimChar"/>
+        </w:rPr>
+        <w:t xml:space="preserve">{ "saved":true,"client_seq":12 }</w:t>
+      </w:r>
+      <w:r>
+        <w:t xml:space="preserve">.</w:t>
+      </w:r>
+      <w:r>
+        <w:t xml:space="preserve"> </w:t>
+      </w:r>
+      <w:r>
+        <w:rPr>
+          <w:b/>
+          <w:bCs/>
+        </w:rPr>
+        <w:t xml:space="preserve">POST /drive/v1/exam-sessions/{sid}/submit</w:t>
+      </w:r>
+      <w:r>
+        <w:t xml:space="preserve"> </w:t>
+      </w:r>
+      <w:r>
+        <w:t xml:space="preserve">→</w:t>
+      </w:r>
+      <w:r>
+        <w:t xml:space="preserve"> </w:t>
+      </w:r>
+      <w:r>
+        <w:rPr>
+          <w:rStyle w:val="VerbatimChar"/>
+        </w:rPr>
+        <w:t xml:space="preserve">{ "status":"submitted","answer_count":40 }</w:t>
+      </w:r>
+      <w:r>
+        <w:t xml:space="preserve">.</w:t>
+      </w:r>
+      <w:r>
+        <w:t xml:space="preserve"> </w:t>
+      </w:r>
+      <w:r>
+        <w:rPr>
+          <w:b/>
+          <w:bCs/>
+        </w:rPr>
+        <w:t xml:space="preserve">POST /drive/v1/coding/run-adhoc</w:t>
+      </w:r>
+      <w:r>
+        <w:t xml:space="preserve"> </w:t>
+      </w:r>
+      <w:r>
+        <w:t xml:space="preserve">—</w:t>
+      </w:r>
+      <w:r>
+        <w:t xml:space="preserve"> </w:t>
+      </w:r>
+      <w:r>
+        <w:rPr>
+          <w:rStyle w:val="VerbatimChar"/>
+        </w:rPr>
+        <w:t xml:space="preserve">{ "language":"python","code":"...","cases":[{"input","expected"}] }</w:t>
+      </w:r>
+      <w:r>
+        <w:t xml:space="preserve"> </w:t>
+      </w:r>
+      <w:r>
+        <w:t xml:space="preserve">→</w:t>
+      </w:r>
+      <w:r>
+        <w:t xml:space="preserve"> </w:t>
+      </w:r>
+      <w:r>
+        <w:rPr>
+          <w:rStyle w:val="VerbatimChar"/>
+        </w:rPr>
+        <w:t xml:space="preserve">{ "results":[{"passed":true,"got"}] }</w:t>
+      </w:r>
+      <w:r>
+        <w:t xml:space="preserve">.</w:t>
+      </w:r>
+      <w:r>
+        <w:t xml:space="preserve"> </w:t>
+      </w:r>
+      <w:r>
+        <w:rPr>
+          <w:b/>
+          <w:bCs/>
+        </w:rPr>
+        <w:t xml:space="preserve">GET /drive/v1/coding/languages</w:t>
+      </w:r>
+      <w:r>
+        <w:t xml:space="preserve"> </w:t>
+      </w:r>
+      <w:r>
+        <w:t xml:space="preserve">→</w:t>
+      </w:r>
+      <w:r>
+        <w:t xml:space="preserve"> </w:t>
+      </w:r>
+      <w:r>
+        <w:rPr>
+          <w:rStyle w:val="VerbatimChar"/>
+        </w:rPr>
+        <w:t xml:space="preserve">[ "python","java","cpp","javascript" ]</w:t>
+      </w:r>
+      <w:r>
+        <w:t xml:space="preserve">.</w:t>
+      </w:r>
+      <w:r>
+        <w:t xml:space="preserve"> </w:t>
+      </w:r>
+      <w:r>
+        <w:rPr>
+          <w:b/>
+          <w:bCs/>
+        </w:rPr>
+        <w:t xml:space="preserve">POST /drive/v1/coding/session</w:t>
+      </w:r>
+      <w:r>
+        <w:t xml:space="preserve"> </w:t>
+      </w:r>
+      <w:r>
+        <w:t xml:space="preserve">—</w:t>
+      </w:r>
+      <w:r>
+        <w:t xml:space="preserve"> </w:t>
+      </w:r>
+      <w:r>
+        <w:rPr>
+          <w:rStyle w:val="VerbatimChar"/>
+        </w:rPr>
+        <w:t xml:space="preserve">{ "problem_id" }</w:t>
+      </w:r>
+      <w:r>
+        <w:t xml:space="preserve"> </w:t>
+      </w:r>
+      <w:r>
+        <w:t xml:space="preserve">→</w:t>
+      </w:r>
+      <w:r>
+        <w:t xml:space="preserve"> </w:t>
+      </w:r>
+      <w:r>
+        <w:rPr>
+          <w:rStyle w:val="VerbatimChar"/>
+        </w:rPr>
+        <w:t xml:space="preserve">{ "session_id","language","draft_code" }</w:t>
+      </w:r>
+      <w:r>
+        <w:t xml:space="preserve">.</w:t>
+      </w:r>
+      <w:r>
+        <w:t xml:space="preserve"> </w:t>
+      </w:r>
+      <w:r>
+        <w:rPr>
+          <w:b/>
+          <w:bCs/>
+        </w:rPr>
+        <w:t xml:space="preserve">POST /drive/v1/coding/{sid}/submit</w:t>
+      </w:r>
+      <w:r>
+        <w:t xml:space="preserve"> </w:t>
+      </w:r>
+      <w:r>
+        <w:t xml:space="preserve">—</w:t>
+      </w:r>
+      <w:r>
+        <w:t xml:space="preserve"> </w:t>
+      </w:r>
+      <w:r>
+        <w:rPr>
+          <w:rStyle w:val="VerbatimChar"/>
+        </w:rPr>
+        <w:t xml:space="preserve">{ "code":"..." }</w:t>
+      </w:r>
+      <w:r>
+        <w:t xml:space="preserve"> </w:t>
+      </w:r>
+      <w:r>
+        <w:t xml:space="preserve">→</w:t>
+      </w:r>
+      <w:r>
+        <w:t xml:space="preserve"> </w:t>
+      </w:r>
+      <w:r>
+        <w:rPr>
+          <w:rStyle w:val="VerbatimChar"/>
+        </w:rPr>
+        <w:t xml:space="preserve">{ "score":100,"cases_passed":8,"total_cases":8 }</w:t>
+      </w:r>
+      <w:r>
+        <w:t xml:space="preserve">.</w:t>
+      </w:r>
+      <w:r>
+        <w:t xml:space="preserve"> </w:t>
+      </w:r>
+      <w:r>
+        <w:rPr>
+          <w:b/>
+          <w:bCs/>
+        </w:rPr>
+        <w:t xml:space="preserve">POST /drive/v1/proctor/start</w:t>
+      </w:r>
+      <w:r>
+        <w:t xml:space="preserve"> </w:t>
+      </w:r>
+      <w:r>
+        <w:t xml:space="preserve">—</w:t>
+      </w:r>
+      <w:r>
+        <w:t xml:space="preserve"> </w:t>
+      </w:r>
+      <w:r>
+        <w:rPr>
+          <w:rStyle w:val="VerbatimChar"/>
+        </w:rPr>
+        <w:t xml:space="preserve">{ "exam_session_id","candidate_id","drive_id","fingerprint","browser" }</w:t>
+      </w:r>
+      <w:r>
+        <w:t xml:space="preserve"> </w:t>
+      </w:r>
+      <w:r>
+        <w:t xml:space="preserve">→</w:t>
+      </w:r>
+      <w:r>
+        <w:t xml:space="preserve"> </w:t>
+      </w:r>
+      <w:r>
+        <w:rPr>
+          <w:rStyle w:val="VerbatimChar"/>
+        </w:rPr>
+        <w:t xml:space="preserve">{ "proctor_session_id","status":"active" }</w:t>
+      </w:r>
+      <w:r>
+        <w:t xml:space="preserve">.</w:t>
+      </w:r>
+      <w:r>
+        <w:t xml:space="preserve"> </w:t>
+      </w:r>
+      <w:r>
+        <w:rPr>
+          <w:b/>
+          <w:bCs/>
+        </w:rPr>
+        <w:t xml:space="preserve">POST /drive/v1/proctor/{examSessionId}/events</w:t>
+      </w:r>
+      <w:r>
+        <w:t xml:space="preserve"> </w:t>
+      </w:r>
+      <w:r>
+        <w:t xml:space="preserve">—</w:t>
+      </w:r>
+      <w:r>
+        <w:t xml:space="preserve"> </w:t>
+      </w:r>
+      <w:r>
+        <w:rPr>
+          <w:rStyle w:val="VerbatimChar"/>
+        </w:rPr>
+        <w:t xml:space="preserve">{ "type":"tab_switch","meta":{"count":1} }</w:t>
+      </w:r>
+      <w:r>
+        <w:t xml:space="preserve"> </w:t>
+      </w:r>
+      <w:r>
+        <w:t xml:space="preserve">→</w:t>
+      </w:r>
+      <w:r>
+        <w:t xml:space="preserve"> </w:t>
+      </w:r>
+      <w:r>
+        <w:rPr>
+          <w:rStyle w:val="VerbatimChar"/>
+        </w:rPr>
+        <w:t xml:space="preserve">{ "violation_score":1,"status":"active" }</w:t>
+      </w:r>
+      <w:r>
+        <w:t xml:space="preserve"> </w:t>
+      </w:r>
+      <w:r>
+        <w:t xml:space="preserve">(auto_submitted at threshold).</w:t>
+      </w:r>
+    </w:p>
+    <w:bookmarkEnd w:id="169"/>
+    <w:bookmarkStart w:id="170" w:name="lare-hire-recruiter-management"/>
+    <w:p>
+      <w:pPr>
+        <w:pStyle w:val="Heading2"/>
+      </w:pPr>
+      <w:r>
+        <w:t xml:space="preserve">18.10 LARE Hire — recruiter management</w:t>
+      </w:r>
+    </w:p>
+    <w:p>
+      <w:pPr>
+        <w:pStyle w:val="FirstParagraph"/>
+      </w:pPr>
+      <w:r>
+        <w:rPr>
+          <w:b/>
+          <w:bCs/>
+        </w:rPr>
+        <w:t xml:space="preserve">POST /drive/v1/drives</w:t>
+      </w:r>
+      <w:r>
+        <w:t xml:space="preserve"> </w:t>
+      </w:r>
+      <w:r>
+        <w:t xml:space="preserve">—</w:t>
+      </w:r>
+      <w:r>
+        <w:t xml:space="preserve"> </w:t>
+      </w:r>
+      <w:r>
+        <w:rPr>
+          <w:rStyle w:val="VerbatimChar"/>
+        </w:rPr>
+        <w:t xml:space="preserve">{ "company_name","title","venue","reporting_time" }</w:t>
+      </w:r>
+      <w:r>
+        <w:t xml:space="preserve"> </w:t>
+      </w:r>
+      <w:r>
+        <w:t xml:space="preserve">→</w:t>
+      </w:r>
+      <w:r>
+        <w:t xml:space="preserve"> </w:t>
+      </w:r>
+      <w:r>
+        <w:rPr>
+          <w:rStyle w:val="VerbatimChar"/>
+        </w:rPr>
+        <w:t xml:space="preserve">{ "id","status":"draft" }</w:t>
+      </w:r>
+      <w:r>
+        <w:t xml:space="preserve">.</w:t>
+      </w:r>
+      <w:r>
+        <w:t xml:space="preserve"> </w:t>
+      </w:r>
+      <w:r>
+        <w:rPr>
+          <w:b/>
+          <w:bCs/>
+        </w:rPr>
+        <w:t xml:space="preserve">POST /drive/v1/drives/{id}/roles</w:t>
+      </w:r>
+      <w:r>
+        <w:t xml:space="preserve"> </w:t>
+      </w:r>
+      <w:r>
+        <w:t xml:space="preserve">—</w:t>
+      </w:r>
+      <w:r>
+        <w:t xml:space="preserve"> </w:t>
+      </w:r>
+      <w:r>
+        <w:rPr>
+          <w:rStyle w:val="VerbatimChar"/>
+        </w:rPr>
+        <w:t xml:space="preserve">{ "title","ctc","positions","skills":[{"name","weight"}] }</w:t>
+      </w:r>
+      <w:r>
+        <w:t xml:space="preserve"> </w:t>
+      </w:r>
+      <w:r>
+        <w:t xml:space="preserve">→ role.</w:t>
+      </w:r>
+      <w:r>
+        <w:t xml:space="preserve"> </w:t>
+      </w:r>
+      <w:r>
+        <w:rPr>
+          <w:b/>
+          <w:bCs/>
+        </w:rPr>
+        <w:t xml:space="preserve">POST /drive/v1/drives/{id}/eligibility</w:t>
+      </w:r>
+      <w:r>
+        <w:t xml:space="preserve"> </w:t>
+      </w:r>
+      <w:r>
+        <w:t xml:space="preserve">—</w:t>
+      </w:r>
+      <w:r>
+        <w:t xml:space="preserve"> </w:t>
+      </w:r>
+      <w:r>
+        <w:rPr>
+          <w:rStyle w:val="VerbatimChar"/>
+        </w:rPr>
+        <w:t xml:space="preserve">{ "min_cgpa":7,"branches":["CSE"],"max_backlogs":0 }</w:t>
+      </w:r>
+      <w:r>
+        <w:t xml:space="preserve"> </w:t>
+      </w:r>
+      <w:r>
+        <w:t xml:space="preserve">→ rule.</w:t>
+      </w:r>
+      <w:r>
+        <w:t xml:space="preserve"> </w:t>
+      </w:r>
+      <w:r>
+        <w:rPr>
+          <w:b/>
+          <w:bCs/>
+        </w:rPr>
+        <w:t xml:space="preserve">POST /drive/v1/drives/{id}/rounds</w:t>
+      </w:r>
+      <w:r>
+        <w:t xml:space="preserve"> </w:t>
+      </w:r>
+      <w:r>
+        <w:t xml:space="preserve">—</w:t>
+      </w:r>
+      <w:r>
+        <w:t xml:space="preserve"> </w:t>
+      </w:r>
+      <w:r>
+        <w:rPr>
+          <w:rStyle w:val="VerbatimChar"/>
+        </w:rPr>
+        <w:t xml:space="preserve">{ "order":2,"type":"coding","label":"Coding round" }</w:t>
+      </w:r>
+      <w:r>
+        <w:t xml:space="preserve"> </w:t>
+      </w:r>
+      <w:r>
+        <w:t xml:space="preserve">→ round.</w:t>
+      </w:r>
+      <w:r>
+        <w:t xml:space="preserve"> </w:t>
+      </w:r>
+      <w:r>
+        <w:rPr>
+          <w:b/>
+          <w:bCs/>
+        </w:rPr>
+        <w:t xml:space="preserve">GET /drive/v1/drives/{id}/registrations</w:t>
+      </w:r>
+      <w:r>
+        <w:t xml:space="preserve"> </w:t>
+      </w:r>
+      <w:r>
+        <w:t xml:space="preserve">→</w:t>
+      </w:r>
+      <w:r>
+        <w:t xml:space="preserve"> </w:t>
+      </w:r>
+      <w:r>
+        <w:rPr>
+          <w:rStyle w:val="VerbatimChar"/>
+        </w:rPr>
+        <w:t xml:space="preserve">[ { "candidate_id","candidate_name","candidate_email","status","eligible","current_round" } ]</w:t>
+      </w:r>
+      <w:r>
+        <w:t xml:space="preserve">.</w:t>
+      </w:r>
+      <w:r>
+        <w:t xml:space="preserve"> </w:t>
+      </w:r>
+      <w:r>
+        <w:rPr>
+          <w:b/>
+          <w:bCs/>
+        </w:rPr>
+        <w:t xml:space="preserve">GET /drive/v1/drives/{id}/funnel</w:t>
+      </w:r>
+      <w:r>
+        <w:t xml:space="preserve"> </w:t>
+      </w:r>
+      <w:r>
+        <w:t xml:space="preserve">→</w:t>
+      </w:r>
+      <w:r>
+        <w:t xml:space="preserve"> </w:t>
+      </w:r>
+      <w:r>
+        <w:rPr>
+          <w:rStyle w:val="VerbatimChar"/>
+        </w:rPr>
+        <w:t xml:space="preserve">{ "total":42,"by_status":{"applied":20,"shortlisted":12,"in_round":8,"selected":2} }</w:t>
+      </w:r>
+      <w:r>
+        <w:t xml:space="preserve">.</w:t>
+      </w:r>
+      <w:r>
+        <w:t xml:space="preserve"> </w:t>
+      </w:r>
+      <w:r>
+        <w:rPr>
+          <w:b/>
+          <w:bCs/>
+        </w:rPr>
+        <w:t xml:space="preserve">POST /drive/v1/drives/{id}/rounds/{order}/scores</w:t>
+      </w:r>
+      <w:r>
+        <w:t xml:space="preserve"> </w:t>
+      </w:r>
+      <w:r>
+        <w:t xml:space="preserve">—</w:t>
+      </w:r>
+      <w:r>
+        <w:t xml:space="preserve"> </w:t>
+      </w:r>
+      <w:r>
+        <w:rPr>
+          <w:rStyle w:val="VerbatimChar"/>
+        </w:rPr>
+        <w:t xml:space="preserve">{ "candidate_id","marks":78,"max_marks":100,"remarks":"" }</w:t>
+      </w:r>
+      <w:r>
+        <w:t xml:space="preserve"> </w:t>
+      </w:r>
+      <w:r>
+        <w:t xml:space="preserve">→ score row.</w:t>
+      </w:r>
+      <w:r>
+        <w:t xml:space="preserve"> </w:t>
+      </w:r>
+      <w:r>
+        <w:rPr>
+          <w:b/>
+          <w:bCs/>
+        </w:rPr>
+        <w:t xml:space="preserve">POST /drive/v1/drives/{id}/rounds/{order}/publish</w:t>
+      </w:r>
+      <w:r>
+        <w:t xml:space="preserve"> </w:t>
+      </w:r>
+      <w:r>
+        <w:t xml:space="preserve">→</w:t>
+      </w:r>
+      <w:r>
+        <w:t xml:space="preserve"> </w:t>
+      </w:r>
+      <w:r>
+        <w:rPr>
+          <w:rStyle w:val="VerbatimChar"/>
+        </w:rPr>
+        <w:t xml:space="preserve">{ "advanced":9,"cleared_only":true }</w:t>
+      </w:r>
+      <w:r>
+        <w:t xml:space="preserve"> </w:t>
+      </w:r>
+      <w:r>
+        <w:t xml:space="preserve">(cleared candidates advance).</w:t>
+      </w:r>
+      <w:r>
+        <w:t xml:space="preserve"> </w:t>
+      </w:r>
+      <w:r>
+        <w:rPr>
+          <w:b/>
+          <w:bCs/>
+        </w:rPr>
+        <w:t xml:space="preserve">GET /drive/v1/drives/{id}/rounds/{order}/export?cleared=true</w:t>
+      </w:r>
+      <w:r>
+        <w:t xml:space="preserve"> </w:t>
+      </w:r>
+      <w:r>
+        <w:t xml:space="preserve">→ binary</w:t>
+      </w:r>
+      <w:r>
+        <w:t xml:space="preserve"> </w:t>
+      </w:r>
+      <w:r>
+        <w:rPr>
+          <w:rStyle w:val="VerbatimChar"/>
+        </w:rPr>
+        <w:t xml:space="preserve">.xlsx</w:t>
+      </w:r>
+      <w:r>
+        <w:t xml:space="preserve"> </w:t>
+      </w:r>
+      <w:r>
+        <w:t xml:space="preserve">(Content-Disposition attachment).</w:t>
+      </w:r>
+      <w:r>
+        <w:t xml:space="preserve"> </w:t>
+      </w:r>
+      <w:r>
+        <w:rPr>
+          <w:b/>
+          <w:bCs/>
+        </w:rPr>
+        <w:t xml:space="preserve">POST /drive/v1/results/compile</w:t>
+      </w:r>
+      <w:r>
+        <w:t xml:space="preserve"> </w:t>
+      </w:r>
+      <w:r>
+        <w:t xml:space="preserve">—</w:t>
+      </w:r>
+      <w:r>
+        <w:t xml:space="preserve"> </w:t>
+      </w:r>
+      <w:r>
+        <w:rPr>
+          <w:rStyle w:val="VerbatimChar"/>
+        </w:rPr>
+        <w:t xml:space="preserve">{ "drive_id","cutoff":60,"rows":[{"candidate_id","final_score":82,"interview_decision":"select"}] }</w:t>
+      </w:r>
+      <w:r>
+        <w:t xml:space="preserve"> </w:t>
+      </w:r>
+      <w:r>
+        <w:t xml:space="preserve">→</w:t>
+      </w:r>
+      <w:r>
+        <w:t xml:space="preserve"> </w:t>
+      </w:r>
+      <w:r>
+        <w:rPr>
+          <w:rStyle w:val="VerbatimChar"/>
+        </w:rPr>
+        <w:t xml:space="preserve">[ { "candidate_id","final_score","rank","outcome":"selected","status":"draft" } ]</w:t>
+      </w:r>
+      <w:r>
+        <w:t xml:space="preserve">.</w:t>
+      </w:r>
+      <w:r>
+        <w:t xml:space="preserve"> </w:t>
+      </w:r>
+      <w:r>
+        <w:rPr>
+          <w:b/>
+          <w:bCs/>
+        </w:rPr>
+        <w:t xml:space="preserve">POST /drive/v1/results/{driveId}/publish</w:t>
+      </w:r>
+      <w:r>
+        <w:t xml:space="preserve"> </w:t>
+      </w:r>
+      <w:r>
+        <w:t xml:space="preserve">→</w:t>
+      </w:r>
+      <w:r>
+        <w:t xml:space="preserve"> </w:t>
+      </w:r>
+      <w:r>
+        <w:rPr>
+          <w:rStyle w:val="VerbatimChar"/>
+        </w:rPr>
+        <w:t xml:space="preserve">[ { ... , "status":"published" } ]</w:t>
+      </w:r>
+      <w:r>
+        <w:t xml:space="preserve">.</w:t>
+      </w:r>
+      <w:r>
+        <w:t xml:space="preserve"> </w:t>
+      </w:r>
+      <w:r>
+        <w:rPr>
+          <w:b/>
+          <w:bCs/>
+        </w:rPr>
+        <w:t xml:space="preserve">POST /drive/v1/offers/generate</w:t>
+      </w:r>
+      <w:r>
+        <w:t xml:space="preserve"> </w:t>
+      </w:r>
+      <w:r>
+        <w:t xml:space="preserve">—</w:t>
+      </w:r>
+      <w:r>
+        <w:t xml:space="preserve"> </w:t>
+      </w:r>
+      <w:r>
+        <w:rPr>
+          <w:rStyle w:val="VerbatimChar"/>
+        </w:rPr>
+        <w:t xml:space="preserve">{ "drive_id","candidate_id","type":"ppo","company_name","role_title","ctc" }</w:t>
+      </w:r>
+      <w:r>
+        <w:t xml:space="preserve"> </w:t>
+      </w:r>
+      <w:r>
+        <w:t xml:space="preserve">→</w:t>
+      </w:r>
+      <w:r>
+        <w:t xml:space="preserve"> </w:t>
+      </w:r>
+      <w:r>
+        <w:rPr>
+          <w:rStyle w:val="VerbatimChar"/>
+        </w:rPr>
+        <w:t xml:space="preserve">{ "offer_id","verify_id","type":"ppo","status":"issued" }</w:t>
+      </w:r>
+      <w:r>
+        <w:t xml:space="preserve">.</w:t>
+      </w:r>
+      <w:r>
+        <w:t xml:space="preserve"> </w:t>
+      </w:r>
+      <w:r>
+        <w:rPr>
+          <w:b/>
+          <w:bCs/>
+        </w:rPr>
+        <w:t xml:space="preserve">POST /drive/v1/interviews/schedule</w:t>
+      </w:r>
+      <w:r>
+        <w:t xml:space="preserve"> </w:t>
+      </w:r>
+      <w:r>
+        <w:t xml:space="preserve">—</w:t>
+      </w:r>
+      <w:r>
+        <w:t xml:space="preserve"> </w:t>
+      </w:r>
+      <w:r>
+        <w:rPr>
+          <w:rStyle w:val="VerbatimChar"/>
+        </w:rPr>
+        <w:t xml:space="preserve">{ "drive_id","candidate_id","stage":"technical","mode":"online","slot" }</w:t>
+      </w:r>
+      <w:r>
+        <w:t xml:space="preserve"> </w:t>
+      </w:r>
+      <w:r>
+        <w:t xml:space="preserve">→ interview.</w:t>
+      </w:r>
+      <w:r>
+        <w:t xml:space="preserve"> </w:t>
+      </w:r>
+      <w:r>
+        <w:rPr>
+          <w:b/>
+          <w:bCs/>
+        </w:rPr>
+        <w:t xml:space="preserve">POST /drive/v1/interviews/{id}/rate</w:t>
+      </w:r>
+      <w:r>
+        <w:t xml:space="preserve"> </w:t>
+      </w:r>
+      <w:r>
+        <w:t xml:space="preserve">—</w:t>
+      </w:r>
+      <w:r>
+        <w:t xml:space="preserve"> </w:t>
+      </w:r>
+      <w:r>
+        <w:rPr>
+          <w:rStyle w:val="VerbatimChar"/>
+        </w:rPr>
+        <w:t xml:space="preserve">{ "competency":"technical","score":4,"remark":"" }</w:t>
+      </w:r>
+      <w:r>
+        <w:t xml:space="preserve"> </w:t>
+      </w:r>
+      <w:r>
+        <w:t xml:space="preserve">→</w:t>
+      </w:r>
+      <w:r>
+        <w:t xml:space="preserve"> </w:t>
+      </w:r>
+      <w:r>
+        <w:rPr>
+          <w:rStyle w:val="VerbatimChar"/>
+        </w:rPr>
+        <w:t xml:space="preserve">{ "avg_rating":4.2 }</w:t>
+      </w:r>
+      <w:r>
+        <w:t xml:space="preserve">.</w:t>
+      </w:r>
+      <w:r>
+        <w:t xml:space="preserve"> </w:t>
+      </w:r>
+      <w:r>
+        <w:rPr>
+          <w:b/>
+          <w:bCs/>
+        </w:rPr>
+        <w:t xml:space="preserve">POST /drive/v1/interviews/{id}/decision</w:t>
+      </w:r>
+      <w:r>
+        <w:t xml:space="preserve"> </w:t>
+      </w:r>
+      <w:r>
+        <w:t xml:space="preserve">—</w:t>
+      </w:r>
+      <w:r>
+        <w:t xml:space="preserve"> </w:t>
+      </w:r>
+      <w:r>
+        <w:rPr>
+          <w:rStyle w:val="VerbatimChar"/>
+        </w:rPr>
+        <w:t xml:space="preserve">{ "decision":"select","decision_reason":"" }</w:t>
+      </w:r>
+      <w:r>
+        <w:t xml:space="preserve"> </w:t>
+      </w:r>
+      <w:r>
+        <w:t xml:space="preserve">→</w:t>
+      </w:r>
+      <w:r>
+        <w:t xml:space="preserve"> </w:t>
+      </w:r>
+      <w:r>
+        <w:rPr>
+          <w:rStyle w:val="VerbatimChar"/>
+        </w:rPr>
+        <w:t xml:space="preserve">{ "status":"completed","decision":"select" }</w:t>
+      </w:r>
+      <w:r>
+        <w:t xml:space="preserve">.</w:t>
+      </w:r>
+      <w:r>
+        <w:t xml:space="preserve"> </w:t>
+      </w:r>
+      <w:r>
+        <w:rPr>
+          <w:b/>
+          <w:bCs/>
+        </w:rPr>
+        <w:t xml:space="preserve">POST /drive/v1/questions</w:t>
+      </w:r>
+      <w:r>
+        <w:t xml:space="preserve"> </w:t>
+      </w:r>
+      <w:r>
+        <w:t xml:space="preserve">—</w:t>
+      </w:r>
+      <w:r>
+        <w:t xml:space="preserve"> </w:t>
+      </w:r>
+      <w:r>
+        <w:rPr>
+          <w:rStyle w:val="VerbatimChar"/>
+        </w:rPr>
+        <w:t xml:space="preserve">{ "type":"mcq","category":"aptitude","difficulty":"easy","stem","options":[{"id","text"}],"answer_key":{"option":"b"} }</w:t>
+      </w:r>
+      <w:r>
+        <w:t xml:space="preserve"> </w:t>
+      </w:r>
+      <w:r>
+        <w:t xml:space="preserve">→</w:t>
+      </w:r>
+      <w:r>
+        <w:t xml:space="preserve"> </w:t>
+      </w:r>
+      <w:r>
+        <w:rPr>
+          <w:rStyle w:val="VerbatimChar"/>
+        </w:rPr>
+        <w:t xml:space="preserve">{ "id","status":"draft","version":1 }</w:t>
+      </w:r>
+      <w:r>
+        <w:t xml:space="preserve">.</w:t>
+      </w:r>
+      <w:r>
+        <w:t xml:space="preserve"> </w:t>
+      </w:r>
+      <w:r>
+        <w:rPr>
+          <w:b/>
+          <w:bCs/>
+        </w:rPr>
+        <w:t xml:space="preserve">POST /drive/v1/questions/generate</w:t>
+      </w:r>
+      <w:r>
+        <w:t xml:space="preserve"> </w:t>
+      </w:r>
+      <w:r>
+        <w:t xml:space="preserve">—</w:t>
+      </w:r>
+      <w:r>
+        <w:t xml:space="preserve"> </w:t>
+      </w:r>
+      <w:r>
+        <w:rPr>
+          <w:rStyle w:val="VerbatimChar"/>
+        </w:rPr>
+        <w:t xml:space="preserve">{ "category","difficulty","count":5,"topic" }</w:t>
+      </w:r>
+      <w:r>
+        <w:t xml:space="preserve"> </w:t>
+      </w:r>
+      <w:r>
+        <w:t xml:space="preserve">→</w:t>
+      </w:r>
+      <w:r>
+        <w:t xml:space="preserve"> </w:t>
+      </w:r>
+      <w:r>
+        <w:rPr>
+          <w:rStyle w:val="VerbatimChar"/>
+        </w:rPr>
+        <w:t xml:space="preserve">[ { question objects (draft) } ]</w:t>
+      </w:r>
+      <w:r>
+        <w:t xml:space="preserve">.</w:t>
+      </w:r>
+      <w:r>
+        <w:t xml:space="preserve"> </w:t>
+      </w:r>
+      <w:r>
+        <w:rPr>
+          <w:b/>
+          <w:bCs/>
+        </w:rPr>
+        <w:t xml:space="preserve">POST /drive/v1/blueprints/{id}/generate-paper</w:t>
+      </w:r>
+      <w:r>
+        <w:t xml:space="preserve"> </w:t>
+      </w:r>
+      <w:r>
+        <w:t xml:space="preserve">→</w:t>
+      </w:r>
+      <w:r>
+        <w:t xml:space="preserve"> </w:t>
+      </w:r>
+      <w:r>
+        <w:rPr>
+          <w:rStyle w:val="VerbatimChar"/>
+        </w:rPr>
+        <w:t xml:space="preserve">{ "exam_id","question_count":30 }</w:t>
+      </w:r>
+      <w:r>
+        <w:t xml:space="preserve">.</w:t>
+      </w:r>
+      <w:r>
+        <w:t xml:space="preserve"> </w:t>
+      </w:r>
+      <w:r>
+        <w:rPr>
+          <w:b/>
+          <w:bCs/>
+        </w:rPr>
+        <w:t xml:space="preserve">POST /drive/v1/evaluations/rank</w:t>
+      </w:r>
+      <w:r>
+        <w:t xml:space="preserve"> </w:t>
+      </w:r>
+      <w:r>
+        <w:t xml:space="preserve">—</w:t>
+      </w:r>
+      <w:r>
+        <w:t xml:space="preserve"> </w:t>
+      </w:r>
+      <w:r>
+        <w:rPr>
+          <w:rStyle w:val="VerbatimChar"/>
+        </w:rPr>
+        <w:t xml:space="preserve">{ "exam_id" }</w:t>
+      </w:r>
+      <w:r>
+        <w:t xml:space="preserve"> </w:t>
+      </w:r>
+      <w:r>
+        <w:t xml:space="preserve">→</w:t>
+      </w:r>
+      <w:r>
+        <w:t xml:space="preserve"> </w:t>
+      </w:r>
+      <w:r>
+        <w:rPr>
+          <w:rStyle w:val="VerbatimChar"/>
+        </w:rPr>
+        <w:t xml:space="preserve">[ { "candidate_id","rank","percentage" } ]</w:t>
+      </w:r>
+      <w:r>
+        <w:t xml:space="preserve">.</w:t>
+      </w:r>
+    </w:p>
+    <w:bookmarkEnd w:id="170"/>
+    <w:bookmarkStart w:id="171" w:name="platform-1"/>
+    <w:p>
+      <w:pPr>
+        <w:pStyle w:val="Heading2"/>
+      </w:pPr>
+      <w:r>
+        <w:t xml:space="preserve">18.11 Platform</w:t>
+      </w:r>
+    </w:p>
+    <w:p>
+      <w:pPr>
+        <w:pStyle w:val="FirstParagraph"/>
+      </w:pPr>
+      <w:r>
+        <w:rPr>
+          <w:b/>
+          <w:bCs/>
+        </w:rPr>
+        <w:t xml:space="preserve">GET /analytics/v1/dashboard/{role}</w:t>
+      </w:r>
+      <w:r>
+        <w:t xml:space="preserve"> </w:t>
+      </w:r>
+      <w:r>
+        <w:t xml:space="preserve">→</w:t>
+      </w:r>
+      <w:r>
+        <w:t xml:space="preserve"> </w:t>
+      </w:r>
+      <w:r>
+        <w:rPr>
+          <w:rStyle w:val="VerbatimChar"/>
+        </w:rPr>
+        <w:t xml:space="preserve">{ "role":"college_admin","colleges":2,"learners":1880,"drives":6,"top_colleges":[{"rank":1,"college_id","readiness_index":81.6}] }</w:t>
+      </w:r>
+      <w:r>
+        <w:t xml:space="preserve">.</w:t>
+      </w:r>
+      <w:r>
+        <w:t xml:space="preserve"> </w:t>
+      </w:r>
+      <w:r>
+        <w:rPr>
+          <w:b/>
+          <w:bCs/>
+        </w:rPr>
+        <w:t xml:space="preserve">GET /analytics/v1/colleges/ranking</w:t>
+      </w:r>
+      <w:r>
+        <w:t xml:space="preserve"> </w:t>
+      </w:r>
+      <w:r>
+        <w:t xml:space="preserve">→</w:t>
+      </w:r>
+      <w:r>
+        <w:t xml:space="preserve"> </w:t>
+      </w:r>
+      <w:r>
+        <w:rPr>
+          <w:rStyle w:val="VerbatimChar"/>
+        </w:rPr>
+        <w:t xml:space="preserve">[ { "rank":1,"college_id","readiness_index":81.6 } ]</w:t>
+      </w:r>
+      <w:r>
+        <w:t xml:space="preserve">.</w:t>
+      </w:r>
+      <w:r>
+        <w:t xml:space="preserve"> </w:t>
+      </w:r>
+      <w:r>
+        <w:rPr>
+          <w:b/>
+          <w:bCs/>
+        </w:rPr>
+        <w:t xml:space="preserve">GET /notify/v1/inbox</w:t>
+      </w:r>
+      <w:r>
+        <w:t xml:space="preserve"> </w:t>
+      </w:r>
+      <w:r>
+        <w:t xml:space="preserve">→</w:t>
+      </w:r>
+      <w:r>
+        <w:t xml:space="preserve"> </w:t>
+      </w:r>
+      <w:r>
+        <w:rPr>
+          <w:rStyle w:val="VerbatimChar"/>
+        </w:rPr>
+        <w:t xml:space="preserve">[ { "id","template_key":"badge_earned","subject","body","read":false,"created_at" } ]</w:t>
+      </w:r>
+      <w:r>
+        <w:t xml:space="preserve">.</w:t>
+      </w:r>
+      <w:r>
+        <w:t xml:space="preserve"> </w:t>
+      </w:r>
+      <w:r>
+        <w:rPr>
+          <w:b/>
+          <w:bCs/>
+        </w:rPr>
+        <w:t xml:space="preserve">POST /notify/v1/inbox/{id}/read</w:t>
+      </w:r>
+      <w:r>
+        <w:t xml:space="preserve"> </w:t>
+      </w:r>
+      <w:r>
+        <w:t xml:space="preserve">→</w:t>
+      </w:r>
+      <w:r>
+        <w:t xml:space="preserve"> </w:t>
+      </w:r>
+      <w:r>
+        <w:rPr>
+          <w:rStyle w:val="VerbatimChar"/>
+        </w:rPr>
+        <w:t xml:space="preserve">{ "id","read":true }</w:t>
+      </w:r>
+      <w:r>
+        <w:t xml:space="preserve">.</w:t>
+      </w:r>
+      <w:r>
+        <w:t xml:space="preserve"> </w:t>
+      </w:r>
+      <w:r>
+        <w:rPr>
+          <w:b/>
+          <w:bCs/>
+        </w:rPr>
+        <w:t xml:space="preserve">POST /files/v1/upload-url</w:t>
+      </w:r>
+      <w:r>
+        <w:t xml:space="preserve"> </w:t>
+      </w:r>
+      <w:r>
+        <w:t xml:space="preserve">—</w:t>
+      </w:r>
+      <w:r>
+        <w:t xml:space="preserve"> </w:t>
+      </w:r>
+      <w:r>
+        <w:rPr>
+          <w:rStyle w:val="VerbatimChar"/>
+        </w:rPr>
+        <w:t xml:space="preserve">{ "purpose":"resume","filename","mime","size" }</w:t>
+      </w:r>
+      <w:r>
+        <w:t xml:space="preserve"> </w:t>
+      </w:r>
+      <w:r>
+        <w:t xml:space="preserve">→</w:t>
+      </w:r>
+      <w:r>
+        <w:t xml:space="preserve"> </w:t>
+      </w:r>
+      <w:r>
+        <w:rPr>
+          <w:rStyle w:val="VerbatimChar"/>
+        </w:rPr>
+        <w:t xml:space="preserve">{ "file_id","upload_token","upload_url" }</w:t>
+      </w:r>
+      <w:r>
+        <w:t xml:space="preserve">. Then</w:t>
+      </w:r>
+      <w:r>
+        <w:t xml:space="preserve"> </w:t>
+      </w:r>
+      <w:r>
+        <w:rPr>
+          <w:b/>
+          <w:bCs/>
+        </w:rPr>
+        <w:t xml:space="preserve">PUT /files/v1/upload/{token}</w:t>
+      </w:r>
+      <w:r>
+        <w:t xml:space="preserve"> </w:t>
+      </w:r>
+      <w:r>
+        <w:t xml:space="preserve">(raw bytes) and</w:t>
+      </w:r>
+      <w:r>
+        <w:t xml:space="preserve"> </w:t>
+      </w:r>
+      <w:r>
+        <w:rPr>
+          <w:b/>
+          <w:bCs/>
+        </w:rPr>
+        <w:t xml:space="preserve">POST /files/v1/{fileId}/complete</w:t>
+      </w:r>
+      <w:r>
+        <w:t xml:space="preserve"> </w:t>
+      </w:r>
+      <w:r>
+        <w:t xml:space="preserve">→</w:t>
+      </w:r>
+      <w:r>
+        <w:t xml:space="preserve"> </w:t>
+      </w:r>
+      <w:r>
+        <w:rPr>
+          <w:rStyle w:val="VerbatimChar"/>
+        </w:rPr>
+        <w:t xml:space="preserve">{ "file_id","status":"ready" }</w:t>
+      </w:r>
+      <w:r>
+        <w:t xml:space="preserve">.</w:t>
+      </w:r>
+      <w:r>
+        <w:t xml:space="preserve"> </w:t>
+      </w:r>
+      <w:r>
+        <w:rPr>
+          <w:b/>
+          <w:bCs/>
+        </w:rPr>
+        <w:t xml:space="preserve">POST /ai/v1/tutor/chat</w:t>
+      </w:r>
+      <w:r>
+        <w:t xml:space="preserve"> </w:t>
+      </w:r>
+      <w:r>
+        <w:t xml:space="preserve">—</w:t>
+      </w:r>
+      <w:r>
+        <w:t xml:space="preserve"> </w:t>
+      </w:r>
+      <w:r>
+        <w:rPr>
+          <w:rStyle w:val="VerbatimChar"/>
+        </w:rPr>
+        <w:t xml:space="preserve">{ "message","session_id","context" }</w:t>
+      </w:r>
+      <w:r>
+        <w:t xml:space="preserve"> </w:t>
+      </w:r>
+      <w:r>
+        <w:t xml:space="preserve">→</w:t>
+      </w:r>
+      <w:r>
+        <w:t xml:space="preserve"> </w:t>
+      </w:r>
+      <w:r>
+        <w:rPr>
+          <w:rStyle w:val="VerbatimChar"/>
+        </w:rPr>
+        <w:t xml:space="preserve">{ "session_id","reply":"...","messages":[...] }</w:t>
+      </w:r>
+      <w:r>
+        <w:t xml:space="preserve">.</w:t>
+      </w:r>
+      <w:r>
+        <w:t xml:space="preserve"> </w:t>
+      </w:r>
+      <w:r>
+        <w:rPr>
+          <w:b/>
+          <w:bCs/>
+        </w:rPr>
+        <w:t xml:space="preserve">POST /ai/v1/tutor/study-plan</w:t>
+      </w:r>
+      <w:r>
+        <w:t xml:space="preserve"> </w:t>
+      </w:r>
+      <w:r>
+        <w:t xml:space="preserve">—</w:t>
+      </w:r>
+      <w:r>
+        <w:t xml:space="preserve"> </w:t>
+      </w:r>
+      <w:r>
+        <w:rPr>
+          <w:rStyle w:val="VerbatimChar"/>
+        </w:rPr>
+        <w:t xml:space="preserve">{ "variables":{ "year_no":2,"scorecard":{...},"weak_areas":[...],"goal":"TCS NQT","hours":10 } }</w:t>
+      </w:r>
+      <w:r>
+        <w:t xml:space="preserve"> </w:t>
+      </w:r>
+      <w:r>
+        <w:t xml:space="preserve">→</w:t>
+      </w:r>
+      <w:r>
+        <w:t xml:space="preserve"> </w:t>
+      </w:r>
+      <w:r>
+        <w:rPr>
+          <w:rStyle w:val="VerbatimChar"/>
+        </w:rPr>
+        <w:t xml:space="preserve">{ "plan":{...} }</w:t>
+      </w:r>
+      <w:r>
+        <w:t xml:space="preserve">.</w:t>
+      </w:r>
+    </w:p>
+    <w:p>
+      <w:r>
         <w:pict>
           <v:rect style="width:0;height:1.5pt" o:hralign="center" o:hrstd="t" o:hr="t"/>
         </w:pict>
@@ -24853,8 +28589,8 @@
         <w:t xml:space="preserve">End of document. Prepared for LARE Cloud Solutions - a unit of LARE Consulting &amp; Technology Pvt. Ltd.</w:t>
       </w:r>
     </w:p>
-    <w:bookmarkEnd w:id="159"/>
-    <w:bookmarkEnd w:id="160"/>
+    <w:bookmarkEnd w:id="171"/>
+    <w:bookmarkEnd w:id="172"/>
     <w:sectPr>
       <w:footnotePr>
         <w:numRestart w:val="eachSect"/>

</xml_diff>

<commit_message>
docs: add detailed screen reference part 1 (Assessments, Drill, Keep Sharp, Skill Map)
Co-Authored-By: Claude Opus 4.8 <noreply@anthropic.com>
</commit_message>
<xml_diff>
--- a/docs/LARE-Documentation.docx
+++ b/docs/LARE-Documentation.docx
@@ -28572,6 +28572,2366 @@
     </w:p>
     <w:p>
       <w:r>
+        <w:br w:type="page"/>
+      </w:r>
+    </w:p>
+    <w:bookmarkEnd w:id="171"/>
+    <w:bookmarkEnd w:id="172"/>
+    <w:bookmarkStart w:id="177" w:name="Xdb24d64fd74c8350d1a9e3a8964f2bfde7ebd28"/>
+    <w:p>
+      <w:pPr>
+        <w:pStyle w:val="Heading1"/>
+      </w:pPr>
+      <w:r>
+        <w:t xml:space="preserve">19. Detailed Screen Reference — LARE Learn (Part 1)</w:t>
+      </w:r>
+    </w:p>
+    <w:p>
+      <w:pPr>
+        <w:pStyle w:val="FirstParagraph"/>
+      </w:pPr>
+      <w:r>
+        <w:t xml:space="preserve">This section documents selected screens at element level (source: the page components). Each screen lists its phases/states, every interactive control, and the exact API calls and side effects.</w:t>
+      </w:r>
+    </w:p>
+    <w:bookmarkStart w:id="173" w:name="assessments-lmsassessments"/>
+    <w:p>
+      <w:pPr>
+        <w:pStyle w:val="Heading2"/>
+      </w:pPr>
+      <w:r>
+        <w:t xml:space="preserve">19.1 Assessments (</w:t>
+      </w:r>
+      <w:r>
+        <w:rPr>
+          <w:rStyle w:val="VerbatimChar"/>
+        </w:rPr>
+        <w:t xml:space="preserve">/lms/assessments</w:t>
+      </w:r>
+      <w:r>
+        <w:t xml:space="preserve">)</w:t>
+      </w:r>
+    </w:p>
+    <w:p>
+      <w:pPr>
+        <w:pStyle w:val="FirstParagraph"/>
+      </w:pPr>
+      <w:r>
+        <w:t xml:space="preserve">A three-phase take-flow:</w:t>
+      </w:r>
+      <w:r>
+        <w:t xml:space="preserve"> </w:t>
+      </w:r>
+      <w:r>
+        <w:rPr>
+          <w:b/>
+          <w:bCs/>
+        </w:rPr>
+        <w:t xml:space="preserve">intro → taking → done</w:t>
+      </w:r>
+      <w:r>
+        <w:t xml:space="preserve">. Proctored assessments enforce fullscreen + anti-cheat with a</w:t>
+      </w:r>
+      <w:r>
+        <w:t xml:space="preserve"> </w:t>
+      </w:r>
+      <w:r>
+        <w:rPr>
+          <w:b/>
+          <w:bCs/>
+        </w:rPr>
+        <w:t xml:space="preserve">5-warning auto-submit</w:t>
+      </w:r>
+      <w:r>
+        <w:t xml:space="preserve"> </w:t>
+      </w:r>
+      <w:r>
+        <w:t xml:space="preserve">(the same engine as LARE Hire exams;</w:t>
+      </w:r>
+      <w:r>
+        <w:t xml:space="preserve"> </w:t>
+      </w:r>
+      <w:r>
+        <w:rPr>
+          <w:rStyle w:val="VerbatimChar"/>
+        </w:rPr>
+        <w:t xml:space="preserve">VIOLATION_LIMIT = 5</w:t>
+      </w:r>
+      <w:r>
+        <w:t xml:space="preserve">).</w:t>
+      </w:r>
+    </w:p>
+    <w:p>
+      <w:pPr>
+        <w:pStyle w:val="BodyText"/>
+      </w:pPr>
+      <w:r>
+        <w:rPr>
+          <w:b/>
+          <w:bCs/>
+        </w:rPr>
+        <w:t xml:space="preserve">Phase</w:t>
+      </w:r>
+      <w:r>
+        <w:rPr>
+          <w:b/>
+          <w:bCs/>
+        </w:rPr>
+        <w:t xml:space="preserve"> </w:t>
+      </w:r>
+      <w:r>
+        <w:rPr>
+          <w:rStyle w:val="VerbatimChar"/>
+          <w:b/>
+          <w:bCs/>
+        </w:rPr>
+        <w:t xml:space="preserve">intro</w:t>
+      </w:r>
+      <w:r>
+        <w:t xml:space="preserve"> </w:t>
+      </w:r>
+      <w:r>
+        <w:t xml:space="preserve">- On mount,</w:t>
+      </w:r>
+      <w:r>
+        <w:t xml:space="preserve"> </w:t>
+      </w:r>
+      <w:r>
+        <w:rPr>
+          <w:rStyle w:val="VerbatimChar"/>
+        </w:rPr>
+        <w:t xml:space="preserve">GET /lms/v1/assessments</w:t>
+      </w:r>
+      <w:r>
+        <w:t xml:space="preserve"> </w:t>
+      </w:r>
+      <w:r>
+        <w:t xml:space="preserve">populates the card grid; if empty, a sample card is shown with the note</w:t>
+      </w:r>
+      <w:r>
+        <w:t xml:space="preserve"> </w:t>
+      </w:r>
+      <w:r>
+        <w:rPr>
+          <w:i/>
+          <w:iCs/>
+        </w:rPr>
+        <w:t xml:space="preserve">“your trainer’s published assessments will appear here.”</w:t>
+      </w:r>
+      <w:r>
+        <w:t xml:space="preserve"> </w:t>
+      </w:r>
+      <w:r>
+        <w:t xml:space="preserve">-</w:t>
+      </w:r>
+      <w:r>
+        <w:t xml:space="preserve"> </w:t>
+      </w:r>
+      <w:r>
+        <w:rPr>
+          <w:b/>
+          <w:bCs/>
+        </w:rPr>
+        <w:t xml:space="preserve">Assessment card</w:t>
+      </w:r>
+      <w:r>
+        <w:t xml:space="preserve"> </w:t>
+      </w:r>
+      <w:r>
+        <w:t xml:space="preserve">— icon, title,</w:t>
+      </w:r>
+      <w:r>
+        <w:t xml:space="preserve"> </w:t>
+      </w:r>
+      <w:r>
+        <w:rPr>
+          <w:rStyle w:val="VerbatimChar"/>
+        </w:rPr>
+        <w:t xml:space="preserve">item_count</w:t>
+      </w:r>
+      <w:r>
+        <w:t xml:space="preserve"> </w:t>
+      </w:r>
+      <w:r>
+        <w:t xml:space="preserve">+</w:t>
+      </w:r>
+      <w:r>
+        <w:t xml:space="preserve"> </w:t>
+      </w:r>
+      <w:r>
+        <w:rPr>
+          <w:rStyle w:val="VerbatimChar"/>
+        </w:rPr>
+        <w:t xml:space="preserve">passing_pct</w:t>
+      </w:r>
+      <w:r>
+        <w:t xml:space="preserve">, optional time limit (</w:t>
+      </w:r>
+      <w:r>
+        <w:rPr>
+          <w:rStyle w:val="VerbatimChar"/>
+        </w:rPr>
+        <w:t xml:space="preserve">Timer</w:t>
+      </w:r>
+      <w:r>
+        <w:t xml:space="preserve">), a</w:t>
+      </w:r>
+      <w:r>
+        <w:t xml:space="preserve"> </w:t>
+      </w:r>
+      <w:r>
+        <w:t xml:space="preserve">“+XP on pass”</w:t>
+      </w:r>
+      <w:r>
+        <w:t xml:space="preserve"> </w:t>
+      </w:r>
+      <w:r>
+        <w:t xml:space="preserve">hint, and a</w:t>
+      </w:r>
+      <w:r>
+        <w:t xml:space="preserve"> </w:t>
+      </w:r>
+      <w:r>
+        <w:rPr>
+          <w:b/>
+          <w:bCs/>
+        </w:rPr>
+        <w:t xml:space="preserve">Proctored</w:t>
+      </w:r>
+      <w:r>
+        <w:t xml:space="preserve"> </w:t>
+      </w:r>
+      <w:r>
+        <w:t xml:space="preserve">badge (</w:t>
+      </w:r>
+      <w:r>
+        <w:rPr>
+          <w:rStyle w:val="VerbatimChar"/>
+        </w:rPr>
+        <w:t xml:space="preserve">ShieldAlert</w:t>
+      </w:r>
+      <w:r>
+        <w:t xml:space="preserve">) when</w:t>
+      </w:r>
+      <w:r>
+        <w:t xml:space="preserve"> </w:t>
+      </w:r>
+      <w:r>
+        <w:rPr>
+          <w:rStyle w:val="VerbatimChar"/>
+        </w:rPr>
+        <w:t xml:space="preserve">proctored=true</w:t>
+      </w:r>
+      <w:r>
+        <w:t xml:space="preserve">.</w:t>
+      </w:r>
+      <w:r>
+        <w:t xml:space="preserve"> </w:t>
+      </w:r>
+      <w:r>
+        <w:t xml:space="preserve">-</w:t>
+      </w:r>
+      <w:r>
+        <w:t xml:space="preserve"> </w:t>
+      </w:r>
+      <w:r>
+        <w:rPr>
+          <w:b/>
+          <w:bCs/>
+        </w:rPr>
+        <w:t xml:space="preserve">Button: Start assessment</w:t>
+      </w:r>
+      <w:r>
+        <w:t xml:space="preserve"> </w:t>
+      </w:r>
+      <w:r>
+        <w:t xml:space="preserve">→</w:t>
+      </w:r>
+      <w:r>
+        <w:t xml:space="preserve"> </w:t>
+      </w:r>
+      <w:r>
+        <w:rPr>
+          <w:rStyle w:val="VerbatimChar"/>
+        </w:rPr>
+        <w:t xml:space="preserve">start(a)</w:t>
+      </w:r>
+      <w:r>
+        <w:t xml:space="preserve">:</w:t>
+      </w:r>
+      <w:r>
+        <w:t xml:space="preserve"> </w:t>
+      </w:r>
+      <w:r>
+        <w:rPr>
+          <w:rStyle w:val="VerbatimChar"/>
+        </w:rPr>
+        <w:t xml:space="preserve">GET /lms/v1/assessments/{id}</w:t>
+      </w:r>
+      <w:r>
+        <w:t xml:space="preserve"> </w:t>
+      </w:r>
+      <w:r>
+        <w:t xml:space="preserve">then</w:t>
+      </w:r>
+      <w:r>
+        <w:t xml:space="preserve"> </w:t>
+      </w:r>
+      <w:r>
+        <w:rPr>
+          <w:rStyle w:val="VerbatimChar"/>
+        </w:rPr>
+        <w:t xml:space="preserve">POST .../attempts { learner_id }</w:t>
+      </w:r>
+      <w:r>
+        <w:t xml:space="preserve">. If the assessment is proctored, the app requests</w:t>
+      </w:r>
+      <w:r>
+        <w:t xml:space="preserve"> </w:t>
+      </w:r>
+      <w:r>
+        <w:rPr>
+          <w:b/>
+          <w:bCs/>
+        </w:rPr>
+        <w:t xml:space="preserve">fullscreen</w:t>
+      </w:r>
+      <w:r>
+        <w:t xml:space="preserve">. If the fetch fails or returns no items, it never enters the take-flow with an empty paper.</w:t>
+      </w:r>
+    </w:p>
+    <w:p>
+      <w:pPr>
+        <w:pStyle w:val="BodyText"/>
+      </w:pPr>
+      <w:r>
+        <w:rPr>
+          <w:b/>
+          <w:bCs/>
+        </w:rPr>
+        <w:t xml:space="preserve">Phase</w:t>
+      </w:r>
+      <w:r>
+        <w:rPr>
+          <w:b/>
+          <w:bCs/>
+        </w:rPr>
+        <w:t xml:space="preserve"> </w:t>
+      </w:r>
+      <w:r>
+        <w:rPr>
+          <w:rStyle w:val="VerbatimChar"/>
+          <w:b/>
+          <w:bCs/>
+        </w:rPr>
+        <w:t xml:space="preserve">taking</w:t>
+      </w:r>
+      <w:r>
+        <w:t xml:space="preserve"> </w:t>
+      </w:r>
+      <w:r>
+        <w:t xml:space="preserve">-</w:t>
+      </w:r>
+      <w:r>
+        <w:t xml:space="preserve"> </w:t>
+      </w:r>
+      <w:r>
+        <w:rPr>
+          <w:b/>
+          <w:bCs/>
+        </w:rPr>
+        <w:t xml:space="preserve">PageHeader</w:t>
+      </w:r>
+      <w:r>
+        <w:t xml:space="preserve"> </w:t>
+      </w:r>
+      <w:r>
+        <w:t xml:space="preserve">shows the title and a live</w:t>
+      </w:r>
+      <w:r>
+        <w:t xml:space="preserve"> </w:t>
+      </w:r>
+      <w:r>
+        <w:rPr>
+          <w:rStyle w:val="VerbatimChar"/>
+        </w:rPr>
+        <w:t xml:space="preserve">answered/total</w:t>
+      </w:r>
+      <w:r>
+        <w:t xml:space="preserve"> </w:t>
+      </w:r>
+      <w:r>
+        <w:t xml:space="preserve">counter;</w:t>
+      </w:r>
+      <w:r>
+        <w:t xml:space="preserve"> </w:t>
+      </w:r>
+      <w:r>
+        <w:rPr>
+          <w:b/>
+          <w:bCs/>
+        </w:rPr>
+        <w:t xml:space="preserve">DataSource</w:t>
+      </w:r>
+      <w:r>
+        <w:t xml:space="preserve"> </w:t>
+      </w:r>
+      <w:r>
+        <w:t xml:space="preserve">shows live vs. offline.</w:t>
+      </w:r>
+      <w:r>
+        <w:t xml:space="preserve"> </w:t>
+      </w:r>
+      <w:r>
+        <w:t xml:space="preserve">-</w:t>
+      </w:r>
+      <w:r>
+        <w:t xml:space="preserve"> </w:t>
+      </w:r>
+      <w:r>
+        <w:rPr>
+          <w:b/>
+          <w:bCs/>
+        </w:rPr>
+        <w:t xml:space="preserve">Proctor banner</w:t>
+      </w:r>
+      <w:r>
+        <w:t xml:space="preserve"> </w:t>
+      </w:r>
+      <w:r>
+        <w:t xml:space="preserve">(proctored only) — shows</w:t>
+      </w:r>
+      <w:r>
+        <w:t xml:space="preserve"> </w:t>
+      </w:r>
+      <w:r>
+        <w:rPr>
+          <w:rStyle w:val="VerbatimChar"/>
+        </w:rPr>
+        <w:t xml:space="preserve">violations/5</w:t>
+      </w:r>
+      <w:r>
+        <w:t xml:space="preserve"> </w:t>
+      </w:r>
+      <w:r>
+        <w:t xml:space="preserve">warnings; turns rose at ≥3; explains that tab-switch, copy, or exiting fullscreen is flagged, and that reaching 5 auto-submits. Displays the</w:t>
+      </w:r>
+      <w:r>
+        <w:t xml:space="preserve"> </w:t>
+      </w:r>
+      <w:r>
+        <w:rPr>
+          <w:b/>
+          <w:bCs/>
+        </w:rPr>
+        <w:t xml:space="preserve">last flag</w:t>
+      </w:r>
+      <w:r>
+        <w:t xml:space="preserve"> </w:t>
+      </w:r>
+      <w:r>
+        <w:t xml:space="preserve">label.</w:t>
+      </w:r>
+      <w:r>
+        <w:t xml:space="preserve"> </w:t>
+      </w:r>
+      <w:r>
+        <w:t xml:space="preserve">-</w:t>
+      </w:r>
+      <w:r>
+        <w:t xml:space="preserve"> </w:t>
+      </w:r>
+      <w:r>
+        <w:rPr>
+          <w:b/>
+          <w:bCs/>
+        </w:rPr>
+        <w:t xml:space="preserve">Question card</w:t>
+      </w:r>
+      <w:r>
+        <w:t xml:space="preserve"> </w:t>
+      </w:r>
+      <w:r>
+        <w:t xml:space="preserve">— index, prompt/stem, and radio options; selecting an option writes</w:t>
+      </w:r>
+      <w:r>
+        <w:t xml:space="preserve"> </w:t>
+      </w:r>
+      <w:r>
+        <w:rPr>
+          <w:rStyle w:val="VerbatimChar"/>
+        </w:rPr>
+        <w:t xml:space="preserve">answers[itemId]=optionId</w:t>
+      </w:r>
+      <w:r>
+        <w:t xml:space="preserve"> </w:t>
+      </w:r>
+      <w:r>
+        <w:t xml:space="preserve">and highlights the choice.</w:t>
+      </w:r>
+      <w:r>
+        <w:t xml:space="preserve"> </w:t>
+      </w:r>
+      <w:r>
+        <w:t xml:space="preserve">-</w:t>
+      </w:r>
+      <w:r>
+        <w:t xml:space="preserve"> </w:t>
+      </w:r>
+      <w:r>
+        <w:rPr>
+          <w:b/>
+          <w:bCs/>
+        </w:rPr>
+        <w:t xml:space="preserve">Anti-cheat</w:t>
+      </w:r>
+      <w:r>
+        <w:t xml:space="preserve"> </w:t>
+      </w:r>
+      <w:r>
+        <w:t xml:space="preserve">— while taking a proctored assessment,</w:t>
+      </w:r>
+      <w:r>
+        <w:t xml:space="preserve"> </w:t>
+      </w:r>
+      <w:r>
+        <w:rPr>
+          <w:rStyle w:val="VerbatimChar"/>
+        </w:rPr>
+        <w:t xml:space="preserve">attachProctoring</w:t>
+      </w:r>
+      <w:r>
+        <w:t xml:space="preserve"> </w:t>
+      </w:r>
+      <w:r>
+        <w:t xml:space="preserve">listens for violations; each increments the counter and, at 5, calls</w:t>
+      </w:r>
+      <w:r>
+        <w:t xml:space="preserve"> </w:t>
+      </w:r>
+      <w:r>
+        <w:rPr>
+          <w:rStyle w:val="VerbatimChar"/>
+        </w:rPr>
+        <w:t xml:space="preserve">submit("proctor")</w:t>
+      </w:r>
+      <w:r>
+        <w:t xml:space="preserve">.</w:t>
+      </w:r>
+      <w:r>
+        <w:t xml:space="preserve"> </w:t>
+      </w:r>
+      <w:r>
+        <w:t xml:space="preserve">-</w:t>
+      </w:r>
+      <w:r>
+        <w:t xml:space="preserve"> </w:t>
+      </w:r>
+      <w:r>
+        <w:rPr>
+          <w:b/>
+          <w:bCs/>
+        </w:rPr>
+        <w:t xml:space="preserve">Button: Submit assessment</w:t>
+      </w:r>
+      <w:r>
+        <w:t xml:space="preserve"> </w:t>
+      </w:r>
+      <w:r>
+        <w:t xml:space="preserve">— disabled until ≥1 answered →</w:t>
+      </w:r>
+      <w:r>
+        <w:t xml:space="preserve"> </w:t>
+      </w:r>
+      <w:r>
+        <w:rPr>
+          <w:rStyle w:val="VerbatimChar"/>
+        </w:rPr>
+        <w:t xml:space="preserve">submit()</w:t>
+      </w:r>
+      <w:r>
+        <w:t xml:space="preserve">: exits fullscreen, maps answers to</w:t>
+      </w:r>
+      <w:r>
+        <w:t xml:space="preserve"> </w:t>
+      </w:r>
+      <w:r>
+        <w:rPr>
+          <w:rStyle w:val="VerbatimChar"/>
+        </w:rPr>
+        <w:t xml:space="preserve">{ [qid]: { option } }</w:t>
+      </w:r>
+      <w:r>
+        <w:t xml:space="preserve">, and calls</w:t>
+      </w:r>
+      <w:r>
+        <w:t xml:space="preserve"> </w:t>
+      </w:r>
+      <w:r>
+        <w:rPr>
+          <w:rStyle w:val="VerbatimChar"/>
+        </w:rPr>
+        <w:t xml:space="preserve">POST /lms/v1/attempts/{attemptId}/submit</w:t>
+      </w:r>
+      <w:r>
+        <w:t xml:space="preserve">.</w:t>
+      </w:r>
+    </w:p>
+    <w:p>
+      <w:pPr>
+        <w:pStyle w:val="BodyText"/>
+      </w:pPr>
+      <w:r>
+        <w:rPr>
+          <w:b/>
+          <w:bCs/>
+        </w:rPr>
+        <w:t xml:space="preserve">Phase</w:t>
+      </w:r>
+      <w:r>
+        <w:rPr>
+          <w:b/>
+          <w:bCs/>
+        </w:rPr>
+        <w:t xml:space="preserve"> </w:t>
+      </w:r>
+      <w:r>
+        <w:rPr>
+          <w:rStyle w:val="VerbatimChar"/>
+          <w:b/>
+          <w:bCs/>
+        </w:rPr>
+        <w:t xml:space="preserve">done</w:t>
+      </w:r>
+      <w:r>
+        <w:t xml:space="preserve"> </w:t>
+      </w:r>
+      <w:r>
+        <w:t xml:space="preserve">- Result card — pass/fail icon, big</w:t>
+      </w:r>
+      <w:r>
+        <w:t xml:space="preserve"> </w:t>
+      </w:r>
+      <w:r>
+        <w:rPr>
+          <w:b/>
+          <w:bCs/>
+        </w:rPr>
+        <w:t xml:space="preserve">percentage</w:t>
+      </w:r>
+      <w:r>
+        <w:t xml:space="preserve">, a Passed/Keep-practising badge,</w:t>
+      </w:r>
+      <w:r>
+        <w:t xml:space="preserve"> </w:t>
+      </w:r>
+      <w:r>
+        <w:rPr>
+          <w:rStyle w:val="VerbatimChar"/>
+        </w:rPr>
+        <w:t xml:space="preserve">score/max_score</w:t>
+      </w:r>
+      <w:r>
+        <w:t xml:space="preserve">, optional</w:t>
+      </w:r>
+      <w:r>
+        <w:t xml:space="preserve"> </w:t>
+      </w:r>
+      <w:r>
+        <w:t xml:space="preserve">“pending manual grade”</w:t>
+      </w:r>
+      <w:r>
+        <w:t xml:space="preserve"> </w:t>
+      </w:r>
+      <w:r>
+        <w:t xml:space="preserve">note, and an</w:t>
+      </w:r>
+      <w:r>
+        <w:t xml:space="preserve"> </w:t>
+      </w:r>
+      <w:r>
+        <w:rPr>
+          <w:b/>
+          <w:bCs/>
+        </w:rPr>
+        <w:t xml:space="preserve">auto-submitted</w:t>
+      </w:r>
+      <w:r>
+        <w:t xml:space="preserve"> </w:t>
+      </w:r>
+      <w:r>
+        <w:t xml:space="preserve">warning if the proctor limit was hit.</w:t>
+      </w:r>
+      <w:r>
+        <w:t xml:space="preserve"> </w:t>
+      </w:r>
+      <w:r>
+        <w:t xml:space="preserve">-</w:t>
+      </w:r>
+      <w:r>
+        <w:t xml:space="preserve"> </w:t>
+      </w:r>
+      <w:r>
+        <w:rPr>
+          <w:b/>
+          <w:bCs/>
+        </w:rPr>
+        <w:t xml:space="preserve">Buttons: Back</w:t>
+      </w:r>
+      <w:r>
+        <w:t xml:space="preserve"> </w:t>
+      </w:r>
+      <w:r>
+        <w:t xml:space="preserve">(→ intro) and</w:t>
+      </w:r>
+      <w:r>
+        <w:t xml:space="preserve"> </w:t>
+      </w:r>
+      <w:r>
+        <w:rPr>
+          <w:b/>
+          <w:bCs/>
+        </w:rPr>
+        <w:t xml:space="preserve">Retake</w:t>
+      </w:r>
+      <w:r>
+        <w:t xml:space="preserve"> </w:t>
+      </w:r>
+      <w:r>
+        <w:t xml:space="preserve">(re-runs</w:t>
+      </w:r>
+      <w:r>
+        <w:t xml:space="preserve"> </w:t>
+      </w:r>
+      <w:r>
+        <w:rPr>
+          <w:rStyle w:val="VerbatimChar"/>
+        </w:rPr>
+        <w:t xml:space="preserve">start</w:t>
+      </w:r>
+      <w:r>
+        <w:t xml:space="preserve">).</w:t>
+      </w:r>
+    </w:p>
+    <w:bookmarkEnd w:id="173"/>
+    <w:bookmarkStart w:id="174" w:name="adaptive-drill-lmsdrill"/>
+    <w:p>
+      <w:pPr>
+        <w:pStyle w:val="Heading2"/>
+      </w:pPr>
+      <w:r>
+        <w:t xml:space="preserve">19.2 Adaptive Drill (</w:t>
+      </w:r>
+      <w:r>
+        <w:rPr>
+          <w:rStyle w:val="VerbatimChar"/>
+        </w:rPr>
+        <w:t xml:space="preserve">/lms/drill</w:t>
+      </w:r>
+      <w:r>
+        <w:t xml:space="preserve">)</w:t>
+      </w:r>
+    </w:p>
+    <w:p>
+      <w:pPr>
+        <w:pStyle w:val="FirstParagraph"/>
+      </w:pPr>
+      <w:r>
+        <w:t xml:space="preserve">The</w:t>
+      </w:r>
+      <w:r>
+        <w:t xml:space="preserve"> </w:t>
+      </w:r>
+      <w:r>
+        <w:rPr>
+          <w:b/>
+          <w:bCs/>
+        </w:rPr>
+        <w:t xml:space="preserve">Flow layer</w:t>
+      </w:r>
+      <w:r>
+        <w:t xml:space="preserve">: one question at a time whose difficulty rises when you’re correct and confident and eases when you struggle. Phases</w:t>
+      </w:r>
+      <w:r>
+        <w:t xml:space="preserve"> </w:t>
+      </w:r>
+      <w:r>
+        <w:rPr>
+          <w:b/>
+          <w:bCs/>
+        </w:rPr>
+        <w:t xml:space="preserve">pick → play → done</w:t>
+      </w:r>
+      <w:r>
+        <w:t xml:space="preserve">.</w:t>
+      </w:r>
+    </w:p>
+    <w:p>
+      <w:pPr>
+        <w:pStyle w:val="BodyText"/>
+      </w:pPr>
+      <w:r>
+        <w:rPr>
+          <w:b/>
+          <w:bCs/>
+        </w:rPr>
+        <w:t xml:space="preserve">Phase</w:t>
+      </w:r>
+      <w:r>
+        <w:rPr>
+          <w:b/>
+          <w:bCs/>
+        </w:rPr>
+        <w:t xml:space="preserve"> </w:t>
+      </w:r>
+      <w:r>
+        <w:rPr>
+          <w:rStyle w:val="VerbatimChar"/>
+          <w:b/>
+          <w:bCs/>
+        </w:rPr>
+        <w:t xml:space="preserve">pick</w:t>
+      </w:r>
+      <w:r>
+        <w:t xml:space="preserve"> </w:t>
+      </w:r>
+      <w:r>
+        <w:t xml:space="preserve">- On mount,</w:t>
+      </w:r>
+      <w:r>
+        <w:t xml:space="preserve"> </w:t>
+      </w:r>
+      <w:r>
+        <w:rPr>
+          <w:rStyle w:val="VerbatimChar"/>
+        </w:rPr>
+        <w:t xml:space="preserve">GET /lms/v1/assessments/twin/{id}</w:t>
+      </w:r>
+      <w:r>
+        <w:t xml:space="preserve"> </w:t>
+      </w:r>
+      <w:r>
+        <w:t xml:space="preserve">yields</w:t>
+      </w:r>
+      <w:r>
+        <w:t xml:space="preserve"> </w:t>
+      </w:r>
+      <w:r>
+        <w:rPr>
+          <w:rStyle w:val="VerbatimChar"/>
+        </w:rPr>
+        <w:t xml:space="preserve">focus_areas</w:t>
+      </w:r>
+      <w:r>
+        <w:t xml:space="preserve">; each becomes a topic button.</w:t>
+      </w:r>
+      <w:r>
+        <w:t xml:space="preserve"> </w:t>
+      </w:r>
+      <w:r>
+        <w:t xml:space="preserve">-</w:t>
+      </w:r>
+      <w:r>
+        <w:t xml:space="preserve"> </w:t>
+      </w:r>
+      <w:r>
+        <w:rPr>
+          <w:b/>
+          <w:bCs/>
+        </w:rPr>
+        <w:t xml:space="preserve">Buttons:</w:t>
+      </w:r>
+      <w:r>
+        <w:rPr>
+          <w:b/>
+          <w:bCs/>
+        </w:rPr>
+        <w:t xml:space="preserve"> </w:t>
+      </w:r>
+      <w:r>
+        <w:t xml:space="preserve"> </w:t>
+      </w:r>
+      <w:r>
+        <w:t xml:space="preserve">(start a focused drill) and</w:t>
+      </w:r>
+      <w:r>
+        <w:t xml:space="preserve"> </w:t>
+      </w:r>
+      <w:r>
+        <w:rPr>
+          <w:b/>
+          <w:bCs/>
+        </w:rPr>
+        <w:t xml:space="preserve">Mixed set</w:t>
+      </w:r>
+      <w:r>
+        <w:t xml:space="preserve"> </w:t>
+      </w:r>
+      <w:r>
+        <w:t xml:space="preserve">→</w:t>
+      </w:r>
+      <w:r>
+        <w:t xml:space="preserve"> </w:t>
+      </w:r>
+      <w:r>
+        <w:rPr>
+          <w:rStyle w:val="VerbatimChar"/>
+        </w:rPr>
+        <w:t xml:space="preserve">POST /lms/v1/drill/start { topic, target: 8 }</w:t>
+      </w:r>
+      <w:r>
+        <w:t xml:space="preserve">. If no questions are available, an inline message explains to take an assessment first.</w:t>
+      </w:r>
+      <w:r>
+        <w:t xml:space="preserve"> </w:t>
+      </w:r>
+      <w:r>
+        <w:t xml:space="preserve">-</w:t>
+      </w:r>
+      <w:r>
+        <w:t xml:space="preserve"> </w:t>
+      </w:r>
+      <w:r>
+        <w:rPr>
+          <w:b/>
+          <w:bCs/>
+        </w:rPr>
+        <w:t xml:space="preserve">Header action: Skill Map</w:t>
+      </w:r>
+      <w:r>
+        <w:t xml:space="preserve"> </w:t>
+      </w:r>
+      <w:r>
+        <w:t xml:space="preserve">(→</w:t>
+      </w:r>
+      <w:r>
+        <w:t xml:space="preserve"> </w:t>
+      </w:r>
+      <w:r>
+        <w:rPr>
+          <w:rStyle w:val="VerbatimChar"/>
+        </w:rPr>
+        <w:t xml:space="preserve">/lms/skill-map</w:t>
+      </w:r>
+      <w:r>
+        <w:t xml:space="preserve">).</w:t>
+      </w:r>
+    </w:p>
+    <w:p>
+      <w:pPr>
+        <w:pStyle w:val="BodyText"/>
+      </w:pPr>
+      <w:r>
+        <w:rPr>
+          <w:b/>
+          <w:bCs/>
+        </w:rPr>
+        <w:t xml:space="preserve">Phase</w:t>
+      </w:r>
+      <w:r>
+        <w:rPr>
+          <w:b/>
+          <w:bCs/>
+        </w:rPr>
+        <w:t xml:space="preserve"> </w:t>
+      </w:r>
+      <w:r>
+        <w:rPr>
+          <w:rStyle w:val="VerbatimChar"/>
+          <w:b/>
+          <w:bCs/>
+        </w:rPr>
+        <w:t xml:space="preserve">play</w:t>
+      </w:r>
+      <w:r>
+        <w:t xml:space="preserve"> </w:t>
+      </w:r>
+      <w:r>
+        <w:t xml:space="preserve">-</w:t>
+      </w:r>
+      <w:r>
+        <w:t xml:space="preserve"> </w:t>
+      </w:r>
+      <w:r>
+        <w:rPr>
+          <w:b/>
+          <w:bCs/>
+        </w:rPr>
+        <w:t xml:space="preserve">ProctorBanner</w:t>
+      </w:r>
+      <w:r>
+        <w:t xml:space="preserve"> </w:t>
+      </w:r>
+      <w:r>
+        <w:t xml:space="preserve">is active.</w:t>
+      </w:r>
+      <w:r>
+        <w:t xml:space="preserve"> </w:t>
+      </w:r>
+      <w:r>
+        <w:t xml:space="preserve">-</w:t>
+      </w:r>
+      <w:r>
+        <w:t xml:space="preserve"> </w:t>
+      </w:r>
+      <w:r>
+        <w:rPr>
+          <w:b/>
+          <w:bCs/>
+        </w:rPr>
+        <w:t xml:space="preserve">Level badge</w:t>
+      </w:r>
+      <w:r>
+        <w:t xml:space="preserve"> </w:t>
+      </w:r>
+      <w:r>
+        <w:t xml:space="preserve">(</w:t>
+      </w:r>
+      <w:r>
+        <w:rPr>
+          <w:rStyle w:val="VerbatimChar"/>
+        </w:rPr>
+        <w:t xml:space="preserve">easy</w:t>
+      </w:r>
+      <w:r>
+        <w:t xml:space="preserve">/</w:t>
+      </w:r>
+      <w:r>
+        <w:rPr>
+          <w:rStyle w:val="VerbatimChar"/>
+        </w:rPr>
+        <w:t xml:space="preserve">medium</w:t>
+      </w:r>
+      <w:r>
+        <w:t xml:space="preserve">/</w:t>
+      </w:r>
+      <w:r>
+        <w:rPr>
+          <w:rStyle w:val="VerbatimChar"/>
+        </w:rPr>
+        <w:t xml:space="preserve">hard</w:t>
+      </w:r>
+      <w:r>
+        <w:t xml:space="preserve">, colour-coded) + a</w:t>
+      </w:r>
+      <w:r>
+        <w:t xml:space="preserve"> </w:t>
+      </w:r>
+      <w:r>
+        <w:rPr>
+          <w:rStyle w:val="VerbatimChar"/>
+        </w:rPr>
+        <w:t xml:space="preserve">answered/target</w:t>
+      </w:r>
+      <w:r>
+        <w:t xml:space="preserve"> </w:t>
+      </w:r>
+      <w:r>
+        <w:t xml:space="preserve">counter + a progress bar.</w:t>
+      </w:r>
+      <w:r>
+        <w:t xml:space="preserve"> </w:t>
+      </w:r>
+      <w:r>
+        <w:t xml:space="preserve">-</w:t>
+      </w:r>
+      <w:r>
+        <w:t xml:space="preserve"> </w:t>
+      </w:r>
+      <w:r>
+        <w:rPr>
+          <w:b/>
+          <w:bCs/>
+        </w:rPr>
+        <w:t xml:space="preserve">Question card</w:t>
+      </w:r>
+      <w:r>
+        <w:t xml:space="preserve"> </w:t>
+      </w:r>
+      <w:r>
+        <w:t xml:space="preserve">— topic eyebrow, prompt, and option buttons. Clicking an option (disabled once chosen) calls</w:t>
+      </w:r>
+      <w:r>
+        <w:t xml:space="preserve"> </w:t>
+      </w:r>
+      <w:r>
+        <w:rPr>
+          <w:rStyle w:val="VerbatimChar"/>
+        </w:rPr>
+        <w:t xml:space="preserve">POST /lms/v1/drill/{drillId}/answer { item_id, option, elapsed_ms }</w:t>
+      </w:r>
+      <w:r>
+        <w:t xml:space="preserve">. The elapsed time is measured from when the question rendered (speed feeds the difficulty tuning).</w:t>
+      </w:r>
+      <w:r>
+        <w:t xml:space="preserve"> </w:t>
+      </w:r>
+      <w:r>
+        <w:t xml:space="preserve">-</w:t>
+      </w:r>
+      <w:r>
+        <w:t xml:space="preserve"> </w:t>
+      </w:r>
+      <w:r>
+        <w:rPr>
+          <w:b/>
+          <w:bCs/>
+        </w:rPr>
+        <w:t xml:space="preserve">Feedback</w:t>
+      </w:r>
+      <w:r>
+        <w:t xml:space="preserve"> </w:t>
+      </w:r>
+      <w:r>
+        <w:t xml:space="preserve">— the correct option turns teal; a wrong pick turns rose; an explanation shows; the status line reads</w:t>
+      </w:r>
+      <w:r>
+        <w:t xml:space="preserve"> </w:t>
+      </w:r>
+      <w:r>
+        <w:rPr>
+          <w:i/>
+          <w:iCs/>
+        </w:rPr>
+        <w:t xml:space="preserve">“Nice — leveling up”</w:t>
+      </w:r>
+      <w:r>
+        <w:t xml:space="preserve"> </w:t>
+      </w:r>
+      <w:r>
+        <w:t xml:space="preserve">or</w:t>
+      </w:r>
+      <w:r>
+        <w:t xml:space="preserve"> </w:t>
+      </w:r>
+      <w:r>
+        <w:rPr>
+          <w:i/>
+          <w:iCs/>
+        </w:rPr>
+        <w:t xml:space="preserve">“Not quite — easing off”</w:t>
+      </w:r>
+      <w:r>
+        <w:t xml:space="preserve">.</w:t>
+      </w:r>
+      <w:r>
+        <w:t xml:space="preserve"> </w:t>
+      </w:r>
+      <w:r>
+        <w:t xml:space="preserve">-</w:t>
+      </w:r>
+      <w:r>
+        <w:t xml:space="preserve"> </w:t>
+      </w:r>
+      <w:r>
+        <w:rPr>
+          <w:b/>
+          <w:bCs/>
+        </w:rPr>
+        <w:t xml:space="preserve">Button: Next / See results</w:t>
+      </w:r>
+      <w:r>
+        <w:t xml:space="preserve"> </w:t>
+      </w:r>
+      <w:r>
+        <w:t xml:space="preserve">— advances to the next server-provided item or ends the drill.</w:t>
+      </w:r>
+    </w:p>
+    <w:p>
+      <w:pPr>
+        <w:pStyle w:val="BodyText"/>
+      </w:pPr>
+      <w:r>
+        <w:rPr>
+          <w:b/>
+          <w:bCs/>
+        </w:rPr>
+        <w:t xml:space="preserve">Phase</w:t>
+      </w:r>
+      <w:r>
+        <w:rPr>
+          <w:b/>
+          <w:bCs/>
+        </w:rPr>
+        <w:t xml:space="preserve"> </w:t>
+      </w:r>
+      <w:r>
+        <w:rPr>
+          <w:rStyle w:val="VerbatimChar"/>
+          <w:b/>
+          <w:bCs/>
+        </w:rPr>
+        <w:t xml:space="preserve">done</w:t>
+      </w:r>
+      <w:r>
+        <w:t xml:space="preserve"> </w:t>
+      </w:r>
+      <w:r>
+        <w:t xml:space="preserve">- Summary card —</w:t>
+      </w:r>
+      <w:r>
+        <w:t xml:space="preserve"> </w:t>
+      </w:r>
+      <w:r>
+        <w:rPr>
+          <w:b/>
+          <w:bCs/>
+        </w:rPr>
+        <w:t xml:space="preserve">accuracy %</w:t>
+      </w:r>
+      <w:r>
+        <w:t xml:space="preserve">,</w:t>
+      </w:r>
+      <w:r>
+        <w:t xml:space="preserve"> </w:t>
+      </w:r>
+      <w:r>
+        <w:rPr>
+          <w:rStyle w:val="VerbatimChar"/>
+        </w:rPr>
+        <w:t xml:space="preserve">correct/answered</w:t>
+      </w:r>
+      <w:r>
+        <w:t xml:space="preserve">, the</w:t>
+      </w:r>
+      <w:r>
+        <w:t xml:space="preserve"> </w:t>
+      </w:r>
+      <w:r>
+        <w:rPr>
+          <w:b/>
+          <w:bCs/>
+        </w:rPr>
+        <w:t xml:space="preserve">final level</w:t>
+      </w:r>
+      <w:r>
+        <w:t xml:space="preserve"> </w:t>
+      </w:r>
+      <w:r>
+        <w:t xml:space="preserve">reached, and the topic; a note that</w:t>
+      </w:r>
+      <w:r>
+        <w:t xml:space="preserve"> </w:t>
+      </w:r>
+      <w:r>
+        <w:rPr>
+          <w:i/>
+          <w:iCs/>
+        </w:rPr>
+        <w:t xml:space="preserve">“your skill map and review schedule have been updated.”</w:t>
+      </w:r>
+      <w:r>
+        <w:t xml:space="preserve"> </w:t>
+      </w:r>
+      <w:r>
+        <w:t xml:space="preserve">-</w:t>
+      </w:r>
+      <w:r>
+        <w:t xml:space="preserve"> </w:t>
+      </w:r>
+      <w:r>
+        <w:rPr>
+          <w:b/>
+          <w:bCs/>
+        </w:rPr>
+        <w:t xml:space="preserve">Buttons: Drill again</w:t>
+      </w:r>
+      <w:r>
+        <w:t xml:space="preserve"> </w:t>
+      </w:r>
+      <w:r>
+        <w:t xml:space="preserve">and</w:t>
+      </w:r>
+      <w:r>
+        <w:t xml:space="preserve"> </w:t>
+      </w:r>
+      <w:r>
+        <w:rPr>
+          <w:b/>
+          <w:bCs/>
+        </w:rPr>
+        <w:t xml:space="preserve">Keep Sharp</w:t>
+      </w:r>
+      <w:r>
+        <w:t xml:space="preserve"> </w:t>
+      </w:r>
+      <w:r>
+        <w:t xml:space="preserve">(→</w:t>
+      </w:r>
+      <w:r>
+        <w:t xml:space="preserve"> </w:t>
+      </w:r>
+      <w:r>
+        <w:rPr>
+          <w:rStyle w:val="VerbatimChar"/>
+        </w:rPr>
+        <w:t xml:space="preserve">/lms/keep-sharp</w:t>
+      </w:r>
+      <w:r>
+        <w:t xml:space="preserve">).</w:t>
+      </w:r>
+    </w:p>
+    <w:bookmarkEnd w:id="174"/>
+    <w:bookmarkStart w:id="175" w:name="keep-sharp-lmskeep-sharp"/>
+    <w:p>
+      <w:pPr>
+        <w:pStyle w:val="Heading2"/>
+      </w:pPr>
+      <w:r>
+        <w:t xml:space="preserve">19.3 Keep Sharp (</w:t>
+      </w:r>
+      <w:r>
+        <w:rPr>
+          <w:rStyle w:val="VerbatimChar"/>
+        </w:rPr>
+        <w:t xml:space="preserve">/lms/keep-sharp</w:t>
+      </w:r>
+      <w:r>
+        <w:t xml:space="preserve">)</w:t>
+      </w:r>
+    </w:p>
+    <w:p>
+      <w:pPr>
+        <w:pStyle w:val="FirstParagraph"/>
+      </w:pPr>
+      <w:r>
+        <w:rPr>
+          <w:b/>
+          <w:bCs/>
+        </w:rPr>
+        <w:t xml:space="preserve">Lifelong Reinforcement (Sustain).</w:t>
+      </w:r>
+      <w:r>
+        <w:t xml:space="preserve"> </w:t>
+      </w:r>
+      <w:r>
+        <w:t xml:space="preserve">Surfaces skills whose retention is decaying and lets the learner do a 20-second self-check that reschedules them on a forgetting curve.</w:t>
+      </w:r>
+    </w:p>
+    <w:p>
+      <w:pPr>
+        <w:pStyle w:val="Compact"/>
+        <w:numPr>
+          <w:ilvl w:val="0"/>
+          <w:numId w:val="1078"/>
+        </w:numPr>
+      </w:pPr>
+      <w:r>
+        <w:t xml:space="preserve">On mount,</w:t>
+      </w:r>
+      <w:r>
+        <w:t xml:space="preserve"> </w:t>
+      </w:r>
+      <w:r>
+        <w:rPr>
+          <w:rStyle w:val="VerbatimChar"/>
+        </w:rPr>
+        <w:t xml:space="preserve">GET /lms/v1/reviews/{id}</w:t>
+      </w:r>
+      <w:r>
+        <w:t xml:space="preserve"> </w:t>
+      </w:r>
+      <w:r>
+        <w:t xml:space="preserve">returns</w:t>
+      </w:r>
+      <w:r>
+        <w:t xml:space="preserve"> </w:t>
+      </w:r>
+      <w:r>
+        <w:rPr>
+          <w:rStyle w:val="VerbatimChar"/>
+        </w:rPr>
+        <w:t xml:space="preserve">{ due, upcoming, due_count }</w:t>
+      </w:r>
+      <w:r>
+        <w:t xml:space="preserve">.</w:t>
+      </w:r>
+    </w:p>
+    <w:p>
+      <w:pPr>
+        <w:pStyle w:val="Compact"/>
+        <w:numPr>
+          <w:ilvl w:val="0"/>
+          <w:numId w:val="1078"/>
+        </w:numPr>
+      </w:pPr>
+      <w:r>
+        <w:rPr>
+          <w:b/>
+          <w:bCs/>
+        </w:rPr>
+        <w:t xml:space="preserve">Empty state</w:t>
+      </w:r>
+      <w:r>
+        <w:t xml:space="preserve"> </w:t>
+      </w:r>
+      <w:r>
+        <w:t xml:space="preserve">— a</w:t>
+      </w:r>
+      <w:r>
+        <w:t xml:space="preserve"> </w:t>
+      </w:r>
+      <w:r>
+        <w:t xml:space="preserve">“You’re all caught up”</w:t>
+      </w:r>
+      <w:r>
+        <w:t xml:space="preserve"> </w:t>
+      </w:r>
+      <w:r>
+        <w:t xml:space="preserve">card when nothing is due.</w:t>
+      </w:r>
+    </w:p>
+    <w:p>
+      <w:pPr>
+        <w:pStyle w:val="Compact"/>
+        <w:numPr>
+          <w:ilvl w:val="0"/>
+          <w:numId w:val="1078"/>
+        </w:numPr>
+      </w:pPr>
+      <w:r>
+        <w:rPr>
+          <w:b/>
+          <w:bCs/>
+        </w:rPr>
+        <w:t xml:space="preserve">Due list</w:t>
+      </w:r>
+      <w:r>
+        <w:t xml:space="preserve"> </w:t>
+      </w:r>
+      <w:r>
+        <w:t xml:space="preserve">— sorted weakest-memory-first; header shows the due count.</w:t>
+      </w:r>
+    </w:p>
+    <w:p>
+      <w:pPr>
+        <w:pStyle w:val="Compact"/>
+        <w:numPr>
+          <w:ilvl w:val="0"/>
+          <w:numId w:val="1078"/>
+        </w:numPr>
+      </w:pPr>
+      <w:r>
+        <w:rPr>
+          <w:b/>
+          <w:bCs/>
+        </w:rPr>
+        <w:t xml:space="preserve">Review row</w:t>
+      </w:r>
+      <w:r>
+        <w:t xml:space="preserve"> </w:t>
+      </w:r>
+      <w:r>
+        <w:t xml:space="preserve">(per skill) — source icon (coding vs. written), skill name, a</w:t>
+      </w:r>
+      <w:r>
+        <w:t xml:space="preserve"> </w:t>
+      </w:r>
+      <w:r>
+        <w:rPr>
+          <w:b/>
+          <w:bCs/>
+        </w:rPr>
+        <w:t xml:space="preserve">recall %</w:t>
+      </w:r>
+      <w:r>
+        <w:t xml:space="preserve"> </w:t>
+      </w:r>
+      <w:r>
+        <w:t xml:space="preserve">badge (teal ≥70 / amber ≥45 / rose below), a</w:t>
+      </w:r>
+      <w:r>
+        <w:t xml:space="preserve"> </w:t>
+      </w:r>
+      <w:r>
+        <w:t xml:space="preserve">“reviewed N×”</w:t>
+      </w:r>
+      <w:r>
+        <w:t xml:space="preserve"> </w:t>
+      </w:r>
+      <w:r>
+        <w:t xml:space="preserve">note, a retention bar, and the honesty prompt.</w:t>
+      </w:r>
+    </w:p>
+    <w:p>
+      <w:pPr>
+        <w:pStyle w:val="Compact"/>
+        <w:numPr>
+          <w:ilvl w:val="1"/>
+          <w:numId w:val="1079"/>
+        </w:numPr>
+      </w:pPr>
+      <w:r>
+        <w:rPr>
+          <w:b/>
+          <w:bCs/>
+        </w:rPr>
+        <w:t xml:space="preserve">Button: Rusty</w:t>
+      </w:r>
+      <w:r>
+        <w:t xml:space="preserve"> </w:t>
+      </w:r>
+      <w:r>
+        <w:t xml:space="preserve">→</w:t>
+      </w:r>
+      <w:r>
+        <w:t xml:space="preserve"> </w:t>
+      </w:r>
+      <w:r>
+        <w:rPr>
+          <w:rStyle w:val="VerbatimChar"/>
+        </w:rPr>
+        <w:t xml:space="preserve">POST /lms/v1/reviews/{id}/review { skill, outcome:"rusty" }</w:t>
+      </w:r>
+      <w:r>
+        <w:t xml:space="preserve"> </w:t>
+      </w:r>
+      <w:r>
+        <w:t xml:space="preserve">(resurfaces tomorrow).</w:t>
+      </w:r>
+    </w:p>
+    <w:p>
+      <w:pPr>
+        <w:pStyle w:val="Compact"/>
+        <w:numPr>
+          <w:ilvl w:val="1"/>
+          <w:numId w:val="1079"/>
+        </w:numPr>
+      </w:pPr>
+      <w:r>
+        <w:rPr>
+          <w:b/>
+          <w:bCs/>
+        </w:rPr>
+        <w:t xml:space="preserve">Button: Got it</w:t>
+      </w:r>
+      <w:r>
+        <w:t xml:space="preserve"> </w:t>
+      </w:r>
+      <w:r>
+        <w:t xml:space="preserve">→ same endpoint with</w:t>
+      </w:r>
+      <w:r>
+        <w:t xml:space="preserve"> </w:t>
+      </w:r>
+      <w:r>
+        <w:rPr>
+          <w:rStyle w:val="VerbatimChar"/>
+        </w:rPr>
+        <w:t xml:space="preserve">outcome:"good"</w:t>
+      </w:r>
+      <w:r>
+        <w:t xml:space="preserve"> </w:t>
+      </w:r>
+      <w:r>
+        <w:t xml:space="preserve">(pushes the next due out by the new interval; flash shows</w:t>
+      </w:r>
+      <w:r>
+        <w:t xml:space="preserve"> </w:t>
+      </w:r>
+      <w:r>
+        <w:rPr>
+          <w:i/>
+          <w:iCs/>
+        </w:rPr>
+        <w:t xml:space="preserve">“won’t resurface for ~N day(s)”</w:t>
+      </w:r>
+      <w:r>
+        <w:t xml:space="preserve">).</w:t>
+      </w:r>
+    </w:p>
+    <w:p>
+      <w:pPr>
+        <w:pStyle w:val="Compact"/>
+        <w:numPr>
+          <w:ilvl w:val="1"/>
+          <w:numId w:val="1079"/>
+        </w:numPr>
+      </w:pPr>
+      <w:r>
+        <w:rPr>
+          <w:b/>
+          <w:bCs/>
+        </w:rPr>
+        <w:t xml:space="preserve">Button: Practise</w:t>
+      </w:r>
+      <w:r>
+        <w:t xml:space="preserve"> </w:t>
+      </w:r>
+      <w:r>
+        <w:t xml:space="preserve">→ deep-links to</w:t>
+      </w:r>
+      <w:r>
+        <w:t xml:space="preserve"> </w:t>
+      </w:r>
+      <w:r>
+        <w:rPr>
+          <w:rStyle w:val="VerbatimChar"/>
+        </w:rPr>
+        <w:t xml:space="preserve">/lms/practice</w:t>
+      </w:r>
+      <w:r>
+        <w:t xml:space="preserve"> </w:t>
+      </w:r>
+      <w:r>
+        <w:t xml:space="preserve">(coding) or</w:t>
+      </w:r>
+      <w:r>
+        <w:t xml:space="preserve"> </w:t>
+      </w:r>
+      <w:r>
+        <w:rPr>
+          <w:rStyle w:val="VerbatimChar"/>
+        </w:rPr>
+        <w:t xml:space="preserve">/lms/assessments</w:t>
+      </w:r>
+      <w:r>
+        <w:t xml:space="preserve"> </w:t>
+      </w:r>
+      <w:r>
+        <w:t xml:space="preserve">(written).</w:t>
+      </w:r>
+    </w:p>
+    <w:p>
+      <w:pPr>
+        <w:pStyle w:val="Compact"/>
+        <w:numPr>
+          <w:ilvl w:val="1"/>
+          <w:numId w:val="1079"/>
+        </w:numPr>
+      </w:pPr>
+      <w:r>
+        <w:t xml:space="preserve">The reviewed row is optimistically removed and</w:t>
+      </w:r>
+      <w:r>
+        <w:t xml:space="preserve"> </w:t>
+      </w:r>
+      <w:r>
+        <w:rPr>
+          <w:rStyle w:val="VerbatimChar"/>
+        </w:rPr>
+        <w:t xml:space="preserve">due_count</w:t>
+      </w:r>
+      <w:r>
+        <w:t xml:space="preserve"> </w:t>
+      </w:r>
+      <w:r>
+        <w:t xml:space="preserve">decremented.</w:t>
+      </w:r>
+    </w:p>
+    <w:p>
+      <w:pPr>
+        <w:pStyle w:val="Compact"/>
+        <w:numPr>
+          <w:ilvl w:val="0"/>
+          <w:numId w:val="1078"/>
+        </w:numPr>
+      </w:pPr>
+      <w:r>
+        <w:rPr>
+          <w:b/>
+          <w:bCs/>
+        </w:rPr>
+        <w:t xml:space="preserve">Coming up</w:t>
+      </w:r>
+      <w:r>
+        <w:t xml:space="preserve"> </w:t>
+      </w:r>
+      <w:r>
+        <w:t xml:space="preserve">— upcoming reviews with a</w:t>
+      </w:r>
+      <w:r>
+        <w:t xml:space="preserve"> </w:t>
+      </w:r>
+      <w:r>
+        <w:t xml:space="preserve">“in N days”</w:t>
+      </w:r>
+      <w:r>
+        <w:t xml:space="preserve"> </w:t>
+      </w:r>
+      <w:r>
+        <w:t xml:space="preserve">ETA.</w:t>
+      </w:r>
+    </w:p>
+    <w:p>
+      <w:pPr>
+        <w:pStyle w:val="Compact"/>
+        <w:numPr>
+          <w:ilvl w:val="0"/>
+          <w:numId w:val="1078"/>
+        </w:numPr>
+      </w:pPr>
+      <w:r>
+        <w:rPr>
+          <w:b/>
+          <w:bCs/>
+        </w:rPr>
+        <w:t xml:space="preserve">Header action: My Skill Map</w:t>
+      </w:r>
+      <w:r>
+        <w:t xml:space="preserve">.</w:t>
+      </w:r>
+    </w:p>
+    <w:bookmarkEnd w:id="175"/>
+    <w:bookmarkStart w:id="176" w:name="Xb41075515823705a89c8f67e524328ad0d50e1f"/>
+    <w:p>
+      <w:pPr>
+        <w:pStyle w:val="Heading2"/>
+      </w:pPr>
+      <w:r>
+        <w:t xml:space="preserve">19.4 My Skill Map (</w:t>
+      </w:r>
+      <w:r>
+        <w:rPr>
+          <w:rStyle w:val="VerbatimChar"/>
+        </w:rPr>
+        <w:t xml:space="preserve">/lms/skill-map</w:t>
+      </w:r>
+      <w:r>
+        <w:t xml:space="preserve">) + embedded AI Coach</w:t>
+      </w:r>
+    </w:p>
+    <w:p>
+      <w:pPr>
+        <w:pStyle w:val="FirstParagraph"/>
+      </w:pPr>
+      <w:r>
+        <w:t xml:space="preserve">The</w:t>
+      </w:r>
+      <w:r>
+        <w:t xml:space="preserve"> </w:t>
+      </w:r>
+      <w:r>
+        <w:rPr>
+          <w:b/>
+          <w:bCs/>
+        </w:rPr>
+        <w:t xml:space="preserve">Cognitive Twin</w:t>
+      </w:r>
+      <w:r>
+        <w:t xml:space="preserve"> </w:t>
+      </w:r>
+      <w:r>
+        <w:t xml:space="preserve">visualised. Reusable: a student sees their own; a recruiter/admin can pass a</w:t>
+      </w:r>
+      <w:r>
+        <w:t xml:space="preserve"> </w:t>
+      </w:r>
+      <w:r>
+        <w:rPr>
+          <w:rStyle w:val="VerbatimChar"/>
+        </w:rPr>
+        <w:t xml:space="preserve">candidateId</w:t>
+      </w:r>
+      <w:r>
+        <w:t xml:space="preserve"> </w:t>
+      </w:r>
+      <w:r>
+        <w:t xml:space="preserve">to view any learner’s.</w:t>
+      </w:r>
+    </w:p>
+    <w:p>
+      <w:pPr>
+        <w:pStyle w:val="Compact"/>
+        <w:numPr>
+          <w:ilvl w:val="0"/>
+          <w:numId w:val="1080"/>
+        </w:numPr>
+      </w:pPr>
+      <w:r>
+        <w:t xml:space="preserve">Loads</w:t>
+      </w:r>
+      <w:r>
+        <w:t xml:space="preserve"> </w:t>
+      </w:r>
+      <w:r>
+        <w:rPr>
+          <w:rStyle w:val="VerbatimChar"/>
+        </w:rPr>
+        <w:t xml:space="preserve">GET /lms/v1/assessments/twin/{id}</w:t>
+      </w:r>
+      <w:r>
+        <w:t xml:space="preserve"> </w:t>
+      </w:r>
+      <w:r>
+        <w:t xml:space="preserve">→</w:t>
+      </w:r>
+      <w:r>
+        <w:t xml:space="preserve"> </w:t>
+      </w:r>
+      <w:r>
+        <w:rPr>
+          <w:rStyle w:val="VerbatimChar"/>
+        </w:rPr>
+        <w:t xml:space="preserve">{ overall, by_category, topics, strengths, focus_areas, languages, coding_solved/attempted/verified, exams_taken }</w:t>
+      </w:r>
+      <w:r>
+        <w:t xml:space="preserve">. Also fetches the review due-count.</w:t>
+      </w:r>
+    </w:p>
+    <w:p>
+      <w:pPr>
+        <w:pStyle w:val="Compact"/>
+        <w:numPr>
+          <w:ilvl w:val="0"/>
+          <w:numId w:val="1080"/>
+        </w:numPr>
+      </w:pPr>
+      <w:r>
+        <w:rPr>
+          <w:b/>
+          <w:bCs/>
+        </w:rPr>
+        <w:t xml:space="preserve">Empty state</w:t>
+      </w:r>
+      <w:r>
+        <w:t xml:space="preserve"> </w:t>
+      </w:r>
+      <w:r>
+        <w:t xml:space="preserve">—</w:t>
+      </w:r>
+      <w:r>
+        <w:t xml:space="preserve"> </w:t>
+      </w:r>
+      <w:r>
+        <w:t xml:space="preserve">“Your skill map is waking up”</w:t>
+      </w:r>
+      <w:r>
+        <w:t xml:space="preserve"> </w:t>
+      </w:r>
+      <w:r>
+        <w:t xml:space="preserve">with CTAs to start coding practice or take an assessment.</w:t>
+      </w:r>
+    </w:p>
+    <w:p>
+      <w:pPr>
+        <w:pStyle w:val="Compact"/>
+        <w:numPr>
+          <w:ilvl w:val="0"/>
+          <w:numId w:val="1080"/>
+        </w:numPr>
+      </w:pPr>
+      <w:r>
+        <w:rPr>
+          <w:b/>
+          <w:bCs/>
+        </w:rPr>
+        <w:t xml:space="preserve">Overall tiles</w:t>
+      </w:r>
+      <w:r>
+        <w:t xml:space="preserve"> </w:t>
+      </w:r>
+      <w:r>
+        <w:t xml:space="preserve">— Overall mastery %, Questions correct (</w:t>
+      </w:r>
+      <w:r>
+        <w:rPr>
+          <w:rStyle w:val="VerbatimChar"/>
+        </w:rPr>
+        <w:t xml:space="preserve">correct/attempted</w:t>
+      </w:r>
+      <w:r>
+        <w:t xml:space="preserve">), Tests taken, Topics mapped.</w:t>
+      </w:r>
+    </w:p>
+    <w:p>
+      <w:pPr>
+        <w:pStyle w:val="Compact"/>
+        <w:numPr>
+          <w:ilvl w:val="0"/>
+          <w:numId w:val="1080"/>
+        </w:numPr>
+      </w:pPr>
+      <w:r>
+        <w:rPr>
+          <w:b/>
+          <w:bCs/>
+        </w:rPr>
+        <w:t xml:space="preserve">Reviews-due banner</w:t>
+      </w:r>
+      <w:r>
+        <w:t xml:space="preserve"> </w:t>
+      </w:r>
+      <w:r>
+        <w:t xml:space="preserve">— if reviews are due, an amber card links to Keep Sharp.</w:t>
+      </w:r>
+    </w:p>
+    <w:p>
+      <w:pPr>
+        <w:pStyle w:val="Compact"/>
+        <w:numPr>
+          <w:ilvl w:val="0"/>
+          <w:numId w:val="1080"/>
+        </w:numPr>
+      </w:pPr>
+      <w:r>
+        <w:rPr>
+          <w:b/>
+          <w:bCs/>
+        </w:rPr>
+        <w:t xml:space="preserve">Strengths</w:t>
+      </w:r>
+      <w:r>
+        <w:t xml:space="preserve"> </w:t>
+      </w:r>
+      <w:r>
+        <w:t xml:space="preserve">and</w:t>
+      </w:r>
+      <w:r>
+        <w:t xml:space="preserve"> </w:t>
+      </w:r>
+      <w:r>
+        <w:rPr>
+          <w:b/>
+          <w:bCs/>
+        </w:rPr>
+        <w:t xml:space="preserve">Focus next on</w:t>
+      </w:r>
+      <w:r>
+        <w:t xml:space="preserve"> </w:t>
+      </w:r>
+      <w:r>
+        <w:t xml:space="preserve">— skill chips with mastery %.</w:t>
+      </w:r>
+    </w:p>
+    <w:p>
+      <w:pPr>
+        <w:pStyle w:val="Compact"/>
+        <w:numPr>
+          <w:ilvl w:val="0"/>
+          <w:numId w:val="1080"/>
+        </w:numPr>
+      </w:pPr>
+      <w:r>
+        <w:rPr>
+          <w:b/>
+          <w:bCs/>
+        </w:rPr>
+        <w:t xml:space="preserve">Mastery by area</w:t>
+      </w:r>
+      <w:r>
+        <w:t xml:space="preserve"> </w:t>
+      </w:r>
+      <w:r>
+        <w:t xml:space="preserve">— per-category bars (strong/developing/weak bands).</w:t>
+      </w:r>
+    </w:p>
+    <w:p>
+      <w:pPr>
+        <w:pStyle w:val="Compact"/>
+        <w:numPr>
+          <w:ilvl w:val="0"/>
+          <w:numId w:val="1080"/>
+        </w:numPr>
+      </w:pPr>
+      <w:r>
+        <w:rPr>
+          <w:b/>
+          <w:bCs/>
+        </w:rPr>
+        <w:t xml:space="preserve">Coding by language</w:t>
+      </w:r>
+      <w:r>
+        <w:t xml:space="preserve"> </w:t>
+      </w:r>
+      <w:r>
+        <w:t xml:space="preserve">— per-language solved/attempted bars, with</w:t>
+      </w:r>
+      <w:r>
+        <w:t xml:space="preserve"> </w:t>
+      </w:r>
+      <w:r>
+        <w:rPr>
+          <w:rStyle w:val="VerbatimChar"/>
+        </w:rPr>
+        <w:t xml:space="preserve">solved/attempted</w:t>
+      </w:r>
+      <w:r>
+        <w:t xml:space="preserve"> </w:t>
+      </w:r>
+      <w:r>
+        <w:t xml:space="preserve">and</w:t>
+      </w:r>
+      <w:r>
+        <w:t xml:space="preserve"> </w:t>
+      </w:r>
+      <w:r>
+        <w:rPr>
+          <w:rStyle w:val="VerbatimChar"/>
+        </w:rPr>
+        <w:t xml:space="preserve">verified ✓</w:t>
+      </w:r>
+      <w:r>
+        <w:t xml:space="preserve"> </w:t>
+      </w:r>
+      <w:r>
+        <w:t xml:space="preserve">badges (verified = passed the adversarial viva).</w:t>
+      </w:r>
+    </w:p>
+    <w:p>
+      <w:pPr>
+        <w:pStyle w:val="Compact"/>
+        <w:numPr>
+          <w:ilvl w:val="0"/>
+          <w:numId w:val="1080"/>
+        </w:numPr>
+      </w:pPr>
+      <w:r>
+        <w:rPr>
+          <w:b/>
+          <w:bCs/>
+        </w:rPr>
+        <w:t xml:space="preserve">Every topic, ranked</w:t>
+      </w:r>
+      <w:r>
+        <w:t xml:space="preserve"> </w:t>
+      </w:r>
+      <w:r>
+        <w:t xml:space="preserve">— a full ranked bar list.</w:t>
+      </w:r>
+    </w:p>
+    <w:p>
+      <w:pPr>
+        <w:pStyle w:val="FirstParagraph"/>
+      </w:pPr>
+      <w:r>
+        <w:rPr>
+          <w:b/>
+          <w:bCs/>
+        </w:rPr>
+        <w:t xml:space="preserve">Embedded AI Study Coach (the</w:t>
+      </w:r>
+      <w:r>
+        <w:rPr>
+          <w:b/>
+          <w:bCs/>
+        </w:rPr>
+        <w:t xml:space="preserve"> </w:t>
+      </w:r>
+      <w:r>
+        <w:rPr>
+          <w:rStyle w:val="VerbatimChar"/>
+          <w:b/>
+          <w:bCs/>
+        </w:rPr>
+        <w:t xml:space="preserve">Coach</w:t>
+      </w:r>
+      <w:r>
+        <w:rPr>
+          <w:b/>
+          <w:bCs/>
+        </w:rPr>
+        <w:t xml:space="preserve"> </w:t>
+      </w:r>
+      <w:r>
+        <w:rPr>
+          <w:b/>
+          <w:bCs/>
+        </w:rPr>
+        <w:t xml:space="preserve">component)</w:t>
+      </w:r>
+      <w:r>
+        <w:t xml:space="preserve"> </w:t>
+      </w:r>
+      <w:r>
+        <w:t xml:space="preserve">- Auto-loads the</w:t>
+      </w:r>
+      <w:r>
+        <w:t xml:space="preserve"> </w:t>
+      </w:r>
+      <w:r>
+        <w:rPr>
+          <w:b/>
+          <w:bCs/>
+        </w:rPr>
+        <w:t xml:space="preserve">persistent plan</w:t>
+      </w:r>
+      <w:r>
+        <w:t xml:space="preserve"> </w:t>
+      </w:r>
+      <w:r>
+        <w:t xml:space="preserve">via</w:t>
+      </w:r>
+      <w:r>
+        <w:t xml:space="preserve"> </w:t>
+      </w:r>
+      <w:r>
+        <w:rPr>
+          <w:rStyle w:val="VerbatimChar"/>
+        </w:rPr>
+        <w:t xml:space="preserve">GET /lms/v1/assessments/coach/{id}</w:t>
+      </w:r>
+      <w:r>
+        <w:t xml:space="preserve"> </w:t>
+      </w:r>
+      <w:r>
+        <w:t xml:space="preserve">on mount (reuses the stored plan; first-time users have none).</w:t>
+      </w:r>
+      <w:r>
+        <w:t xml:space="preserve"> </w:t>
+      </w:r>
+      <w:r>
+        <w:t xml:space="preserve">-</w:t>
+      </w:r>
+      <w:r>
+        <w:t xml:space="preserve"> </w:t>
+      </w:r>
+      <w:r>
+        <w:rPr>
+          <w:b/>
+          <w:bCs/>
+        </w:rPr>
+        <w:t xml:space="preserve">Button: Get my plan</w:t>
+      </w:r>
+      <w:r>
+        <w:t xml:space="preserve"> </w:t>
+      </w:r>
+      <w:r>
+        <w:t xml:space="preserve">(when no plan) → same endpoint;</w:t>
+      </w:r>
+      <w:r>
+        <w:t xml:space="preserve"> </w:t>
+      </w:r>
+      <w:r>
+        <w:rPr>
+          <w:b/>
+          <w:bCs/>
+        </w:rPr>
+        <w:t xml:space="preserve">Refresh plan</w:t>
+      </w:r>
+      <w:r>
+        <w:t xml:space="preserve"> </w:t>
+      </w:r>
+      <w:r>
+        <w:t xml:space="preserve">→</w:t>
+      </w:r>
+      <w:r>
+        <w:t xml:space="preserve"> </w:t>
+      </w:r>
+      <w:r>
+        <w:rPr>
+          <w:rStyle w:val="VerbatimChar"/>
+        </w:rPr>
+        <w:t xml:space="preserve">?force=1</w:t>
+      </w:r>
+      <w:r>
+        <w:t xml:space="preserve"> </w:t>
+      </w:r>
+      <w:r>
+        <w:t xml:space="preserve">regenerates.</w:t>
+      </w:r>
+      <w:r>
+        <w:t xml:space="preserve"> </w:t>
+      </w:r>
+      <w:r>
+        <w:t xml:space="preserve">- Renders</w:t>
+      </w:r>
+      <w:r>
+        <w:t xml:space="preserve"> </w:t>
+      </w:r>
+      <w:r>
+        <w:rPr>
+          <w:rStyle w:val="VerbatimChar"/>
+        </w:rPr>
+        <w:t xml:space="preserve">headline</w:t>
+      </w:r>
+      <w:r>
+        <w:t xml:space="preserve">, a</w:t>
+      </w:r>
+      <w:r>
+        <w:t xml:space="preserve"> </w:t>
+      </w:r>
+      <w:r>
+        <w:rPr>
+          <w:b/>
+          <w:bCs/>
+        </w:rPr>
+        <w:t xml:space="preserve">2-minute explainer</w:t>
+      </w:r>
+      <w:r>
+        <w:t xml:space="preserve"> </w:t>
+      </w:r>
+      <w:r>
+        <w:t xml:space="preserve">for the #1 gap, a</w:t>
+      </w:r>
+      <w:r>
+        <w:t xml:space="preserve"> </w:t>
+      </w:r>
+      <w:r>
+        <w:rPr>
+          <w:b/>
+          <w:bCs/>
+        </w:rPr>
+        <w:t xml:space="preserve">quick win</w:t>
+      </w:r>
+      <w:r>
+        <w:t xml:space="preserve">, the</w:t>
+      </w:r>
+      <w:r>
+        <w:t xml:space="preserve"> </w:t>
+      </w:r>
+      <w:r>
+        <w:rPr>
+          <w:b/>
+          <w:bCs/>
+        </w:rPr>
+        <w:t xml:space="preserve">why-these-topics</w:t>
+      </w:r>
+      <w:r>
+        <w:t xml:space="preserve"> </w:t>
+      </w:r>
+      <w:r>
+        <w:t xml:space="preserve">list, and the</w:t>
+      </w:r>
+      <w:r>
+        <w:t xml:space="preserve"> </w:t>
+      </w:r>
+      <w:r>
+        <w:rPr>
+          <w:b/>
+          <w:bCs/>
+        </w:rPr>
+        <w:t xml:space="preserve">week plan</w:t>
+      </w:r>
+      <w:r>
+        <w:t xml:space="preserve"> </w:t>
+      </w:r>
+      <w:r>
+        <w:t xml:space="preserve">— each day is a tickable button that calls</w:t>
+      </w:r>
+      <w:r>
+        <w:t xml:space="preserve"> </w:t>
+      </w:r>
+      <w:r>
+        <w:rPr>
+          <w:rStyle w:val="VerbatimChar"/>
+        </w:rPr>
+        <w:t xml:space="preserve">POST .../coach/{id}/progress { day, done }</w:t>
+      </w:r>
+      <w:r>
+        <w:t xml:space="preserve"> </w:t>
+      </w:r>
+      <w:r>
+        <w:t xml:space="preserve">(optimistic, reverts on failure). Shows</w:t>
+      </w:r>
+      <w:r>
+        <w:t xml:space="preserve"> </w:t>
+      </w:r>
+      <w:r>
+        <w:rPr>
+          <w:rStyle w:val="VerbatimChar"/>
+        </w:rPr>
+        <w:t xml:space="preserve">done/total</w:t>
+      </w:r>
+      <w:r>
+        <w:t xml:space="preserve">.</w:t>
+      </w:r>
+      <w:r>
+        <w:t xml:space="preserve"> </w:t>
+      </w:r>
+      <w:r>
+        <w:t xml:space="preserve">-</w:t>
+      </w:r>
+      <w:r>
+        <w:t xml:space="preserve"> </w:t>
+      </w:r>
+      <w:r>
+        <w:rPr>
+          <w:b/>
+          <w:bCs/>
+        </w:rPr>
+        <w:t xml:space="preserve">Practice problems</w:t>
+      </w:r>
+      <w:r>
+        <w:t xml:space="preserve"> </w:t>
+      </w:r>
+      <w:r>
+        <w:t xml:space="preserve">list.</w:t>
+      </w:r>
+      <w:r>
+        <w:t xml:space="preserve"> </w:t>
+      </w:r>
+      <w:r>
+        <w:t xml:space="preserve">-</w:t>
+      </w:r>
+      <w:r>
+        <w:t xml:space="preserve"> </w:t>
+      </w:r>
+      <w:r>
+        <w:rPr>
+          <w:b/>
+          <w:bCs/>
+        </w:rPr>
+        <w:t xml:space="preserve">Button: Email me my plan</w:t>
+      </w:r>
+      <w:r>
+        <w:t xml:space="preserve"> </w:t>
+      </w:r>
+      <w:r>
+        <w:t xml:space="preserve">→</w:t>
+      </w:r>
+      <w:r>
+        <w:t xml:space="preserve"> </w:t>
+      </w:r>
+      <w:r>
+        <w:rPr>
+          <w:rStyle w:val="VerbatimChar"/>
+        </w:rPr>
+        <w:t xml:space="preserve">POST /lms/v1/assessments/nudge/{id}</w:t>
+      </w:r>
+      <w:r>
+        <w:t xml:space="preserve"> </w:t>
+      </w:r>
+      <w:r>
+        <w:t xml:space="preserve">(sends via in-app + email; confirms</w:t>
+      </w:r>
+      <w:r>
+        <w:t xml:space="preserve"> </w:t>
+      </w:r>
+      <w:r>
+        <w:t xml:space="preserve">“Sent to your inbox + notifications ✓”</w:t>
+      </w:r>
+      <w:r>
+        <w:t xml:space="preserve">).</w:t>
+      </w:r>
+      <w:r>
+        <w:t xml:space="preserve"> </w:t>
+      </w:r>
+      <w:r>
+        <w:t xml:space="preserve">- A badge marks the plan</w:t>
+      </w:r>
+      <w:r>
+        <w:t xml:space="preserve"> </w:t>
+      </w:r>
+      <w:r>
+        <w:rPr>
+          <w:b/>
+          <w:bCs/>
+        </w:rPr>
+        <w:t xml:space="preserve">AI-generated</w:t>
+      </w:r>
+      <w:r>
+        <w:t xml:space="preserve"> </w:t>
+      </w:r>
+      <w:r>
+        <w:t xml:space="preserve">vs. </w:t>
+      </w:r>
+      <w:r>
+        <w:rPr>
+          <w:b/>
+          <w:bCs/>
+        </w:rPr>
+        <w:t xml:space="preserve">Smart plan</w:t>
+      </w:r>
+      <w:r>
+        <w:t xml:space="preserve"> </w:t>
+      </w:r>
+      <w:r>
+        <w:t xml:space="preserve">(deterministic fallback).</w:t>
+      </w:r>
+    </w:p>
+    <w:p>
+      <w:r>
         <w:pict>
           <v:rect style="width:0;height:1.5pt" o:hralign="center" o:hrstd="t" o:hr="t"/>
         </w:pict>
@@ -28589,8 +30949,8 @@
         <w:t xml:space="preserve">End of document. Prepared for LARE Cloud Solutions - a unit of LARE Consulting &amp; Technology Pvt. Ltd.</w:t>
       </w:r>
     </w:p>
-    <w:bookmarkEnd w:id="171"/>
-    <w:bookmarkEnd w:id="172"/>
+    <w:bookmarkEnd w:id="176"/>
+    <w:bookmarkEnd w:id="177"/>
     <w:sectPr>
       <w:footnotePr>
         <w:numRestart w:val="eachSect"/>
@@ -29256,6 +31616,15 @@
     <w:abstractNumId w:val="991"/>
   </w:num>
   <w:num w:numId="1077">
+    <w:abstractNumId w:val="991"/>
+  </w:num>
+  <w:num w:numId="1078">
+    <w:abstractNumId w:val="991"/>
+  </w:num>
+  <w:num w:numId="1079">
+    <w:abstractNumId w:val="991"/>
+  </w:num>
+  <w:num w:numId="1080">
     <w:abstractNumId w:val="991"/>
   </w:num>
 </w:numbering>

</xml_diff>

<commit_message>
docs: detailed screen reference part 2 (Coding Practice+viva, Worlds, Careers, Wallet)
Co-Authored-By: Claude Opus 4.8 <noreply@anthropic.com>
</commit_message>
<xml_diff>
--- a/docs/LARE-Documentation.docx
+++ b/docs/LARE-Documentation.docx
@@ -30932,6 +30932,1749 @@
     </w:p>
     <w:p>
       <w:r>
+        <w:br w:type="page"/>
+      </w:r>
+    </w:p>
+    <w:bookmarkEnd w:id="176"/>
+    <w:bookmarkEnd w:id="177"/>
+    <w:bookmarkStart w:id="182" w:name="X34883f8b2f035db3995974e71be729418544a20"/>
+    <w:p>
+      <w:pPr>
+        <w:pStyle w:val="Heading1"/>
+      </w:pPr>
+      <w:r>
+        <w:t xml:space="preserve">20. Detailed Screen Reference — LARE Learn (Part 2)</w:t>
+      </w:r>
+    </w:p>
+    <w:bookmarkStart w:id="178" w:name="coding-practice-lmspractice"/>
+    <w:p>
+      <w:pPr>
+        <w:pStyle w:val="Heading2"/>
+      </w:pPr>
+      <w:r>
+        <w:t xml:space="preserve">20.1 Coding Practice (</w:t>
+      </w:r>
+      <w:r>
+        <w:rPr>
+          <w:rStyle w:val="VerbatimChar"/>
+        </w:rPr>
+        <w:t xml:space="preserve">/lms/practice</w:t>
+      </w:r>
+      <w:r>
+        <w:t xml:space="preserve">)</w:t>
+      </w:r>
+    </w:p>
+    <w:p>
+      <w:pPr>
+        <w:pStyle w:val="FirstParagraph"/>
+      </w:pPr>
+      <w:r>
+        <w:t xml:space="preserve">A real, graded coding surface on the live sandbox (no demo fallback). Two views: the</w:t>
+      </w:r>
+      <w:r>
+        <w:t xml:space="preserve"> </w:t>
+      </w:r>
+      <w:r>
+        <w:rPr>
+          <w:b/>
+          <w:bCs/>
+        </w:rPr>
+        <w:t xml:space="preserve">bank</w:t>
+      </w:r>
+      <w:r>
+        <w:t xml:space="preserve"> </w:t>
+      </w:r>
+      <w:r>
+        <w:t xml:space="preserve">and the</w:t>
+      </w:r>
+      <w:r>
+        <w:t xml:space="preserve"> </w:t>
+      </w:r>
+      <w:r>
+        <w:rPr>
+          <w:b/>
+          <w:bCs/>
+        </w:rPr>
+        <w:t xml:space="preserve">solve view</w:t>
+      </w:r>
+      <w:r>
+        <w:t xml:space="preserve">.</w:t>
+      </w:r>
+    </w:p>
+    <w:p>
+      <w:pPr>
+        <w:pStyle w:val="BodyText"/>
+      </w:pPr>
+      <w:r>
+        <w:rPr>
+          <w:b/>
+          <w:bCs/>
+        </w:rPr>
+        <w:t xml:space="preserve">Bank view</w:t>
+      </w:r>
+      <w:r>
+        <w:t xml:space="preserve"> </w:t>
+      </w:r>
+      <w:r>
+        <w:t xml:space="preserve">- On mount,</w:t>
+      </w:r>
+      <w:r>
+        <w:t xml:space="preserve"> </w:t>
+      </w:r>
+      <w:r>
+        <w:rPr>
+          <w:rStyle w:val="VerbatimChar"/>
+        </w:rPr>
+        <w:t xml:space="preserve">GET /lms/v1/practice/problems</w:t>
+      </w:r>
+      <w:r>
+        <w:t xml:space="preserve"> </w:t>
+      </w:r>
+      <w:r>
+        <w:t xml:space="preserve">(all practice problems) and, if signed in,</w:t>
+      </w:r>
+      <w:r>
+        <w:t xml:space="preserve"> </w:t>
+      </w:r>
+      <w:r>
+        <w:rPr>
+          <w:rStyle w:val="VerbatimChar"/>
+        </w:rPr>
+        <w:t xml:space="preserve">GET /lms/v1/practice/skills/{id}</w:t>
+      </w:r>
+      <w:r>
+        <w:t xml:space="preserve"> </w:t>
+      </w:r>
+      <w:r>
+        <w:t xml:space="preserve">run in parallel.</w:t>
+      </w:r>
+      <w:r>
+        <w:t xml:space="preserve"> </w:t>
+      </w:r>
+      <w:r>
+        <w:t xml:space="preserve">-</w:t>
+      </w:r>
+      <w:r>
+        <w:t xml:space="preserve"> </w:t>
+      </w:r>
+      <w:r>
+        <w:rPr>
+          <w:b/>
+          <w:bCs/>
+        </w:rPr>
+        <w:t xml:space="preserve">Stats strip</w:t>
+      </w:r>
+      <w:r>
+        <w:t xml:space="preserve"> </w:t>
+      </w:r>
+      <w:r>
+        <w:t xml:space="preserve">(when the learner has attempted) — Problems solved (</w:t>
+      </w:r>
+      <w:r>
+        <w:rPr>
+          <w:rStyle w:val="VerbatimChar"/>
+        </w:rPr>
+        <w:t xml:space="preserve">solved/attempted</w:t>
+      </w:r>
+      <w:r>
+        <w:t xml:space="preserve">), Verified skills, Coding mastery %, and per-language solved counts.</w:t>
+      </w:r>
+      <w:r>
+        <w:t xml:space="preserve"> </w:t>
+      </w:r>
+      <w:r>
+        <w:t xml:space="preserve">- Problems are</w:t>
+      </w:r>
+      <w:r>
+        <w:t xml:space="preserve"> </w:t>
+      </w:r>
+      <w:r>
+        <w:rPr>
+          <w:b/>
+          <w:bCs/>
+        </w:rPr>
+        <w:t xml:space="preserve">grouped by skill</w:t>
+      </w:r>
+      <w:r>
+        <w:t xml:space="preserve">; each group header shows a mastery badge.</w:t>
+      </w:r>
+      <w:r>
+        <w:t xml:space="preserve"> </w:t>
+      </w:r>
+      <w:r>
+        <w:rPr>
+          <w:b/>
+          <w:bCs/>
+        </w:rPr>
+        <w:t xml:space="preserve">Problem card</w:t>
+      </w:r>
+      <w:r>
+        <w:t xml:space="preserve"> </w:t>
+      </w:r>
+      <w:r>
+        <w:t xml:space="preserve">— title, a difficulty badge (easy=teal / medium=amber / hard=rose), and up to five language chips. Clicking opens the solve view.</w:t>
+      </w:r>
+      <w:r>
+        <w:t xml:space="preserve"> </w:t>
+      </w:r>
+      <w:r>
+        <w:t xml:space="preserve">-</w:t>
+      </w:r>
+      <w:r>
+        <w:t xml:space="preserve"> </w:t>
+      </w:r>
+      <w:r>
+        <w:rPr>
+          <w:b/>
+          <w:bCs/>
+        </w:rPr>
+        <w:t xml:space="preserve">Empty state</w:t>
+      </w:r>
+      <w:r>
+        <w:t xml:space="preserve"> </w:t>
+      </w:r>
+      <w:r>
+        <w:t xml:space="preserve">—</w:t>
+      </w:r>
+      <w:r>
+        <w:t xml:space="preserve"> </w:t>
+      </w:r>
+      <w:r>
+        <w:t xml:space="preserve">“No practice problems yet”</w:t>
+      </w:r>
+      <w:r>
+        <w:t xml:space="preserve"> </w:t>
+      </w:r>
+      <w:r>
+        <w:t xml:space="preserve">when the trainer hasn’t published any.</w:t>
+      </w:r>
+      <w:r>
+        <w:t xml:space="preserve"> </w:t>
+      </w:r>
+      <w:r>
+        <w:t xml:space="preserve">-</w:t>
+      </w:r>
+      <w:r>
+        <w:t xml:space="preserve"> </w:t>
+      </w:r>
+      <w:r>
+        <w:rPr>
+          <w:b/>
+          <w:bCs/>
+        </w:rPr>
+        <w:t xml:space="preserve">Header action: My Skill Map</w:t>
+      </w:r>
+      <w:r>
+        <w:t xml:space="preserve">.</w:t>
+      </w:r>
+    </w:p>
+    <w:p>
+      <w:pPr>
+        <w:pStyle w:val="BodyText"/>
+      </w:pPr>
+      <w:r>
+        <w:rPr>
+          <w:b/>
+          <w:bCs/>
+        </w:rPr>
+        <w:t xml:space="preserve">Solve view</w:t>
+      </w:r>
+      <w:r>
+        <w:t xml:space="preserve"> </w:t>
+      </w:r>
+      <w:r>
+        <w:t xml:space="preserve">- On open,</w:t>
+      </w:r>
+      <w:r>
+        <w:t xml:space="preserve"> </w:t>
+      </w:r>
+      <w:r>
+        <w:rPr>
+          <w:rStyle w:val="VerbatimChar"/>
+        </w:rPr>
+        <w:t xml:space="preserve">POST /lms/v1/practice/session { problem_id, language }</w:t>
+      </w:r>
+      <w:r>
+        <w:t xml:space="preserve"> </w:t>
+      </w:r>
+      <w:r>
+        <w:t xml:space="preserve">starts a session; the statement and sample cases render on the left.</w:t>
+      </w:r>
+      <w:r>
+        <w:t xml:space="preserve"> </w:t>
+      </w:r>
+      <w:r>
+        <w:t xml:space="preserve">-</w:t>
+      </w:r>
+      <w:r>
+        <w:t xml:space="preserve"> </w:t>
+      </w:r>
+      <w:r>
+        <w:rPr>
+          <w:b/>
+          <w:bCs/>
+        </w:rPr>
+        <w:t xml:space="preserve">Language tabs</w:t>
+      </w:r>
+      <w:r>
+        <w:t xml:space="preserve"> </w:t>
+      </w:r>
+      <w:r>
+        <w:t xml:space="preserve">— switching language resets the editor to that language’s starter template and lazily opens a new session on the next Run/Submit.</w:t>
+      </w:r>
+      <w:r>
+        <w:t xml:space="preserve"> </w:t>
+      </w:r>
+      <w:r>
+        <w:t xml:space="preserve">-</w:t>
+      </w:r>
+      <w:r>
+        <w:t xml:space="preserve"> </w:t>
+      </w:r>
+      <w:r>
+        <w:rPr>
+          <w:b/>
+          <w:bCs/>
+        </w:rPr>
+        <w:t xml:space="preserve">Editor</w:t>
+      </w:r>
+      <w:r>
+        <w:t xml:space="preserve"> </w:t>
+      </w:r>
+      <w:r>
+        <w:t xml:space="preserve">— a monospace</w:t>
+      </w:r>
+      <w:r>
+        <w:t xml:space="preserve"> </w:t>
+      </w:r>
+      <w:r>
+        <w:rPr>
+          <w:rStyle w:val="VerbatimChar"/>
+        </w:rPr>
+        <w:t xml:space="preserve">stdin → stdout</w:t>
+      </w:r>
+      <w:r>
+        <w:t xml:space="preserve"> </w:t>
+      </w:r>
+      <w:r>
+        <w:t xml:space="preserve">textarea seeded from</w:t>
+      </w:r>
+      <w:r>
+        <w:t xml:space="preserve"> </w:t>
+      </w:r>
+      <w:r>
+        <w:rPr>
+          <w:rStyle w:val="VerbatimChar"/>
+        </w:rPr>
+        <w:t xml:space="preserve">STARTERS</w:t>
+      </w:r>
+      <w:r>
+        <w:t xml:space="preserve"> </w:t>
+      </w:r>
+      <w:r>
+        <w:t xml:space="preserve">(python/javascript/cpp/java/c).</w:t>
+      </w:r>
+      <w:r>
+        <w:t xml:space="preserve"> </w:t>
+      </w:r>
+      <w:r>
+        <w:t xml:space="preserve">-</w:t>
+      </w:r>
+      <w:r>
+        <w:t xml:space="preserve"> </w:t>
+      </w:r>
+      <w:r>
+        <w:rPr>
+          <w:b/>
+          <w:bCs/>
+        </w:rPr>
+        <w:t xml:space="preserve">Button: Run samples</w:t>
+      </w:r>
+      <w:r>
+        <w:t xml:space="preserve"> </w:t>
+      </w:r>
+      <w:r>
+        <w:t xml:space="preserve">→</w:t>
+      </w:r>
+      <w:r>
+        <w:t xml:space="preserve"> </w:t>
+      </w:r>
+      <w:r>
+        <w:rPr>
+          <w:rStyle w:val="VerbatimChar"/>
+        </w:rPr>
+        <w:t xml:space="preserve">POST /lms/v1/practice/{sid}/run</w:t>
+      </w:r>
+      <w:r>
+        <w:t xml:space="preserve"> </w:t>
+      </w:r>
+      <w:r>
+        <w:t xml:space="preserve">→ a</w:t>
+      </w:r>
+      <w:r>
+        <w:t xml:space="preserve"> </w:t>
+      </w:r>
+      <w:r>
+        <w:t xml:space="preserve">“Sample results”</w:t>
+      </w:r>
+      <w:r>
+        <w:t xml:space="preserve"> </w:t>
+      </w:r>
+      <w:r>
+        <w:t xml:space="preserve">card with</w:t>
+      </w:r>
+      <w:r>
+        <w:t xml:space="preserve"> </w:t>
+      </w:r>
+      <w:r>
+        <w:rPr>
+          <w:rStyle w:val="VerbatimChar"/>
+        </w:rPr>
+        <w:t xml:space="preserve">passed/total</w:t>
+      </w:r>
+      <w:r>
+        <w:t xml:space="preserve">, compile errors if any, and per-case pass/fail (showing your output on failures — expected is never leaked for hidden cases).</w:t>
+      </w:r>
+      <w:r>
+        <w:t xml:space="preserve"> </w:t>
+      </w:r>
+      <w:r>
+        <w:t xml:space="preserve">-</w:t>
+      </w:r>
+      <w:r>
+        <w:t xml:space="preserve"> </w:t>
+      </w:r>
+      <w:r>
+        <w:rPr>
+          <w:b/>
+          <w:bCs/>
+        </w:rPr>
+        <w:t xml:space="preserve">Button: Submit</w:t>
+      </w:r>
+      <w:r>
+        <w:t xml:space="preserve"> </w:t>
+      </w:r>
+      <w:r>
+        <w:t xml:space="preserve">→</w:t>
+      </w:r>
+      <w:r>
+        <w:t xml:space="preserve"> </w:t>
+      </w:r>
+      <w:r>
+        <w:rPr>
+          <w:rStyle w:val="VerbatimChar"/>
+        </w:rPr>
+        <w:t xml:space="preserve">POST /lms/v1/practice/{sid}/submit</w:t>
+      </w:r>
+      <w:r>
+        <w:t xml:space="preserve"> </w:t>
+      </w:r>
+      <w:r>
+        <w:t xml:space="preserve">→ a result card:</w:t>
+      </w:r>
+      <w:r>
+        <w:t xml:space="preserve"> </w:t>
+      </w:r>
+      <w:r>
+        <w:rPr>
+          <w:b/>
+          <w:bCs/>
+        </w:rPr>
+        <w:t xml:space="preserve">Solved! 🎉</w:t>
+      </w:r>
+      <w:r>
+        <w:t xml:space="preserve"> </w:t>
+      </w:r>
+      <w:r>
+        <w:t xml:space="preserve">or</w:t>
+      </w:r>
+      <w:r>
+        <w:t xml:space="preserve"> </w:t>
+      </w:r>
+      <w:r>
+        <w:rPr>
+          <w:b/>
+          <w:bCs/>
+        </w:rPr>
+        <w:t xml:space="preserve">Partial</w:t>
+      </w:r>
+      <w:r>
+        <w:t xml:space="preserve">, with</w:t>
+      </w:r>
+      <w:r>
+        <w:t xml:space="preserve"> </w:t>
+      </w:r>
+      <w:r>
+        <w:rPr>
+          <w:rStyle w:val="VerbatimChar"/>
+        </w:rPr>
+        <w:t xml:space="preserve">cases_passed/total_cases</w:t>
+      </w:r>
+      <w:r>
+        <w:t xml:space="preserve"> </w:t>
+      </w:r>
+      <w:r>
+        <w:t xml:space="preserve">and score;</w:t>
+      </w:r>
+      <w:r>
+        <w:t xml:space="preserve"> </w:t>
+      </w:r>
+      <w:r>
+        <w:t xml:space="preserve">“Your Skill Map has been updated.”</w:t>
+      </w:r>
+      <w:r>
+        <w:t xml:space="preserve"> </w:t>
+      </w:r>
+      <w:r>
+        <w:t xml:space="preserve">-</w:t>
+      </w:r>
+      <w:r>
+        <w:t xml:space="preserve"> </w:t>
+      </w:r>
+      <w:r>
+        <w:rPr>
+          <w:b/>
+          <w:bCs/>
+        </w:rPr>
+        <w:t xml:space="preserve">Adversarial viva</w:t>
+      </w:r>
+      <w:r>
+        <w:t xml:space="preserve"> </w:t>
+      </w:r>
+      <w:r>
+        <w:t xml:space="preserve">(only after a full solve) — the cheat-resistant proof of understanding:</w:t>
+      </w:r>
+      <w:r>
+        <w:t xml:space="preserve"> </w:t>
+      </w:r>
+      <w:r>
+        <w:t xml:space="preserve">-</w:t>
+      </w:r>
+      <w:r>
+        <w:t xml:space="preserve"> </w:t>
+      </w:r>
+      <w:r>
+        <w:rPr>
+          <w:b/>
+          <w:bCs/>
+        </w:rPr>
+        <w:t xml:space="preserve">Button: Start viva</w:t>
+      </w:r>
+      <w:r>
+        <w:t xml:space="preserve"> </w:t>
+      </w:r>
+      <w:r>
+        <w:t xml:space="preserve">→</w:t>
+      </w:r>
+      <w:r>
+        <w:t xml:space="preserve"> </w:t>
+      </w:r>
+      <w:r>
+        <w:rPr>
+          <w:rStyle w:val="VerbatimChar"/>
+        </w:rPr>
+        <w:t xml:space="preserve">POST /lms/v1/practice/{sid}/viva</w:t>
+      </w:r>
+      <w:r>
+        <w:t xml:space="preserve"> </w:t>
+      </w:r>
+      <w:r>
+        <w:t xml:space="preserve">returns an examiner’s question about</w:t>
+      </w:r>
+      <w:r>
+        <w:t xml:space="preserve"> </w:t>
+      </w:r>
+      <w:r>
+        <w:rPr>
+          <w:i/>
+          <w:iCs/>
+        </w:rPr>
+        <w:t xml:space="preserve">your</w:t>
+      </w:r>
+      <w:r>
+        <w:t xml:space="preserve"> </w:t>
+      </w:r>
+      <w:r>
+        <w:t xml:space="preserve">solution.</w:t>
+      </w:r>
+      <w:r>
+        <w:t xml:space="preserve"> </w:t>
+      </w:r>
+      <w:r>
+        <w:t xml:space="preserve">-</w:t>
+      </w:r>
+      <w:r>
+        <w:t xml:space="preserve"> </w:t>
+      </w:r>
+      <w:r>
+        <w:rPr>
+          <w:b/>
+          <w:bCs/>
+        </w:rPr>
+        <w:t xml:space="preserve">Explanation textarea</w:t>
+      </w:r>
+      <w:r>
+        <w:t xml:space="preserve"> </w:t>
+      </w:r>
+      <w:r>
+        <w:t xml:space="preserve">+</w:t>
+      </w:r>
+      <w:r>
+        <w:t xml:space="preserve"> </w:t>
+      </w:r>
+      <w:r>
+        <w:rPr>
+          <w:b/>
+          <w:bCs/>
+        </w:rPr>
+        <w:t xml:space="preserve">Submit explanation</w:t>
+      </w:r>
+      <w:r>
+        <w:t xml:space="preserve"> </w:t>
+      </w:r>
+      <w:r>
+        <w:t xml:space="preserve">→</w:t>
+      </w:r>
+      <w:r>
+        <w:t xml:space="preserve"> </w:t>
+      </w:r>
+      <w:r>
+        <w:rPr>
+          <w:rStyle w:val="VerbatimChar"/>
+        </w:rPr>
+        <w:t xml:space="preserve">POST /lms/v1/practice/viva/{vivaId} { answer }</w:t>
+      </w:r>
+      <w:r>
+        <w:t xml:space="preserve"> </w:t>
+      </w:r>
+      <w:r>
+        <w:t xml:space="preserve">→</w:t>
+      </w:r>
+      <w:r>
+        <w:t xml:space="preserve"> </w:t>
+      </w:r>
+      <w:r>
+        <w:rPr>
+          <w:b/>
+          <w:bCs/>
+        </w:rPr>
+        <w:t xml:space="preserve">Verified ✓</w:t>
+      </w:r>
+      <w:r>
+        <w:t xml:space="preserve"> </w:t>
+      </w:r>
+      <w:r>
+        <w:t xml:space="preserve">(with verdict) or</w:t>
+      </w:r>
+      <w:r>
+        <w:t xml:space="preserve"> </w:t>
+      </w:r>
+      <w:r>
+        <w:t xml:space="preserve">“Not verified yet (score/100)”</w:t>
+      </w:r>
+      <w:r>
+        <w:t xml:space="preserve"> </w:t>
+      </w:r>
+      <w:r>
+        <w:t xml:space="preserve">with a</w:t>
+      </w:r>
+      <w:r>
+        <w:t xml:space="preserve"> </w:t>
+      </w:r>
+      <w:r>
+        <w:rPr>
+          <w:b/>
+          <w:bCs/>
+        </w:rPr>
+        <w:t xml:space="preserve">Try explaining again</w:t>
+      </w:r>
+      <w:r>
+        <w:t xml:space="preserve"> </w:t>
+      </w:r>
+      <w:r>
+        <w:t xml:space="preserve">option. Passing earns a</w:t>
+      </w:r>
+      <w:r>
+        <w:t xml:space="preserve"> </w:t>
+      </w:r>
+      <w:r>
+        <w:rPr>
+          <w:i/>
+          <w:iCs/>
+        </w:rPr>
+        <w:t xml:space="preserve">Verified</w:t>
+      </w:r>
+      <w:r>
+        <w:t xml:space="preserve"> </w:t>
+      </w:r>
+      <w:r>
+        <w:t xml:space="preserve">mark on the Skill Map.</w:t>
+      </w:r>
+      <w:r>
+        <w:t xml:space="preserve"> </w:t>
+      </w:r>
+      <w:r>
+        <w:t xml:space="preserve">-</w:t>
+      </w:r>
+      <w:r>
+        <w:t xml:space="preserve"> </w:t>
+      </w:r>
+      <w:r>
+        <w:rPr>
+          <w:b/>
+          <w:bCs/>
+        </w:rPr>
+        <w:t xml:space="preserve">ProctorBanner</w:t>
+      </w:r>
+      <w:r>
+        <w:t xml:space="preserve"> </w:t>
+      </w:r>
+      <w:r>
+        <w:t xml:space="preserve">is active throughout.</w:t>
+      </w:r>
+    </w:p>
+    <w:bookmarkEnd w:id="178"/>
+    <w:bookmarkStart w:id="179" w:name="practice-worlds-lmsworlds"/>
+    <w:p>
+      <w:pPr>
+        <w:pStyle w:val="Heading2"/>
+      </w:pPr>
+      <w:r>
+        <w:t xml:space="preserve">20.2 Practice Worlds (</w:t>
+      </w:r>
+      <w:r>
+        <w:rPr>
+          <w:rStyle w:val="VerbatimChar"/>
+        </w:rPr>
+        <w:t xml:space="preserve">/lms/worlds</w:t>
+      </w:r>
+      <w:r>
+        <w:t xml:space="preserve">)</w:t>
+      </w:r>
+    </w:p>
+    <w:p>
+      <w:pPr>
+        <w:pStyle w:val="FirstParagraph"/>
+      </w:pPr>
+      <w:r>
+        <w:t xml:space="preserve">Embodied practice — a stepped, on-the-job scenario scored from decisions.</w:t>
+      </w:r>
+    </w:p>
+    <w:p>
+      <w:pPr>
+        <w:pStyle w:val="BodyText"/>
+      </w:pPr>
+      <w:r>
+        <w:rPr>
+          <w:b/>
+          <w:bCs/>
+        </w:rPr>
+        <w:t xml:space="preserve">Catalogue</w:t>
+      </w:r>
+      <w:r>
+        <w:t xml:space="preserve"> </w:t>
+      </w:r>
+      <w:r>
+        <w:t xml:space="preserve">-</w:t>
+      </w:r>
+      <w:r>
+        <w:t xml:space="preserve"> </w:t>
+      </w:r>
+      <w:r>
+        <w:rPr>
+          <w:rStyle w:val="VerbatimChar"/>
+        </w:rPr>
+        <w:t xml:space="preserve">GET /lms/v1/worlds</w:t>
+      </w:r>
+      <w:r>
+        <w:t xml:space="preserve"> </w:t>
+      </w:r>
+      <w:r>
+        <w:t xml:space="preserve">→ world cards: icon, difficulty badge, title, a 2-line summary, role, step count, and mapped skill. Empty state when none published.</w:t>
+      </w:r>
+    </w:p>
+    <w:p>
+      <w:pPr>
+        <w:pStyle w:val="BodyText"/>
+      </w:pPr>
+      <w:r>
+        <w:rPr>
+          <w:b/>
+          <w:bCs/>
+        </w:rPr>
+        <w:t xml:space="preserve">Player</w:t>
+      </w:r>
+      <w:r>
+        <w:t xml:space="preserve"> </w:t>
+      </w:r>
+      <w:r>
+        <w:t xml:space="preserve">- On open,</w:t>
+      </w:r>
+      <w:r>
+        <w:t xml:space="preserve"> </w:t>
+      </w:r>
+      <w:r>
+        <w:rPr>
+          <w:rStyle w:val="VerbatimChar"/>
+        </w:rPr>
+        <w:t xml:space="preserve">POST /lms/v1/worlds/{worldId}/start</w:t>
+      </w:r>
+      <w:r>
+        <w:t xml:space="preserve"> </w:t>
+      </w:r>
+      <w:r>
+        <w:t xml:space="preserve">returns the first step and progress.</w:t>
+      </w:r>
+      <w:r>
+        <w:t xml:space="preserve"> </w:t>
+      </w:r>
+      <w:r>
+        <w:t xml:space="preserve">-</w:t>
+      </w:r>
+      <w:r>
+        <w:t xml:space="preserve"> </w:t>
+      </w:r>
+      <w:r>
+        <w:rPr>
+          <w:b/>
+          <w:bCs/>
+        </w:rPr>
+        <w:t xml:space="preserve">Step card</w:t>
+      </w:r>
+      <w:r>
+        <w:t xml:space="preserve"> </w:t>
+      </w:r>
+      <w:r>
+        <w:t xml:space="preserve">— the</w:t>
+      </w:r>
+      <w:r>
+        <w:t xml:space="preserve"> </w:t>
+      </w:r>
+      <w:r>
+        <w:rPr>
+          <w:b/>
+          <w:bCs/>
+        </w:rPr>
+        <w:t xml:space="preserve">situation</w:t>
+      </w:r>
+      <w:r>
+        <w:t xml:space="preserve"> </w:t>
+      </w:r>
+      <w:r>
+        <w:t xml:space="preserve">text, an optional</w:t>
+      </w:r>
+      <w:r>
+        <w:t xml:space="preserve"> </w:t>
+      </w:r>
+      <w:r>
+        <w:rPr>
+          <w:b/>
+          <w:bCs/>
+        </w:rPr>
+        <w:t xml:space="preserve">Artifact</w:t>
+      </w:r>
+      <w:r>
+        <w:t xml:space="preserve"> </w:t>
+      </w:r>
+      <w:r>
+        <w:t xml:space="preserve">panel (logs / code / data table, terminal-styled), the</w:t>
+      </w:r>
+      <w:r>
+        <w:t xml:space="preserve"> </w:t>
+      </w:r>
+      <w:r>
+        <w:rPr>
+          <w:b/>
+          <w:bCs/>
+        </w:rPr>
+        <w:t xml:space="preserve">prompt</w:t>
+      </w:r>
+      <w:r>
+        <w:t xml:space="preserve">, and option buttons.</w:t>
+      </w:r>
+      <w:r>
+        <w:t xml:space="preserve"> </w:t>
+      </w:r>
+      <w:r>
+        <w:t xml:space="preserve">- Choosing an option →</w:t>
+      </w:r>
+      <w:r>
+        <w:t xml:space="preserve"> </w:t>
+      </w:r>
+      <w:r>
+        <w:rPr>
+          <w:rStyle w:val="VerbatimChar"/>
+        </w:rPr>
+        <w:t xml:space="preserve">POST /lms/v1/worlds/runs/{runId}/answer { step_id, choice }</w:t>
+      </w:r>
+      <w:r>
+        <w:t xml:space="preserve"> </w:t>
+      </w:r>
+      <w:r>
+        <w:t xml:space="preserve">→ highlights the correct choice (teal) / wrong pick (rose), shows</w:t>
+      </w:r>
+      <w:r>
+        <w:t xml:space="preserve"> </w:t>
+      </w:r>
+      <w:r>
+        <w:rPr>
+          <w:b/>
+          <w:bCs/>
+        </w:rPr>
+        <w:t xml:space="preserve">feedback</w:t>
+      </w:r>
+      <w:r>
+        <w:t xml:space="preserve">, and updates the progress bar.</w:t>
+      </w:r>
+      <w:r>
+        <w:t xml:space="preserve"> </w:t>
+      </w:r>
+      <w:r>
+        <w:t xml:space="preserve">-</w:t>
+      </w:r>
+      <w:r>
+        <w:t xml:space="preserve"> </w:t>
+      </w:r>
+      <w:r>
+        <w:rPr>
+          <w:b/>
+          <w:bCs/>
+        </w:rPr>
+        <w:t xml:space="preserve">Button: Continue / See results</w:t>
+      </w:r>
+      <w:r>
+        <w:t xml:space="preserve"> </w:t>
+      </w:r>
+      <w:r>
+        <w:t xml:space="preserve">— advances to the next step or the summary.</w:t>
+      </w:r>
+      <w:r>
+        <w:t xml:space="preserve"> </w:t>
+      </w:r>
+      <w:r>
+        <w:t xml:space="preserve">-</w:t>
+      </w:r>
+      <w:r>
+        <w:t xml:space="preserve"> </w:t>
+      </w:r>
+      <w:r>
+        <w:rPr>
+          <w:b/>
+          <w:bCs/>
+        </w:rPr>
+        <w:t xml:space="preserve">Summary</w:t>
+      </w:r>
+      <w:r>
+        <w:t xml:space="preserve"> </w:t>
+      </w:r>
+      <w:r>
+        <w:t xml:space="preserve">—</w:t>
+      </w:r>
+      <w:r>
+        <w:t xml:space="preserve"> </w:t>
+      </w:r>
+      <w:r>
+        <w:rPr>
+          <w:b/>
+          <w:bCs/>
+        </w:rPr>
+        <w:t xml:space="preserve">score %</w:t>
+      </w:r>
+      <w:r>
+        <w:t xml:space="preserve"> </w:t>
+      </w:r>
+      <w:r>
+        <w:t xml:space="preserve">and</w:t>
+      </w:r>
+      <w:r>
+        <w:t xml:space="preserve"> </w:t>
+      </w:r>
+      <w:r>
+        <w:t xml:space="preserve">“handled well / keep practising”</w:t>
+      </w:r>
+      <w:r>
+        <w:t xml:space="preserve">,</w:t>
+      </w:r>
+      <w:r>
+        <w:t xml:space="preserve"> </w:t>
+      </w:r>
+      <w:r>
+        <w:rPr>
+          <w:rStyle w:val="VerbatimChar"/>
+        </w:rPr>
+        <w:t xml:space="preserve">correct/total</w:t>
+      </w:r>
+      <w:r>
+        <w:t xml:space="preserve"> </w:t>
+      </w:r>
+      <w:r>
+        <w:t xml:space="preserve">good calls as the role, and a note that the skill + review schedule updated.</w:t>
+      </w:r>
+      <w:r>
+        <w:t xml:space="preserve"> </w:t>
+      </w:r>
+      <w:r>
+        <w:rPr>
+          <w:b/>
+          <w:bCs/>
+        </w:rPr>
+        <w:t xml:space="preserve">Buttons: Back to worlds</w:t>
+      </w:r>
+      <w:r>
+        <w:t xml:space="preserve">,</w:t>
+      </w:r>
+      <w:r>
+        <w:t xml:space="preserve"> </w:t>
+      </w:r>
+      <w:r>
+        <w:rPr>
+          <w:b/>
+          <w:bCs/>
+        </w:rPr>
+        <w:t xml:space="preserve">Skill Map</w:t>
+      </w:r>
+      <w:r>
+        <w:t xml:space="preserve">.</w:t>
+      </w:r>
+      <w:r>
+        <w:t xml:space="preserve"> </w:t>
+      </w:r>
+      <w:r>
+        <w:t xml:space="preserve">-</w:t>
+      </w:r>
+      <w:r>
+        <w:t xml:space="preserve"> </w:t>
+      </w:r>
+      <w:r>
+        <w:rPr>
+          <w:b/>
+          <w:bCs/>
+        </w:rPr>
+        <w:t xml:space="preserve">ProctorBanner</w:t>
+      </w:r>
+      <w:r>
+        <w:t xml:space="preserve"> </w:t>
+      </w:r>
+      <w:r>
+        <w:t xml:space="preserve">active while answering.</w:t>
+      </w:r>
+    </w:p>
+    <w:bookmarkEnd w:id="179"/>
+    <w:bookmarkStart w:id="180" w:name="career-readiness-lmscareers"/>
+    <w:p>
+      <w:pPr>
+        <w:pStyle w:val="Heading2"/>
+      </w:pPr>
+      <w:r>
+        <w:t xml:space="preserve">20.3 Career Readiness (</w:t>
+      </w:r>
+      <w:r>
+        <w:rPr>
+          <w:rStyle w:val="VerbatimChar"/>
+        </w:rPr>
+        <w:t xml:space="preserve">/lms/careers</w:t>
+      </w:r>
+      <w:r>
+        <w:t xml:space="preserve">)</w:t>
+      </w:r>
+    </w:p>
+    <w:p>
+      <w:pPr>
+        <w:pStyle w:val="FirstParagraph"/>
+      </w:pPr>
+      <w:r>
+        <w:t xml:space="preserve">Skills-to-Opportunity for the Learn domain (independent of live Hire drives).</w:t>
+      </w:r>
+    </w:p>
+    <w:p>
+      <w:pPr>
+        <w:pStyle w:val="Compact"/>
+        <w:numPr>
+          <w:ilvl w:val="0"/>
+          <w:numId w:val="1081"/>
+        </w:numPr>
+      </w:pPr>
+      <w:r>
+        <w:rPr>
+          <w:rStyle w:val="VerbatimChar"/>
+        </w:rPr>
+        <w:t xml:space="preserve">GET /lms/v1/careers/readiness/{id}</w:t>
+      </w:r>
+      <w:r>
+        <w:t xml:space="preserve"> </w:t>
+      </w:r>
+      <w:r>
+        <w:t xml:space="preserve">→</w:t>
+      </w:r>
+      <w:r>
+        <w:t xml:space="preserve"> </w:t>
+      </w:r>
+      <w:r>
+        <w:rPr>
+          <w:rStyle w:val="VerbatimChar"/>
+        </w:rPr>
+        <w:t xml:space="preserve">{ readiness:[roles], has_data }</w:t>
+      </w:r>
+      <w:r>
+        <w:t xml:space="preserve">.</w:t>
+      </w:r>
+    </w:p>
+    <w:p>
+      <w:pPr>
+        <w:pStyle w:val="Compact"/>
+        <w:numPr>
+          <w:ilvl w:val="0"/>
+          <w:numId w:val="1081"/>
+        </w:numPr>
+      </w:pPr>
+      <w:r>
+        <w:rPr>
+          <w:b/>
+          <w:bCs/>
+        </w:rPr>
+        <w:t xml:space="preserve">Empty states</w:t>
+      </w:r>
+      <w:r>
+        <w:t xml:space="preserve"> </w:t>
+      </w:r>
+      <w:r>
+        <w:t xml:space="preserve">—</w:t>
+      </w:r>
+      <w:r>
+        <w:t xml:space="preserve"> </w:t>
+      </w:r>
+      <w:r>
+        <w:t xml:space="preserve">“Let’s find your direction”</w:t>
+      </w:r>
+      <w:r>
+        <w:t xml:space="preserve"> </w:t>
+      </w:r>
+      <w:r>
+        <w:t xml:space="preserve">(no data) or</w:t>
+      </w:r>
+      <w:r>
+        <w:t xml:space="preserve"> </w:t>
+      </w:r>
+      <w:r>
+        <w:t xml:space="preserve">“No career roles yet”</w:t>
+      </w:r>
+      <w:r>
+        <w:t xml:space="preserve"> </w:t>
+      </w:r>
+      <w:r>
+        <w:t xml:space="preserve">(trainer hasn’t set targets).</w:t>
+      </w:r>
+    </w:p>
+    <w:p>
+      <w:pPr>
+        <w:pStyle w:val="Compact"/>
+        <w:numPr>
+          <w:ilvl w:val="0"/>
+          <w:numId w:val="1081"/>
+        </w:numPr>
+      </w:pPr>
+      <w:r>
+        <w:rPr>
+          <w:b/>
+          <w:bCs/>
+        </w:rPr>
+        <w:t xml:space="preserve">Role card</w:t>
+      </w:r>
+      <w:r>
+        <w:t xml:space="preserve"> </w:t>
+      </w:r>
+      <w:r>
+        <w:t xml:space="preserve">— title, description, a large</w:t>
+      </w:r>
+      <w:r>
+        <w:t xml:space="preserve"> </w:t>
+      </w:r>
+      <w:r>
+        <w:rPr>
+          <w:b/>
+          <w:bCs/>
+        </w:rPr>
+        <w:t xml:space="preserve">ready %</w:t>
+      </w:r>
+      <w:r>
+        <w:t xml:space="preserve"> </w:t>
+      </w:r>
+      <w:r>
+        <w:t xml:space="preserve">(teal ≥80 / amber ≥50 / rose below) and a progress bar; badges for</w:t>
+      </w:r>
+      <w:r>
+        <w:t xml:space="preserve"> </w:t>
+      </w:r>
+      <w:r>
+        <w:rPr>
+          <w:b/>
+          <w:bCs/>
+        </w:rPr>
+        <w:t xml:space="preserve">N skills ready</w:t>
+      </w:r>
+      <w:r>
+        <w:t xml:space="preserve"> </w:t>
+      </w:r>
+      <w:r>
+        <w:t xml:space="preserve">and</w:t>
+      </w:r>
+      <w:r>
+        <w:t xml:space="preserve"> </w:t>
+      </w:r>
+      <w:r>
+        <w:rPr>
+          <w:b/>
+          <w:bCs/>
+        </w:rPr>
+        <w:t xml:space="preserve">N to learn</w:t>
+      </w:r>
+      <w:r>
+        <w:t xml:space="preserve">.</w:t>
+      </w:r>
+    </w:p>
+    <w:p>
+      <w:pPr>
+        <w:pStyle w:val="Compact"/>
+        <w:numPr>
+          <w:ilvl w:val="1"/>
+          <w:numId w:val="1082"/>
+        </w:numPr>
+      </w:pPr>
+      <w:r>
+        <w:rPr>
+          <w:b/>
+          <w:bCs/>
+        </w:rPr>
+        <w:t xml:space="preserve">Toggle: See what to learn / Hide details</w:t>
+      </w:r>
+      <w:r>
+        <w:t xml:space="preserve"> </w:t>
+      </w:r>
+      <w:r>
+        <w:t xml:space="preserve">— expands two columns:</w:t>
+      </w:r>
+      <w:r>
+        <w:t xml:space="preserve"> </w:t>
+      </w:r>
+      <w:r>
+        <w:rPr>
+          <w:b/>
+          <w:bCs/>
+        </w:rPr>
+        <w:t xml:space="preserve">Skills you have</w:t>
+      </w:r>
+      <w:r>
+        <w:t xml:space="preserve"> </w:t>
+      </w:r>
+      <w:r>
+        <w:t xml:space="preserve">(name + mastery %) and</w:t>
+      </w:r>
+      <w:r>
+        <w:t xml:space="preserve"> </w:t>
+      </w:r>
+      <w:r>
+        <w:rPr>
+          <w:b/>
+          <w:bCs/>
+        </w:rPr>
+        <w:t xml:space="preserve">Learn next (biggest impact first)</w:t>
+      </w:r>
+      <w:r>
+        <w:t xml:space="preserve"> </w:t>
+      </w:r>
+      <w:r>
+        <w:t xml:space="preserve">(name + weight + current mastery).</w:t>
+      </w:r>
+    </w:p>
+    <w:p>
+      <w:pPr>
+        <w:pStyle w:val="Compact"/>
+        <w:numPr>
+          <w:ilvl w:val="1"/>
+          <w:numId w:val="1082"/>
+        </w:numPr>
+      </w:pPr>
+      <w:r>
+        <w:rPr>
+          <w:b/>
+          <w:bCs/>
+        </w:rPr>
+        <w:t xml:space="preserve">Buttons (in details): Practice</w:t>
+      </w:r>
+      <w:r>
+        <w:t xml:space="preserve"> </w:t>
+      </w:r>
+      <w:r>
+        <w:t xml:space="preserve">(→</w:t>
+      </w:r>
+      <w:r>
+        <w:t xml:space="preserve"> </w:t>
+      </w:r>
+      <w:r>
+        <w:rPr>
+          <w:rStyle w:val="VerbatimChar"/>
+        </w:rPr>
+        <w:t xml:space="preserve">/lms/practice</w:t>
+      </w:r>
+      <w:r>
+        <w:t xml:space="preserve">) and</w:t>
+      </w:r>
+      <w:r>
+        <w:t xml:space="preserve"> </w:t>
+      </w:r>
+      <w:r>
+        <w:rPr>
+          <w:b/>
+          <w:bCs/>
+        </w:rPr>
+        <w:t xml:space="preserve">Plan</w:t>
+      </w:r>
+      <w:r>
+        <w:t xml:space="preserve"> </w:t>
+      </w:r>
+      <w:r>
+        <w:t xml:space="preserve">(→</w:t>
+      </w:r>
+      <w:r>
+        <w:t xml:space="preserve"> </w:t>
+      </w:r>
+      <w:r>
+        <w:rPr>
+          <w:rStyle w:val="VerbatimChar"/>
+        </w:rPr>
+        <w:t xml:space="preserve">/lms/skill-map</w:t>
+      </w:r>
+      <w:r>
+        <w:t xml:space="preserve">).</w:t>
+      </w:r>
+    </w:p>
+    <w:p>
+      <w:pPr>
+        <w:pStyle w:val="Compact"/>
+        <w:numPr>
+          <w:ilvl w:val="0"/>
+          <w:numId w:val="1081"/>
+        </w:numPr>
+      </w:pPr>
+      <w:r>
+        <w:rPr>
+          <w:b/>
+          <w:bCs/>
+        </w:rPr>
+        <w:t xml:space="preserve">Header action: My Skill Map</w:t>
+      </w:r>
+      <w:r>
+        <w:t xml:space="preserve">.</w:t>
+      </w:r>
+    </w:p>
+    <w:bookmarkEnd w:id="180"/>
+    <w:bookmarkStart w:id="181" w:name="my-learning-wallet-lmswallet"/>
+    <w:p>
+      <w:pPr>
+        <w:pStyle w:val="Heading2"/>
+      </w:pPr>
+      <w:r>
+        <w:t xml:space="preserve">20.4 My Learning Wallet (</w:t>
+      </w:r>
+      <w:r>
+        <w:rPr>
+          <w:rStyle w:val="VerbatimChar"/>
+        </w:rPr>
+        <w:t xml:space="preserve">/lms/wallet</w:t>
+      </w:r>
+      <w:r>
+        <w:t xml:space="preserve">)</w:t>
+      </w:r>
+    </w:p>
+    <w:p>
+      <w:pPr>
+        <w:pStyle w:val="FirstParagraph"/>
+      </w:pPr>
+      <w:r>
+        <w:t xml:space="preserve">The Sovereign Learning Wallet — a signed, publicly verifiable competence record.</w:t>
+      </w:r>
+    </w:p>
+    <w:p>
+      <w:pPr>
+        <w:pStyle w:val="Compact"/>
+        <w:numPr>
+          <w:ilvl w:val="0"/>
+          <w:numId w:val="1083"/>
+        </w:numPr>
+      </w:pPr>
+      <w:r>
+        <w:rPr>
+          <w:rStyle w:val="VerbatimChar"/>
+        </w:rPr>
+        <w:t xml:space="preserve">GET /lms/v1/wallet/{id}</w:t>
+      </w:r>
+      <w:r>
+        <w:t xml:space="preserve"> </w:t>
+      </w:r>
+      <w:r>
+        <w:t xml:space="preserve">loads the credential (or the empty state).</w:t>
+      </w:r>
+    </w:p>
+    <w:p>
+      <w:pPr>
+        <w:pStyle w:val="Compact"/>
+        <w:numPr>
+          <w:ilvl w:val="0"/>
+          <w:numId w:val="1083"/>
+        </w:numPr>
+      </w:pPr>
+      <w:r>
+        <w:rPr>
+          <w:b/>
+          <w:bCs/>
+        </w:rPr>
+        <w:t xml:space="preserve">Empty state</w:t>
+      </w:r>
+      <w:r>
+        <w:t xml:space="preserve"> </w:t>
+      </w:r>
+      <w:r>
+        <w:t xml:space="preserve">—</w:t>
+      </w:r>
+      <w:r>
+        <w:t xml:space="preserve"> </w:t>
+      </w:r>
+      <w:r>
+        <w:t xml:space="preserve">“Create your verified wallet”</w:t>
+      </w:r>
+      <w:r>
+        <w:t xml:space="preserve"> </w:t>
+      </w:r>
+      <w:r>
+        <w:t xml:space="preserve">with an</w:t>
+      </w:r>
+      <w:r>
+        <w:t xml:space="preserve"> </w:t>
+      </w:r>
+      <w:r>
+        <w:rPr>
+          <w:b/>
+          <w:bCs/>
+        </w:rPr>
+        <w:t xml:space="preserve">Issue my wallet</w:t>
+      </w:r>
+      <w:r>
+        <w:t xml:space="preserve"> </w:t>
+      </w:r>
+      <w:r>
+        <w:t xml:space="preserve">button →</w:t>
+      </w:r>
+      <w:r>
+        <w:t xml:space="preserve"> </w:t>
+      </w:r>
+      <w:r>
+        <w:rPr>
+          <w:rStyle w:val="VerbatimChar"/>
+        </w:rPr>
+        <w:t xml:space="preserve">POST /lms/v1/wallet/{id}/issue</w:t>
+      </w:r>
+      <w:r>
+        <w:t xml:space="preserve">.</w:t>
+      </w:r>
+    </w:p>
+    <w:p>
+      <w:pPr>
+        <w:pStyle w:val="Compact"/>
+        <w:numPr>
+          <w:ilvl w:val="0"/>
+          <w:numId w:val="1083"/>
+        </w:numPr>
+      </w:pPr>
+      <w:r>
+        <w:rPr>
+          <w:b/>
+          <w:bCs/>
+        </w:rPr>
+        <w:t xml:space="preserve">Credential card</w:t>
+      </w:r>
+      <w:r>
+        <w:t xml:space="preserve"> </w:t>
+      </w:r>
+      <w:r>
+        <w:t xml:space="preserve">—</w:t>
+      </w:r>
+      <w:r>
+        <w:t xml:space="preserve"> </w:t>
+      </w:r>
+      <w:r>
+        <w:t xml:space="preserve">“LARE Verified Competence”</w:t>
+      </w:r>
+      <w:r>
+        <w:t xml:space="preserve">, subject name, issued date + issuer, and a big</w:t>
+      </w:r>
+      <w:r>
+        <w:t xml:space="preserve"> </w:t>
+      </w:r>
+      <w:r>
+        <w:rPr>
+          <w:b/>
+          <w:bCs/>
+        </w:rPr>
+        <w:t xml:space="preserve">overall mastery %</w:t>
+      </w:r>
+      <w:r>
+        <w:t xml:space="preserve">. Metrics: Assessments, Problems solved,</w:t>
+      </w:r>
+      <w:r>
+        <w:t xml:space="preserve"> </w:t>
+      </w:r>
+      <w:r>
+        <w:rPr>
+          <w:b/>
+          <w:bCs/>
+        </w:rPr>
+        <w:t xml:space="preserve">Verified (viva)</w:t>
+      </w:r>
+      <w:r>
+        <w:t xml:space="preserve">. Chips for</w:t>
+      </w:r>
+      <w:r>
+        <w:t xml:space="preserve"> </w:t>
+      </w:r>
+      <w:r>
+        <w:rPr>
+          <w:b/>
+          <w:bCs/>
+        </w:rPr>
+        <w:t xml:space="preserve">Proven strengths</w:t>
+      </w:r>
+      <w:r>
+        <w:t xml:space="preserve"> </w:t>
+      </w:r>
+      <w:r>
+        <w:t xml:space="preserve">and</w:t>
+      </w:r>
+      <w:r>
+        <w:t xml:space="preserve"> </w:t>
+      </w:r>
+      <w:r>
+        <w:rPr>
+          <w:b/>
+          <w:bCs/>
+        </w:rPr>
+        <w:t xml:space="preserve">Viva-verified coding</w:t>
+      </w:r>
+      <w:r>
+        <w:t xml:space="preserve">. A</w:t>
+      </w:r>
+      <w:r>
+        <w:t xml:space="preserve"> </w:t>
+      </w:r>
+      <w:r>
+        <w:t xml:space="preserve">“Closest career fit”</w:t>
+      </w:r>
+      <w:r>
+        <w:t xml:space="preserve"> </w:t>
+      </w:r>
+      <w:r>
+        <w:t xml:space="preserve">line.</w:t>
+      </w:r>
+    </w:p>
+    <w:p>
+      <w:pPr>
+        <w:pStyle w:val="Compact"/>
+        <w:numPr>
+          <w:ilvl w:val="0"/>
+          <w:numId w:val="1083"/>
+        </w:numPr>
+      </w:pPr>
+      <w:r>
+        <w:rPr>
+          <w:b/>
+          <w:bCs/>
+        </w:rPr>
+        <w:t xml:space="preserve">Share &amp; verify card</w:t>
+      </w:r>
+      <w:r>
+        <w:t xml:space="preserve"> </w:t>
+      </w:r>
+      <w:r>
+        <w:t xml:space="preserve">— the public</w:t>
+      </w:r>
+      <w:r>
+        <w:t xml:space="preserve"> </w:t>
+      </w:r>
+      <w:r>
+        <w:rPr>
+          <w:b/>
+          <w:bCs/>
+        </w:rPr>
+        <w:t xml:space="preserve">verify URL</w:t>
+      </w:r>
+      <w:r>
+        <w:t xml:space="preserve"> </w:t>
+      </w:r>
+      <w:r>
+        <w:t xml:space="preserve">(</w:t>
+      </w:r>
+      <w:r>
+        <w:rPr>
+          <w:rStyle w:val="VerbatimChar"/>
+        </w:rPr>
+        <w:t xml:space="preserve">/verify/wallet/{verify_id}</w:t>
+      </w:r>
+      <w:r>
+        <w:t xml:space="preserve">) with:</w:t>
+      </w:r>
+    </w:p>
+    <w:p>
+      <w:pPr>
+        <w:pStyle w:val="Compact"/>
+        <w:numPr>
+          <w:ilvl w:val="1"/>
+          <w:numId w:val="1084"/>
+        </w:numPr>
+      </w:pPr>
+      <w:r>
+        <w:rPr>
+          <w:b/>
+          <w:bCs/>
+        </w:rPr>
+        <w:t xml:space="preserve">Copy</w:t>
+      </w:r>
+      <w:r>
+        <w:t xml:space="preserve"> </w:t>
+      </w:r>
+      <w:r>
+        <w:t xml:space="preserve">(copies the link),</w:t>
+      </w:r>
+      <w:r>
+        <w:t xml:space="preserve"> </w:t>
+      </w:r>
+      <w:r>
+        <w:rPr>
+          <w:b/>
+          <w:bCs/>
+        </w:rPr>
+        <w:t xml:space="preserve">Open</w:t>
+      </w:r>
+      <w:r>
+        <w:t xml:space="preserve"> </w:t>
+      </w:r>
+      <w:r>
+        <w:t xml:space="preserve">(opens the public page).</w:t>
+      </w:r>
+    </w:p>
+    <w:p>
+      <w:pPr>
+        <w:pStyle w:val="Compact"/>
+        <w:numPr>
+          <w:ilvl w:val="1"/>
+          <w:numId w:val="1084"/>
+        </w:numPr>
+      </w:pPr>
+      <w:r>
+        <w:rPr>
+          <w:b/>
+          <w:bCs/>
+        </w:rPr>
+        <w:t xml:space="preserve">Download PDF</w:t>
+      </w:r>
+      <w:r>
+        <w:t xml:space="preserve"> </w:t>
+      </w:r>
+      <w:r>
+        <w:t xml:space="preserve">→</w:t>
+      </w:r>
+      <w:r>
+        <w:t xml:space="preserve"> </w:t>
+      </w:r>
+      <w:r>
+        <w:rPr>
+          <w:rStyle w:val="VerbatimChar"/>
+        </w:rPr>
+        <w:t xml:space="preserve">GET /lms/v1/wallet/{id}/export.pdf</w:t>
+      </w:r>
+      <w:r>
+        <w:t xml:space="preserve">.</w:t>
+      </w:r>
+      <w:r>
+        <w:t xml:space="preserve"> </w:t>
+      </w:r>
+      <w:r>
+        <w:rPr>
+          <w:b/>
+          <w:bCs/>
+        </w:rPr>
+        <w:t xml:space="preserve">Download JSON</w:t>
+      </w:r>
+      <w:r>
+        <w:t xml:space="preserve"> </w:t>
+      </w:r>
+      <w:r>
+        <w:t xml:space="preserve">(client-side blob).</w:t>
+      </w:r>
+      <w:r>
+        <w:t xml:space="preserve"> </w:t>
+      </w:r>
+      <w:r>
+        <w:rPr>
+          <w:b/>
+          <w:bCs/>
+        </w:rPr>
+        <w:t xml:space="preserve">Refresh</w:t>
+      </w:r>
+      <w:r>
+        <w:t xml:space="preserve"> </w:t>
+      </w:r>
+      <w:r>
+        <w:t xml:space="preserve">→ re-issue in place (a shared verify link keeps working).</w:t>
+      </w:r>
+      <w:r>
+        <w:t xml:space="preserve"> </w:t>
+      </w:r>
+      <w:r>
+        <w:rPr>
+          <w:b/>
+          <w:bCs/>
+        </w:rPr>
+        <w:t xml:space="preserve">Revoke</w:t>
+      </w:r>
+      <w:r>
+        <w:t xml:space="preserve"> </w:t>
+      </w:r>
+      <w:r>
+        <w:t xml:space="preserve">→</w:t>
+      </w:r>
+      <w:r>
+        <w:t xml:space="preserve"> </w:t>
+      </w:r>
+      <w:r>
+        <w:rPr>
+          <w:rStyle w:val="VerbatimChar"/>
+        </w:rPr>
+        <w:t xml:space="preserve">POST /lms/v1/wallet/{id}/revoke</w:t>
+      </w:r>
+      <w:r>
+        <w:t xml:space="preserve">.</w:t>
+      </w:r>
+    </w:p>
+    <w:p>
+      <w:pPr>
+        <w:pStyle w:val="Compact"/>
+        <w:numPr>
+          <w:ilvl w:val="0"/>
+          <w:numId w:val="1083"/>
+        </w:numPr>
+      </w:pPr>
+      <w:r>
+        <w:rPr>
+          <w:b/>
+          <w:bCs/>
+        </w:rPr>
+        <w:t xml:space="preserve">Header action: Skill Map</w:t>
+      </w:r>
+      <w:r>
+        <w:t xml:space="preserve">.</w:t>
+      </w:r>
+    </w:p>
+    <w:p>
+      <w:r>
         <w:pict>
           <v:rect style="width:0;height:1.5pt" o:hralign="center" o:hrstd="t" o:hr="t"/>
         </w:pict>
@@ -30949,8 +32692,8 @@
         <w:t xml:space="preserve">End of document. Prepared for LARE Cloud Solutions - a unit of LARE Consulting &amp; Technology Pvt. Ltd.</w:t>
       </w:r>
     </w:p>
-    <w:bookmarkEnd w:id="176"/>
-    <w:bookmarkEnd w:id="177"/>
+    <w:bookmarkEnd w:id="181"/>
+    <w:bookmarkEnd w:id="182"/>
     <w:sectPr>
       <w:footnotePr>
         <w:numRestart w:val="eachSect"/>
@@ -31625,6 +33368,18 @@
     <w:abstractNumId w:val="991"/>
   </w:num>
   <w:num w:numId="1080">
+    <w:abstractNumId w:val="991"/>
+  </w:num>
+  <w:num w:numId="1081">
+    <w:abstractNumId w:val="991"/>
+  </w:num>
+  <w:num w:numId="1082">
+    <w:abstractNumId w:val="991"/>
+  </w:num>
+  <w:num w:numId="1083">
+    <w:abstractNumId w:val="991"/>
+  </w:num>
+  <w:num w:numId="1084">
     <w:abstractNumId w:val="991"/>
   </w:num>
 </w:numbering>

</xml_diff>

<commit_message>
docs: detailed screen reference part 3 (Exam Portal + recruiter consoles)
Co-Authored-By: Claude Opus 4.8 <noreply@anthropic.com>
</commit_message>
<xml_diff>
--- a/docs/LARE-Documentation.docx
+++ b/docs/LARE-Documentation.docx
@@ -32675,6 +32675,2062 @@
     </w:p>
     <w:p>
       <w:r>
+        <w:br w:type="page"/>
+      </w:r>
+    </w:p>
+    <w:bookmarkEnd w:id="181"/>
+    <w:bookmarkEnd w:id="182"/>
+    <w:bookmarkStart w:id="191" w:name="detailed-screen-reference-lare-hire"/>
+    <w:p>
+      <w:pPr>
+        <w:pStyle w:val="Heading1"/>
+      </w:pPr>
+      <w:r>
+        <w:t xml:space="preserve">21. Detailed Screen Reference — LARE Hire</w:t>
+      </w:r>
+    </w:p>
+    <w:bookmarkStart w:id="183" w:name="exam-portal-drivetestexamid"/>
+    <w:p>
+      <w:pPr>
+        <w:pStyle w:val="Heading2"/>
+      </w:pPr>
+      <w:r>
+        <w:t xml:space="preserve">21.1 Exam Portal (</w:t>
+      </w:r>
+      <w:r>
+        <w:rPr>
+          <w:rStyle w:val="VerbatimChar"/>
+        </w:rPr>
+        <w:t xml:space="preserve">/drive/test/:examId</w:t>
+      </w:r>
+      <w:r>
+        <w:t xml:space="preserve">)</w:t>
+      </w:r>
+    </w:p>
+    <w:p>
+      <w:pPr>
+        <w:pStyle w:val="FirstParagraph"/>
+      </w:pPr>
+      <w:r>
+        <w:t xml:space="preserve">The proctored, timed exam experience. Two phases:</w:t>
+      </w:r>
+      <w:r>
+        <w:t xml:space="preserve"> </w:t>
+      </w:r>
+      <w:r>
+        <w:rPr>
+          <w:b/>
+          <w:bCs/>
+        </w:rPr>
+        <w:t xml:space="preserve">Instructions gate → Runner</w:t>
+      </w:r>
+      <w:r>
+        <w:t xml:space="preserve">.</w:t>
+      </w:r>
+      <w:r>
+        <w:t xml:space="preserve"> </w:t>
+      </w:r>
+      <w:r>
+        <w:rPr>
+          <w:rStyle w:val="VerbatimChar"/>
+        </w:rPr>
+        <w:t xml:space="preserve">VIOLATION_LIMIT = 5</w:t>
+      </w:r>
+      <w:r>
+        <w:t xml:space="preserve"> </w:t>
+      </w:r>
+      <w:r>
+        <w:t xml:space="preserve">(the client counts flags; the backend also decides via a weighted score).</w:t>
+      </w:r>
+    </w:p>
+    <w:p>
+      <w:pPr>
+        <w:pStyle w:val="BodyText"/>
+      </w:pPr>
+      <w:r>
+        <w:rPr>
+          <w:b/>
+          <w:bCs/>
+        </w:rPr>
+        <w:t xml:space="preserve">Instructions gate</w:t>
+      </w:r>
+      <w:r>
+        <w:t xml:space="preserve"> </w:t>
+      </w:r>
+      <w:r>
+        <w:t xml:space="preserve">- A back link (</w:t>
+      </w:r>
+      <w:r>
+        <w:t xml:space="preserve">“Back to my drives”</w:t>
+      </w:r>
+      <w:r>
+        <w:t xml:space="preserve">), a</w:t>
+      </w:r>
+      <w:r>
+        <w:t xml:space="preserve"> </w:t>
+      </w:r>
+      <w:r>
+        <w:rPr>
+          <w:b/>
+          <w:bCs/>
+        </w:rPr>
+        <w:t xml:space="preserve">Do</w:t>
+      </w:r>
+      <w:r>
+        <w:t xml:space="preserve"> </w:t>
+      </w:r>
+      <w:r>
+        <w:t xml:space="preserve">list (stable connection, photo ID, stay fullscreen, revisit within a section) and a</w:t>
+      </w:r>
+      <w:r>
+        <w:t xml:space="preserve"> </w:t>
+      </w:r>
+      <w:r>
+        <w:rPr>
+          <w:b/>
+          <w:bCs/>
+        </w:rPr>
+        <w:t xml:space="preserve">Don’t</w:t>
+      </w:r>
+      <w:r>
+        <w:t xml:space="preserve"> </w:t>
+      </w:r>
+      <w:r>
+        <w:t xml:space="preserve">list (no tab-switch/minimise/leave-fullscreen, no copy/paste/right-click, no dev tools/screenshots, no refresh/close).</w:t>
+      </w:r>
+      <w:r>
+        <w:t xml:space="preserve"> </w:t>
+      </w:r>
+      <w:r>
+        <w:t xml:space="preserve">-</w:t>
+      </w:r>
+      <w:r>
+        <w:t xml:space="preserve"> </w:t>
+      </w:r>
+      <w:r>
+        <w:rPr>
+          <w:b/>
+          <w:bCs/>
+        </w:rPr>
+        <w:t xml:space="preserve">Consent checkbox</w:t>
+      </w:r>
+      <w:r>
+        <w:t xml:space="preserve"> </w:t>
+      </w:r>
+      <w:r>
+        <w:t xml:space="preserve">— must be ticked to enable</w:t>
+      </w:r>
+      <w:r>
+        <w:t xml:space="preserve"> </w:t>
+      </w:r>
+      <w:r>
+        <w:rPr>
+          <w:b/>
+          <w:bCs/>
+        </w:rPr>
+        <w:t xml:space="preserve">Start test</w:t>
+      </w:r>
+      <w:r>
+        <w:t xml:space="preserve"> </w:t>
+      </w:r>
+      <w:r>
+        <w:t xml:space="preserve">→</w:t>
+      </w:r>
+      <w:r>
+        <w:t xml:space="preserve"> </w:t>
+      </w:r>
+      <w:r>
+        <w:rPr>
+          <w:rStyle w:val="VerbatimChar"/>
+        </w:rPr>
+        <w:t xml:space="preserve">POST /drive/v1/exams/{examId}/start</w:t>
+      </w:r>
+      <w:r>
+        <w:t xml:space="preserve"> </w:t>
+      </w:r>
+      <w:r>
+        <w:t xml:space="preserve">(returns the session + paper). Errors surface inline.</w:t>
+      </w:r>
+    </w:p>
+    <w:p>
+      <w:pPr>
+        <w:pStyle w:val="BodyText"/>
+      </w:pPr>
+      <w:r>
+        <w:rPr>
+          <w:b/>
+          <w:bCs/>
+        </w:rPr>
+        <w:t xml:space="preserve">Runner</w:t>
+      </w:r>
+      <w:r>
+        <w:t xml:space="preserve"> </w:t>
+      </w:r>
+      <w:r>
+        <w:t xml:space="preserve">-</w:t>
+      </w:r>
+      <w:r>
+        <w:t xml:space="preserve"> </w:t>
+      </w:r>
+      <w:r>
+        <w:rPr>
+          <w:b/>
+          <w:bCs/>
+        </w:rPr>
+        <w:t xml:space="preserve">Header</w:t>
+      </w:r>
+      <w:r>
+        <w:t xml:space="preserve"> </w:t>
+      </w:r>
+      <w:r>
+        <w:t xml:space="preserve">— exam title,</w:t>
+      </w:r>
+      <w:r>
+        <w:t xml:space="preserve"> </w:t>
+      </w:r>
+      <w:r>
+        <w:t xml:space="preserve">“Section X of N”</w:t>
+      </w:r>
+      <w:r>
+        <w:t xml:space="preserve">, a</w:t>
+      </w:r>
+      <w:r>
+        <w:t xml:space="preserve"> </w:t>
+      </w:r>
+      <w:r>
+        <w:rPr>
+          <w:b/>
+          <w:bCs/>
+        </w:rPr>
+        <w:t xml:space="preserve">Calculator</w:t>
+      </w:r>
+      <w:r>
+        <w:t xml:space="preserve"> </w:t>
+      </w:r>
+      <w:r>
+        <w:t xml:space="preserve">toggle, a</w:t>
+      </w:r>
+      <w:r>
+        <w:t xml:space="preserve"> </w:t>
+      </w:r>
+      <w:r>
+        <w:rPr>
+          <w:b/>
+          <w:bCs/>
+        </w:rPr>
+        <w:t xml:space="preserve">flags</w:t>
+      </w:r>
+      <w:r>
+        <w:t xml:space="preserve"> </w:t>
+      </w:r>
+      <w:r>
+        <w:t xml:space="preserve">indicator (</w:t>
+      </w:r>
+      <w:r>
+        <w:rPr>
+          <w:rStyle w:val="VerbatimChar"/>
+        </w:rPr>
+        <w:t xml:space="preserve">violations/5</w:t>
+      </w:r>
+      <w:r>
+        <w:t xml:space="preserve">, teal→rose), and a</w:t>
+      </w:r>
+      <w:r>
+        <w:t xml:space="preserve"> </w:t>
+      </w:r>
+      <w:r>
+        <w:rPr>
+          <w:b/>
+          <w:bCs/>
+        </w:rPr>
+        <w:t xml:space="preserve">server-driven countdown</w:t>
+      </w:r>
+      <w:r>
+        <w:t xml:space="preserve"> </w:t>
+      </w:r>
+      <w:r>
+        <w:t xml:space="preserve">(</w:t>
+      </w:r>
+      <w:r>
+        <w:rPr>
+          <w:rStyle w:val="VerbatimChar"/>
+        </w:rPr>
+        <w:t xml:space="preserve">mm:ss</w:t>
+      </w:r>
+      <w:r>
+        <w:t xml:space="preserve">, turns rose under 30s).</w:t>
+      </w:r>
+      <w:r>
+        <w:t xml:space="preserve"> </w:t>
+      </w:r>
+      <w:r>
+        <w:t xml:space="preserve">-</w:t>
+      </w:r>
+      <w:r>
+        <w:t xml:space="preserve"> </w:t>
+      </w:r>
+      <w:r>
+        <w:rPr>
+          <w:b/>
+          <w:bCs/>
+        </w:rPr>
+        <w:t xml:space="preserve">Timer</w:t>
+      </w:r>
+      <w:r>
+        <w:t xml:space="preserve"> </w:t>
+      </w:r>
+      <w:r>
+        <w:t xml:space="preserve">— decrements each second; at 0 it</w:t>
+      </w:r>
+      <w:r>
+        <w:t xml:space="preserve"> </w:t>
+      </w:r>
+      <w:r>
+        <w:rPr>
+          <w:b/>
+          <w:bCs/>
+        </w:rPr>
+        <w:t xml:space="preserve">auto-submits</w:t>
+      </w:r>
+      <w:r>
+        <w:t xml:space="preserve"> </w:t>
+      </w:r>
+      <w:r>
+        <w:t xml:space="preserve">(</w:t>
+      </w:r>
+      <w:r>
+        <w:rPr>
+          <w:rStyle w:val="VerbatimChar"/>
+        </w:rPr>
+        <w:t xml:space="preserve">reason: timeout</w:t>
+      </w:r>
+      <w:r>
+        <w:t xml:space="preserve">).</w:t>
+      </w:r>
+      <w:r>
+        <w:t xml:space="preserve"> </w:t>
+      </w:r>
+      <w:r>
+        <w:t xml:space="preserve">-</w:t>
+      </w:r>
+      <w:r>
+        <w:t xml:space="preserve"> </w:t>
+      </w:r>
+      <w:r>
+        <w:rPr>
+          <w:b/>
+          <w:bCs/>
+        </w:rPr>
+        <w:t xml:space="preserve">Proctoring</w:t>
+      </w:r>
+      <w:r>
+        <w:t xml:space="preserve"> </w:t>
+      </w:r>
+      <w:r>
+        <w:t xml:space="preserve">— on mount,</w:t>
+      </w:r>
+      <w:r>
+        <w:t xml:space="preserve"> </w:t>
+      </w:r>
+      <w:r>
+        <w:rPr>
+          <w:rStyle w:val="VerbatimChar"/>
+        </w:rPr>
+        <w:t xml:space="preserve">POST /drive/v1/proctor/start</w:t>
+      </w:r>
+      <w:r>
+        <w:t xml:space="preserve"> </w:t>
+      </w:r>
+      <w:r>
+        <w:t xml:space="preserve">registers the session;</w:t>
+      </w:r>
+      <w:r>
+        <w:t xml:space="preserve"> </w:t>
+      </w:r>
+      <w:r>
+        <w:rPr>
+          <w:rStyle w:val="VerbatimChar"/>
+        </w:rPr>
+        <w:t xml:space="preserve">attachProctoring</w:t>
+      </w:r>
+      <w:r>
+        <w:t xml:space="preserve"> </w:t>
+      </w:r>
+      <w:r>
+        <w:t xml:space="preserve">captures focus/tab/visibility/copy events. Each violation: increments the counter, shows a toast + a</w:t>
+      </w:r>
+      <w:r>
+        <w:t xml:space="preserve"> </w:t>
+      </w:r>
+      <w:r>
+        <w:rPr>
+          <w:b/>
+          <w:bCs/>
+        </w:rPr>
+        <w:t xml:space="preserve">Proctor log</w:t>
+      </w:r>
+      <w:r>
+        <w:t xml:space="preserve"> </w:t>
+      </w:r>
+      <w:r>
+        <w:t xml:space="preserve">entry, and posts</w:t>
+      </w:r>
+      <w:r>
+        <w:t xml:space="preserve"> </w:t>
+      </w:r>
+      <w:r>
+        <w:rPr>
+          <w:rStyle w:val="VerbatimChar"/>
+        </w:rPr>
+        <w:t xml:space="preserve">POST /drive/v1/proctor/{sid}/events</w:t>
+      </w:r>
+      <w:r>
+        <w:t xml:space="preserve">. At 5 it auto-submits (</w:t>
+      </w:r>
+      <w:r>
+        <w:rPr>
+          <w:rStyle w:val="VerbatimChar"/>
+        </w:rPr>
+        <w:t xml:space="preserve">reason: proctor</w:t>
+      </w:r>
+      <w:r>
+        <w:t xml:space="preserve">). A one-shot guard prevents double submits and overshooting.</w:t>
+      </w:r>
+      <w:r>
+        <w:t xml:space="preserve"> </w:t>
+      </w:r>
+      <w:r>
+        <w:t xml:space="preserve">-</w:t>
+      </w:r>
+      <w:r>
+        <w:t xml:space="preserve"> </w:t>
+      </w:r>
+      <w:r>
+        <w:rPr>
+          <w:b/>
+          <w:bCs/>
+        </w:rPr>
+        <w:t xml:space="preserve">Question card</w:t>
+      </w:r>
+      <w:r>
+        <w:t xml:space="preserve"> </w:t>
+      </w:r>
+      <w:r>
+        <w:t xml:space="preserve">— index, stem, and a type badge (MCQ / Multi-select / True-False / Coding / SQL / Verbal / etc.).</w:t>
+      </w:r>
+      <w:r>
+        <w:t xml:space="preserve"> </w:t>
+      </w:r>
+      <w:r>
+        <w:t xml:space="preserve">-</w:t>
+      </w:r>
+      <w:r>
+        <w:t xml:space="preserve"> </w:t>
+      </w:r>
+      <w:r>
+        <w:rPr>
+          <w:b/>
+          <w:bCs/>
+        </w:rPr>
+        <w:t xml:space="preserve">MCQ options</w:t>
+      </w:r>
+      <w:r>
+        <w:t xml:space="preserve"> </w:t>
+      </w:r>
+      <w:r>
+        <w:t xml:space="preserve">— clicking selects and writes the answer; each choice triggers a durable autosave</w:t>
+      </w:r>
+      <w:r>
+        <w:t xml:space="preserve"> </w:t>
+      </w:r>
+      <w:r>
+        <w:rPr>
+          <w:rStyle w:val="VerbatimChar"/>
+        </w:rPr>
+        <w:t xml:space="preserve">POST /drive/v1/exam-sessions/{sid}/save</w:t>
+      </w:r>
+      <w:r>
+        <w:t xml:space="preserve">.</w:t>
+      </w:r>
+      <w:r>
+        <w:t xml:space="preserve"> </w:t>
+      </w:r>
+      <w:r>
+        <w:t xml:space="preserve">-</w:t>
+      </w:r>
+      <w:r>
+        <w:t xml:space="preserve"> </w:t>
+      </w:r>
+      <w:r>
+        <w:rPr>
+          <w:b/>
+          <w:bCs/>
+        </w:rPr>
+        <w:t xml:space="preserve">Coding answer</w:t>
+      </w:r>
+      <w:r>
+        <w:t xml:space="preserve"> </w:t>
+      </w:r>
+      <w:r>
+        <w:t xml:space="preserve">(</w:t>
+      </w:r>
+      <w:r>
+        <w:rPr>
+          <w:rStyle w:val="VerbatimChar"/>
+        </w:rPr>
+        <w:t xml:space="preserve">CodeAnswer</w:t>
+      </w:r>
+      <w:r>
+        <w:t xml:space="preserve">) — a language</w:t>
+      </w:r>
+      <w:r>
+        <w:t xml:space="preserve"> </w:t>
+      </w:r>
+      <w:r>
+        <w:rPr>
+          <w:rStyle w:val="VerbatimChar"/>
+        </w:rPr>
+        <w:t xml:space="preserve">&lt;select&gt;</w:t>
+      </w:r>
+      <w:r>
+        <w:t xml:space="preserve"> </w:t>
+      </w:r>
+      <w:r>
+        <w:t xml:space="preserve">(filtered to languages the server can actually run via</w:t>
+      </w:r>
+      <w:r>
+        <w:t xml:space="preserve"> </w:t>
+      </w:r>
+      <w:r>
+        <w:rPr>
+          <w:rStyle w:val="VerbatimChar"/>
+        </w:rPr>
+        <w:t xml:space="preserve">GET /drive/v1/coding/languages</w:t>
+      </w:r>
+      <w:r>
+        <w:t xml:space="preserve">), a code editor seeded from the question’s starter, a</w:t>
+      </w:r>
+      <w:r>
+        <w:t xml:space="preserve"> </w:t>
+      </w:r>
+      <w:r>
+        <w:rPr>
+          <w:b/>
+          <w:bCs/>
+        </w:rPr>
+        <w:t xml:space="preserve">Run sample tests</w:t>
+      </w:r>
+      <w:r>
+        <w:t xml:space="preserve"> </w:t>
+      </w:r>
+      <w:r>
+        <w:t xml:space="preserve">button (</w:t>
+      </w:r>
+      <w:r>
+        <w:rPr>
+          <w:rStyle w:val="VerbatimChar"/>
+        </w:rPr>
+        <w:t xml:space="preserve">POST /drive/v1/coding/run-adhoc</w:t>
+      </w:r>
+      <w:r>
+        <w:t xml:space="preserve">) with per-case pass/fail (hidden cases are graded server-side on submit), and autosave on blur/change.</w:t>
+      </w:r>
+      <w:r>
+        <w:t xml:space="preserve"> </w:t>
+      </w:r>
+      <w:r>
+        <w:t xml:space="preserve">-</w:t>
+      </w:r>
+      <w:r>
+        <w:t xml:space="preserve"> </w:t>
+      </w:r>
+      <w:r>
+        <w:rPr>
+          <w:b/>
+          <w:bCs/>
+        </w:rPr>
+        <w:t xml:space="preserve">Scientific calculator</w:t>
+      </w:r>
+      <w:r>
+        <w:t xml:space="preserve"> </w:t>
+      </w:r>
+      <w:r>
+        <w:t xml:space="preserve">— an in-exam, safe expression evaluator (shunting-yard; no</w:t>
+      </w:r>
+      <w:r>
+        <w:t xml:space="preserve"> </w:t>
+      </w:r>
+      <w:r>
+        <w:rPr>
+          <w:rStyle w:val="VerbatimChar"/>
+        </w:rPr>
+        <w:t xml:space="preserve">eval</w:t>
+      </w:r>
+      <w:r>
+        <w:t xml:space="preserve">) supporting + − × ÷, powers, √, brackets, π, e; fixed bottom-right, toggled from the header.</w:t>
+      </w:r>
+      <w:r>
+        <w:t xml:space="preserve"> </w:t>
+      </w:r>
+      <w:r>
+        <w:t xml:space="preserve">-</w:t>
+      </w:r>
+      <w:r>
+        <w:t xml:space="preserve"> </w:t>
+      </w:r>
+      <w:r>
+        <w:rPr>
+          <w:b/>
+          <w:bCs/>
+        </w:rPr>
+        <w:t xml:space="preserve">Navigation</w:t>
+      </w:r>
+      <w:r>
+        <w:t xml:space="preserve"> </w:t>
+      </w:r>
+      <w:r>
+        <w:t xml:space="preserve">—</w:t>
+      </w:r>
+      <w:r>
+        <w:t xml:space="preserve"> </w:t>
+      </w:r>
+      <w:r>
+        <w:rPr>
+          <w:b/>
+          <w:bCs/>
+        </w:rPr>
+        <w:t xml:space="preserve">Previous / Next section</w:t>
+      </w:r>
+      <w:r>
+        <w:t xml:space="preserve"> </w:t>
+      </w:r>
+      <w:r>
+        <w:t xml:space="preserve">buttons; a sticky</w:t>
+      </w:r>
+      <w:r>
+        <w:t xml:space="preserve"> </w:t>
+      </w:r>
+      <w:r>
+        <w:rPr>
+          <w:b/>
+          <w:bCs/>
+        </w:rPr>
+        <w:t xml:space="preserve">question palette</w:t>
+      </w:r>
+      <w:r>
+        <w:t xml:space="preserve"> </w:t>
+      </w:r>
+      <w:r>
+        <w:t xml:space="preserve">(answered = teal) with an answered count;</w:t>
+      </w:r>
+      <w:r>
+        <w:t xml:space="preserve"> </w:t>
+      </w:r>
+      <w:r>
+        <w:rPr>
+          <w:b/>
+          <w:bCs/>
+        </w:rPr>
+        <w:t xml:space="preserve">Submit exam</w:t>
+      </w:r>
+      <w:r>
+        <w:t xml:space="preserve"> </w:t>
+      </w:r>
+      <w:r>
+        <w:t xml:space="preserve">(amber) available from the palette and the last section.</w:t>
+      </w:r>
+      <w:r>
+        <w:t xml:space="preserve"> </w:t>
+      </w:r>
+      <w:r>
+        <w:t xml:space="preserve">-</w:t>
+      </w:r>
+      <w:r>
+        <w:t xml:space="preserve"> </w:t>
+      </w:r>
+      <w:r>
+        <w:rPr>
+          <w:b/>
+          <w:bCs/>
+        </w:rPr>
+        <w:t xml:space="preserve">Submit</w:t>
+      </w:r>
+      <w:r>
+        <w:t xml:space="preserve"> </w:t>
+      </w:r>
+      <w:r>
+        <w:t xml:space="preserve">—</w:t>
+      </w:r>
+      <w:r>
+        <w:t xml:space="preserve"> </w:t>
+      </w:r>
+      <w:r>
+        <w:rPr>
+          <w:rStyle w:val="VerbatimChar"/>
+        </w:rPr>
+        <w:t xml:space="preserve">POST /drive/v1/exam-sessions/{sid}/submit</w:t>
+      </w:r>
+      <w:r>
+        <w:t xml:space="preserve">; the confirmation shows answered/total and the integrity-flag count, with a distinct rose treatment if auto-submitted for violations.</w:t>
+      </w:r>
+    </w:p>
+    <w:bookmarkEnd w:id="183"/>
+    <w:bookmarkStart w:id="184" w:name="recruiter-drives-driverecruiterdrives"/>
+    <w:p>
+      <w:pPr>
+        <w:pStyle w:val="Heading2"/>
+      </w:pPr>
+      <w:r>
+        <w:t xml:space="preserve">21.2 Recruiter Drives (</w:t>
+      </w:r>
+      <w:r>
+        <w:rPr>
+          <w:rStyle w:val="VerbatimChar"/>
+        </w:rPr>
+        <w:t xml:space="preserve">/drive/recruiter/drives</w:t>
+      </w:r>
+      <w:r>
+        <w:t xml:space="preserve">)</w:t>
+      </w:r>
+    </w:p>
+    <w:p>
+      <w:pPr>
+        <w:pStyle w:val="Compact"/>
+        <w:numPr>
+          <w:ilvl w:val="0"/>
+          <w:numId w:val="1085"/>
+        </w:numPr>
+      </w:pPr>
+      <w:r>
+        <w:t xml:space="preserve">Loads</w:t>
+      </w:r>
+      <w:r>
+        <w:t xml:space="preserve"> </w:t>
+      </w:r>
+      <w:r>
+        <w:rPr>
+          <w:rStyle w:val="VerbatimChar"/>
+        </w:rPr>
+        <w:t xml:space="preserve">GET /drive/v1/drives</w:t>
+      </w:r>
+      <w:r>
+        <w:t xml:space="preserve">.</w:t>
+      </w:r>
+      <w:r>
+        <w:t xml:space="preserve"> </w:t>
+      </w:r>
+      <w:r>
+        <w:rPr>
+          <w:b/>
+          <w:bCs/>
+        </w:rPr>
+        <w:t xml:space="preserve">Search box</w:t>
+      </w:r>
+      <w:r>
+        <w:t xml:space="preserve"> </w:t>
+      </w:r>
+      <w:r>
+        <w:t xml:space="preserve">(title/company/venue) +</w:t>
+      </w:r>
+      <w:r>
+        <w:t xml:space="preserve"> </w:t>
+      </w:r>
+      <w:r>
+        <w:rPr>
+          <w:b/>
+          <w:bCs/>
+        </w:rPr>
+        <w:t xml:space="preserve">status filter</w:t>
+      </w:r>
+      <w:r>
+        <w:t xml:space="preserve"> </w:t>
+      </w:r>
+      <w:r>
+        <w:t xml:space="preserve">(all/draft/open/closed) + an</w:t>
+      </w:r>
+      <w:r>
+        <w:t xml:space="preserve"> </w:t>
+      </w:r>
+      <w:r>
+        <w:t xml:space="preserve">“N of M”</w:t>
+      </w:r>
+      <w:r>
+        <w:t xml:space="preserve"> </w:t>
+      </w:r>
+      <w:r>
+        <w:t xml:space="preserve">count.</w:t>
+      </w:r>
+    </w:p>
+    <w:p>
+      <w:pPr>
+        <w:pStyle w:val="Compact"/>
+        <w:numPr>
+          <w:ilvl w:val="0"/>
+          <w:numId w:val="1085"/>
+        </w:numPr>
+      </w:pPr>
+      <w:r>
+        <w:rPr>
+          <w:b/>
+          <w:bCs/>
+        </w:rPr>
+        <w:t xml:space="preserve">Drive card</w:t>
+      </w:r>
+      <w:r>
+        <w:t xml:space="preserve"> </w:t>
+      </w:r>
+      <w:r>
+        <w:t xml:space="preserve">— building icon, status badge (open=teal / draft=slate / closed=amber), title, company, venue, reporting time.</w:t>
+      </w:r>
+      <w:r>
+        <w:t xml:space="preserve"> </w:t>
+      </w:r>
+      <w:r>
+        <w:rPr>
+          <w:b/>
+          <w:bCs/>
+        </w:rPr>
+        <w:t xml:space="preserve">Buttons: Manage</w:t>
+      </w:r>
+      <w:r>
+        <w:t xml:space="preserve"> </w:t>
+      </w:r>
+      <w:r>
+        <w:t xml:space="preserve">(→</w:t>
+      </w:r>
+      <w:r>
+        <w:t xml:space="preserve"> </w:t>
+      </w:r>
+      <w:r>
+        <w:rPr>
+          <w:rStyle w:val="VerbatimChar"/>
+        </w:rPr>
+        <w:t xml:space="preserve">/drive/recruiter/drives/:id</w:t>
+      </w:r>
+      <w:r>
+        <w:t xml:space="preserve">) and</w:t>
+      </w:r>
+      <w:r>
+        <w:t xml:space="preserve"> </w:t>
+      </w:r>
+      <w:r>
+        <w:rPr>
+          <w:b/>
+          <w:bCs/>
+        </w:rPr>
+        <w:t xml:space="preserve">Delete</w:t>
+      </w:r>
+      <w:r>
+        <w:t xml:space="preserve"> </w:t>
+      </w:r>
+      <w:r>
+        <w:t xml:space="preserve">(confirm →</w:t>
+      </w:r>
+      <w:r>
+        <w:t xml:space="preserve"> </w:t>
+      </w:r>
+      <w:r>
+        <w:rPr>
+          <w:rStyle w:val="VerbatimChar"/>
+        </w:rPr>
+        <w:t xml:space="preserve">DELETE /drive/v1/drives/{id}</w:t>
+      </w:r>
+      <w:r>
+        <w:t xml:space="preserve">, cascades rounds/marks/registrations/results; hidden locally on success).</w:t>
+      </w:r>
+    </w:p>
+    <w:p>
+      <w:pPr>
+        <w:pStyle w:val="Compact"/>
+        <w:numPr>
+          <w:ilvl w:val="0"/>
+          <w:numId w:val="1085"/>
+        </w:numPr>
+      </w:pPr>
+      <w:r>
+        <w:rPr>
+          <w:b/>
+          <w:bCs/>
+        </w:rPr>
+        <w:t xml:space="preserve">Button: New drive</w:t>
+      </w:r>
+      <w:r>
+        <w:t xml:space="preserve"> </w:t>
+      </w:r>
+      <w:r>
+        <w:t xml:space="preserve">— opens the</w:t>
+      </w:r>
+      <w:r>
+        <w:t xml:space="preserve"> </w:t>
+      </w:r>
+      <w:r>
+        <w:rPr>
+          <w:b/>
+          <w:bCs/>
+        </w:rPr>
+        <w:t xml:space="preserve">CreateDrive</w:t>
+      </w:r>
+      <w:r>
+        <w:t xml:space="preserve"> </w:t>
+      </w:r>
+      <w:r>
+        <w:t xml:space="preserve">modal (company name, drive title, venue, reporting time) →</w:t>
+      </w:r>
+      <w:r>
+        <w:t xml:space="preserve"> </w:t>
+      </w:r>
+      <w:r>
+        <w:rPr>
+          <w:rStyle w:val="VerbatimChar"/>
+        </w:rPr>
+        <w:t xml:space="preserve">POST /drive/v1/drives</w:t>
+      </w:r>
+      <w:r>
+        <w:t xml:space="preserve">. The new drive is added to the list.</w:t>
+      </w:r>
+    </w:p>
+    <w:p>
+      <w:pPr>
+        <w:pStyle w:val="Compact"/>
+        <w:numPr>
+          <w:ilvl w:val="0"/>
+          <w:numId w:val="1085"/>
+        </w:numPr>
+      </w:pPr>
+      <w:r>
+        <w:t xml:space="preserve">Empty states for</w:t>
+      </w:r>
+      <w:r>
+        <w:t xml:space="preserve"> </w:t>
+      </w:r>
+      <w:r>
+        <w:t xml:space="preserve">“no drives yet”</w:t>
+      </w:r>
+      <w:r>
+        <w:t xml:space="preserve"> </w:t>
+      </w:r>
+      <w:r>
+        <w:t xml:space="preserve">and</w:t>
+      </w:r>
+      <w:r>
+        <w:t xml:space="preserve"> </w:t>
+      </w:r>
+      <w:r>
+        <w:t xml:space="preserve">“no match”</w:t>
+      </w:r>
+      <w:r>
+        <w:t xml:space="preserve">.</w:t>
+      </w:r>
+    </w:p>
+    <w:bookmarkEnd w:id="184"/>
+    <w:bookmarkStart w:id="185" w:name="drive-console-driverecruiterdrivesid"/>
+    <w:p>
+      <w:pPr>
+        <w:pStyle w:val="Heading2"/>
+      </w:pPr>
+      <w:r>
+        <w:t xml:space="preserve">21.3 Drive Console (</w:t>
+      </w:r>
+      <w:r>
+        <w:rPr>
+          <w:rStyle w:val="VerbatimChar"/>
+        </w:rPr>
+        <w:t xml:space="preserve">/drive/recruiter/drives/:id</w:t>
+      </w:r>
+      <w:r>
+        <w:t xml:space="preserve">)</w:t>
+      </w:r>
+    </w:p>
+    <w:p>
+      <w:pPr>
+        <w:pStyle w:val="FirstParagraph"/>
+      </w:pPr>
+      <w:r>
+        <w:t xml:space="preserve">The per-drive command centre — a tabbed container over the drive header. It loads</w:t>
+      </w:r>
+      <w:r>
+        <w:t xml:space="preserve"> </w:t>
+      </w:r>
+      <w:r>
+        <w:rPr>
+          <w:rStyle w:val="VerbatimChar"/>
+        </w:rPr>
+        <w:t xml:space="preserve">GET /drive/v1/drives/{id}</w:t>
+      </w:r>
+      <w:r>
+        <w:t xml:space="preserve"> </w:t>
+      </w:r>
+      <w:r>
+        <w:t xml:space="preserve">and</w:t>
+      </w:r>
+      <w:r>
+        <w:t xml:space="preserve"> </w:t>
+      </w:r>
+      <w:r>
+        <w:rPr>
+          <w:rStyle w:val="VerbatimChar"/>
+        </w:rPr>
+        <w:t xml:space="preserve">GET /drive/v1/drives/{id}/funnel</w:t>
+      </w:r>
+      <w:r>
+        <w:t xml:space="preserve">, and composes the</w:t>
+      </w:r>
+      <w:r>
+        <w:t xml:space="preserve"> </w:t>
+      </w:r>
+      <w:r>
+        <w:rPr>
+          <w:b/>
+          <w:bCs/>
+        </w:rPr>
+        <w:t xml:space="preserve">Rounds</w:t>
+      </w:r>
+      <w:r>
+        <w:t xml:space="preserve">,</w:t>
+      </w:r>
+      <w:r>
+        <w:t xml:space="preserve"> </w:t>
+      </w:r>
+      <w:r>
+        <w:rPr>
+          <w:b/>
+          <w:bCs/>
+        </w:rPr>
+        <w:t xml:space="preserve">Results</w:t>
+      </w:r>
+      <w:r>
+        <w:t xml:space="preserve">,</w:t>
+      </w:r>
+      <w:r>
+        <w:t xml:space="preserve"> </w:t>
+      </w:r>
+      <w:r>
+        <w:rPr>
+          <w:b/>
+          <w:bCs/>
+        </w:rPr>
+        <w:t xml:space="preserve">Interviews</w:t>
+      </w:r>
+      <w:r>
+        <w:t xml:space="preserve">, and</w:t>
+      </w:r>
+      <w:r>
+        <w:t xml:space="preserve"> </w:t>
+      </w:r>
+      <w:r>
+        <w:rPr>
+          <w:b/>
+          <w:bCs/>
+        </w:rPr>
+        <w:t xml:space="preserve">Analytics</w:t>
+      </w:r>
+      <w:r>
+        <w:t xml:space="preserve"> </w:t>
+      </w:r>
+      <w:r>
+        <w:t xml:space="preserve">tabs (below), plus drive setup (roles, eligibility, rounds, workflow, PPO config) and the</w:t>
+      </w:r>
+      <w:r>
+        <w:t xml:space="preserve"> </w:t>
+      </w:r>
+      <w:r>
+        <w:rPr>
+          <w:b/>
+          <w:bCs/>
+        </w:rPr>
+        <w:t xml:space="preserve">Open drive</w:t>
+      </w:r>
+      <w:r>
+        <w:t xml:space="preserve"> </w:t>
+      </w:r>
+      <w:r>
+        <w:t xml:space="preserve">control (</w:t>
+      </w:r>
+      <w:r>
+        <w:rPr>
+          <w:rStyle w:val="VerbatimChar"/>
+        </w:rPr>
+        <w:t xml:space="preserve">POST /drive/v1/drives/{id}/open</w:t>
+      </w:r>
+      <w:r>
+        <w:t xml:space="preserve">). The funnel header shows counts by status.</w:t>
+      </w:r>
+    </w:p>
+    <w:bookmarkEnd w:id="185"/>
+    <w:bookmarkStart w:id="186" w:name="rounds-tab"/>
+    <w:p>
+      <w:pPr>
+        <w:pStyle w:val="Heading2"/>
+      </w:pPr>
+      <w:r>
+        <w:t xml:space="preserve">21.4 Rounds Tab</w:t>
+      </w:r>
+    </w:p>
+    <w:p>
+      <w:pPr>
+        <w:pStyle w:val="FirstParagraph"/>
+      </w:pPr>
+      <w:r>
+        <w:t xml:space="preserve">Round-by-round marks and progression (Round 1 auto-seeded from applicants; later rounds panel-scored).</w:t>
+      </w:r>
+      <w:r>
+        <w:t xml:space="preserve"> </w:t>
+      </w:r>
+      <w:r>
+        <w:t xml:space="preserve">-</w:t>
+      </w:r>
+      <w:r>
+        <w:t xml:space="preserve"> </w:t>
+      </w:r>
+      <w:r>
+        <w:rPr>
+          <w:b/>
+          <w:bCs/>
+        </w:rPr>
+        <w:t xml:space="preserve">Round selector</w:t>
+      </w:r>
+      <w:r>
+        <w:t xml:space="preserve"> </w:t>
+      </w:r>
+      <w:r>
+        <w:t xml:space="preserve">+ an editable</w:t>
+      </w:r>
+      <w:r>
+        <w:t xml:space="preserve"> </w:t>
+      </w:r>
+      <w:r>
+        <w:rPr>
+          <w:b/>
+          <w:bCs/>
+        </w:rPr>
+        <w:t xml:space="preserve">marks table</w:t>
+      </w:r>
+      <w:r>
+        <w:t xml:space="preserve"> </w:t>
+      </w:r>
+      <w:r>
+        <w:t xml:space="preserve">with candidate search/filter and a skills popover.</w:t>
+      </w:r>
+      <w:r>
+        <w:t xml:space="preserve"> </w:t>
+      </w:r>
+      <w:r>
+        <w:t xml:space="preserve">-</w:t>
+      </w:r>
+      <w:r>
+        <w:t xml:space="preserve"> </w:t>
+      </w:r>
+      <w:r>
+        <w:rPr>
+          <w:b/>
+          <w:bCs/>
+        </w:rPr>
+        <w:t xml:space="preserve">Buttons: Save score</w:t>
+      </w:r>
+      <w:r>
+        <w:t xml:space="preserve"> </w:t>
+      </w:r>
+      <w:r>
+        <w:t xml:space="preserve">(</w:t>
+      </w:r>
+      <w:r>
+        <w:rPr>
+          <w:rStyle w:val="VerbatimChar"/>
+        </w:rPr>
+        <w:t xml:space="preserve">POST .../rounds/{order}/scores</w:t>
+      </w:r>
+      <w:r>
+        <w:t xml:space="preserve">),</w:t>
+      </w:r>
+      <w:r>
+        <w:t xml:space="preserve"> </w:t>
+      </w:r>
+      <w:r>
+        <w:rPr>
+          <w:b/>
+          <w:bCs/>
+        </w:rPr>
+        <w:t xml:space="preserve">Add candidate</w:t>
+      </w:r>
+      <w:r>
+        <w:t xml:space="preserve"> </w:t>
+      </w:r>
+      <w:r>
+        <w:t xml:space="preserve">(</w:t>
+      </w:r>
+      <w:r>
+        <w:rPr>
+          <w:rStyle w:val="VerbatimChar"/>
+        </w:rPr>
+        <w:t xml:space="preserve">POST .../rounds/{order}/candidates</w:t>
+      </w:r>
+      <w:r>
+        <w:t xml:space="preserve">),</w:t>
+      </w:r>
+      <w:r>
+        <w:t xml:space="preserve"> </w:t>
+      </w:r>
+      <w:r>
+        <w:rPr>
+          <w:b/>
+          <w:bCs/>
+        </w:rPr>
+        <w:t xml:space="preserve">Remove candidate</w:t>
+      </w:r>
+      <w:r>
+        <w:t xml:space="preserve"> </w:t>
+      </w:r>
+      <w:r>
+        <w:t xml:space="preserve">(</w:t>
+      </w:r>
+      <w:r>
+        <w:rPr>
+          <w:rStyle w:val="VerbatimChar"/>
+        </w:rPr>
+        <w:t xml:space="preserve">DELETE .../candidates/{cid}</w:t>
+      </w:r>
+      <w:r>
+        <w:t xml:space="preserve">),</w:t>
+      </w:r>
+      <w:r>
+        <w:t xml:space="preserve"> </w:t>
+      </w:r>
+      <w:r>
+        <w:rPr>
+          <w:b/>
+          <w:bCs/>
+        </w:rPr>
+        <w:t xml:space="preserve">Publish round</w:t>
+      </w:r>
+      <w:r>
+        <w:t xml:space="preserve"> </w:t>
+      </w:r>
+      <w:r>
+        <w:t xml:space="preserve">(</w:t>
+      </w:r>
+      <w:r>
+        <w:rPr>
+          <w:rStyle w:val="VerbatimChar"/>
+        </w:rPr>
+        <w:t xml:space="preserve">POST .../rounds/{order}/publish</w:t>
+      </w:r>
+      <w:r>
+        <w:t xml:space="preserve"> </w:t>
+      </w:r>
+      <w:r>
+        <w:t xml:space="preserve">— cleared candidates advance),</w:t>
+      </w:r>
+      <w:r>
+        <w:t xml:space="preserve"> </w:t>
+      </w:r>
+      <w:r>
+        <w:rPr>
+          <w:b/>
+          <w:bCs/>
+        </w:rPr>
+        <w:t xml:space="preserve">Delete round</w:t>
+      </w:r>
+      <w:r>
+        <w:t xml:space="preserve"> </w:t>
+      </w:r>
+      <w:r>
+        <w:t xml:space="preserve">(</w:t>
+      </w:r>
+      <w:r>
+        <w:rPr>
+          <w:rStyle w:val="VerbatimChar"/>
+        </w:rPr>
+        <w:t xml:space="preserve">DELETE .../rounds/{order}</w:t>
+      </w:r>
+      <w:r>
+        <w:t xml:space="preserve"> </w:t>
+      </w:r>
+      <w:r>
+        <w:t xml:space="preserve">— later rounds shift up),</w:t>
+      </w:r>
+      <w:r>
+        <w:t xml:space="preserve"> </w:t>
+      </w:r>
+      <w:r>
+        <w:rPr>
+          <w:b/>
+          <w:bCs/>
+        </w:rPr>
+        <w:t xml:space="preserve">Download all / Download cleared</w:t>
+      </w:r>
+      <w:r>
+        <w:t xml:space="preserve"> </w:t>
+      </w:r>
+      <w:r>
+        <w:t xml:space="preserve">(</w:t>
+      </w:r>
+      <w:r>
+        <w:rPr>
+          <w:rStyle w:val="VerbatimChar"/>
+        </w:rPr>
+        <w:t xml:space="preserve">GET .../rounds/{order}/export</w:t>
+      </w:r>
+      <w:r>
+        <w:t xml:space="preserve"> </w:t>
+      </w:r>
+      <w:r>
+        <w:t xml:space="preserve">→</w:t>
+      </w:r>
+      <w:r>
+        <w:t xml:space="preserve"> </w:t>
+      </w:r>
+      <w:r>
+        <w:rPr>
+          <w:rStyle w:val="VerbatimChar"/>
+        </w:rPr>
+        <w:t xml:space="preserve">.xlsx</w:t>
+      </w:r>
+      <w:r>
+        <w:t xml:space="preserve">).</w:t>
+      </w:r>
+    </w:p>
+    <w:bookmarkEnd w:id="186"/>
+    <w:bookmarkStart w:id="187" w:name="results-tab"/>
+    <w:p>
+      <w:pPr>
+        <w:pStyle w:val="Heading2"/>
+      </w:pPr>
+      <w:r>
+        <w:t xml:space="preserve">21.5 Results Tab</w:t>
+      </w:r>
+    </w:p>
+    <w:p>
+      <w:pPr>
+        <w:pStyle w:val="FirstParagraph"/>
+      </w:pPr>
+      <w:r>
+        <w:t xml:space="preserve">Compile → publish → offer.</w:t>
+      </w:r>
+      <w:r>
+        <w:t xml:space="preserve"> </w:t>
+      </w:r>
+      <w:r>
+        <w:t xml:space="preserve">-</w:t>
+      </w:r>
+      <w:r>
+        <w:t xml:space="preserve"> </w:t>
+      </w:r>
+      <w:r>
+        <w:rPr>
+          <w:b/>
+          <w:bCs/>
+        </w:rPr>
+        <w:t xml:space="preserve">Compile controls</w:t>
+      </w:r>
+      <w:r>
+        <w:t xml:space="preserve"> </w:t>
+      </w:r>
+      <w:r>
+        <w:t xml:space="preserve">— a</w:t>
+      </w:r>
+      <w:r>
+        <w:t xml:space="preserve"> </w:t>
+      </w:r>
+      <w:r>
+        <w:rPr>
+          <w:b/>
+          <w:bCs/>
+        </w:rPr>
+        <w:t xml:space="preserve">cutoff %</w:t>
+      </w:r>
+      <w:r>
+        <w:t xml:space="preserve"> </w:t>
+      </w:r>
+      <w:r>
+        <w:t xml:space="preserve">input and per-candidate</w:t>
+      </w:r>
+      <w:r>
+        <w:t xml:space="preserve"> </w:t>
+      </w:r>
+      <w:r>
+        <w:rPr>
+          <w:b/>
+          <w:bCs/>
+        </w:rPr>
+        <w:t xml:space="preserve">final-score</w:t>
+      </w:r>
+      <w:r>
+        <w:t xml:space="preserve"> </w:t>
+      </w:r>
+      <w:r>
+        <w:t xml:space="preserve">inputs (eligible candidates only).</w:t>
+      </w:r>
+      <w:r>
+        <w:t xml:space="preserve"> </w:t>
+      </w:r>
+      <w:r>
+        <w:rPr>
+          <w:b/>
+          <w:bCs/>
+        </w:rPr>
+        <w:t xml:space="preserve">Button: Compile</w:t>
+      </w:r>
+      <w:r>
+        <w:t xml:space="preserve"> </w:t>
+      </w:r>
+      <w:r>
+        <w:t xml:space="preserve">→</w:t>
+      </w:r>
+      <w:r>
+        <w:t xml:space="preserve"> </w:t>
+      </w:r>
+      <w:r>
+        <w:rPr>
+          <w:rStyle w:val="VerbatimChar"/>
+        </w:rPr>
+        <w:t xml:space="preserve">POST /drive/v1/results/compile</w:t>
+      </w:r>
+      <w:r>
+        <w:t xml:space="preserve"> </w:t>
+      </w:r>
+      <w:r>
+        <w:t xml:space="preserve">then</w:t>
+      </w:r>
+      <w:r>
+        <w:t xml:space="preserve"> </w:t>
+      </w:r>
+      <w:r>
+        <w:rPr>
+          <w:rStyle w:val="VerbatimChar"/>
+        </w:rPr>
+        <w:t xml:space="preserve">GET /drive/v1/results/{id}</w:t>
+      </w:r>
+      <w:r>
+        <w:t xml:space="preserve">. On error a clear message is shown (no fabricated results).</w:t>
+      </w:r>
+      <w:r>
+        <w:t xml:space="preserve"> </w:t>
+      </w:r>
+      <w:r>
+        <w:t xml:space="preserve">-</w:t>
+      </w:r>
+      <w:r>
+        <w:t xml:space="preserve"> </w:t>
+      </w:r>
+      <w:r>
+        <w:rPr>
+          <w:b/>
+          <w:bCs/>
+        </w:rPr>
+        <w:t xml:space="preserve">Results table</w:t>
+      </w:r>
+      <w:r>
+        <w:t xml:space="preserve"> </w:t>
+      </w:r>
+      <w:r>
+        <w:t xml:space="preserve">— rank, candidate (name/email/roll via a registration lookup), score, outcome badge (selected/shortlist/fail), and an</w:t>
+      </w:r>
+      <w:r>
+        <w:t xml:space="preserve"> </w:t>
+      </w:r>
+      <w:r>
+        <w:rPr>
+          <w:b/>
+          <w:bCs/>
+        </w:rPr>
+        <w:t xml:space="preserve">Offer</w:t>
+      </w:r>
+      <w:r>
+        <w:t xml:space="preserve"> </w:t>
+      </w:r>
+      <w:r>
+        <w:t xml:space="preserve">column.</w:t>
+      </w:r>
+      <w:r>
+        <w:t xml:space="preserve"> </w:t>
+      </w:r>
+      <w:r>
+        <w:t xml:space="preserve">-</w:t>
+      </w:r>
+      <w:r>
+        <w:t xml:space="preserve"> </w:t>
+      </w:r>
+      <w:r>
+        <w:rPr>
+          <w:b/>
+          <w:bCs/>
+        </w:rPr>
+        <w:t xml:space="preserve">Button: Publish results</w:t>
+      </w:r>
+      <w:r>
+        <w:t xml:space="preserve"> </w:t>
+      </w:r>
+      <w:r>
+        <w:t xml:space="preserve">→</w:t>
+      </w:r>
+      <w:r>
+        <w:t xml:space="preserve"> </w:t>
+      </w:r>
+      <w:r>
+        <w:rPr>
+          <w:rStyle w:val="VerbatimChar"/>
+        </w:rPr>
+        <w:t xml:space="preserve">POST .../results/{id}/publish</w:t>
+      </w:r>
+      <w:r>
+        <w:t xml:space="preserve">.</w:t>
+      </w:r>
+      <w:r>
+        <w:t xml:space="preserve"> </w:t>
+      </w:r>
+      <w:r>
+        <w:rPr>
+          <w:b/>
+          <w:bCs/>
+        </w:rPr>
+        <w:t xml:space="preserve">PPO offer / Offer</w:t>
+      </w:r>
+      <w:r>
+        <w:t xml:space="preserve"> </w:t>
+      </w:r>
+      <w:r>
+        <w:t xml:space="preserve">→</w:t>
+      </w:r>
+      <w:r>
+        <w:t xml:space="preserve"> </w:t>
+      </w:r>
+      <w:r>
+        <w:rPr>
+          <w:rStyle w:val="VerbatimChar"/>
+        </w:rPr>
+        <w:t xml:space="preserve">POST /drive/v1/offers/generate</w:t>
+      </w:r>
+      <w:r>
+        <w:t xml:space="preserve">; issued offers link to the public</w:t>
+      </w:r>
+      <w:r>
+        <w:t xml:space="preserve"> </w:t>
+      </w:r>
+      <w:r>
+        <w:rPr>
+          <w:rStyle w:val="VerbatimChar"/>
+        </w:rPr>
+        <w:t xml:space="preserve">/verify/offer/:id</w:t>
+      </w:r>
+      <w:r>
+        <w:t xml:space="preserve">.</w:t>
+      </w:r>
+    </w:p>
+    <w:bookmarkEnd w:id="187"/>
+    <w:bookmarkStart w:id="188" w:name="interviews-tab"/>
+    <w:p>
+      <w:pPr>
+        <w:pStyle w:val="Heading2"/>
+      </w:pPr>
+      <w:r>
+        <w:t xml:space="preserve">21.6 Interviews Tab</w:t>
+      </w:r>
+    </w:p>
+    <w:p>
+      <w:pPr>
+        <w:pStyle w:val="Compact"/>
+        <w:numPr>
+          <w:ilvl w:val="0"/>
+          <w:numId w:val="1086"/>
+        </w:numPr>
+      </w:pPr>
+      <w:r>
+        <w:rPr>
+          <w:b/>
+          <w:bCs/>
+        </w:rPr>
+        <w:t xml:space="preserve">Schedule form</w:t>
+      </w:r>
+      <w:r>
+        <w:t xml:space="preserve"> </w:t>
+      </w:r>
+      <w:r>
+        <w:t xml:space="preserve">— candidate, stage (technical/hr/ppo), mode (online/in_person), meeting link/slot →</w:t>
+      </w:r>
+      <w:r>
+        <w:t xml:space="preserve"> </w:t>
+      </w:r>
+      <w:r>
+        <w:rPr>
+          <w:rStyle w:val="VerbatimChar"/>
+        </w:rPr>
+        <w:t xml:space="preserve">POST /drive/v1/interviews/schedule</w:t>
+      </w:r>
+      <w:r>
+        <w:t xml:space="preserve">.</w:t>
+      </w:r>
+    </w:p>
+    <w:p>
+      <w:pPr>
+        <w:pStyle w:val="Compact"/>
+        <w:numPr>
+          <w:ilvl w:val="0"/>
+          <w:numId w:val="1086"/>
+        </w:numPr>
+      </w:pPr>
+      <w:r>
+        <w:rPr>
+          <w:b/>
+          <w:bCs/>
+        </w:rPr>
+        <w:t xml:space="preserve">Interview card</w:t>
+      </w:r>
+      <w:r>
+        <w:t xml:space="preserve"> </w:t>
+      </w:r>
+      <w:r>
+        <w:t xml:space="preserve">— candidate, stage · mode, a status/decision badge, and (when undecided) inline controls:</w:t>
+      </w:r>
+      <w:r>
+        <w:t xml:space="preserve"> </w:t>
+      </w:r>
+      <w:r>
+        <w:rPr>
+          <w:b/>
+          <w:bCs/>
+        </w:rPr>
+        <w:t xml:space="preserve">Rate 3/4/5</w:t>
+      </w:r>
+      <w:r>
+        <w:t xml:space="preserve"> </w:t>
+      </w:r>
+      <w:r>
+        <w:t xml:space="preserve">(</w:t>
+      </w:r>
+      <w:r>
+        <w:rPr>
+          <w:rStyle w:val="VerbatimChar"/>
+        </w:rPr>
+        <w:t xml:space="preserve">POST .../interviews/{id}/rate</w:t>
+      </w:r>
+      <w:r>
+        <w:t xml:space="preserve">),</w:t>
+      </w:r>
+      <w:r>
+        <w:t xml:space="preserve"> </w:t>
+      </w:r>
+      <w:r>
+        <w:rPr>
+          <w:b/>
+          <w:bCs/>
+        </w:rPr>
+        <w:t xml:space="preserve">Reject</w:t>
+      </w:r>
+      <w:r>
+        <w:t xml:space="preserve"> </w:t>
+      </w:r>
+      <w:r>
+        <w:t xml:space="preserve">/</w:t>
+      </w:r>
+      <w:r>
+        <w:t xml:space="preserve"> </w:t>
+      </w:r>
+      <w:r>
+        <w:rPr>
+          <w:b/>
+          <w:bCs/>
+        </w:rPr>
+        <w:t xml:space="preserve">Select</w:t>
+      </w:r>
+      <w:r>
+        <w:t xml:space="preserve"> </w:t>
+      </w:r>
+      <w:r>
+        <w:t xml:space="preserve">(</w:t>
+      </w:r>
+      <w:r>
+        <w:rPr>
+          <w:rStyle w:val="VerbatimChar"/>
+        </w:rPr>
+        <w:t xml:space="preserve">POST .../interviews/{id}/decision</w:t>
+      </w:r>
+      <w:r>
+        <w:t xml:space="preserve">). A</w:t>
+      </w:r>
+      <w:r>
+        <w:t xml:space="preserve"> </w:t>
+      </w:r>
+      <w:r>
+        <w:t xml:space="preserve">“Recommended for offer”</w:t>
+      </w:r>
+      <w:r>
+        <w:t xml:space="preserve"> </w:t>
+      </w:r>
+      <w:r>
+        <w:t xml:space="preserve">line appears on select; avg rating shows when rated.</w:t>
+      </w:r>
+    </w:p>
+    <w:bookmarkEnd w:id="188"/>
+    <w:bookmarkStart w:id="189" w:name="analytics-tab"/>
+    <w:p>
+      <w:pPr>
+        <w:pStyle w:val="Heading2"/>
+      </w:pPr>
+      <w:r>
+        <w:t xml:space="preserve">21.7 Analytics Tab</w:t>
+      </w:r>
+    </w:p>
+    <w:p>
+      <w:pPr>
+        <w:pStyle w:val="FirstParagraph"/>
+      </w:pPr>
+      <w:r>
+        <w:t xml:space="preserve">Written-test (Round 1) analytics with Excel export.</w:t>
+      </w:r>
+      <w:r>
+        <w:t xml:space="preserve"> </w:t>
+      </w:r>
+      <w:r>
+        <w:t xml:space="preserve">-</w:t>
+      </w:r>
+      <w:r>
+        <w:t xml:space="preserve"> </w:t>
+      </w:r>
+      <w:r>
+        <w:rPr>
+          <w:b/>
+          <w:bCs/>
+        </w:rPr>
+        <w:t xml:space="preserve">Tiles</w:t>
+      </w:r>
+      <w:r>
+        <w:t xml:space="preserve"> </w:t>
+      </w:r>
+      <w:r>
+        <w:t xml:space="preserve">— Registered, Attended written test, Cleared, Pass rate. Data from</w:t>
+      </w:r>
+      <w:r>
+        <w:t xml:space="preserve"> </w:t>
+      </w:r>
+      <w:r>
+        <w:rPr>
+          <w:rStyle w:val="VerbatimChar"/>
+        </w:rPr>
+        <w:t xml:space="preserve">GET /drive/v1/drives/{id}/analytics</w:t>
+      </w:r>
+      <w:r>
+        <w:t xml:space="preserve">.</w:t>
+      </w:r>
+      <w:r>
+        <w:t xml:space="preserve"> </w:t>
+      </w:r>
+      <w:r>
+        <w:t xml:space="preserve">-</w:t>
+      </w:r>
+      <w:r>
+        <w:t xml:space="preserve"> </w:t>
+      </w:r>
+      <w:r>
+        <w:rPr>
+          <w:b/>
+          <w:bCs/>
+        </w:rPr>
+        <w:t xml:space="preserve">Score distribution</w:t>
+      </w:r>
+      <w:r>
+        <w:t xml:space="preserve"> </w:t>
+      </w:r>
+      <w:r>
+        <w:t xml:space="preserve">— banded bar chart with the average percentage.</w:t>
+      </w:r>
+      <w:r>
+        <w:t xml:space="preserve"> </w:t>
+      </w:r>
+      <w:r>
+        <w:t xml:space="preserve">-</w:t>
+      </w:r>
+      <w:r>
+        <w:t xml:space="preserve"> </w:t>
+      </w:r>
+      <w:r>
+        <w:rPr>
+          <w:b/>
+          <w:bCs/>
+        </w:rPr>
+        <w:t xml:space="preserve">Coding questions</w:t>
+      </w:r>
+      <w:r>
+        <w:t xml:space="preserve"> </w:t>
+      </w:r>
+      <w:r>
+        <w:t xml:space="preserve">— students with coding, attempted, total correct/attempted, and coding accuracy.</w:t>
+      </w:r>
+      <w:r>
+        <w:t xml:space="preserve"> </w:t>
+      </w:r>
+      <w:r>
+        <w:t xml:space="preserve">-</w:t>
+      </w:r>
+      <w:r>
+        <w:t xml:space="preserve"> </w:t>
+      </w:r>
+      <w:r>
+        <w:rPr>
+          <w:b/>
+          <w:bCs/>
+        </w:rPr>
+        <w:t xml:space="preserve">Buttons: Attendees (Excel) / Cleared (Excel)</w:t>
+      </w:r>
+      <w:r>
+        <w:t xml:space="preserve"> </w:t>
+      </w:r>
+      <w:r>
+        <w:t xml:space="preserve">→</w:t>
+      </w:r>
+      <w:r>
+        <w:t xml:space="preserve"> </w:t>
+      </w:r>
+      <w:r>
+        <w:rPr>
+          <w:rStyle w:val="VerbatimChar"/>
+        </w:rPr>
+        <w:t xml:space="preserve">GET .../rounds/1/export[?cleared=true]</w:t>
+      </w:r>
+      <w:r>
+        <w:t xml:space="preserve"> </w:t>
+      </w:r>
+      <w:r>
+        <w:t xml:space="preserve">(binary</w:t>
+      </w:r>
+      <w:r>
+        <w:t xml:space="preserve"> </w:t>
+      </w:r>
+      <w:r>
+        <w:rPr>
+          <w:rStyle w:val="VerbatimChar"/>
+        </w:rPr>
+        <w:t xml:space="preserve">.xlsx</w:t>
+      </w:r>
+      <w:r>
+        <w:t xml:space="preserve">).</w:t>
+      </w:r>
+    </w:p>
+    <w:bookmarkEnd w:id="189"/>
+    <w:bookmarkStart w:id="190" w:name="question-bank-driverecruiterquestions"/>
+    <w:p>
+      <w:pPr>
+        <w:pStyle w:val="Heading2"/>
+      </w:pPr>
+      <w:r>
+        <w:t xml:space="preserve">21.8 Question Bank (</w:t>
+      </w:r>
+      <w:r>
+        <w:rPr>
+          <w:rStyle w:val="VerbatimChar"/>
+        </w:rPr>
+        <w:t xml:space="preserve">/drive/recruiter/questions</w:t>
+      </w:r>
+      <w:r>
+        <w:t xml:space="preserve">)</w:t>
+      </w:r>
+    </w:p>
+    <w:p>
+      <w:pPr>
+        <w:pStyle w:val="Compact"/>
+        <w:numPr>
+          <w:ilvl w:val="0"/>
+          <w:numId w:val="1087"/>
+        </w:numPr>
+      </w:pPr>
+      <w:r>
+        <w:t xml:space="preserve">Loads</w:t>
+      </w:r>
+      <w:r>
+        <w:t xml:space="preserve"> </w:t>
+      </w:r>
+      <w:r>
+        <w:rPr>
+          <w:rStyle w:val="VerbatimChar"/>
+        </w:rPr>
+        <w:t xml:space="preserve">GET /drive/v1/questions</w:t>
+      </w:r>
+      <w:r>
+        <w:t xml:space="preserve">. Question list shows type, category, difficulty, status (draft/active/retired), and version.</w:t>
+      </w:r>
+    </w:p>
+    <w:p>
+      <w:pPr>
+        <w:pStyle w:val="Compact"/>
+        <w:numPr>
+          <w:ilvl w:val="0"/>
+          <w:numId w:val="1087"/>
+        </w:numPr>
+      </w:pPr>
+      <w:r>
+        <w:rPr>
+          <w:b/>
+          <w:bCs/>
+        </w:rPr>
+        <w:t xml:space="preserve">Buttons: Create question</w:t>
+      </w:r>
+      <w:r>
+        <w:t xml:space="preserve"> </w:t>
+      </w:r>
+      <w:r>
+        <w:t xml:space="preserve">(</w:t>
+      </w:r>
+      <w:r>
+        <w:rPr>
+          <w:rStyle w:val="VerbatimChar"/>
+        </w:rPr>
+        <w:t xml:space="preserve">POST /drive/v1/questions</w:t>
+      </w:r>
+      <w:r>
+        <w:t xml:space="preserve">),</w:t>
+      </w:r>
+      <w:r>
+        <w:t xml:space="preserve"> </w:t>
+      </w:r>
+      <w:r>
+        <w:rPr>
+          <w:b/>
+          <w:bCs/>
+        </w:rPr>
+        <w:t xml:space="preserve">Activate</w:t>
+      </w:r>
+      <w:r>
+        <w:t xml:space="preserve"> </w:t>
+      </w:r>
+      <w:r>
+        <w:t xml:space="preserve">(</w:t>
+      </w:r>
+      <w:r>
+        <w:rPr>
+          <w:rStyle w:val="VerbatimChar"/>
+        </w:rPr>
+        <w:t xml:space="preserve">POST .../questions/{id}/activate</w:t>
+      </w:r>
+      <w:r>
+        <w:t xml:space="preserve">),</w:t>
+      </w:r>
+      <w:r>
+        <w:t xml:space="preserve"> </w:t>
+      </w:r>
+      <w:r>
+        <w:rPr>
+          <w:b/>
+          <w:bCs/>
+        </w:rPr>
+        <w:t xml:space="preserve">AI-generate questions</w:t>
+      </w:r>
+      <w:r>
+        <w:t xml:space="preserve"> </w:t>
+      </w:r>
+      <w:r>
+        <w:t xml:space="preserve">(</w:t>
+      </w:r>
+      <w:r>
+        <w:rPr>
+          <w:rStyle w:val="VerbatimChar"/>
+        </w:rPr>
+        <w:t xml:space="preserve">POST /drive/v1/questions/generate</w:t>
+      </w:r>
+      <w:r>
+        <w:t xml:space="preserve">),</w:t>
+      </w:r>
+      <w:r>
+        <w:t xml:space="preserve"> </w:t>
+      </w:r>
+      <w:r>
+        <w:rPr>
+          <w:b/>
+          <w:bCs/>
+        </w:rPr>
+        <w:t xml:space="preserve">Create blueprint</w:t>
+      </w:r>
+      <w:r>
+        <w:t xml:space="preserve"> </w:t>
+      </w:r>
+      <w:r>
+        <w:t xml:space="preserve">(</w:t>
+      </w:r>
+      <w:r>
+        <w:rPr>
+          <w:rStyle w:val="VerbatimChar"/>
+        </w:rPr>
+        <w:t xml:space="preserve">POST /drive/v1/blueprints</w:t>
+      </w:r>
+      <w:r>
+        <w:t xml:space="preserve">),</w:t>
+      </w:r>
+      <w:r>
+        <w:t xml:space="preserve"> </w:t>
+      </w:r>
+      <w:r>
+        <w:rPr>
+          <w:b/>
+          <w:bCs/>
+        </w:rPr>
+        <w:t xml:space="preserve">Generate paper</w:t>
+      </w:r>
+      <w:r>
+        <w:t xml:space="preserve"> </w:t>
+      </w:r>
+      <w:r>
+        <w:t xml:space="preserve">(</w:t>
+      </w:r>
+      <w:r>
+        <w:rPr>
+          <w:rStyle w:val="VerbatimChar"/>
+        </w:rPr>
+        <w:t xml:space="preserve">POST .../blueprints/{id}/generate-paper</w:t>
+      </w:r>
+      <w:r>
+        <w:t xml:space="preserve">),</w:t>
+      </w:r>
+      <w:r>
+        <w:t xml:space="preserve"> </w:t>
+      </w:r>
+      <w:r>
+        <w:rPr>
+          <w:b/>
+          <w:bCs/>
+        </w:rPr>
+        <w:t xml:space="preserve">Create exam</w:t>
+      </w:r>
+      <w:r>
+        <w:t xml:space="preserve"> </w:t>
+      </w:r>
+      <w:r>
+        <w:t xml:space="preserve">(</w:t>
+      </w:r>
+      <w:r>
+        <w:rPr>
+          <w:rStyle w:val="VerbatimChar"/>
+        </w:rPr>
+        <w:t xml:space="preserve">POST /drive/v1/exams</w:t>
+      </w:r>
+      <w:r>
+        <w:t xml:space="preserve">),</w:t>
+      </w:r>
+      <w:r>
+        <w:t xml:space="preserve"> </w:t>
+      </w:r>
+      <w:r>
+        <w:rPr>
+          <w:b/>
+          <w:bCs/>
+        </w:rPr>
+        <w:t xml:space="preserve">Upsert eval key</w:t>
+      </w:r>
+      <w:r>
+        <w:t xml:space="preserve"> </w:t>
+      </w:r>
+      <w:r>
+        <w:t xml:space="preserve">(</w:t>
+      </w:r>
+      <w:r>
+        <w:rPr>
+          <w:rStyle w:val="VerbatimChar"/>
+        </w:rPr>
+        <w:t xml:space="preserve">POST /drive/v1/evaluations/keys</w:t>
+      </w:r>
+      <w:r>
+        <w:t xml:space="preserve">).</w:t>
+      </w:r>
+    </w:p>
+    <w:p>
+      <w:r>
         <w:pict>
           <v:rect style="width:0;height:1.5pt" o:hralign="center" o:hrstd="t" o:hr="t"/>
         </w:pict>
@@ -32692,8 +34748,8 @@
         <w:t xml:space="preserve">End of document. Prepared for LARE Cloud Solutions - a unit of LARE Consulting &amp; Technology Pvt. Ltd.</w:t>
       </w:r>
     </w:p>
-    <w:bookmarkEnd w:id="181"/>
-    <w:bookmarkEnd w:id="182"/>
+    <w:bookmarkEnd w:id="190"/>
+    <w:bookmarkEnd w:id="191"/>
     <w:sectPr>
       <w:footnotePr>
         <w:numRestart w:val="eachSect"/>
@@ -33380,6 +35436,15 @@
     <w:abstractNumId w:val="991"/>
   </w:num>
   <w:num w:numId="1084">
+    <w:abstractNumId w:val="991"/>
+  </w:num>
+  <w:num w:numId="1085">
+    <w:abstractNumId w:val="991"/>
+  </w:num>
+  <w:num w:numId="1086">
+    <w:abstractNumId w:val="991"/>
+  </w:num>
+  <w:num w:numId="1087">
     <w:abstractNumId w:val="991"/>
   </w:num>
 </w:numbering>

</xml_diff>

<commit_message>
docs: detailed screen reference part 4 (staff consoles, generative lessons, shared components)
Co-Authored-By: Claude Opus 4.8 <noreply@anthropic.com>
</commit_message>
<xml_diff>
--- a/docs/LARE-Documentation.docx
+++ b/docs/LARE-Documentation.docx
@@ -34731,6 +34731,2342 @@
     </w:p>
     <w:p>
       <w:r>
+        <w:br w:type="page"/>
+      </w:r>
+    </w:p>
+    <w:bookmarkEnd w:id="190"/>
+    <w:bookmarkEnd w:id="191"/>
+    <w:bookmarkStart w:id="203" w:name="X03ccd3fb6078687ed14d171fc93911b6431eb0d"/>
+    <w:p>
+      <w:pPr>
+        <w:pStyle w:val="Heading1"/>
+      </w:pPr>
+      <w:r>
+        <w:t xml:space="preserve">22. Detailed Screen Reference — Staff Consoles, Generative Lessons &amp; Shared Components</w:t>
+      </w:r>
+    </w:p>
+    <w:bookmarkStart w:id="192" w:name="micro-lessons-lmslessons"/>
+    <w:p>
+      <w:pPr>
+        <w:pStyle w:val="Heading2"/>
+      </w:pPr>
+      <w:r>
+        <w:t xml:space="preserve">22.1 Micro-Lessons (</w:t>
+      </w:r>
+      <w:r>
+        <w:rPr>
+          <w:rStyle w:val="VerbatimChar"/>
+        </w:rPr>
+        <w:t xml:space="preserve">/lms/lessons</w:t>
+      </w:r>
+      <w:r>
+        <w:t xml:space="preserve">)</w:t>
+      </w:r>
+    </w:p>
+    <w:p>
+      <w:pPr>
+        <w:pStyle w:val="FirstParagraph"/>
+      </w:pPr>
+      <w:r>
+        <w:t xml:space="preserve">The</w:t>
+      </w:r>
+      <w:r>
+        <w:t xml:space="preserve"> </w:t>
+      </w:r>
+      <w:r>
+        <w:rPr>
+          <w:b/>
+          <w:bCs/>
+        </w:rPr>
+        <w:t xml:space="preserve">Generative Learning Fabric</w:t>
+      </w:r>
+      <w:r>
+        <w:t xml:space="preserve"> </w:t>
+      </w:r>
+      <w:r>
+        <w:t xml:space="preserve">— name a concept and the AI writes a complete lesson (rich text with tables/examples, runnable code, callouts, and checks) in the same block format as curriculum lessons.</w:t>
+      </w:r>
+    </w:p>
+    <w:p>
+      <w:pPr>
+        <w:pStyle w:val="Compact"/>
+        <w:numPr>
+          <w:ilvl w:val="0"/>
+          <w:numId w:val="1088"/>
+        </w:numPr>
+      </w:pPr>
+      <w:r>
+        <w:t xml:space="preserve">On mount, loads the twin’s</w:t>
+      </w:r>
+      <w:r>
+        <w:t xml:space="preserve"> </w:t>
+      </w:r>
+      <w:r>
+        <w:rPr>
+          <w:rStyle w:val="VerbatimChar"/>
+        </w:rPr>
+        <w:t xml:space="preserve">focus_areas</w:t>
+      </w:r>
+      <w:r>
+        <w:t xml:space="preserve"> </w:t>
+      </w:r>
+      <w:r>
+        <w:t xml:space="preserve">(as suggested topics) and the learner’s saved lesson</w:t>
+      </w:r>
+      <w:r>
+        <w:t xml:space="preserve"> </w:t>
+      </w:r>
+      <w:r>
+        <w:rPr>
+          <w:b/>
+          <w:bCs/>
+        </w:rPr>
+        <w:t xml:space="preserve">library</w:t>
+      </w:r>
+      <w:r>
+        <w:t xml:space="preserve"> </w:t>
+      </w:r>
+      <w:r>
+        <w:t xml:space="preserve">(</w:t>
+      </w:r>
+      <w:r>
+        <w:rPr>
+          <w:rStyle w:val="VerbatimChar"/>
+        </w:rPr>
+        <w:t xml:space="preserve">GET /lms/v1/micro-lessons/{id}</w:t>
+      </w:r>
+      <w:r>
+        <w:t xml:space="preserve">).</w:t>
+      </w:r>
+    </w:p>
+    <w:p>
+      <w:pPr>
+        <w:pStyle w:val="Compact"/>
+        <w:numPr>
+          <w:ilvl w:val="0"/>
+          <w:numId w:val="1088"/>
+        </w:numPr>
+      </w:pPr>
+      <w:r>
+        <w:rPr>
+          <w:b/>
+          <w:bCs/>
+        </w:rPr>
+        <w:t xml:space="preserve">Generate bar</w:t>
+      </w:r>
+      <w:r>
+        <w:t xml:space="preserve"> </w:t>
+      </w:r>
+      <w:r>
+        <w:t xml:space="preserve">— a topic input (Enter to submit) +</w:t>
+      </w:r>
+      <w:r>
+        <w:t xml:space="preserve"> </w:t>
+      </w:r>
+      <w:r>
+        <w:rPr>
+          <w:b/>
+          <w:bCs/>
+        </w:rPr>
+        <w:t xml:space="preserve">Generate</w:t>
+      </w:r>
+      <w:r>
+        <w:t xml:space="preserve"> </w:t>
+      </w:r>
+      <w:r>
+        <w:t xml:space="preserve">→</w:t>
+      </w:r>
+      <w:r>
+        <w:t xml:space="preserve"> </w:t>
+      </w:r>
+      <w:r>
+        <w:rPr>
+          <w:rStyle w:val="VerbatimChar"/>
+        </w:rPr>
+        <w:t xml:space="preserve">POST /lms/v1/micro-lessons/{id}/generate { topic, force:false }</w:t>
+      </w:r>
+      <w:r>
+        <w:t xml:space="preserve">.</w:t>
+      </w:r>
+      <w:r>
+        <w:t xml:space="preserve"> </w:t>
+      </w:r>
+      <w:r>
+        <w:rPr>
+          <w:b/>
+          <w:bCs/>
+        </w:rPr>
+        <w:t xml:space="preserve">Focus-area chips</w:t>
+      </w:r>
+      <w:r>
+        <w:t xml:space="preserve"> </w:t>
+      </w:r>
+      <w:r>
+        <w:t xml:space="preserve">generate on click.</w:t>
+      </w:r>
+    </w:p>
+    <w:p>
+      <w:pPr>
+        <w:pStyle w:val="Compact"/>
+        <w:numPr>
+          <w:ilvl w:val="0"/>
+          <w:numId w:val="1088"/>
+        </w:numPr>
+      </w:pPr>
+      <w:r>
+        <w:rPr>
+          <w:b/>
+          <w:bCs/>
+        </w:rPr>
+        <w:t xml:space="preserve">Lesson panel</w:t>
+      </w:r>
+      <w:r>
+        <w:t xml:space="preserve"> </w:t>
+      </w:r>
+      <w:r>
+        <w:t xml:space="preserve">— the lesson title, an</w:t>
+      </w:r>
+      <w:r>
+        <w:t xml:space="preserve"> </w:t>
+      </w:r>
+      <w:r>
+        <w:rPr>
+          <w:b/>
+          <w:bCs/>
+        </w:rPr>
+        <w:t xml:space="preserve">AI-generated / Smart lesson</w:t>
+      </w:r>
+      <w:r>
+        <w:t xml:space="preserve"> </w:t>
+      </w:r>
+      <w:r>
+        <w:t xml:space="preserve">badge, a</w:t>
+      </w:r>
+      <w:r>
+        <w:t xml:space="preserve"> </w:t>
+      </w:r>
+      <w:r>
+        <w:rPr>
+          <w:b/>
+          <w:bCs/>
+        </w:rPr>
+        <w:t xml:space="preserve">Regenerate</w:t>
+      </w:r>
+      <w:r>
+        <w:t xml:space="preserve"> </w:t>
+      </w:r>
+      <w:r>
+        <w:t xml:space="preserve">button (</w:t>
+      </w:r>
+      <w:r>
+        <w:rPr>
+          <w:rStyle w:val="VerbatimChar"/>
+        </w:rPr>
+        <w:t xml:space="preserve">force:true</w:t>
+      </w:r>
+      <w:r>
+        <w:t xml:space="preserve">), and the rendered</w:t>
+      </w:r>
+      <w:r>
+        <w:t xml:space="preserve"> </w:t>
+      </w:r>
+      <w:r>
+        <w:rPr>
+          <w:b/>
+          <w:bCs/>
+        </w:rPr>
+        <w:t xml:space="preserve">LessonBlocks</w:t>
+      </w:r>
+      <w:r>
+        <w:t xml:space="preserve">. A backward-compat shim converts older</w:t>
+      </w:r>
+      <w:r>
+        <w:t xml:space="preserve"> </w:t>
+      </w:r>
+      <w:r>
+        <w:rPr>
+          <w:rStyle w:val="VerbatimChar"/>
+        </w:rPr>
+        <w:t xml:space="preserve">{intro, key_points, worked_example, misconception, practice}</w:t>
+      </w:r>
+      <w:r>
+        <w:t xml:space="preserve"> </w:t>
+      </w:r>
+      <w:r>
+        <w:t xml:space="preserve">lessons into blocks.</w:t>
+      </w:r>
+    </w:p>
+    <w:p>
+      <w:pPr>
+        <w:pStyle w:val="Compact"/>
+        <w:numPr>
+          <w:ilvl w:val="0"/>
+          <w:numId w:val="1088"/>
+        </w:numPr>
+      </w:pPr>
+      <w:r>
+        <w:rPr>
+          <w:b/>
+          <w:bCs/>
+        </w:rPr>
+        <w:t xml:space="preserve">“Your lessons”</w:t>
+      </w:r>
+      <w:r>
+        <w:rPr>
+          <w:b/>
+          <w:bCs/>
+        </w:rPr>
+        <w:t xml:space="preserve"> </w:t>
+      </w:r>
+      <w:r>
+        <w:rPr>
+          <w:b/>
+          <w:bCs/>
+        </w:rPr>
+        <w:t xml:space="preserve">sidebar</w:t>
+      </w:r>
+      <w:r>
+        <w:t xml:space="preserve"> </w:t>
+      </w:r>
+      <w:r>
+        <w:t xml:space="preserve">— the saved library; clicking a title re-opens it.</w:t>
+      </w:r>
+    </w:p>
+    <w:p>
+      <w:pPr>
+        <w:pStyle w:val="Compact"/>
+        <w:numPr>
+          <w:ilvl w:val="0"/>
+          <w:numId w:val="1088"/>
+        </w:numPr>
+      </w:pPr>
+      <w:r>
+        <w:t xml:space="preserve">Empty state:</w:t>
+      </w:r>
+      <w:r>
+        <w:t xml:space="preserve"> </w:t>
+      </w:r>
+      <w:r>
+        <w:t xml:space="preserve">“Pick a concept to learn”</w:t>
+      </w:r>
+      <w:r>
+        <w:t xml:space="preserve">.</w:t>
+      </w:r>
+    </w:p>
+    <w:bookmarkEnd w:id="192"/>
+    <w:bookmarkStart w:id="193" w:name="lesson-viewer-lmslessonlid"/>
+    <w:p>
+      <w:pPr>
+        <w:pStyle w:val="Heading2"/>
+      </w:pPr>
+      <w:r>
+        <w:t xml:space="preserve">22.2 Lesson Viewer (</w:t>
+      </w:r>
+      <w:r>
+        <w:rPr>
+          <w:rStyle w:val="VerbatimChar"/>
+        </w:rPr>
+        <w:t xml:space="preserve">/lms/lesson/:lid</w:t>
+      </w:r>
+      <w:r>
+        <w:t xml:space="preserve">)</w:t>
+      </w:r>
+    </w:p>
+    <w:p>
+      <w:pPr>
+        <w:pStyle w:val="FirstParagraph"/>
+      </w:pPr>
+      <w:r>
+        <w:t xml:space="preserve">Student view of a curriculum</w:t>
+      </w:r>
+      <w:r>
+        <w:t xml:space="preserve"> </w:t>
+      </w:r>
+      <w:r>
+        <w:t xml:space="preserve">“living lesson”</w:t>
+      </w:r>
+      <w:r>
+        <w:t xml:space="preserve">.</w:t>
+      </w:r>
+      <w:r>
+        <w:t xml:space="preserve"> </w:t>
+      </w:r>
+      <w:r>
+        <w:t xml:space="preserve">- Loads</w:t>
+      </w:r>
+      <w:r>
+        <w:t xml:space="preserve"> </w:t>
+      </w:r>
+      <w:r>
+        <w:rPr>
+          <w:rStyle w:val="VerbatimChar"/>
+        </w:rPr>
+        <w:t xml:space="preserve">GET /lms/v1/lessons/{lid}</w:t>
+      </w:r>
+      <w:r>
+        <w:t xml:space="preserve">; renders</w:t>
+      </w:r>
+      <w:r>
+        <w:t xml:space="preserve"> </w:t>
+      </w:r>
+      <w:r>
+        <w:rPr>
+          <w:rStyle w:val="VerbatimChar"/>
+        </w:rPr>
+        <w:t xml:space="preserve">content</w:t>
+      </w:r>
+      <w:r>
+        <w:t xml:space="preserve"> </w:t>
+      </w:r>
+      <w:r>
+        <w:t xml:space="preserve">via</w:t>
+      </w:r>
+      <w:r>
+        <w:t xml:space="preserve"> </w:t>
+      </w:r>
+      <w:r>
+        <w:rPr>
+          <w:b/>
+          <w:bCs/>
+        </w:rPr>
+        <w:t xml:space="preserve">LessonBlocks</w:t>
+      </w:r>
+      <w:r>
+        <w:t xml:space="preserve">.</w:t>
+      </w:r>
+      <w:r>
+        <w:t xml:space="preserve"> </w:t>
+      </w:r>
+      <w:r>
+        <w:t xml:space="preserve">- If any block is a</w:t>
+      </w:r>
+      <w:r>
+        <w:t xml:space="preserve"> </w:t>
+      </w:r>
+      <w:r>
+        <w:rPr>
+          <w:b/>
+          <w:bCs/>
+        </w:rPr>
+        <w:t xml:space="preserve">check</w:t>
+      </w:r>
+      <w:r>
+        <w:t xml:space="preserve">, a</w:t>
+      </w:r>
+      <w:r>
+        <w:t xml:space="preserve"> </w:t>
+      </w:r>
+      <w:r>
+        <w:rPr>
+          <w:b/>
+          <w:bCs/>
+        </w:rPr>
+        <w:t xml:space="preserve">ProctorBanner</w:t>
+      </w:r>
+      <w:r>
+        <w:t xml:space="preserve"> </w:t>
+      </w:r>
+      <w:r>
+        <w:t xml:space="preserve">is shown and each check is graded via</w:t>
+      </w:r>
+      <w:r>
+        <w:t xml:space="preserve"> </w:t>
+      </w:r>
+      <w:r>
+        <w:rPr>
+          <w:rStyle w:val="VerbatimChar"/>
+        </w:rPr>
+        <w:t xml:space="preserve">POST /lms/v1/lessons/{lid}/check { block_id, choice }</w:t>
+      </w:r>
+      <w:r>
+        <w:t xml:space="preserve"> </w:t>
+      </w:r>
+      <w:r>
+        <w:t xml:space="preserve">— which also records practice into the learner’s review schedule (feeding the twin).</w:t>
+      </w:r>
+      <w:r>
+        <w:t xml:space="preserve"> </w:t>
+      </w:r>
+      <w:r>
+        <w:t xml:space="preserve">- Empty state when no material has been added;</w:t>
+      </w:r>
+      <w:r>
+        <w:t xml:space="preserve"> </w:t>
+      </w:r>
+      <w:r>
+        <w:rPr>
+          <w:b/>
+          <w:bCs/>
+        </w:rPr>
+        <w:t xml:space="preserve">Back</w:t>
+      </w:r>
+      <w:r>
+        <w:t xml:space="preserve"> </w:t>
+      </w:r>
+      <w:r>
+        <w:t xml:space="preserve">button; a closing note that</w:t>
+      </w:r>
+      <w:r>
+        <w:t xml:space="preserve"> </w:t>
+      </w:r>
+      <w:r>
+        <w:t xml:space="preserve">“your skill map updates from the checks above.”</w:t>
+      </w:r>
+    </w:p>
+    <w:bookmarkEnd w:id="193"/>
+    <w:bookmarkStart w:id="194" w:name="institution-admin-console-lmsadmin"/>
+    <w:p>
+      <w:pPr>
+        <w:pStyle w:val="Heading2"/>
+      </w:pPr>
+      <w:r>
+        <w:t xml:space="preserve">22.3 Institution / Admin Console (</w:t>
+      </w:r>
+      <w:r>
+        <w:rPr>
+          <w:rStyle w:val="VerbatimChar"/>
+        </w:rPr>
+        <w:t xml:space="preserve">/lms/admin</w:t>
+      </w:r>
+      <w:r>
+        <w:t xml:space="preserve">)</w:t>
+      </w:r>
+    </w:p>
+    <w:p>
+      <w:pPr>
+        <w:pStyle w:val="FirstParagraph"/>
+      </w:pPr>
+      <w:r>
+        <w:t xml:space="preserve">Super-Admin / College-Admin / TPO console. Two tabs:</w:t>
+      </w:r>
+      <w:r>
+        <w:t xml:space="preserve"> </w:t>
+      </w:r>
+      <w:r>
+        <w:rPr>
+          <w:b/>
+          <w:bCs/>
+        </w:rPr>
+        <w:t xml:space="preserve">overview</w:t>
+      </w:r>
+      <w:r>
+        <w:t xml:space="preserve"> </w:t>
+      </w:r>
+      <w:r>
+        <w:t xml:space="preserve">and</w:t>
+      </w:r>
+      <w:r>
+        <w:t xml:space="preserve"> </w:t>
+      </w:r>
+      <w:r>
+        <w:rPr>
+          <w:b/>
+          <w:bCs/>
+        </w:rPr>
+        <w:t xml:space="preserve">learners</w:t>
+      </w:r>
+      <w:r>
+        <w:t xml:space="preserve">.</w:t>
+      </w:r>
+      <w:r>
+        <w:t xml:space="preserve"> </w:t>
+      </w:r>
+      <w:r>
+        <w:t xml:space="preserve">-</w:t>
+      </w:r>
+      <w:r>
+        <w:t xml:space="preserve"> </w:t>
+      </w:r>
+      <w:r>
+        <w:rPr>
+          <w:b/>
+          <w:bCs/>
+        </w:rPr>
+        <w:t xml:space="preserve">Stat tiles</w:t>
+      </w:r>
+      <w:r>
+        <w:t xml:space="preserve"> </w:t>
+      </w:r>
+      <w:r>
+        <w:t xml:space="preserve">— Colleges, Learners, Active drives (</w:t>
+      </w:r>
+      <w:r>
+        <w:rPr>
+          <w:rStyle w:val="VerbatimChar"/>
+        </w:rPr>
+        <w:t xml:space="preserve">GET /analytics/v1/dashboard/college_admin</w:t>
+      </w:r>
+      <w:r>
+        <w:t xml:space="preserve">).</w:t>
+      </w:r>
+      <w:r>
+        <w:t xml:space="preserve"> </w:t>
+      </w:r>
+      <w:r>
+        <w:t xml:space="preserve">-</w:t>
+      </w:r>
+      <w:r>
+        <w:t xml:space="preserve"> </w:t>
+      </w:r>
+      <w:r>
+        <w:rPr>
+          <w:b/>
+          <w:bCs/>
+        </w:rPr>
+        <w:t xml:space="preserve">Overview → Colleges</w:t>
+      </w:r>
+      <w:r>
+        <w:t xml:space="preserve"> </w:t>
+      </w:r>
+      <w:r>
+        <w:t xml:space="preserve">— a college list (code avatar, name, city, learner count, verified/pending badge) and an</w:t>
+      </w:r>
+      <w:r>
+        <w:t xml:space="preserve"> </w:t>
+      </w:r>
+      <w:r>
+        <w:rPr>
+          <w:b/>
+          <w:bCs/>
+        </w:rPr>
+        <w:t xml:space="preserve">Add college</w:t>
+      </w:r>
+      <w:r>
+        <w:t xml:space="preserve"> </w:t>
+      </w:r>
+      <w:r>
+        <w:t xml:space="preserve">form (name, code, city) →</w:t>
+      </w:r>
+      <w:r>
+        <w:t xml:space="preserve"> </w:t>
+      </w:r>
+      <w:r>
+        <w:rPr>
+          <w:rStyle w:val="VerbatimChar"/>
+        </w:rPr>
+        <w:t xml:space="preserve">POST /lms/v1/colleges</w:t>
+      </w:r>
+      <w:r>
+        <w:t xml:space="preserve">.</w:t>
+      </w:r>
+      <w:r>
+        <w:t xml:space="preserve"> </w:t>
+      </w:r>
+      <w:r>
+        <w:t xml:space="preserve">-</w:t>
+      </w:r>
+      <w:r>
+        <w:t xml:space="preserve"> </w:t>
+      </w:r>
+      <w:r>
+        <w:rPr>
+          <w:b/>
+          <w:bCs/>
+        </w:rPr>
+        <w:t xml:space="preserve">Learners → Roster</w:t>
+      </w:r>
+      <w:r>
+        <w:t xml:space="preserve"> </w:t>
+      </w:r>
+      <w:r>
+        <w:t xml:space="preserve">— a table (roll no, name, branch, year, CGPA, status). Unverified rows have a</w:t>
+      </w:r>
+      <w:r>
+        <w:t xml:space="preserve"> </w:t>
+      </w:r>
+      <w:r>
+        <w:rPr>
+          <w:b/>
+          <w:bCs/>
+        </w:rPr>
+        <w:t xml:space="preserve">Verify</w:t>
+      </w:r>
+      <w:r>
+        <w:t xml:space="preserve"> </w:t>
+      </w:r>
+      <w:r>
+        <w:t xml:space="preserve">button →</w:t>
+      </w:r>
+      <w:r>
+        <w:t xml:space="preserve"> </w:t>
+      </w:r>
+      <w:r>
+        <w:rPr>
+          <w:rStyle w:val="VerbatimChar"/>
+        </w:rPr>
+        <w:t xml:space="preserve">POST /lms/v1/learners/{id}/verify</w:t>
+      </w:r>
+      <w:r>
+        <w:t xml:space="preserve">. A</w:t>
+      </w:r>
+      <w:r>
+        <w:t xml:space="preserve"> </w:t>
+      </w:r>
+      <w:r>
+        <w:rPr>
+          <w:b/>
+          <w:bCs/>
+        </w:rPr>
+        <w:t xml:space="preserve">Bulk import</w:t>
+      </w:r>
+      <w:r>
+        <w:t xml:space="preserve"> </w:t>
+      </w:r>
+      <w:r>
+        <w:t xml:space="preserve">panel accepts CSV lines (</w:t>
+      </w:r>
+      <w:r>
+        <w:rPr>
+          <w:rStyle w:val="VerbatimChar"/>
+        </w:rPr>
+        <w:t xml:space="preserve">roll_no, name, branch, cgpa</w:t>
+      </w:r>
+      <w:r>
+        <w:t xml:space="preserve">) →</w:t>
+      </w:r>
+      <w:r>
+        <w:t xml:space="preserve"> </w:t>
+      </w:r>
+      <w:r>
+        <w:rPr>
+          <w:rStyle w:val="VerbatimChar"/>
+        </w:rPr>
+        <w:t xml:space="preserve">POST /lms/v1/learners/import</w:t>
+      </w:r>
+      <w:r>
+        <w:t xml:space="preserve">.</w:t>
+      </w:r>
+    </w:p>
+    <w:bookmarkEnd w:id="194"/>
+    <w:bookmarkStart w:id="195" w:name="curriculum-studio-lmscurriculum"/>
+    <w:p>
+      <w:pPr>
+        <w:pStyle w:val="Heading2"/>
+      </w:pPr>
+      <w:r>
+        <w:t xml:space="preserve">22.4 Curriculum Studio (</w:t>
+      </w:r>
+      <w:r>
+        <w:rPr>
+          <w:rStyle w:val="VerbatimChar"/>
+        </w:rPr>
+        <w:t xml:space="preserve">/lms/curriculum</w:t>
+      </w:r>
+      <w:r>
+        <w:t xml:space="preserve">)</w:t>
+      </w:r>
+    </w:p>
+    <w:p>
+      <w:pPr>
+        <w:pStyle w:val="FirstParagraph"/>
+      </w:pPr>
+      <w:r>
+        <w:t xml:space="preserve">Authoring for real curriculum + AI-assisted lesson material.</w:t>
+      </w:r>
+      <w:r>
+        <w:t xml:space="preserve"> </w:t>
+      </w:r>
+      <w:r>
+        <w:t xml:space="preserve">- Loads the real curriculum tree (</w:t>
+      </w:r>
+      <w:r>
+        <w:rPr>
+          <w:rStyle w:val="VerbatimChar"/>
+        </w:rPr>
+        <w:t xml:space="preserve">GET /lms/v1/curricula</w:t>
+      </w:r>
+      <w:r>
+        <w:t xml:space="preserve"> </w:t>
+      </w:r>
+      <w:r>
+        <w:t xml:space="preserve">+</w:t>
+      </w:r>
+      <w:r>
+        <w:t xml:space="preserve"> </w:t>
+      </w:r>
+      <w:r>
+        <w:rPr>
+          <w:rStyle w:val="VerbatimChar"/>
+        </w:rPr>
+        <w:t xml:space="preserve">/tree</w:t>
+      </w:r>
+      <w:r>
+        <w:t xml:space="preserve">). Editors add</w:t>
+      </w:r>
+      <w:r>
+        <w:t xml:space="preserve"> </w:t>
+      </w:r>
+      <w:r>
+        <w:rPr>
+          <w:b/>
+          <w:bCs/>
+        </w:rPr>
+        <w:t xml:space="preserve">years/modules/lessons</w:t>
+      </w:r>
+      <w:r>
+        <w:t xml:space="preserve"> </w:t>
+      </w:r>
+      <w:r>
+        <w:t xml:space="preserve">(</w:t>
+      </w:r>
+      <w:r>
+        <w:rPr>
+          <w:rStyle w:val="VerbatimChar"/>
+        </w:rPr>
+        <w:t xml:space="preserve">POST .../years|modules|lessons</w:t>
+      </w:r>
+      <w:r>
+        <w:t xml:space="preserve">).</w:t>
+      </w:r>
+      <w:r>
+        <w:t xml:space="preserve"> </w:t>
+      </w:r>
+      <w:r>
+        <w:t xml:space="preserve">-</w:t>
+      </w:r>
+      <w:r>
+        <w:t xml:space="preserve"> </w:t>
+      </w:r>
+      <w:r>
+        <w:rPr>
+          <w:b/>
+          <w:bCs/>
+        </w:rPr>
+        <w:t xml:space="preserve">Lesson content editor</w:t>
+      </w:r>
+      <w:r>
+        <w:t xml:space="preserve"> </w:t>
+      </w:r>
+      <w:r>
+        <w:t xml:space="preserve">(see Lesson Editor) builds the block list;</w:t>
+      </w:r>
+      <w:r>
+        <w:t xml:space="preserve"> </w:t>
+      </w:r>
+      <w:r>
+        <w:rPr>
+          <w:b/>
+          <w:bCs/>
+        </w:rPr>
+        <w:t xml:space="preserve">AI-generate blocks</w:t>
+      </w:r>
+      <w:r>
+        <w:t xml:space="preserve"> </w:t>
+      </w:r>
+      <w:r>
+        <w:t xml:space="preserve">→</w:t>
+      </w:r>
+      <w:r>
+        <w:t xml:space="preserve"> </w:t>
+      </w:r>
+      <w:r>
+        <w:rPr>
+          <w:rStyle w:val="VerbatimChar"/>
+        </w:rPr>
+        <w:t xml:space="preserve">POST /lms/v1/micro-lessons/author-blocks { topic }</w:t>
+      </w:r>
+      <w:r>
+        <w:t xml:space="preserve"> </w:t>
+      </w:r>
+      <w:r>
+        <w:t xml:space="preserve">returns reviewable blocks to insert;</w:t>
+      </w:r>
+      <w:r>
+        <w:t xml:space="preserve"> </w:t>
+      </w:r>
+      <w:r>
+        <w:rPr>
+          <w:b/>
+          <w:bCs/>
+        </w:rPr>
+        <w:t xml:space="preserve">Save</w:t>
+      </w:r>
+      <w:r>
+        <w:t xml:space="preserve"> </w:t>
+      </w:r>
+      <w:r>
+        <w:t xml:space="preserve">→</w:t>
+      </w:r>
+      <w:r>
+        <w:t xml:space="preserve"> </w:t>
+      </w:r>
+      <w:r>
+        <w:rPr>
+          <w:rStyle w:val="VerbatimChar"/>
+        </w:rPr>
+        <w:t xml:space="preserve">PUT /lms/v1/lessons/{lid}/content { content }</w:t>
+      </w:r>
+      <w:r>
+        <w:t xml:space="preserve">.</w:t>
+      </w:r>
+      <w:r>
+        <w:t xml:space="preserve"> </w:t>
+      </w:r>
+      <w:r>
+        <w:t xml:space="preserve">-</w:t>
+      </w:r>
+      <w:r>
+        <w:t xml:space="preserve"> </w:t>
+      </w:r>
+      <w:r>
+        <w:rPr>
+          <w:b/>
+          <w:bCs/>
+        </w:rPr>
+        <w:t xml:space="preserve">Publish curriculum</w:t>
+      </w:r>
+      <w:r>
+        <w:t xml:space="preserve"> </w:t>
+      </w:r>
+      <w:r>
+        <w:t xml:space="preserve">→</w:t>
+      </w:r>
+      <w:r>
+        <w:t xml:space="preserve"> </w:t>
+      </w:r>
+      <w:r>
+        <w:rPr>
+          <w:rStyle w:val="VerbatimChar"/>
+        </w:rPr>
+        <w:t xml:space="preserve">POST /lms/v1/curricula/{cid}/publish</w:t>
+      </w:r>
+      <w:r>
+        <w:t xml:space="preserve">.</w:t>
+      </w:r>
+    </w:p>
+    <w:bookmarkEnd w:id="195"/>
+    <w:bookmarkStart w:id="196" w:name="lesson-editor-component"/>
+    <w:p>
+      <w:pPr>
+        <w:pStyle w:val="Heading2"/>
+      </w:pPr>
+      <w:r>
+        <w:t xml:space="preserve">22.5 Lesson Editor (component)</w:t>
+      </w:r>
+    </w:p>
+    <w:p>
+      <w:pPr>
+        <w:pStyle w:val="FirstParagraph"/>
+      </w:pPr>
+      <w:r>
+        <w:t xml:space="preserve">The block editor used by Curriculum Studio: add/reorder/remove blocks of type</w:t>
+      </w:r>
+      <w:r>
+        <w:t xml:space="preserve"> </w:t>
+      </w:r>
+      <w:r>
+        <w:rPr>
+          <w:b/>
+          <w:bCs/>
+        </w:rPr>
+        <w:t xml:space="preserve">text</w:t>
+      </w:r>
+      <w:r>
+        <w:t xml:space="preserve"> </w:t>
+      </w:r>
+      <w:r>
+        <w:t xml:space="preserve">(markdown + tables),</w:t>
+      </w:r>
+      <w:r>
+        <w:t xml:space="preserve"> </w:t>
+      </w:r>
+      <w:r>
+        <w:rPr>
+          <w:b/>
+          <w:bCs/>
+        </w:rPr>
+        <w:t xml:space="preserve">code</w:t>
+      </w:r>
+      <w:r>
+        <w:t xml:space="preserve"> </w:t>
+      </w:r>
+      <w:r>
+        <w:t xml:space="preserve">(language + snippet + note),</w:t>
+      </w:r>
+      <w:r>
+        <w:t xml:space="preserve"> </w:t>
+      </w:r>
+      <w:r>
+        <w:rPr>
+          <w:b/>
+          <w:bCs/>
+        </w:rPr>
+        <w:t xml:space="preserve">callout</w:t>
+      </w:r>
+      <w:r>
+        <w:t xml:space="preserve"> </w:t>
+      </w:r>
+      <w:r>
+        <w:t xml:space="preserve">(tip/info/warning), and</w:t>
+      </w:r>
+      <w:r>
+        <w:t xml:space="preserve"> </w:t>
+      </w:r>
+      <w:r>
+        <w:rPr>
+          <w:b/>
+          <w:bCs/>
+        </w:rPr>
+        <w:t xml:space="preserve">check</w:t>
+      </w:r>
+      <w:r>
+        <w:t xml:space="preserve"> </w:t>
+      </w:r>
+      <w:r>
+        <w:t xml:space="preserve">(question + options + answer + explanation); an AI-generate action fills a comprehensive lesson; a live preview renders via LessonBlocks; save persists to the lesson’s JSON</w:t>
+      </w:r>
+      <w:r>
+        <w:t xml:space="preserve"> </w:t>
+      </w:r>
+      <w:r>
+        <w:rPr>
+          <w:rStyle w:val="VerbatimChar"/>
+        </w:rPr>
+        <w:t xml:space="preserve">content</w:t>
+      </w:r>
+      <w:r>
+        <w:t xml:space="preserve">.</w:t>
+      </w:r>
+    </w:p>
+    <w:bookmarkEnd w:id="196"/>
+    <w:bookmarkStart w:id="197" w:name="trainer-console-lmstrainer"/>
+    <w:p>
+      <w:pPr>
+        <w:pStyle w:val="Heading2"/>
+      </w:pPr>
+      <w:r>
+        <w:t xml:space="preserve">22.6 Trainer Console (</w:t>
+      </w:r>
+      <w:r>
+        <w:rPr>
+          <w:rStyle w:val="VerbatimChar"/>
+        </w:rPr>
+        <w:t xml:space="preserve">/lms/trainer</w:t>
+      </w:r>
+      <w:r>
+        <w:t xml:space="preserve">)</w:t>
+      </w:r>
+    </w:p>
+    <w:p>
+      <w:pPr>
+        <w:pStyle w:val="FirstParagraph"/>
+      </w:pPr>
+      <w:r>
+        <w:t xml:space="preserve">Roster, attendance, grading, progress.</w:t>
+      </w:r>
+      <w:r>
+        <w:t xml:space="preserve"> </w:t>
+      </w:r>
+      <w:r>
+        <w:t xml:space="preserve">-</w:t>
+      </w:r>
+      <w:r>
+        <w:t xml:space="preserve"> </w:t>
+      </w:r>
+      <w:r>
+        <w:rPr>
+          <w:b/>
+          <w:bCs/>
+        </w:rPr>
+        <w:t xml:space="preserve">Roster</w:t>
+      </w:r>
+      <w:r>
+        <w:t xml:space="preserve"> </w:t>
+      </w:r>
+      <w:r>
+        <w:t xml:space="preserve">(</w:t>
+      </w:r>
+      <w:r>
+        <w:rPr>
+          <w:rStyle w:val="VerbatimChar"/>
+        </w:rPr>
+        <w:t xml:space="preserve">GET /lms/v1/learners</w:t>
+      </w:r>
+      <w:r>
+        <w:t xml:space="preserve">) with verify/promote (</w:t>
+      </w:r>
+      <w:r>
+        <w:rPr>
+          <w:rStyle w:val="VerbatimChar"/>
+        </w:rPr>
+        <w:t xml:space="preserve">POST .../verify|promote</w:t>
+      </w:r>
+      <w:r>
+        <w:t xml:space="preserve">).</w:t>
+      </w:r>
+      <w:r>
+        <w:t xml:space="preserve"> </w:t>
+      </w:r>
+      <w:r>
+        <w:t xml:space="preserve">-</w:t>
+      </w:r>
+      <w:r>
+        <w:t xml:space="preserve"> </w:t>
+      </w:r>
+      <w:r>
+        <w:rPr>
+          <w:b/>
+          <w:bCs/>
+        </w:rPr>
+        <w:t xml:space="preserve">Attendance</w:t>
+      </w:r>
+      <w:r>
+        <w:t xml:space="preserve"> </w:t>
+      </w:r>
+      <w:r>
+        <w:t xml:space="preserve">—</w:t>
+      </w:r>
+      <w:r>
+        <w:t xml:space="preserve"> </w:t>
+      </w:r>
+      <w:r>
+        <w:rPr>
+          <w:rStyle w:val="VerbatimChar"/>
+        </w:rPr>
+        <w:t xml:space="preserve">POST /lms/v1/attendance</w:t>
+      </w:r>
+      <w:r>
+        <w:t xml:space="preserve">.</w:t>
+      </w:r>
+      <w:r>
+        <w:t xml:space="preserve"> </w:t>
+      </w:r>
+      <w:r>
+        <w:t xml:space="preserve">-</w:t>
+      </w:r>
+      <w:r>
+        <w:t xml:space="preserve"> </w:t>
+      </w:r>
+      <w:r>
+        <w:rPr>
+          <w:b/>
+          <w:bCs/>
+        </w:rPr>
+        <w:t xml:space="preserve">Grading queue</w:t>
+      </w:r>
+      <w:r>
+        <w:t xml:space="preserve"> </w:t>
+      </w:r>
+      <w:r>
+        <w:t xml:space="preserve">— subjective answers awaiting a score →</w:t>
+      </w:r>
+      <w:r>
+        <w:t xml:space="preserve"> </w:t>
+      </w:r>
+      <w:r>
+        <w:rPr>
+          <w:rStyle w:val="VerbatimChar"/>
+        </w:rPr>
+        <w:t xml:space="preserve">POST /lms/v1/answers/{answerId}/grade { score }</w:t>
+      </w:r>
+      <w:r>
+        <w:t xml:space="preserve">.</w:t>
+      </w:r>
+      <w:r>
+        <w:t xml:space="preserve"> </w:t>
+      </w:r>
+      <w:r>
+        <w:t xml:space="preserve">-</w:t>
+      </w:r>
+      <w:r>
+        <w:t xml:space="preserve"> </w:t>
+      </w:r>
+      <w:r>
+        <w:rPr>
+          <w:b/>
+          <w:bCs/>
+        </w:rPr>
+        <w:t xml:space="preserve">Compute year</w:t>
+      </w:r>
+      <w:r>
+        <w:t xml:space="preserve"> </w:t>
+      </w:r>
+      <w:r>
+        <w:t xml:space="preserve">—</w:t>
+      </w:r>
+      <w:r>
+        <w:t xml:space="preserve"> </w:t>
+      </w:r>
+      <w:r>
+        <w:rPr>
+          <w:rStyle w:val="VerbatimChar"/>
+        </w:rPr>
+        <w:t xml:space="preserve">POST /lms/v1/progress/compute-year</w:t>
+      </w:r>
+      <w:r>
+        <w:t xml:space="preserve"> </w:t>
+      </w:r>
+      <w:r>
+        <w:t xml:space="preserve">recomputes year status from attendance + scores.</w:t>
+      </w:r>
+    </w:p>
+    <w:bookmarkEnd w:id="197"/>
+    <w:bookmarkStart w:id="198" w:name="certificates-lmscertificates"/>
+    <w:p>
+      <w:pPr>
+        <w:pStyle w:val="Heading2"/>
+      </w:pPr>
+      <w:r>
+        <w:t xml:space="preserve">22.7 Certificates (</w:t>
+      </w:r>
+      <w:r>
+        <w:rPr>
+          <w:rStyle w:val="VerbatimChar"/>
+        </w:rPr>
+        <w:t xml:space="preserve">/lms/certificates</w:t>
+      </w:r>
+      <w:r>
+        <w:t xml:space="preserve">)</w:t>
+      </w:r>
+    </w:p>
+    <w:p>
+      <w:pPr>
+        <w:pStyle w:val="Compact"/>
+        <w:numPr>
+          <w:ilvl w:val="0"/>
+          <w:numId w:val="1089"/>
+        </w:numPr>
+      </w:pPr>
+      <w:r>
+        <w:t xml:space="preserve">Loads</w:t>
+      </w:r>
+      <w:r>
+        <w:t xml:space="preserve"> </w:t>
+      </w:r>
+      <w:r>
+        <w:rPr>
+          <w:rStyle w:val="VerbatimChar"/>
+        </w:rPr>
+        <w:t xml:space="preserve">GET /lms/v1/certificates/for/{id}</w:t>
+      </w:r>
+      <w:r>
+        <w:t xml:space="preserve">. Each issued certificate shows year, name, cert no, status, and a PPO tag.</w:t>
+      </w:r>
+    </w:p>
+    <w:p>
+      <w:pPr>
+        <w:pStyle w:val="Compact"/>
+        <w:numPr>
+          <w:ilvl w:val="0"/>
+          <w:numId w:val="1089"/>
+        </w:numPr>
+      </w:pPr>
+      <w:r>
+        <w:rPr>
+          <w:b/>
+          <w:bCs/>
+        </w:rPr>
+        <w:t xml:space="preserve">View</w:t>
+      </w:r>
+      <w:r>
+        <w:t xml:space="preserve"> </w:t>
+      </w:r>
+      <w:r>
+        <w:t xml:space="preserve">— opens a</w:t>
+      </w:r>
+      <w:r>
+        <w:t xml:space="preserve"> </w:t>
+      </w:r>
+      <w:r>
+        <w:rPr>
+          <w:b/>
+          <w:bCs/>
+        </w:rPr>
+        <w:t xml:space="preserve">modal</w:t>
+      </w:r>
+      <w:r>
+        <w:t xml:space="preserve"> </w:t>
+      </w:r>
+      <w:r>
+        <w:t xml:space="preserve">rendering the certificate (holder name, credential, issued date, verify id</w:t>
+      </w:r>
+      <w:r>
+        <w:t xml:space="preserve"> </w:t>
+      </w:r>
+      <w:r>
+        <w:rPr>
+          <w:rStyle w:val="VerbatimChar"/>
+        </w:rPr>
+        <w:t xml:space="preserve">LARE-VER-####</w:t>
+      </w:r>
+      <w:r>
+        <w:t xml:space="preserve">).</w:t>
+      </w:r>
+    </w:p>
+    <w:p>
+      <w:pPr>
+        <w:pStyle w:val="Compact"/>
+        <w:numPr>
+          <w:ilvl w:val="0"/>
+          <w:numId w:val="1089"/>
+        </w:numPr>
+      </w:pPr>
+      <w:r>
+        <w:rPr>
+          <w:b/>
+          <w:bCs/>
+        </w:rPr>
+        <w:t xml:space="preserve">Print</w:t>
+      </w:r>
+      <w:r>
+        <w:t xml:space="preserve"> </w:t>
+      </w:r>
+      <w:r>
+        <w:t xml:space="preserve">— the browser print dialog for the certificate.</w:t>
+      </w:r>
+    </w:p>
+    <w:p>
+      <w:pPr>
+        <w:pStyle w:val="Compact"/>
+        <w:numPr>
+          <w:ilvl w:val="0"/>
+          <w:numId w:val="1089"/>
+        </w:numPr>
+      </w:pPr>
+      <w:r>
+        <w:rPr>
+          <w:b/>
+          <w:bCs/>
+        </w:rPr>
+        <w:t xml:space="preserve">Download PDF</w:t>
+      </w:r>
+      <w:r>
+        <w:t xml:space="preserve"> </w:t>
+      </w:r>
+      <w:r>
+        <w:t xml:space="preserve">—</w:t>
+      </w:r>
+      <w:r>
+        <w:t xml:space="preserve"> </w:t>
+      </w:r>
+      <w:r>
+        <w:rPr>
+          <w:rStyle w:val="VerbatimChar"/>
+        </w:rPr>
+        <w:t xml:space="preserve">GET /lms/v1/certificates/{id}/pdf</w:t>
+      </w:r>
+      <w:r>
+        <w:t xml:space="preserve">.</w:t>
+      </w:r>
+    </w:p>
+    <w:p>
+      <w:pPr>
+        <w:pStyle w:val="Compact"/>
+        <w:numPr>
+          <w:ilvl w:val="0"/>
+          <w:numId w:val="1089"/>
+        </w:numPr>
+      </w:pPr>
+      <w:r>
+        <w:rPr>
+          <w:b/>
+          <w:bCs/>
+        </w:rPr>
+        <w:t xml:space="preserve">Verify certificate</w:t>
+      </w:r>
+      <w:r>
+        <w:t xml:space="preserve"> </w:t>
+      </w:r>
+      <w:r>
+        <w:t xml:space="preserve">— opens the public verify page (</w:t>
+      </w:r>
+      <w:r>
+        <w:rPr>
+          <w:rStyle w:val="VerbatimChar"/>
+        </w:rPr>
+        <w:t xml:space="preserve">/verify/{verifyId}</w:t>
+      </w:r>
+      <w:r>
+        <w:t xml:space="preserve">) which asks for / accepts the readable id and renders the verified certificate.</w:t>
+      </w:r>
+    </w:p>
+    <w:bookmarkEnd w:id="198"/>
+    <w:bookmarkStart w:id="199" w:name="ai-tutor-lmstutor"/>
+    <w:p>
+      <w:pPr>
+        <w:pStyle w:val="Heading2"/>
+      </w:pPr>
+      <w:r>
+        <w:t xml:space="preserve">22.8 AI Tutor (</w:t>
+      </w:r>
+      <w:r>
+        <w:rPr>
+          <w:rStyle w:val="VerbatimChar"/>
+        </w:rPr>
+        <w:t xml:space="preserve">/lms/tutor</w:t>
+      </w:r>
+      <w:r>
+        <w:t xml:space="preserve">)</w:t>
+      </w:r>
+    </w:p>
+    <w:p>
+      <w:pPr>
+        <w:pStyle w:val="Compact"/>
+        <w:numPr>
+          <w:ilvl w:val="0"/>
+          <w:numId w:val="1090"/>
+        </w:numPr>
+      </w:pPr>
+      <w:r>
+        <w:t xml:space="preserve">A chat thread with a message composer;</w:t>
+      </w:r>
+      <w:r>
+        <w:t xml:space="preserve"> </w:t>
+      </w:r>
+      <w:r>
+        <w:rPr>
+          <w:b/>
+          <w:bCs/>
+        </w:rPr>
+        <w:t xml:space="preserve">Send</w:t>
+      </w:r>
+      <w:r>
+        <w:t xml:space="preserve"> </w:t>
+      </w:r>
+      <w:r>
+        <w:t xml:space="preserve">→</w:t>
+      </w:r>
+      <w:r>
+        <w:t xml:space="preserve"> </w:t>
+      </w:r>
+      <w:r>
+        <w:rPr>
+          <w:rStyle w:val="VerbatimChar"/>
+        </w:rPr>
+        <w:t xml:space="preserve">POST /ai/v1/tutor/chat { message, session_id, context }</w:t>
+      </w:r>
+      <w:r>
+        <w:t xml:space="preserve">. Sessions are listed (</w:t>
+      </w:r>
+      <w:r>
+        <w:rPr>
+          <w:rStyle w:val="VerbatimChar"/>
+        </w:rPr>
+        <w:t xml:space="preserve">GET /ai/v1/tutor/sessions</w:t>
+      </w:r>
+      <w:r>
+        <w:t xml:space="preserve">) and re-openable (</w:t>
+      </w:r>
+      <w:r>
+        <w:rPr>
+          <w:rStyle w:val="VerbatimChar"/>
+        </w:rPr>
+        <w:t xml:space="preserve">GET .../sessions/{sid}/messages</w:t>
+      </w:r>
+      <w:r>
+        <w:t xml:space="preserve">).</w:t>
+      </w:r>
+    </w:p>
+    <w:p>
+      <w:pPr>
+        <w:pStyle w:val="Compact"/>
+        <w:numPr>
+          <w:ilvl w:val="0"/>
+          <w:numId w:val="1090"/>
+        </w:numPr>
+      </w:pPr>
+      <w:r>
+        <w:rPr>
+          <w:b/>
+          <w:bCs/>
+        </w:rPr>
+        <w:t xml:space="preserve">Generate study plan</w:t>
+      </w:r>
+      <w:r>
+        <w:t xml:space="preserve"> </w:t>
+      </w:r>
+      <w:r>
+        <w:t xml:space="preserve">→</w:t>
+      </w:r>
+      <w:r>
+        <w:t xml:space="preserve"> </w:t>
+      </w:r>
+      <w:r>
+        <w:rPr>
+          <w:rStyle w:val="VerbatimChar"/>
+        </w:rPr>
+        <w:t xml:space="preserve">POST /ai/v1/tutor/study-plan { variables }</w:t>
+      </w:r>
+      <w:r>
+        <w:t xml:space="preserve"> </w:t>
+      </w:r>
+      <w:r>
+        <w:t xml:space="preserve">produces a structured plan (year, scorecard, weak areas, goal, hours). Markdown replies render via</w:t>
+      </w:r>
+      <w:r>
+        <w:t xml:space="preserve"> </w:t>
+      </w:r>
+      <w:r>
+        <w:rPr>
+          <w:rStyle w:val="VerbatimChar"/>
+        </w:rPr>
+        <w:t xml:space="preserve">lib/markdown.js</w:t>
+      </w:r>
+      <w:r>
+        <w:t xml:space="preserve">.</w:t>
+      </w:r>
+    </w:p>
+    <w:bookmarkEnd w:id="199"/>
+    <w:bookmarkStart w:id="200" w:name="drives-candidate-matched-opportunities"/>
+    <w:p>
+      <w:pPr>
+        <w:pStyle w:val="Heading2"/>
+      </w:pPr>
+      <w:r>
+        <w:t xml:space="preserve">22.9 Drives (candidate) &amp; Matched Opportunities</w:t>
+      </w:r>
+    </w:p>
+    <w:p>
+      <w:pPr>
+        <w:pStyle w:val="Compact"/>
+        <w:numPr>
+          <w:ilvl w:val="0"/>
+          <w:numId w:val="1091"/>
+        </w:numPr>
+      </w:pPr>
+      <w:r>
+        <w:rPr>
+          <w:b/>
+          <w:bCs/>
+        </w:rPr>
+        <w:t xml:space="preserve">Drives</w:t>
+      </w:r>
+      <w:r>
+        <w:t xml:space="preserve"> </w:t>
+      </w:r>
+      <w:r>
+        <w:t xml:space="preserve">(</w:t>
+      </w:r>
+      <w:r>
+        <w:rPr>
+          <w:rStyle w:val="VerbatimChar"/>
+        </w:rPr>
+        <w:t xml:space="preserve">/drive</w:t>
+      </w:r>
+      <w:r>
+        <w:t xml:space="preserve">) — open-drive cards (</w:t>
+      </w:r>
+      <w:r>
+        <w:rPr>
+          <w:rStyle w:val="VerbatimChar"/>
+        </w:rPr>
+        <w:t xml:space="preserve">GET /drive/v1/drives?status=open</w:t>
+      </w:r>
+      <w:r>
+        <w:t xml:space="preserve">);</w:t>
+      </w:r>
+      <w:r>
+        <w:t xml:space="preserve"> </w:t>
+      </w:r>
+      <w:r>
+        <w:rPr>
+          <w:b/>
+          <w:bCs/>
+        </w:rPr>
+        <w:t xml:space="preserve">View</w:t>
+      </w:r>
+      <w:r>
+        <w:t xml:space="preserve"> </w:t>
+      </w:r>
+      <w:r>
+        <w:t xml:space="preserve">and</w:t>
+      </w:r>
+      <w:r>
+        <w:t xml:space="preserve"> </w:t>
+      </w:r>
+      <w:r>
+        <w:rPr>
+          <w:b/>
+          <w:bCs/>
+        </w:rPr>
+        <w:t xml:space="preserve">Apply</w:t>
+      </w:r>
+      <w:r>
+        <w:t xml:space="preserve"> </w:t>
+      </w:r>
+      <w:r>
+        <w:t xml:space="preserve">(</w:t>
+      </w:r>
+      <w:r>
+        <w:rPr>
+          <w:rStyle w:val="VerbatimChar"/>
+        </w:rPr>
+        <w:t xml:space="preserve">POST /drive/v1/candidate/apply</w:t>
+      </w:r>
+      <w:r>
+        <w:t xml:space="preserve">).</w:t>
+      </w:r>
+    </w:p>
+    <w:p>
+      <w:pPr>
+        <w:pStyle w:val="Compact"/>
+        <w:numPr>
+          <w:ilvl w:val="0"/>
+          <w:numId w:val="1091"/>
+        </w:numPr>
+      </w:pPr>
+      <w:r>
+        <w:rPr>
+          <w:b/>
+          <w:bCs/>
+        </w:rPr>
+        <w:t xml:space="preserve">Matched Opportunities</w:t>
+      </w:r>
+      <w:r>
+        <w:t xml:space="preserve"> </w:t>
+      </w:r>
+      <w:r>
+        <w:t xml:space="preserve">(</w:t>
+      </w:r>
+      <w:r>
+        <w:rPr>
+          <w:rStyle w:val="VerbatimChar"/>
+        </w:rPr>
+        <w:t xml:space="preserve">/drive/opportunities</w:t>
+      </w:r>
+      <w:r>
+        <w:t xml:space="preserve">) —</w:t>
+      </w:r>
+      <w:r>
+        <w:t xml:space="preserve"> </w:t>
+      </w:r>
+      <w:r>
+        <w:rPr>
+          <w:rStyle w:val="VerbatimChar"/>
+        </w:rPr>
+        <w:t xml:space="preserve">GET /drive/v1/opportunities?candidate_id=…</w:t>
+      </w:r>
+      <w:r>
+        <w:t xml:space="preserve">; open drives ranked by skill match (match %, matched skills).</w:t>
+      </w:r>
+    </w:p>
+    <w:bookmarkEnd w:id="200"/>
+    <w:bookmarkStart w:id="201" w:name="authentication-public-pages"/>
+    <w:p>
+      <w:pPr>
+        <w:pStyle w:val="Heading2"/>
+      </w:pPr>
+      <w:r>
+        <w:t xml:space="preserve">22.10 Authentication &amp; public pages</w:t>
+      </w:r>
+    </w:p>
+    <w:p>
+      <w:pPr>
+        <w:pStyle w:val="Compact"/>
+        <w:numPr>
+          <w:ilvl w:val="0"/>
+          <w:numId w:val="1092"/>
+        </w:numPr>
+      </w:pPr>
+      <w:r>
+        <w:rPr>
+          <w:b/>
+          <w:bCs/>
+        </w:rPr>
+        <w:t xml:space="preserve">Landing</w:t>
+      </w:r>
+      <w:r>
+        <w:t xml:space="preserve"> </w:t>
+      </w:r>
+      <w:r>
+        <w:t xml:space="preserve">(</w:t>
+      </w:r>
+      <w:r>
+        <w:rPr>
+          <w:rStyle w:val="VerbatimChar"/>
+        </w:rPr>
+        <w:t xml:space="preserve">/</w:t>
+      </w:r>
+      <w:r>
+        <w:t xml:space="preserve">),</w:t>
+      </w:r>
+      <w:r>
+        <w:t xml:space="preserve"> </w:t>
+      </w:r>
+      <w:r>
+        <w:rPr>
+          <w:b/>
+          <w:bCs/>
+        </w:rPr>
+        <w:t xml:space="preserve">Login</w:t>
+      </w:r>
+      <w:r>
+        <w:t xml:space="preserve"> </w:t>
+      </w:r>
+      <w:r>
+        <w:t xml:space="preserve">(</w:t>
+      </w:r>
+      <w:r>
+        <w:rPr>
+          <w:rStyle w:val="VerbatimChar"/>
+        </w:rPr>
+        <w:t xml:space="preserve">/login</w:t>
+      </w:r>
+      <w:r>
+        <w:t xml:space="preserve">),</w:t>
+      </w:r>
+      <w:r>
+        <w:t xml:space="preserve"> </w:t>
+      </w:r>
+      <w:r>
+        <w:rPr>
+          <w:b/>
+          <w:bCs/>
+        </w:rPr>
+        <w:t xml:space="preserve">Register</w:t>
+      </w:r>
+      <w:r>
+        <w:t xml:space="preserve"> </w:t>
+      </w:r>
+      <w:r>
+        <w:t xml:space="preserve">(</w:t>
+      </w:r>
+      <w:r>
+        <w:rPr>
+          <w:rStyle w:val="VerbatimChar"/>
+        </w:rPr>
+        <w:t xml:space="preserve">/register</w:t>
+      </w:r>
+      <w:r>
+        <w:t xml:space="preserve">),</w:t>
+      </w:r>
+      <w:r>
+        <w:t xml:space="preserve"> </w:t>
+      </w:r>
+      <w:r>
+        <w:rPr>
+          <w:b/>
+          <w:bCs/>
+        </w:rPr>
+        <w:t xml:space="preserve">Forgot Password</w:t>
+      </w:r>
+      <w:r>
+        <w:t xml:space="preserve"> </w:t>
+      </w:r>
+      <w:r>
+        <w:t xml:space="preserve">(</w:t>
+      </w:r>
+      <w:r>
+        <w:rPr>
+          <w:rStyle w:val="VerbatimChar"/>
+        </w:rPr>
+        <w:t xml:space="preserve">/forgot-password</w:t>
+      </w:r>
+      <w:r>
+        <w:t xml:space="preserve">) — see section 9.A.</w:t>
+      </w:r>
+      <w:r>
+        <w:t xml:space="preserve"> </w:t>
+      </w:r>
+      <w:r>
+        <w:rPr>
+          <w:b/>
+          <w:bCs/>
+        </w:rPr>
+        <w:t xml:space="preserve">AuthLayout</w:t>
+      </w:r>
+      <w:r>
+        <w:t xml:space="preserve"> </w:t>
+      </w:r>
+      <w:r>
+        <w:t xml:space="preserve">frames them (brand panel + form).</w:t>
+      </w:r>
+    </w:p>
+    <w:p>
+      <w:pPr>
+        <w:pStyle w:val="Compact"/>
+        <w:numPr>
+          <w:ilvl w:val="0"/>
+          <w:numId w:val="1092"/>
+        </w:numPr>
+      </w:pPr>
+      <w:r>
+        <w:rPr>
+          <w:b/>
+          <w:bCs/>
+        </w:rPr>
+        <w:t xml:space="preserve">App Chooser</w:t>
+      </w:r>
+      <w:r>
+        <w:t xml:space="preserve"> </w:t>
+      </w:r>
+      <w:r>
+        <w:t xml:space="preserve">(</w:t>
+      </w:r>
+      <w:r>
+        <w:rPr>
+          <w:rStyle w:val="VerbatimChar"/>
+        </w:rPr>
+        <w:t xml:space="preserve">/apps</w:t>
+      </w:r>
+      <w:r>
+        <w:t xml:space="preserve">) — choose LARE Learn or LARE Hire (role-filtered).</w:t>
+      </w:r>
+    </w:p>
+    <w:p>
+      <w:pPr>
+        <w:pStyle w:val="Compact"/>
+        <w:numPr>
+          <w:ilvl w:val="0"/>
+          <w:numId w:val="1092"/>
+        </w:numPr>
+      </w:pPr>
+      <w:r>
+        <w:rPr>
+          <w:b/>
+          <w:bCs/>
+        </w:rPr>
+        <w:t xml:space="preserve">Attend Drive</w:t>
+      </w:r>
+      <w:r>
+        <w:t xml:space="preserve"> </w:t>
+      </w:r>
+      <w:r>
+        <w:t xml:space="preserve">(</w:t>
+      </w:r>
+      <w:r>
+        <w:rPr>
+          <w:rStyle w:val="VerbatimChar"/>
+        </w:rPr>
+        <w:t xml:space="preserve">/drive/attend</w:t>
+      </w:r>
+      <w:r>
+        <w:t xml:space="preserve">) — public, no-login attend + resume.</w:t>
+      </w:r>
+    </w:p>
+    <w:p>
+      <w:pPr>
+        <w:pStyle w:val="Compact"/>
+        <w:numPr>
+          <w:ilvl w:val="0"/>
+          <w:numId w:val="1092"/>
+        </w:numPr>
+      </w:pPr>
+      <w:r>
+        <w:rPr>
+          <w:b/>
+          <w:bCs/>
+        </w:rPr>
+        <w:t xml:space="preserve">Wallet Verify</w:t>
+      </w:r>
+      <w:r>
+        <w:t xml:space="preserve"> </w:t>
+      </w:r>
+      <w:r>
+        <w:t xml:space="preserve">(</w:t>
+      </w:r>
+      <w:r>
+        <w:rPr>
+          <w:rStyle w:val="VerbatimChar"/>
+        </w:rPr>
+        <w:t xml:space="preserve">/verify/wallet/:verifyId</w:t>
+      </w:r>
+      <w:r>
+        <w:t xml:space="preserve">) and</w:t>
+      </w:r>
+      <w:r>
+        <w:t xml:space="preserve"> </w:t>
+      </w:r>
+      <w:r>
+        <w:rPr>
+          <w:b/>
+          <w:bCs/>
+        </w:rPr>
+        <w:t xml:space="preserve">Certificate Verify</w:t>
+      </w:r>
+      <w:r>
+        <w:t xml:space="preserve"> </w:t>
+      </w:r>
+      <w:r>
+        <w:t xml:space="preserve">(</w:t>
+      </w:r>
+      <w:r>
+        <w:rPr>
+          <w:rStyle w:val="VerbatimChar"/>
+        </w:rPr>
+        <w:t xml:space="preserve">/verify/:verifyId</w:t>
+      </w:r>
+      <w:r>
+        <w:t xml:space="preserve">) — public verification (no auth).</w:t>
+      </w:r>
+    </w:p>
+    <w:bookmarkEnd w:id="201"/>
+    <w:bookmarkStart w:id="202" w:name="shared-components-1"/>
+    <w:p>
+      <w:pPr>
+        <w:pStyle w:val="Heading2"/>
+      </w:pPr>
+      <w:r>
+        <w:t xml:space="preserve">22.11 Shared components</w:t>
+      </w:r>
+    </w:p>
+    <w:p>
+      <w:pPr>
+        <w:pStyle w:val="Compact"/>
+        <w:numPr>
+          <w:ilvl w:val="0"/>
+          <w:numId w:val="1093"/>
+        </w:numPr>
+      </w:pPr>
+      <w:r>
+        <w:rPr>
+          <w:b/>
+          <w:bCs/>
+        </w:rPr>
+        <w:t xml:space="preserve">AppShell</w:t>
+      </w:r>
+      <w:r>
+        <w:t xml:space="preserve"> </w:t>
+      </w:r>
+      <w:r>
+        <w:t xml:space="preserve">(</w:t>
+      </w:r>
+      <w:r>
+        <w:rPr>
+          <w:rStyle w:val="VerbatimChar"/>
+        </w:rPr>
+        <w:t xml:space="preserve">components/layout/AppShell.jsx</w:t>
+      </w:r>
+      <w:r>
+        <w:t xml:space="preserve">) — the authenticated shell: top bar, a product/role-scoped sidebar (internally scrollable via</w:t>
+      </w:r>
+      <w:r>
+        <w:t xml:space="preserve"> </w:t>
+      </w:r>
+      <w:r>
+        <w:rPr>
+          <w:rStyle w:val="VerbatimChar"/>
+        </w:rPr>
+        <w:t xml:space="preserve">.sidebar-scroll</w:t>
+      </w:r>
+      <w:r>
+        <w:t xml:space="preserve">,</w:t>
+      </w:r>
+      <w:r>
+        <w:t xml:space="preserve"> </w:t>
+      </w:r>
+      <w:r>
+        <w:rPr>
+          <w:rStyle w:val="VerbatimChar"/>
+        </w:rPr>
+        <w:t xml:space="preserve">lg:sticky lg:top-0 lg:h-screen</w:t>
+      </w:r>
+      <w:r>
+        <w:t xml:space="preserve">), and the routed page area.</w:t>
+      </w:r>
+    </w:p>
+    <w:p>
+      <w:pPr>
+        <w:pStyle w:val="Compact"/>
+        <w:numPr>
+          <w:ilvl w:val="0"/>
+          <w:numId w:val="1093"/>
+        </w:numPr>
+      </w:pPr>
+      <w:r>
+        <w:rPr>
+          <w:b/>
+          <w:bCs/>
+        </w:rPr>
+        <w:t xml:space="preserve">ProctorBanner</w:t>
+      </w:r>
+      <w:r>
+        <w:t xml:space="preserve"> </w:t>
+      </w:r>
+      <w:r>
+        <w:t xml:space="preserve">(</w:t>
+      </w:r>
+      <w:r>
+        <w:rPr>
+          <w:rStyle w:val="VerbatimChar"/>
+        </w:rPr>
+        <w:t xml:space="preserve">components/ProctorBanner.jsx</w:t>
+      </w:r>
+      <w:r>
+        <w:t xml:space="preserve">) — the integrity banner shown on every answer-submission surface (assessments, coding practice, adaptive drill, practice worlds, lesson checks, exam). It surfaces monitoring status and, where wired, reports proctor events.</w:t>
+      </w:r>
+    </w:p>
+    <w:p>
+      <w:pPr>
+        <w:pStyle w:val="Compact"/>
+        <w:numPr>
+          <w:ilvl w:val="0"/>
+          <w:numId w:val="1093"/>
+        </w:numPr>
+      </w:pPr>
+      <w:r>
+        <w:rPr>
+          <w:b/>
+          <w:bCs/>
+        </w:rPr>
+        <w:t xml:space="preserve">LessonBlocks</w:t>
+      </w:r>
+      <w:r>
+        <w:t xml:space="preserve"> </w:t>
+      </w:r>
+      <w:r>
+        <w:t xml:space="preserve">(</w:t>
+      </w:r>
+      <w:r>
+        <w:rPr>
+          <w:rStyle w:val="VerbatimChar"/>
+        </w:rPr>
+        <w:t xml:space="preserve">components/LessonBlocks.jsx</w:t>
+      </w:r>
+      <w:r>
+        <w:t xml:space="preserve">) — renders the lesson block list:</w:t>
+      </w:r>
+      <w:r>
+        <w:t xml:space="preserve"> </w:t>
+      </w:r>
+      <w:r>
+        <w:rPr>
+          <w:rStyle w:val="VerbatimChar"/>
+        </w:rPr>
+        <w:t xml:space="preserve">text</w:t>
+      </w:r>
+      <w:r>
+        <w:t xml:space="preserve"> </w:t>
+      </w:r>
+      <w:r>
+        <w:t xml:space="preserve">(markdown + tables),</w:t>
+      </w:r>
+      <w:r>
+        <w:t xml:space="preserve"> </w:t>
+      </w:r>
+      <w:r>
+        <w:rPr>
+          <w:rStyle w:val="VerbatimChar"/>
+        </w:rPr>
+        <w:t xml:space="preserve">code</w:t>
+      </w:r>
+      <w:r>
+        <w:t xml:space="preserve"> </w:t>
+      </w:r>
+      <w:r>
+        <w:t xml:space="preserve">(syntax-styled with an optional note),</w:t>
+      </w:r>
+      <w:r>
+        <w:t xml:space="preserve"> </w:t>
+      </w:r>
+      <w:r>
+        <w:rPr>
+          <w:rStyle w:val="VerbatimChar"/>
+        </w:rPr>
+        <w:t xml:space="preserve">callout</w:t>
+      </w:r>
+      <w:r>
+        <w:t xml:space="preserve"> </w:t>
+      </w:r>
+      <w:r>
+        <w:t xml:space="preserve">(tip/info/warning), and</w:t>
+      </w:r>
+      <w:r>
+        <w:t xml:space="preserve"> </w:t>
+      </w:r>
+      <w:r>
+        <w:rPr>
+          <w:rStyle w:val="VerbatimChar"/>
+        </w:rPr>
+        <w:t xml:space="preserve">check</w:t>
+      </w:r>
+      <w:r>
+        <w:t xml:space="preserve"> </w:t>
+      </w:r>
+      <w:r>
+        <w:t xml:space="preserve">(an inline question graded via the provided</w:t>
+      </w:r>
+      <w:r>
+        <w:t xml:space="preserve"> </w:t>
+      </w:r>
+      <w:r>
+        <w:rPr>
+          <w:rStyle w:val="VerbatimChar"/>
+        </w:rPr>
+        <w:t xml:space="preserve">grade</w:t>
+      </w:r>
+      <w:r>
+        <w:t xml:space="preserve"> </w:t>
+      </w:r>
+      <w:r>
+        <w:t xml:space="preserve">callback, with correct/explanation feedback).</w:t>
+      </w:r>
+    </w:p>
+    <w:p>
+      <w:pPr>
+        <w:pStyle w:val="Compact"/>
+        <w:numPr>
+          <w:ilvl w:val="0"/>
+          <w:numId w:val="1093"/>
+        </w:numPr>
+      </w:pPr>
+      <w:r>
+        <w:rPr>
+          <w:b/>
+          <w:bCs/>
+        </w:rPr>
+        <w:t xml:space="preserve">Proctoring signals</w:t>
+      </w:r>
+      <w:r>
+        <w:t xml:space="preserve"> </w:t>
+      </w:r>
+      <w:r>
+        <w:t xml:space="preserve">(</w:t>
+      </w:r>
+      <w:r>
+        <w:rPr>
+          <w:rStyle w:val="VerbatimChar"/>
+        </w:rPr>
+        <w:t xml:space="preserve">lib/proctor.js</w:t>
+      </w:r>
+      <w:r>
+        <w:t xml:space="preserve">) —</w:t>
+      </w:r>
+      <w:r>
+        <w:t xml:space="preserve"> </w:t>
+      </w:r>
+      <w:r>
+        <w:rPr>
+          <w:rStyle w:val="VerbatimChar"/>
+        </w:rPr>
+        <w:t xml:space="preserve">attachProctoring({ onViolation })</w:t>
+      </w:r>
+      <w:r>
+        <w:t xml:space="preserve"> </w:t>
+      </w:r>
+      <w:r>
+        <w:t xml:space="preserve">listens for tab-switch / window-blur / visibility-change / fullscreen-exit / copy-paste / right-click / dev-tools signals;</w:t>
+      </w:r>
+      <w:r>
+        <w:t xml:space="preserve"> </w:t>
+      </w:r>
+      <w:r>
+        <w:rPr>
+          <w:rStyle w:val="VerbatimChar"/>
+        </w:rPr>
+        <w:t xml:space="preserve">SIGNAL_LABEL</w:t>
+      </w:r>
+      <w:r>
+        <w:t xml:space="preserve"> </w:t>
+      </w:r>
+      <w:r>
+        <w:t xml:space="preserve">maps each to a human label. Consumers accumulate flags toward the 5-flag auto-submit; the exam also posts each event to the anticheat service.</w:t>
+      </w:r>
+    </w:p>
+    <w:p>
+      <w:pPr>
+        <w:pStyle w:val="Compact"/>
+        <w:numPr>
+          <w:ilvl w:val="0"/>
+          <w:numId w:val="1093"/>
+        </w:numPr>
+      </w:pPr>
+      <w:r>
+        <w:rPr>
+          <w:b/>
+          <w:bCs/>
+        </w:rPr>
+        <w:t xml:space="preserve">UI primitives</w:t>
+      </w:r>
+      <w:r>
+        <w:t xml:space="preserve"> </w:t>
+      </w:r>
+      <w:r>
+        <w:t xml:space="preserve">(</w:t>
+      </w:r>
+      <w:r>
+        <w:rPr>
+          <w:rStyle w:val="VerbatimChar"/>
+        </w:rPr>
+        <w:t xml:space="preserve">components/ui/primitives.jsx</w:t>
+      </w:r>
+      <w:r>
+        <w:t xml:space="preserve">) —</w:t>
+      </w:r>
+      <w:r>
+        <w:t xml:space="preserve"> </w:t>
+      </w:r>
+      <w:r>
+        <w:rPr>
+          <w:rStyle w:val="VerbatimChar"/>
+        </w:rPr>
+        <w:t xml:space="preserve">Card</w:t>
+      </w:r>
+      <w:r>
+        <w:t xml:space="preserve">,</w:t>
+      </w:r>
+      <w:r>
+        <w:t xml:space="preserve"> </w:t>
+      </w:r>
+      <w:r>
+        <w:rPr>
+          <w:rStyle w:val="VerbatimChar"/>
+        </w:rPr>
+        <w:t xml:space="preserve">Button</w:t>
+      </w:r>
+      <w:r>
+        <w:t xml:space="preserve"> </w:t>
+      </w:r>
+      <w:r>
+        <w:t xml:space="preserve">(primary/secondary/ghost/amber;</w:t>
+      </w:r>
+      <w:r>
+        <w:t xml:space="preserve"> </w:t>
+      </w:r>
+      <w:r>
+        <w:rPr>
+          <w:rStyle w:val="VerbatimChar"/>
+        </w:rPr>
+        <w:t xml:space="preserve">as</w:t>
+      </w:r>
+      <w:r>
+        <w:t xml:space="preserve"> </w:t>
+      </w:r>
+      <w:r>
+        <w:t xml:space="preserve">polymorphism for links),</w:t>
+      </w:r>
+      <w:r>
+        <w:t xml:space="preserve"> </w:t>
+      </w:r>
+      <w:r>
+        <w:rPr>
+          <w:rStyle w:val="VerbatimChar"/>
+        </w:rPr>
+        <w:t xml:space="preserve">Badge</w:t>
+      </w:r>
+      <w:r>
+        <w:t xml:space="preserve"> </w:t>
+      </w:r>
+      <w:r>
+        <w:t xml:space="preserve">(brand/teal/amber/rose/slate),</w:t>
+      </w:r>
+      <w:r>
+        <w:t xml:space="preserve"> </w:t>
+      </w:r>
+      <w:r>
+        <w:rPr>
+          <w:rStyle w:val="VerbatimChar"/>
+        </w:rPr>
+        <w:t xml:space="preserve">Input</w:t>
+      </w:r>
+      <w:r>
+        <w:t xml:space="preserve">,</w:t>
+      </w:r>
+      <w:r>
+        <w:t xml:space="preserve"> </w:t>
+      </w:r>
+      <w:r>
+        <w:rPr>
+          <w:rStyle w:val="VerbatimChar"/>
+        </w:rPr>
+        <w:t xml:space="preserve">Field</w:t>
+      </w:r>
+      <w:r>
+        <w:t xml:space="preserve">,</w:t>
+      </w:r>
+      <w:r>
+        <w:t xml:space="preserve"> </w:t>
+      </w:r>
+      <w:r>
+        <w:rPr>
+          <w:rStyle w:val="VerbatimChar"/>
+        </w:rPr>
+        <w:t xml:space="preserve">XPBar</w:t>
+      </w:r>
+      <w:r>
+        <w:t xml:space="preserve">,</w:t>
+      </w:r>
+      <w:r>
+        <w:t xml:space="preserve"> </w:t>
+      </w:r>
+      <w:r>
+        <w:rPr>
+          <w:rStyle w:val="VerbatimChar"/>
+        </w:rPr>
+        <w:t xml:space="preserve">StatTile</w:t>
+      </w:r>
+      <w:r>
+        <w:t xml:space="preserve">.</w:t>
+      </w:r>
+      <w:r>
+        <w:t xml:space="preserve"> </w:t>
+      </w:r>
+      <w:r>
+        <w:rPr>
+          <w:b/>
+          <w:bCs/>
+        </w:rPr>
+        <w:t xml:space="preserve">States</w:t>
+      </w:r>
+      <w:r>
+        <w:t xml:space="preserve"> </w:t>
+      </w:r>
+      <w:r>
+        <w:t xml:space="preserve">(</w:t>
+      </w:r>
+      <w:r>
+        <w:rPr>
+          <w:rStyle w:val="VerbatimChar"/>
+        </w:rPr>
+        <w:t xml:space="preserve">states.jsx</w:t>
+      </w:r>
+      <w:r>
+        <w:t xml:space="preserve">) —</w:t>
+      </w:r>
+      <w:r>
+        <w:t xml:space="preserve"> </w:t>
+      </w:r>
+      <w:r>
+        <w:rPr>
+          <w:rStyle w:val="VerbatimChar"/>
+        </w:rPr>
+        <w:t xml:space="preserve">PageHeader</w:t>
+      </w:r>
+      <w:r>
+        <w:t xml:space="preserve">,</w:t>
+      </w:r>
+      <w:r>
+        <w:t xml:space="preserve"> </w:t>
+      </w:r>
+      <w:r>
+        <w:rPr>
+          <w:rStyle w:val="VerbatimChar"/>
+        </w:rPr>
+        <w:t xml:space="preserve">Loading</w:t>
+      </w:r>
+      <w:r>
+        <w:t xml:space="preserve">,</w:t>
+      </w:r>
+      <w:r>
+        <w:t xml:space="preserve"> </w:t>
+      </w:r>
+      <w:r>
+        <w:rPr>
+          <w:rStyle w:val="VerbatimChar"/>
+        </w:rPr>
+        <w:t xml:space="preserve">EmptyState</w:t>
+      </w:r>
+      <w:r>
+        <w:t xml:space="preserve">,</w:t>
+      </w:r>
+      <w:r>
+        <w:t xml:space="preserve"> </w:t>
+      </w:r>
+      <w:r>
+        <w:rPr>
+          <w:rStyle w:val="VerbatimChar"/>
+        </w:rPr>
+        <w:t xml:space="preserve">DataSource</w:t>
+      </w:r>
+      <w:r>
+        <w:t xml:space="preserve"> </w:t>
+      </w:r>
+      <w:r>
+        <w:t xml:space="preserve">(live/offline indicator).</w:t>
+      </w:r>
+    </w:p>
+    <w:p>
+      <w:r>
         <w:pict>
           <v:rect style="width:0;height:1.5pt" o:hralign="center" o:hrstd="t" o:hr="t"/>
         </w:pict>
@@ -34748,8 +37084,8 @@
         <w:t xml:space="preserve">End of document. Prepared for LARE Cloud Solutions - a unit of LARE Consulting &amp; Technology Pvt. Ltd.</w:t>
       </w:r>
     </w:p>
-    <w:bookmarkEnd w:id="190"/>
-    <w:bookmarkEnd w:id="191"/>
+    <w:bookmarkEnd w:id="202"/>
+    <w:bookmarkEnd w:id="203"/>
     <w:sectPr>
       <w:footnotePr>
         <w:numRestart w:val="eachSect"/>
@@ -35445,6 +37781,24 @@
     <w:abstractNumId w:val="991"/>
   </w:num>
   <w:num w:numId="1087">
+    <w:abstractNumId w:val="991"/>
+  </w:num>
+  <w:num w:numId="1088">
+    <w:abstractNumId w:val="991"/>
+  </w:num>
+  <w:num w:numId="1089">
+    <w:abstractNumId w:val="991"/>
+  </w:num>
+  <w:num w:numId="1090">
+    <w:abstractNumId w:val="991"/>
+  </w:num>
+  <w:num w:numId="1091">
+    <w:abstractNumId w:val="991"/>
+  </w:num>
+  <w:num w:numId="1092">
+    <w:abstractNumId w:val="991"/>
+  </w:num>
+  <w:num w:numId="1093">
     <w:abstractNumId w:val="991"/>
   </w:num>
 </w:numbering>

</xml_diff>

<commit_message>
docs: screen reference part 5 (Rounds, Question Bank, Tutor, Certificates - every button)
Co-Authored-By: Claude Opus 4.8 <noreply@anthropic.com>
</commit_message>
<xml_diff>
--- a/docs/LARE-Documentation.docx
+++ b/docs/LARE-Documentation.docx
@@ -37067,6 +37067,1880 @@
     </w:p>
     <w:p>
       <w:r>
+        <w:br w:type="page"/>
+      </w:r>
+    </w:p>
+    <w:bookmarkEnd w:id="202"/>
+    <w:bookmarkEnd w:id="203"/>
+    <w:bookmarkStart w:id="208" w:name="X93f6f6ba6971c9f0b6c0013765c2b6b16f82a37"/>
+    <w:p>
+      <w:pPr>
+        <w:pStyle w:val="Heading1"/>
+      </w:pPr>
+      <w:r>
+        <w:t xml:space="preserve">23. Detailed Screen Reference — Recruiter Rounds, Question Bank, Tutor, Certificates</w:t>
+      </w:r>
+    </w:p>
+    <w:bookmarkStart w:id="204" w:name="rounds-tab-every-control"/>
+    <w:p>
+      <w:pPr>
+        <w:pStyle w:val="Heading2"/>
+      </w:pPr>
+      <w:r>
+        <w:t xml:space="preserve">23.1 Rounds Tab — every control</w:t>
+      </w:r>
+    </w:p>
+    <w:p>
+      <w:pPr>
+        <w:pStyle w:val="FirstParagraph"/>
+      </w:pPr>
+      <w:r>
+        <w:t xml:space="preserve">Loads the pipeline (</w:t>
+      </w:r>
+      <w:r>
+        <w:rPr>
+          <w:rStyle w:val="VerbatimChar"/>
+        </w:rPr>
+        <w:t xml:space="preserve">GET .../workflow</w:t>
+      </w:r>
+      <w:r>
+        <w:t xml:space="preserve">) and the selected round’s scores (</w:t>
+      </w:r>
+      <w:r>
+        <w:rPr>
+          <w:rStyle w:val="VerbatimChar"/>
+        </w:rPr>
+        <w:t xml:space="preserve">GET .../rounds/{order}/scores</w:t>
+      </w:r>
+      <w:r>
+        <w:t xml:space="preserve">).</w:t>
+      </w:r>
+      <w:r>
+        <w:t xml:space="preserve"> </w:t>
+      </w:r>
+      <w:r>
+        <w:t xml:space="preserve">-</w:t>
+      </w:r>
+      <w:r>
+        <w:t xml:space="preserve"> </w:t>
+      </w:r>
+      <w:r>
+        <w:rPr>
+          <w:b/>
+          <w:bCs/>
+        </w:rPr>
+        <w:t xml:space="preserve">Round selector buttons</w:t>
+      </w:r>
+      <w:r>
+        <w:t xml:space="preserve"> </w:t>
+      </w:r>
+      <w:r>
+        <w:t xml:space="preserve">— one per pipeline round (</w:t>
+      </w:r>
+      <w:r>
+        <w:t xml:space="preserve">“1. Round 1”</w:t>
+      </w:r>
+      <w:r>
+        <w:t xml:space="preserve">,</w:t>
+      </w:r>
+      <w:r>
+        <w:t xml:space="preserve"> </w:t>
+      </w:r>
+      <w:r>
+        <w:t xml:space="preserve">“(opt)”</w:t>
+      </w:r>
+      <w:r>
+        <w:t xml:space="preserve"> </w:t>
+      </w:r>
+      <w:r>
+        <w:t xml:space="preserve">for optional); clicking sets the active round.</w:t>
+      </w:r>
+      <w:r>
+        <w:t xml:space="preserve"> </w:t>
+      </w:r>
+      <w:r>
+        <w:t xml:space="preserve">-</w:t>
+      </w:r>
+      <w:r>
+        <w:t xml:space="preserve"> </w:t>
+      </w:r>
+      <w:r>
+        <w:rPr>
+          <w:b/>
+          <w:bCs/>
+        </w:rPr>
+        <w:t xml:space="preserve">Marks sheet header</w:t>
+      </w:r>
+      <w:r>
+        <w:t xml:space="preserve"> </w:t>
+      </w:r>
+      <w:r>
+        <w:t xml:space="preserve">— round label; helper text differs for written (auto-analysed) vs. panel rounds.</w:t>
+      </w:r>
+      <w:r>
+        <w:t xml:space="preserve"> </w:t>
+      </w:r>
+      <w:r>
+        <w:t xml:space="preserve">-</w:t>
+      </w:r>
+      <w:r>
+        <w:t xml:space="preserve"> </w:t>
+      </w:r>
+      <w:r>
+        <w:rPr>
+          <w:b/>
+          <w:bCs/>
+        </w:rPr>
+        <w:t xml:space="preserve">Button: Export all</w:t>
+      </w:r>
+      <w:r>
+        <w:t xml:space="preserve"> </w:t>
+      </w:r>
+      <w:r>
+        <w:t xml:space="preserve">→</w:t>
+      </w:r>
+      <w:r>
+        <w:t xml:space="preserve"> </w:t>
+      </w:r>
+      <w:r>
+        <w:rPr>
+          <w:rStyle w:val="VerbatimChar"/>
+        </w:rPr>
+        <w:t xml:space="preserve">downloadRoundXlsx(id, order, false)</w:t>
+      </w:r>
+      <w:r>
+        <w:t xml:space="preserve"> </w:t>
+      </w:r>
+      <w:r>
+        <w:t xml:space="preserve">(</w:t>
+      </w:r>
+      <w:r>
+        <w:rPr>
+          <w:rStyle w:val="VerbatimChar"/>
+        </w:rPr>
+        <w:t xml:space="preserve">.xlsx</w:t>
+      </w:r>
+      <w:r>
+        <w:t xml:space="preserve">; disabled while preparing or if empty).</w:t>
+      </w:r>
+      <w:r>
+        <w:t xml:space="preserve"> </w:t>
+      </w:r>
+      <w:r>
+        <w:t xml:space="preserve">-</w:t>
+      </w:r>
+      <w:r>
+        <w:t xml:space="preserve"> </w:t>
+      </w:r>
+      <w:r>
+        <w:rPr>
+          <w:b/>
+          <w:bCs/>
+        </w:rPr>
+        <w:t xml:space="preserve">Button: Export cleared</w:t>
+      </w:r>
+      <w:r>
+        <w:t xml:space="preserve"> </w:t>
+      </w:r>
+      <w:r>
+        <w:t xml:space="preserve">→</w:t>
+      </w:r>
+      <w:r>
+        <w:t xml:space="preserve"> </w:t>
+      </w:r>
+      <w:r>
+        <w:rPr>
+          <w:rStyle w:val="VerbatimChar"/>
+        </w:rPr>
+        <w:t xml:space="preserve">downloadRoundXlsx(id, order, true)</w:t>
+      </w:r>
+      <w:r>
+        <w:t xml:space="preserve">.</w:t>
+      </w:r>
+      <w:r>
+        <w:t xml:space="preserve"> </w:t>
+      </w:r>
+      <w:r>
+        <w:t xml:space="preserve">-</w:t>
+      </w:r>
+      <w:r>
+        <w:t xml:space="preserve"> </w:t>
+      </w:r>
+      <w:r>
+        <w:rPr>
+          <w:b/>
+          <w:bCs/>
+        </w:rPr>
+        <w:t xml:space="preserve">Button: Delete round</w:t>
+      </w:r>
+      <w:r>
+        <w:t xml:space="preserve"> </w:t>
+      </w:r>
+      <w:r>
+        <w:t xml:space="preserve">(ghost, rose; disabled if only one round) → confirm →</w:t>
+      </w:r>
+      <w:r>
+        <w:t xml:space="preserve"> </w:t>
+      </w:r>
+      <w:r>
+        <w:rPr>
+          <w:rStyle w:val="VerbatimChar"/>
+        </w:rPr>
+        <w:t xml:space="preserve">DELETE .../rounds/{order}</w:t>
+      </w:r>
+      <w:r>
+        <w:t xml:space="preserve">; later rounds shift up; refreshes workflow.</w:t>
+      </w:r>
+      <w:r>
+        <w:t xml:space="preserve"> </w:t>
+      </w:r>
+      <w:r>
+        <w:t xml:space="preserve">-</w:t>
+      </w:r>
+      <w:r>
+        <w:t xml:space="preserve"> </w:t>
+      </w:r>
+      <w:r>
+        <w:rPr>
+          <w:b/>
+          <w:bCs/>
+        </w:rPr>
+        <w:t xml:space="preserve">Button: Publish round</w:t>
+      </w:r>
+      <w:r>
+        <w:t xml:space="preserve"> </w:t>
+      </w:r>
+      <w:r>
+        <w:t xml:space="preserve">(amber) → confirm dialog stating how many cleared advance and that the rest are rejected →</w:t>
+      </w:r>
+      <w:r>
+        <w:t xml:space="preserve"> </w:t>
+      </w:r>
+      <w:r>
+        <w:rPr>
+          <w:rStyle w:val="VerbatimChar"/>
+        </w:rPr>
+        <w:t xml:space="preserve">POST .../rounds/{order}/publish</w:t>
+      </w:r>
+      <w:r>
+        <w:t xml:space="preserve">; flash reports</w:t>
+      </w:r>
+      <w:r>
+        <w:t xml:space="preserve"> </w:t>
+      </w:r>
+      <w:r>
+        <w:t xml:space="preserve">“advanced to round N”</w:t>
+      </w:r>
+      <w:r>
+        <w:t xml:space="preserve"> </w:t>
+      </w:r>
+      <w:r>
+        <w:t xml:space="preserve">or</w:t>
+      </w:r>
+      <w:r>
+        <w:t xml:space="preserve"> </w:t>
+      </w:r>
+      <w:r>
+        <w:t xml:space="preserve">“Final round — N selected”</w:t>
+      </w:r>
+      <w:r>
+        <w:t xml:space="preserve">.</w:t>
+      </w:r>
+      <w:r>
+        <w:t xml:space="preserve"> </w:t>
+      </w:r>
+      <w:r>
+        <w:t xml:space="preserve">-</w:t>
+      </w:r>
+      <w:r>
+        <w:t xml:space="preserve"> </w:t>
+      </w:r>
+      <w:r>
+        <w:rPr>
+          <w:b/>
+          <w:bCs/>
+        </w:rPr>
+        <w:t xml:space="preserve">Search box</w:t>
+      </w:r>
+      <w:r>
+        <w:t xml:space="preserve"> </w:t>
+      </w:r>
+      <w:r>
+        <w:t xml:space="preserve">(name/email/roll) and a</w:t>
+      </w:r>
+      <w:r>
+        <w:t xml:space="preserve"> </w:t>
+      </w:r>
+      <w:r>
+        <w:rPr>
+          <w:b/>
+          <w:bCs/>
+        </w:rPr>
+        <w:t xml:space="preserve">filter select</w:t>
+      </w:r>
+      <w:r>
+        <w:t xml:space="preserve"> </w:t>
+      </w:r>
+      <w:r>
+        <w:t xml:space="preserve">(All / Cleared only / not-cleared).</w:t>
+      </w:r>
+      <w:r>
+        <w:t xml:space="preserve"> </w:t>
+      </w:r>
+      <w:r>
+        <w:t xml:space="preserve">-</w:t>
+      </w:r>
+      <w:r>
+        <w:t xml:space="preserve"> </w:t>
+      </w:r>
+      <w:r>
+        <w:rPr>
+          <w:b/>
+          <w:bCs/>
+        </w:rPr>
+        <w:t xml:space="preserve">Per-row inline controls</w:t>
+      </w:r>
+      <w:r>
+        <w:t xml:space="preserve"> </w:t>
+      </w:r>
+      <w:r>
+        <w:t xml:space="preserve">— editable</w:t>
+      </w:r>
+      <w:r>
+        <w:t xml:space="preserve"> </w:t>
+      </w:r>
+      <w:r>
+        <w:rPr>
+          <w:b/>
+          <w:bCs/>
+        </w:rPr>
+        <w:t xml:space="preserve">marks</w:t>
+      </w:r>
+      <w:r>
+        <w:t xml:space="preserve"> </w:t>
+      </w:r>
+      <w:r>
+        <w:t xml:space="preserve">and</w:t>
+      </w:r>
+      <w:r>
+        <w:t xml:space="preserve"> </w:t>
+      </w:r>
+      <w:r>
+        <w:rPr>
+          <w:b/>
+          <w:bCs/>
+        </w:rPr>
+        <w:t xml:space="preserve">remarks</w:t>
+      </w:r>
+      <w:r>
+        <w:t xml:space="preserve"> </w:t>
+      </w:r>
+      <w:r>
+        <w:t xml:space="preserve">(saved via</w:t>
+      </w:r>
+      <w:r>
+        <w:t xml:space="preserve"> </w:t>
+      </w:r>
+      <w:r>
+        <w:rPr>
+          <w:rStyle w:val="VerbatimChar"/>
+        </w:rPr>
+        <w:t xml:space="preserve">POST .../scores { candidate_id, marks, remarks, cleared }</w:t>
+      </w:r>
+      <w:r>
+        <w:t xml:space="preserve">, optimistic), a</w:t>
+      </w:r>
+      <w:r>
+        <w:t xml:space="preserve"> </w:t>
+      </w:r>
+      <w:r>
+        <w:rPr>
+          <w:b/>
+          <w:bCs/>
+        </w:rPr>
+        <w:t xml:space="preserve">cleared</w:t>
+      </w:r>
+      <w:r>
+        <w:t xml:space="preserve"> </w:t>
+      </w:r>
+      <w:r>
+        <w:t xml:space="preserve">toggle,</w:t>
+      </w:r>
+      <w:r>
+        <w:t xml:space="preserve"> </w:t>
+      </w:r>
+      <w:r>
+        <w:rPr>
+          <w:b/>
+          <w:bCs/>
+        </w:rPr>
+        <w:t xml:space="preserve">remove</w:t>
+      </w:r>
+      <w:r>
+        <w:t xml:space="preserve"> </w:t>
+      </w:r>
+      <w:r>
+        <w:t xml:space="preserve">(</w:t>
+      </w:r>
+      <w:r>
+        <w:rPr>
+          <w:rStyle w:val="VerbatimChar"/>
+        </w:rPr>
+        <w:t xml:space="preserve">DELETE .../candidates/{cid}</w:t>
+      </w:r>
+      <w:r>
+        <w:t xml:space="preserve">).</w:t>
+      </w:r>
+      <w:r>
+        <w:t xml:space="preserve"> </w:t>
+      </w:r>
+      <w:r>
+        <w:t xml:space="preserve">-</w:t>
+      </w:r>
+      <w:r>
+        <w:t xml:space="preserve"> </w:t>
+      </w:r>
+      <w:r>
+        <w:rPr>
+          <w:b/>
+          <w:bCs/>
+        </w:rPr>
+        <w:t xml:space="preserve">Add referred candidate</w:t>
+      </w:r>
+      <w:r>
+        <w:t xml:space="preserve"> </w:t>
+      </w:r>
+      <w:r>
+        <w:t xml:space="preserve">— an id input +</w:t>
+      </w:r>
+      <w:r>
+        <w:t xml:space="preserve"> </w:t>
+      </w:r>
+      <w:r>
+        <w:rPr>
+          <w:b/>
+          <w:bCs/>
+        </w:rPr>
+        <w:t xml:space="preserve">Add</w:t>
+      </w:r>
+      <w:r>
+        <w:t xml:space="preserve"> </w:t>
+      </w:r>
+      <w:r>
+        <w:t xml:space="preserve">(</w:t>
+      </w:r>
+      <w:r>
+        <w:rPr>
+          <w:rStyle w:val="VerbatimChar"/>
+        </w:rPr>
+        <w:t xml:space="preserve">POST .../rounds/{order}/candidates</w:t>
+      </w:r>
+      <w:r>
+        <w:t xml:space="preserve">).</w:t>
+      </w:r>
+    </w:p>
+    <w:bookmarkEnd w:id="204"/>
+    <w:bookmarkStart w:id="205" w:name="question-bank-every-control"/>
+    <w:p>
+      <w:pPr>
+        <w:pStyle w:val="Heading2"/>
+      </w:pPr>
+      <w:r>
+        <w:t xml:space="preserve">23.2 Question Bank — every control</w:t>
+      </w:r>
+    </w:p>
+    <w:p>
+      <w:pPr>
+        <w:pStyle w:val="FirstParagraph"/>
+      </w:pPr>
+      <w:r>
+        <w:t xml:space="preserve">Three panes:</w:t>
+      </w:r>
+      <w:r>
+        <w:t xml:space="preserve"> </w:t>
+      </w:r>
+      <w:r>
+        <w:rPr>
+          <w:b/>
+          <w:bCs/>
+        </w:rPr>
+        <w:t xml:space="preserve">Author question</w:t>
+      </w:r>
+      <w:r>
+        <w:t xml:space="preserve">,</w:t>
+      </w:r>
+      <w:r>
+        <w:t xml:space="preserve"> </w:t>
+      </w:r>
+      <w:r>
+        <w:rPr>
+          <w:b/>
+          <w:bCs/>
+        </w:rPr>
+        <w:t xml:space="preserve">Build exam</w:t>
+      </w:r>
+      <w:r>
+        <w:t xml:space="preserve">,</w:t>
+      </w:r>
+      <w:r>
+        <w:t xml:space="preserve"> </w:t>
+      </w:r>
+      <w:r>
+        <w:rPr>
+          <w:b/>
+          <w:bCs/>
+        </w:rPr>
+        <w:t xml:space="preserve">Questions list</w:t>
+      </w:r>
+      <w:r>
+        <w:t xml:space="preserve">, plus</w:t>
+      </w:r>
+      <w:r>
+        <w:t xml:space="preserve"> </w:t>
+      </w:r>
+      <w:r>
+        <w:rPr>
+          <w:b/>
+          <w:bCs/>
+        </w:rPr>
+        <w:t xml:space="preserve">Paper viewer</w:t>
+      </w:r>
+      <w:r>
+        <w:t xml:space="preserve">.</w:t>
+      </w:r>
+    </w:p>
+    <w:p>
+      <w:pPr>
+        <w:pStyle w:val="BodyText"/>
+      </w:pPr>
+      <w:r>
+        <w:rPr>
+          <w:b/>
+          <w:bCs/>
+        </w:rPr>
+        <w:t xml:space="preserve">Author question (left)</w:t>
+      </w:r>
+      <w:r>
+        <w:t xml:space="preserve"> </w:t>
+      </w:r>
+      <w:r>
+        <w:t xml:space="preserve">-</w:t>
+      </w:r>
+      <w:r>
+        <w:t xml:space="preserve"> </w:t>
+      </w:r>
+      <w:r>
+        <w:rPr>
+          <w:b/>
+          <w:bCs/>
+        </w:rPr>
+        <w:t xml:space="preserve">Selects</w:t>
+      </w:r>
+      <w:r>
+        <w:t xml:space="preserve">: type (mcq/multi/coding/sql), category (aptitude/technical/verbal/programming), difficulty (easy/medium/hard).</w:t>
+      </w:r>
+      <w:r>
+        <w:t xml:space="preserve"> </w:t>
+      </w:r>
+      <w:r>
+        <w:t xml:space="preserve">-</w:t>
+      </w:r>
+      <w:r>
+        <w:t xml:space="preserve"> </w:t>
+      </w:r>
+      <w:r>
+        <w:rPr>
+          <w:b/>
+          <w:bCs/>
+        </w:rPr>
+        <w:t xml:space="preserve">Question stem</w:t>
+      </w:r>
+      <w:r>
+        <w:t xml:space="preserve"> </w:t>
+      </w:r>
+      <w:r>
+        <w:t xml:space="preserve">textarea.</w:t>
+      </w:r>
+      <w:r>
+        <w:t xml:space="preserve"> </w:t>
+      </w:r>
+      <w:r>
+        <w:t xml:space="preserve">-</w:t>
+      </w:r>
+      <w:r>
+        <w:t xml:space="preserve"> </w:t>
+      </w:r>
+      <w:r>
+        <w:rPr>
+          <w:b/>
+          <w:bCs/>
+        </w:rPr>
+        <w:t xml:space="preserve">Options</w:t>
+      </w:r>
+      <w:r>
+        <w:t xml:space="preserve"> </w:t>
+      </w:r>
+      <w:r>
+        <w:t xml:space="preserve">(MCQ) — a</w:t>
+      </w:r>
+      <w:r>
+        <w:t xml:space="preserve"> </w:t>
+      </w:r>
+      <w:r>
+        <w:rPr>
+          <w:b/>
+          <w:bCs/>
+        </w:rPr>
+        <w:t xml:space="preserve">correct-answer radio</w:t>
+      </w:r>
+      <w:r>
+        <w:t xml:space="preserve"> </w:t>
+      </w:r>
+      <w:r>
+        <w:t xml:space="preserve">per option, an option text input, a</w:t>
+      </w:r>
+      <w:r>
+        <w:t xml:space="preserve"> </w:t>
+      </w:r>
+      <w:r>
+        <w:rPr>
+          <w:b/>
+          <w:bCs/>
+        </w:rPr>
+        <w:t xml:space="preserve">remove</w:t>
+      </w:r>
+      <w:r>
+        <w:t xml:space="preserve"> </w:t>
+      </w:r>
+      <w:r>
+        <w:t xml:space="preserve">(trash) per option when &gt;2, and</w:t>
+      </w:r>
+      <w:r>
+        <w:t xml:space="preserve"> </w:t>
+      </w:r>
+      <w:r>
+        <w:rPr>
+          <w:b/>
+          <w:bCs/>
+        </w:rPr>
+        <w:t xml:space="preserve">Add option</w:t>
+      </w:r>
+      <w:r>
+        <w:t xml:space="preserve"> </w:t>
+      </w:r>
+      <w:r>
+        <w:t xml:space="preserve">(up to 4).</w:t>
+      </w:r>
+      <w:r>
+        <w:t xml:space="preserve"> </w:t>
+      </w:r>
+      <w:r>
+        <w:t xml:space="preserve">-</w:t>
+      </w:r>
+      <w:r>
+        <w:t xml:space="preserve"> </w:t>
+      </w:r>
+      <w:r>
+        <w:rPr>
+          <w:b/>
+          <w:bCs/>
+        </w:rPr>
+        <w:t xml:space="preserve">Button: Add question</w:t>
+      </w:r>
+      <w:r>
+        <w:t xml:space="preserve"> </w:t>
+      </w:r>
+      <w:r>
+        <w:t xml:space="preserve">→</w:t>
+      </w:r>
+      <w:r>
+        <w:t xml:space="preserve"> </w:t>
+      </w:r>
+      <w:r>
+        <w:rPr>
+          <w:rStyle w:val="VerbatimChar"/>
+        </w:rPr>
+        <w:t xml:space="preserve">POST /drive/v1/questions</w:t>
+      </w:r>
+      <w:r>
+        <w:t xml:space="preserve"> </w:t>
+      </w:r>
+      <w:r>
+        <w:t xml:space="preserve">(falls back to a local draft on error); prepends to the list.</w:t>
+      </w:r>
+    </w:p>
+    <w:p>
+      <w:pPr>
+        <w:pStyle w:val="BodyText"/>
+      </w:pPr>
+      <w:r>
+        <w:rPr>
+          <w:b/>
+          <w:bCs/>
+        </w:rPr>
+        <w:t xml:space="preserve">Build exam (direct authoring → exam + eval key)</w:t>
+      </w:r>
+      <w:r>
+        <w:t xml:space="preserve"> </w:t>
+      </w:r>
+      <w:r>
+        <w:t xml:space="preserve">-</w:t>
+      </w:r>
+      <w:r>
+        <w:t xml:space="preserve"> </w:t>
+      </w:r>
+      <w:r>
+        <w:rPr>
+          <w:b/>
+          <w:bCs/>
+        </w:rPr>
+        <w:t xml:space="preserve">Inputs</w:t>
+      </w:r>
+      <w:r>
+        <w:t xml:space="preserve">: Exam title, Time (min), Pass %.</w:t>
+      </w:r>
+      <w:r>
+        <w:t xml:space="preserve"> </w:t>
+      </w:r>
+      <w:r>
+        <w:t xml:space="preserve">-</w:t>
+      </w:r>
+      <w:r>
+        <w:t xml:space="preserve"> </w:t>
+      </w:r>
+      <w:r>
+        <w:rPr>
+          <w:b/>
+          <w:bCs/>
+        </w:rPr>
+        <w:t xml:space="preserve">Attach to drive</w:t>
+      </w:r>
+      <w:r>
+        <w:t xml:space="preserve"> </w:t>
+      </w:r>
+      <w:r>
+        <w:t xml:space="preserve">select (</w:t>
+      </w:r>
+      <w:r>
+        <w:rPr>
+          <w:rStyle w:val="VerbatimChar"/>
+        </w:rPr>
+        <w:t xml:space="preserve">DriveSelect</w:t>
+      </w:r>
+      <w:r>
+        <w:t xml:space="preserve">) — applicants only see the test once attached.</w:t>
+      </w:r>
+      <w:r>
+        <w:t xml:space="preserve"> </w:t>
+      </w:r>
+      <w:r>
+        <w:t xml:space="preserve">- Per</w:t>
+      </w:r>
+      <w:r>
+        <w:t xml:space="preserve"> </w:t>
+      </w:r>
+      <w:r>
+        <w:rPr>
+          <w:b/>
+          <w:bCs/>
+        </w:rPr>
+        <w:t xml:space="preserve">section</w:t>
+      </w:r>
+      <w:r>
+        <w:t xml:space="preserve">: an editable</w:t>
+      </w:r>
+      <w:r>
+        <w:t xml:space="preserve"> </w:t>
+      </w:r>
+      <w:r>
+        <w:rPr>
+          <w:b/>
+          <w:bCs/>
+        </w:rPr>
+        <w:t xml:space="preserve">section title</w:t>
+      </w:r>
+      <w:r>
+        <w:t xml:space="preserve">, a</w:t>
+      </w:r>
+      <w:r>
+        <w:t xml:space="preserve"> </w:t>
+      </w:r>
+      <w:r>
+        <w:rPr>
+          <w:b/>
+          <w:bCs/>
+        </w:rPr>
+        <w:t xml:space="preserve">remove-section</w:t>
+      </w:r>
+      <w:r>
+        <w:t xml:space="preserve"> </w:t>
+      </w:r>
+      <w:r>
+        <w:t xml:space="preserve">trash (when &gt;1), and per-question editing:</w:t>
+      </w:r>
+      <w:r>
+        <w:t xml:space="preserve"> </w:t>
+      </w:r>
+      <w:r>
+        <w:t xml:space="preserve">-</w:t>
+      </w:r>
+      <w:r>
+        <w:t xml:space="preserve"> </w:t>
+      </w:r>
+      <w:r>
+        <w:rPr>
+          <w:b/>
+          <w:bCs/>
+        </w:rPr>
+        <w:t xml:space="preserve">Button: MCQ</w:t>
+      </w:r>
+      <w:r>
+        <w:t xml:space="preserve"> </w:t>
+      </w:r>
+      <w:r>
+        <w:t xml:space="preserve">(adds a blank MCQ) and</w:t>
+      </w:r>
+      <w:r>
+        <w:t xml:space="preserve"> </w:t>
+      </w:r>
+      <w:r>
+        <w:rPr>
+          <w:b/>
+          <w:bCs/>
+        </w:rPr>
+        <w:t xml:space="preserve">Button: Coding</w:t>
+      </w:r>
+      <w:r>
+        <w:t xml:space="preserve"> </w:t>
+      </w:r>
+      <w:r>
+        <w:t xml:space="preserve">(adds a blank coding question).</w:t>
+      </w:r>
+      <w:r>
+        <w:t xml:space="preserve"> </w:t>
+      </w:r>
+      <w:r>
+        <w:t xml:space="preserve">- MCQ question — stem, options with a</w:t>
+      </w:r>
+      <w:r>
+        <w:t xml:space="preserve"> </w:t>
+      </w:r>
+      <w:r>
+        <w:rPr>
+          <w:b/>
+          <w:bCs/>
+        </w:rPr>
+        <w:t xml:space="preserve">correct radio</w:t>
+      </w:r>
+      <w:r>
+        <w:t xml:space="preserve">,</w:t>
+      </w:r>
+      <w:r>
+        <w:t xml:space="preserve"> </w:t>
+      </w:r>
+      <w:r>
+        <w:rPr>
+          <w:b/>
+          <w:bCs/>
+        </w:rPr>
+        <w:t xml:space="preserve">Add option</w:t>
+      </w:r>
+      <w:r>
+        <w:t xml:space="preserve">, per-option remove.</w:t>
+      </w:r>
+      <w:r>
+        <w:t xml:space="preserve"> </w:t>
+      </w:r>
+      <w:r>
+        <w:t xml:space="preserve">- Coding question — stem,</w:t>
+      </w:r>
+      <w:r>
+        <w:t xml:space="preserve"> </w:t>
+      </w:r>
+      <w:r>
+        <w:rPr>
+          <w:b/>
+          <w:bCs/>
+        </w:rPr>
+        <w:t xml:space="preserve">Sample cases</w:t>
+      </w:r>
+      <w:r>
+        <w:t xml:space="preserve"> </w:t>
+      </w:r>
+      <w:r>
+        <w:t xml:space="preserve">(input/expected, shown to students) with</w:t>
+      </w:r>
+      <w:r>
+        <w:t xml:space="preserve"> </w:t>
+      </w:r>
+      <w:r>
+        <w:rPr>
+          <w:b/>
+          <w:bCs/>
+        </w:rPr>
+        <w:t xml:space="preserve">Add sample</w:t>
+      </w:r>
+      <w:r>
+        <w:t xml:space="preserve">;</w:t>
+      </w:r>
+      <w:r>
+        <w:t xml:space="preserve"> </w:t>
+      </w:r>
+      <w:r>
+        <w:rPr>
+          <w:b/>
+          <w:bCs/>
+        </w:rPr>
+        <w:t xml:space="preserve">Hidden cases</w:t>
+      </w:r>
+      <w:r>
+        <w:t xml:space="preserve"> </w:t>
+      </w:r>
+      <w:r>
+        <w:t xml:space="preserve">(grading-only, never shown) with</w:t>
+      </w:r>
+      <w:r>
+        <w:t xml:space="preserve"> </w:t>
+      </w:r>
+      <w:r>
+        <w:rPr>
+          <w:b/>
+          <w:bCs/>
+        </w:rPr>
+        <w:t xml:space="preserve">Add hidden</w:t>
+      </w:r>
+      <w:r>
+        <w:t xml:space="preserve">.</w:t>
+      </w:r>
+      <w:r>
+        <w:t xml:space="preserve"> </w:t>
+      </w:r>
+      <w:r>
+        <w:t xml:space="preserve">-</w:t>
+      </w:r>
+      <w:r>
+        <w:t xml:space="preserve"> </w:t>
+      </w:r>
+      <w:r>
+        <w:rPr>
+          <w:b/>
+          <w:bCs/>
+        </w:rPr>
+        <w:t xml:space="preserve">Remove question</w:t>
+      </w:r>
+      <w:r>
+        <w:t xml:space="preserve"> </w:t>
+      </w:r>
+      <w:r>
+        <w:t xml:space="preserve">trash per question.</w:t>
+      </w:r>
+      <w:r>
+        <w:t xml:space="preserve"> </w:t>
+      </w:r>
+      <w:r>
+        <w:t xml:space="preserve">-</w:t>
+      </w:r>
+      <w:r>
+        <w:t xml:space="preserve"> </w:t>
+      </w:r>
+      <w:r>
+        <w:rPr>
+          <w:b/>
+          <w:bCs/>
+        </w:rPr>
+        <w:t xml:space="preserve">Button: Generate with AI</w:t>
+      </w:r>
+      <w:r>
+        <w:t xml:space="preserve"> </w:t>
+      </w:r>
+      <w:r>
+        <w:t xml:space="preserve">(</w:t>
+      </w:r>
+      <w:r>
+        <w:rPr>
+          <w:rStyle w:val="VerbatimChar"/>
+        </w:rPr>
+        <w:t xml:space="preserve">AIGenerate</w:t>
+      </w:r>
+      <w:r>
+        <w:t xml:space="preserve">, per section) — opens a panel: topic input, type (MCQ/Coding), difficulty, count →</w:t>
+      </w:r>
+      <w:r>
+        <w:t xml:space="preserve"> </w:t>
+      </w:r>
+      <w:r>
+        <w:rPr>
+          <w:b/>
+          <w:bCs/>
+        </w:rPr>
+        <w:t xml:space="preserve">Generate</w:t>
+      </w:r>
+      <w:r>
+        <w:t xml:space="preserve"> </w:t>
+      </w:r>
+      <w:r>
+        <w:t xml:space="preserve">(</w:t>
+      </w:r>
+      <w:r>
+        <w:rPr>
+          <w:rStyle w:val="VerbatimChar"/>
+        </w:rPr>
+        <w:t xml:space="preserve">POST /drive/v1/questions/generate</w:t>
+      </w:r>
+      <w:r>
+        <w:t xml:space="preserve">) appends editable rows;</w:t>
+      </w:r>
+      <w:r>
+        <w:t xml:space="preserve"> </w:t>
+      </w:r>
+      <w:r>
+        <w:rPr>
+          <w:b/>
+          <w:bCs/>
+        </w:rPr>
+        <w:t xml:space="preserve">Cancel</w:t>
+      </w:r>
+      <w:r>
+        <w:t xml:space="preserve">. Errors show the server’s exact reason (quota/provider/not configured).</w:t>
+      </w:r>
+      <w:r>
+        <w:t xml:space="preserve"> </w:t>
+      </w:r>
+      <w:r>
+        <w:t xml:space="preserve">-</w:t>
+      </w:r>
+      <w:r>
+        <w:t xml:space="preserve"> </w:t>
+      </w:r>
+      <w:r>
+        <w:rPr>
+          <w:b/>
+          <w:bCs/>
+        </w:rPr>
+        <w:t xml:space="preserve">Button: Add section</w:t>
+      </w:r>
+      <w:r>
+        <w:t xml:space="preserve">.</w:t>
+      </w:r>
+      <w:r>
+        <w:t xml:space="preserve"> </w:t>
+      </w:r>
+      <w:r>
+        <w:t xml:space="preserve">-</w:t>
+      </w:r>
+      <w:r>
+        <w:t xml:space="preserve"> </w:t>
+      </w:r>
+      <w:r>
+        <w:rPr>
+          <w:b/>
+          <w:bCs/>
+        </w:rPr>
+        <w:t xml:space="preserve">Button: Create exam (N questions)</w:t>
+      </w:r>
+      <w:r>
+        <w:t xml:space="preserve"> </w:t>
+      </w:r>
+      <w:r>
+        <w:t xml:space="preserve">— runs client-side</w:t>
+      </w:r>
+      <w:r>
+        <w:t xml:space="preserve"> </w:t>
+      </w:r>
+      <w:r>
+        <w:rPr>
+          <w:b/>
+          <w:bCs/>
+        </w:rPr>
+        <w:t xml:space="preserve">validation</w:t>
+      </w:r>
+      <w:r>
+        <w:t xml:space="preserve"> </w:t>
+      </w:r>
+      <w:r>
+        <w:t xml:space="preserve">(drive selected, ≥1 question, no empty stems, MCQ ≥2 options + a marked correct, coding ≥1 case + ≥1 language) and, if valid,</w:t>
+      </w:r>
+      <w:r>
+        <w:t xml:space="preserve"> </w:t>
+      </w:r>
+      <w:r>
+        <w:rPr>
+          <w:rStyle w:val="VerbatimChar"/>
+        </w:rPr>
+        <w:t xml:space="preserve">POST /drive/v1/exams</w:t>
+      </w:r>
+      <w:r>
+        <w:t xml:space="preserve"> </w:t>
+      </w:r>
+      <w:r>
+        <w:t xml:space="preserve">then</w:t>
+      </w:r>
+      <w:r>
+        <w:t xml:space="preserve"> </w:t>
+      </w:r>
+      <w:r>
+        <w:rPr>
+          <w:rStyle w:val="VerbatimChar"/>
+        </w:rPr>
+        <w:t xml:space="preserve">POST /drive/v1/evaluations/keys</w:t>
+      </w:r>
+      <w:r>
+        <w:t xml:space="preserve"> </w:t>
+      </w:r>
+      <w:r>
+        <w:t xml:space="preserve">(answer key → Evaluation service). Validation errors list every problem; success confirms the exam is attached.</w:t>
+      </w:r>
+    </w:p>
+    <w:p>
+      <w:pPr>
+        <w:pStyle w:val="BodyText"/>
+      </w:pPr>
+      <w:r>
+        <w:rPr>
+          <w:b/>
+          <w:bCs/>
+        </w:rPr>
+        <w:t xml:space="preserve">Questions list (right)</w:t>
+      </w:r>
+      <w:r>
+        <w:t xml:space="preserve"> </w:t>
+      </w:r>
+      <w:r>
+        <w:t xml:space="preserve">— each item shows stem + type/category/difficulty badges;</w:t>
+      </w:r>
+      <w:r>
+        <w:t xml:space="preserve"> </w:t>
+      </w:r>
+      <w:r>
+        <w:rPr>
+          <w:b/>
+          <w:bCs/>
+        </w:rPr>
+        <w:t xml:space="preserve">Activate</w:t>
+      </w:r>
+      <w:r>
+        <w:t xml:space="preserve"> </w:t>
+      </w:r>
+      <w:r>
+        <w:t xml:space="preserve">button (</w:t>
+      </w:r>
+      <w:r>
+        <w:rPr>
+          <w:rStyle w:val="VerbatimChar"/>
+        </w:rPr>
+        <w:t xml:space="preserve">POST .../questions/{id}/activate</w:t>
+      </w:r>
+      <w:r>
+        <w:t xml:space="preserve">) for drafts; active items show a badge.</w:t>
+      </w:r>
+    </w:p>
+    <w:p>
+      <w:pPr>
+        <w:pStyle w:val="BodyText"/>
+      </w:pPr>
+      <w:r>
+        <w:rPr>
+          <w:b/>
+          <w:bCs/>
+        </w:rPr>
+        <w:t xml:space="preserve">Paper viewer</w:t>
+      </w:r>
+      <w:r>
+        <w:t xml:space="preserve"> </w:t>
+      </w:r>
+      <w:r>
+        <w:t xml:space="preserve">— a</w:t>
+      </w:r>
+      <w:r>
+        <w:t xml:space="preserve"> </w:t>
+      </w:r>
+      <w:r>
+        <w:rPr>
+          <w:b/>
+          <w:bCs/>
+        </w:rPr>
+        <w:t xml:space="preserve">DriveSelect</w:t>
+      </w:r>
+      <w:r>
+        <w:t xml:space="preserve">, then a button per exam (</w:t>
+      </w:r>
+      <w:r>
+        <w:rPr>
+          <w:rStyle w:val="VerbatimChar"/>
+        </w:rPr>
+        <w:t xml:space="preserve">GET .../exams?drive_id=…</w:t>
+      </w:r>
+      <w:r>
+        <w:t xml:space="preserve">);</w:t>
+      </w:r>
+      <w:r>
+        <w:t xml:space="preserve"> </w:t>
+      </w:r>
+      <w:r>
+        <w:rPr>
+          <w:b/>
+          <w:bCs/>
+        </w:rPr>
+        <w:t xml:space="preserve">clicking an exam</w:t>
+      </w:r>
+      <w:r>
+        <w:t xml:space="preserve"> </w:t>
+      </w:r>
+      <w:r>
+        <w:t xml:space="preserve">loads the full paper (</w:t>
+      </w:r>
+      <w:r>
+        <w:rPr>
+          <w:rStyle w:val="VerbatimChar"/>
+        </w:rPr>
+        <w:t xml:space="preserve">GET .../exams/{id}/paper</w:t>
+      </w:r>
+      <w:r>
+        <w:t xml:space="preserve">) with</w:t>
+      </w:r>
+      <w:r>
+        <w:t xml:space="preserve"> </w:t>
+      </w:r>
+      <w:r>
+        <w:rPr>
+          <w:b/>
+          <w:bCs/>
+        </w:rPr>
+        <w:t xml:space="preserve">correct MCQ options highlighted</w:t>
+      </w:r>
+      <w:r>
+        <w:t xml:space="preserve"> </w:t>
+      </w:r>
+      <w:r>
+        <w:t xml:space="preserve">and coding</w:t>
+      </w:r>
+      <w:r>
+        <w:t xml:space="preserve"> </w:t>
+      </w:r>
+      <w:r>
+        <w:rPr>
+          <w:b/>
+          <w:bCs/>
+        </w:rPr>
+        <w:t xml:space="preserve">test cases</w:t>
+      </w:r>
+      <w:r>
+        <w:t xml:space="preserve"> </w:t>
+      </w:r>
+      <w:r>
+        <w:t xml:space="preserve">shown — an admin answer-key review.</w:t>
+      </w:r>
+    </w:p>
+    <w:bookmarkEnd w:id="205"/>
+    <w:bookmarkStart w:id="206" w:name="ai-tutor-every-control"/>
+    <w:p>
+      <w:pPr>
+        <w:pStyle w:val="Heading2"/>
+      </w:pPr>
+      <w:r>
+        <w:t xml:space="preserve">23.3 AI Tutor — every control</w:t>
+      </w:r>
+    </w:p>
+    <w:p>
+      <w:pPr>
+        <w:pStyle w:val="Compact"/>
+        <w:numPr>
+          <w:ilvl w:val="0"/>
+          <w:numId w:val="1094"/>
+        </w:numPr>
+      </w:pPr>
+      <w:r>
+        <w:rPr>
+          <w:b/>
+          <w:bCs/>
+        </w:rPr>
+        <w:t xml:space="preserve">Chat thread</w:t>
+      </w:r>
+      <w:r>
+        <w:t xml:space="preserve"> </w:t>
+      </w:r>
+      <w:r>
+        <w:t xml:space="preserve">— user/assistant bubbles; a typing indicator while busy; auto-scroll.</w:t>
+      </w:r>
+    </w:p>
+    <w:p>
+      <w:pPr>
+        <w:pStyle w:val="Compact"/>
+        <w:numPr>
+          <w:ilvl w:val="0"/>
+          <w:numId w:val="1094"/>
+        </w:numPr>
+      </w:pPr>
+      <w:r>
+        <w:rPr>
+          <w:b/>
+          <w:bCs/>
+        </w:rPr>
+        <w:t xml:space="preserve">Quick action: Study plan</w:t>
+      </w:r>
+      <w:r>
+        <w:t xml:space="preserve"> </w:t>
+      </w:r>
+      <w:r>
+        <w:t xml:space="preserve">→</w:t>
+      </w:r>
+      <w:r>
+        <w:t xml:space="preserve"> </w:t>
+      </w:r>
+      <w:r>
+        <w:rPr>
+          <w:rStyle w:val="VerbatimChar"/>
+        </w:rPr>
+        <w:t xml:space="preserve">POST /ai/v1/tutor/study-plan</w:t>
+      </w:r>
+      <w:r>
+        <w:t xml:space="preserve"> </w:t>
+      </w:r>
+      <w:r>
+        <w:t xml:space="preserve">(renders a week-by-week plan; offline fallback text).</w:t>
+      </w:r>
+    </w:p>
+    <w:p>
+      <w:pPr>
+        <w:pStyle w:val="Compact"/>
+        <w:numPr>
+          <w:ilvl w:val="0"/>
+          <w:numId w:val="1094"/>
+        </w:numPr>
+      </w:pPr>
+      <w:r>
+        <w:rPr>
+          <w:b/>
+          <w:bCs/>
+        </w:rPr>
+        <w:t xml:space="preserve">Quick action: Stream advice</w:t>
+      </w:r>
+      <w:r>
+        <w:t xml:space="preserve"> </w:t>
+      </w:r>
+      <w:r>
+        <w:t xml:space="preserve">→ sends</w:t>
+      </w:r>
+      <w:r>
+        <w:t xml:space="preserve"> </w:t>
+      </w:r>
+      <w:r>
+        <w:t xml:space="preserve">“Which specialisation stream fits me?”</w:t>
+      </w:r>
+      <w:r>
+        <w:t xml:space="preserve"> </w:t>
+      </w:r>
+      <w:r>
+        <w:t xml:space="preserve">via</w:t>
+      </w:r>
+      <w:r>
+        <w:t xml:space="preserve"> </w:t>
+      </w:r>
+      <w:r>
+        <w:rPr>
+          <w:rStyle w:val="VerbatimChar"/>
+        </w:rPr>
+        <w:t xml:space="preserve">POST /ai/v1/tutor/chat</w:t>
+      </w:r>
+      <w:r>
+        <w:t xml:space="preserve">.</w:t>
+      </w:r>
+    </w:p>
+    <w:p>
+      <w:pPr>
+        <w:pStyle w:val="Compact"/>
+        <w:numPr>
+          <w:ilvl w:val="0"/>
+          <w:numId w:val="1094"/>
+        </w:numPr>
+      </w:pPr>
+      <w:r>
+        <w:rPr>
+          <w:b/>
+          <w:bCs/>
+        </w:rPr>
+        <w:t xml:space="preserve">Message input</w:t>
+      </w:r>
+      <w:r>
+        <w:t xml:space="preserve"> </w:t>
+      </w:r>
+      <w:r>
+        <w:t xml:space="preserve">+</w:t>
+      </w:r>
+      <w:r>
+        <w:t xml:space="preserve"> </w:t>
+      </w:r>
+      <w:r>
+        <w:rPr>
+          <w:b/>
+          <w:bCs/>
+        </w:rPr>
+        <w:t xml:space="preserve">Send</w:t>
+      </w:r>
+      <w:r>
+        <w:t xml:space="preserve"> </w:t>
+      </w:r>
+      <w:r>
+        <w:t xml:space="preserve">→</w:t>
+      </w:r>
+      <w:r>
+        <w:t xml:space="preserve"> </w:t>
+      </w:r>
+      <w:r>
+        <w:rPr>
+          <w:rStyle w:val="VerbatimChar"/>
+        </w:rPr>
+        <w:t xml:space="preserve">POST /ai/v1/tutor/chat { message, session_id, context }</w:t>
+      </w:r>
+      <w:r>
+        <w:t xml:space="preserve">; the returned</w:t>
+      </w:r>
+      <w:r>
+        <w:t xml:space="preserve"> </w:t>
+      </w:r>
+      <w:r>
+        <w:rPr>
+          <w:rStyle w:val="VerbatimChar"/>
+        </w:rPr>
+        <w:t xml:space="preserve">session_id</w:t>
+      </w:r>
+      <w:r>
+        <w:t xml:space="preserve"> </w:t>
+      </w:r>
+      <w:r>
+        <w:t xml:space="preserve">threads the conversation; a</w:t>
+      </w:r>
+      <w:r>
+        <w:t xml:space="preserve"> </w:t>
+      </w:r>
+      <w:r>
+        <w:rPr>
+          <w:b/>
+          <w:bCs/>
+        </w:rPr>
+        <w:t xml:space="preserve">live AI / offline</w:t>
+      </w:r>
+      <w:r>
+        <w:t xml:space="preserve"> </w:t>
+      </w:r>
+      <w:r>
+        <w:t xml:space="preserve">badge reflects</w:t>
+      </w:r>
+      <w:r>
+        <w:t xml:space="preserve"> </w:t>
+      </w:r>
+      <w:r>
+        <w:rPr>
+          <w:rStyle w:val="VerbatimChar"/>
+        </w:rPr>
+        <w:t xml:space="preserve">mode</w:t>
+      </w:r>
+      <w:r>
+        <w:t xml:space="preserve">.</w:t>
+      </w:r>
+    </w:p>
+    <w:bookmarkEnd w:id="206"/>
+    <w:bookmarkStart w:id="207" w:name="certificates-every-control"/>
+    <w:p>
+      <w:pPr>
+        <w:pStyle w:val="Heading2"/>
+      </w:pPr>
+      <w:r>
+        <w:t xml:space="preserve">23.4 Certificates — every control</w:t>
+      </w:r>
+    </w:p>
+    <w:p>
+      <w:pPr>
+        <w:pStyle w:val="FirstParagraph"/>
+      </w:pPr>
+      <w:r>
+        <w:t xml:space="preserve">Loads</w:t>
+      </w:r>
+      <w:r>
+        <w:t xml:space="preserve"> </w:t>
+      </w:r>
+      <w:r>
+        <w:rPr>
+          <w:rStyle w:val="VerbatimChar"/>
+        </w:rPr>
+        <w:t xml:space="preserve">GET /lms/v1/certificates/for/{id}</w:t>
+      </w:r>
+      <w:r>
+        <w:t xml:space="preserve">.</w:t>
+      </w:r>
+      <w:r>
+        <w:t xml:space="preserve"> </w:t>
+      </w:r>
+      <w:r>
+        <w:t xml:space="preserve">-</w:t>
+      </w:r>
+      <w:r>
+        <w:t xml:space="preserve"> </w:t>
+      </w:r>
+      <w:r>
+        <w:rPr>
+          <w:b/>
+          <w:bCs/>
+        </w:rPr>
+        <w:t xml:space="preserve">Certificate card</w:t>
+      </w:r>
+      <w:r>
+        <w:t xml:space="preserve"> </w:t>
+      </w:r>
+      <w:r>
+        <w:t xml:space="preserve">(clickable) — series-coloured award icon, name, optional</w:t>
+      </w:r>
+      <w:r>
+        <w:t xml:space="preserve"> </w:t>
+      </w:r>
+      <w:r>
+        <w:rPr>
+          <w:b/>
+          <w:bCs/>
+        </w:rPr>
+        <w:t xml:space="preserve">PPO eligible</w:t>
+      </w:r>
+      <w:r>
+        <w:t xml:space="preserve"> </w:t>
+      </w:r>
+      <w:r>
+        <w:t xml:space="preserve">badge,</w:t>
+      </w:r>
+      <w:r>
+        <w:t xml:space="preserve"> </w:t>
+      </w:r>
+      <w:r>
+        <w:t xml:space="preserve">“Year N · cert_no”</w:t>
+      </w:r>
+      <w:r>
+        <w:t xml:space="preserve">, a status badge, and a</w:t>
+      </w:r>
+      <w:r>
+        <w:t xml:space="preserve"> </w:t>
+      </w:r>
+      <w:r>
+        <w:t xml:space="preserve">“View certificate”</w:t>
+      </w:r>
+      <w:r>
+        <w:t xml:space="preserve"> </w:t>
+      </w:r>
+      <w:r>
+        <w:t xml:space="preserve">affordance. Clicking opens the</w:t>
+      </w:r>
+      <w:r>
+        <w:t xml:space="preserve"> </w:t>
+      </w:r>
+      <w:r>
+        <w:rPr>
+          <w:b/>
+          <w:bCs/>
+        </w:rPr>
+        <w:t xml:space="preserve">modal</w:t>
+      </w:r>
+      <w:r>
+        <w:t xml:space="preserve">.</w:t>
+      </w:r>
+      <w:r>
+        <w:t xml:space="preserve"> </w:t>
+      </w:r>
+      <w:r>
+        <w:t xml:space="preserve">-</w:t>
+      </w:r>
+      <w:r>
+        <w:t xml:space="preserve"> </w:t>
+      </w:r>
+      <w:r>
+        <w:rPr>
+          <w:b/>
+          <w:bCs/>
+        </w:rPr>
+        <w:t xml:space="preserve">Certificate modal</w:t>
+      </w:r>
+      <w:r>
+        <w:t xml:space="preserve"> </w:t>
+      </w:r>
+      <w:r>
+        <w:t xml:space="preserve">— renders the certificate artwork (</w:t>
+      </w:r>
+      <w:r>
+        <w:rPr>
+          <w:rStyle w:val="VerbatimChar"/>
+        </w:rPr>
+        <w:t xml:space="preserve">certificateHtml</w:t>
+      </w:r>
+      <w:r>
+        <w:t xml:space="preserve">). Buttons:</w:t>
+      </w:r>
+      <w:r>
+        <w:t xml:space="preserve"> </w:t>
+      </w:r>
+      <w:r>
+        <w:t xml:space="preserve">-</w:t>
+      </w:r>
+      <w:r>
+        <w:t xml:space="preserve"> </w:t>
+      </w:r>
+      <w:r>
+        <w:rPr>
+          <w:b/>
+          <w:bCs/>
+        </w:rPr>
+        <w:t xml:space="preserve">Print</w:t>
+      </w:r>
+      <w:r>
+        <w:t xml:space="preserve"> </w:t>
+      </w:r>
+      <w:r>
+        <w:t xml:space="preserve">→</w:t>
+      </w:r>
+      <w:r>
+        <w:t xml:space="preserve"> </w:t>
+      </w:r>
+      <w:r>
+        <w:rPr>
+          <w:rStyle w:val="VerbatimChar"/>
+        </w:rPr>
+        <w:t xml:space="preserve">printCertificate(cert)</w:t>
+      </w:r>
+      <w:r>
+        <w:t xml:space="preserve"> </w:t>
+      </w:r>
+      <w:r>
+        <w:t xml:space="preserve">(browser print of the certificate).</w:t>
+      </w:r>
+      <w:r>
+        <w:t xml:space="preserve"> </w:t>
+      </w:r>
+      <w:r>
+        <w:t xml:space="preserve">-</w:t>
+      </w:r>
+      <w:r>
+        <w:t xml:space="preserve"> </w:t>
+      </w:r>
+      <w:r>
+        <w:rPr>
+          <w:b/>
+          <w:bCs/>
+        </w:rPr>
+        <w:t xml:space="preserve">Download PDF</w:t>
+      </w:r>
+      <w:r>
+        <w:t xml:space="preserve"> </w:t>
+      </w:r>
+      <w:r>
+        <w:t xml:space="preserve">(when the cert has an id) →</w:t>
+      </w:r>
+      <w:r>
+        <w:t xml:space="preserve"> </w:t>
+      </w:r>
+      <w:r>
+        <w:rPr>
+          <w:rStyle w:val="VerbatimChar"/>
+        </w:rPr>
+        <w:t xml:space="preserve">GET /lms/v1/certificates/{id}/pdf</w:t>
+      </w:r>
+      <w:r>
+        <w:t xml:space="preserve">.</w:t>
+      </w:r>
+      <w:r>
+        <w:t xml:space="preserve"> </w:t>
+      </w:r>
+      <w:r>
+        <w:t xml:space="preserve">-</w:t>
+      </w:r>
+      <w:r>
+        <w:t xml:space="preserve"> </w:t>
+      </w:r>
+      <w:r>
+        <w:rPr>
+          <w:b/>
+          <w:bCs/>
+        </w:rPr>
+        <w:t xml:space="preserve">Public verify</w:t>
+      </w:r>
+      <w:r>
+        <w:t xml:space="preserve"> </w:t>
+      </w:r>
+      <w:r>
+        <w:t xml:space="preserve">→ opens</w:t>
+      </w:r>
+      <w:r>
+        <w:t xml:space="preserve"> </w:t>
+      </w:r>
+      <w:r>
+        <w:rPr>
+          <w:rStyle w:val="VerbatimChar"/>
+        </w:rPr>
+        <w:t xml:space="preserve">/verify/{verify_id}</w:t>
+      </w:r>
+      <w:r>
+        <w:t xml:space="preserve"> </w:t>
+      </w:r>
+      <w:r>
+        <w:t xml:space="preserve">in a new tab.</w:t>
+      </w:r>
+      <w:r>
+        <w:t xml:space="preserve"> </w:t>
+      </w:r>
+      <w:r>
+        <w:t xml:space="preserve">-</w:t>
+      </w:r>
+      <w:r>
+        <w:t xml:space="preserve"> </w:t>
+      </w:r>
+      <w:r>
+        <w:rPr>
+          <w:b/>
+          <w:bCs/>
+        </w:rPr>
+        <w:t xml:space="preserve">Close</w:t>
+      </w:r>
+      <w:r>
+        <w:t xml:space="preserve"> </w:t>
+      </w:r>
+      <w:r>
+        <w:t xml:space="preserve">(X).</w:t>
+      </w:r>
+      <w:r>
+        <w:t xml:space="preserve"> </w:t>
+      </w:r>
+      <w:r>
+        <w:t xml:space="preserve">-</w:t>
+      </w:r>
+      <w:r>
+        <w:t xml:space="preserve"> </w:t>
+      </w:r>
+      <w:r>
+        <w:rPr>
+          <w:b/>
+          <w:bCs/>
+        </w:rPr>
+        <w:t xml:space="preserve">Verify a certificate widget</w:t>
+      </w:r>
+      <w:r>
+        <w:t xml:space="preserve"> </w:t>
+      </w:r>
+      <w:r>
+        <w:t xml:space="preserve">(side panel, also public-capable) — a</w:t>
+      </w:r>
+      <w:r>
+        <w:t xml:space="preserve"> </w:t>
+      </w:r>
+      <w:r>
+        <w:rPr>
+          <w:b/>
+          <w:bCs/>
+        </w:rPr>
+        <w:t xml:space="preserve">verify-id input</w:t>
+      </w:r>
+      <w:r>
+        <w:t xml:space="preserve"> </w:t>
+      </w:r>
+      <w:r>
+        <w:t xml:space="preserve">(e.g. </w:t>
+      </w:r>
+      <w:r>
+        <w:rPr>
+          <w:rStyle w:val="VerbatimChar"/>
+        </w:rPr>
+        <w:t xml:space="preserve">LARE-VER-4821</w:t>
+      </w:r>
+      <w:r>
+        <w:t xml:space="preserve">) +</w:t>
+      </w:r>
+      <w:r>
+        <w:t xml:space="preserve"> </w:t>
+      </w:r>
+      <w:r>
+        <w:rPr>
+          <w:b/>
+          <w:bCs/>
+        </w:rPr>
+        <w:t xml:space="preserve">Verify</w:t>
+      </w:r>
+      <w:r>
+        <w:t xml:space="preserve"> </w:t>
+      </w:r>
+      <w:r>
+        <w:t xml:space="preserve">→</w:t>
+      </w:r>
+      <w:r>
+        <w:t xml:space="preserve"> </w:t>
+      </w:r>
+      <w:r>
+        <w:rPr>
+          <w:rStyle w:val="VerbatimChar"/>
+        </w:rPr>
+        <w:t xml:space="preserve">GET /verify/{verifyId}</w:t>
+      </w:r>
+      <w:r>
+        <w:t xml:space="preserve">. On success it opens the</w:t>
+      </w:r>
+      <w:r>
+        <w:t xml:space="preserve"> </w:t>
+      </w:r>
+      <w:r>
+        <w:rPr>
+          <w:b/>
+          <w:bCs/>
+        </w:rPr>
+        <w:t xml:space="preserve">same certificate modal with an</w:t>
+      </w:r>
+      <w:r>
+        <w:rPr>
+          <w:b/>
+          <w:bCs/>
+        </w:rPr>
+        <w:t xml:space="preserve"> </w:t>
+      </w:r>
+      <w:r>
+        <w:rPr>
+          <w:b/>
+          <w:bCs/>
+        </w:rPr>
+        <w:t xml:space="preserve">“Authentic — verified by LARE Learn”</w:t>
+      </w:r>
+      <w:r>
+        <w:rPr>
+          <w:b/>
+          <w:bCs/>
+        </w:rPr>
+        <w:t xml:space="preserve"> </w:t>
+      </w:r>
+      <w:r>
+        <w:rPr>
+          <w:b/>
+          <w:bCs/>
+        </w:rPr>
+        <w:t xml:space="preserve">banner</w:t>
+      </w:r>
+      <w:r>
+        <w:t xml:space="preserve">; on failure it shows</w:t>
+      </w:r>
+      <w:r>
+        <w:t xml:space="preserve"> </w:t>
+      </w:r>
+      <w:r>
+        <w:t xml:space="preserve">“not valid / not found”</w:t>
+      </w:r>
+      <w:r>
+        <w:t xml:space="preserve">.</w:t>
+      </w:r>
+      <w:r>
+        <w:t xml:space="preserve"> </w:t>
+      </w:r>
+      <w:r>
+        <w:t xml:space="preserve">- Empty state when no certificates (</w:t>
+      </w:r>
+      <w:r>
+        <w:t xml:space="preserve">“auto-issues on completing a year”</w:t>
+      </w:r>
+      <w:r>
+        <w:t xml:space="preserve">).</w:t>
+      </w:r>
+    </w:p>
+    <w:p>
+      <w:r>
         <w:pict>
           <v:rect style="width:0;height:1.5pt" o:hralign="center" o:hrstd="t" o:hr="t"/>
         </w:pict>
@@ -37084,8 +38958,8 @@
         <w:t xml:space="preserve">End of document. Prepared for LARE Cloud Solutions - a unit of LARE Consulting &amp; Technology Pvt. Ltd.</w:t>
       </w:r>
     </w:p>
-    <w:bookmarkEnd w:id="202"/>
-    <w:bookmarkEnd w:id="203"/>
+    <w:bookmarkEnd w:id="207"/>
+    <w:bookmarkEnd w:id="208"/>
     <w:sectPr>
       <w:footnotePr>
         <w:numRestart w:val="eachSect"/>
@@ -37799,6 +39673,9 @@
     <w:abstractNumId w:val="991"/>
   </w:num>
   <w:num w:numId="1093">
+    <w:abstractNumId w:val="991"/>
+  </w:num>
+  <w:num w:numId="1094">
     <w:abstractNumId w:val="991"/>
   </w:num>
 </w:numbering>

</xml_diff>

<commit_message>
docs: screen reference part 6 (Trainer Console, Drives, Notifications, Settings)
Co-Authored-By: Claude Opus 4.8 <noreply@anthropic.com>
</commit_message>
<xml_diff>
--- a/docs/LARE-Documentation.docx
+++ b/docs/LARE-Documentation.docx
@@ -38941,6 +38941,1289 @@
     </w:p>
     <w:p>
       <w:r>
+        <w:br w:type="page"/>
+      </w:r>
+    </w:p>
+    <w:bookmarkEnd w:id="207"/>
+    <w:bookmarkEnd w:id="208"/>
+    <w:bookmarkStart w:id="213" w:name="Xc5fc0bd3bab00cdd27a0d964fef5befbbb7efcf"/>
+    <w:p>
+      <w:pPr>
+        <w:pStyle w:val="Heading1"/>
+      </w:pPr>
+      <w:r>
+        <w:t xml:space="preserve">24. Detailed Screen Reference — Trainer Console, Candidate Drives, Notifications, Settings</w:t>
+      </w:r>
+    </w:p>
+    <w:bookmarkStart w:id="209" w:name="trainer-console-lmstrainer-every-control"/>
+    <w:p>
+      <w:pPr>
+        <w:pStyle w:val="Heading2"/>
+      </w:pPr>
+      <w:r>
+        <w:t xml:space="preserve">24.1 Trainer Console (</w:t>
+      </w:r>
+      <w:r>
+        <w:rPr>
+          <w:rStyle w:val="VerbatimChar"/>
+        </w:rPr>
+        <w:t xml:space="preserve">/lms/trainer</w:t>
+      </w:r>
+      <w:r>
+        <w:t xml:space="preserve">) — every control</w:t>
+      </w:r>
+    </w:p>
+    <w:p>
+      <w:pPr>
+        <w:pStyle w:val="FirstParagraph"/>
+      </w:pPr>
+      <w:r>
+        <w:t xml:space="preserve">Four panels:</w:t>
+      </w:r>
+      <w:r>
+        <w:t xml:space="preserve"> </w:t>
+      </w:r>
+      <w:r>
+        <w:rPr>
+          <w:b/>
+          <w:bCs/>
+        </w:rPr>
+        <w:t xml:space="preserve">My learners</w:t>
+      </w:r>
+      <w:r>
+        <w:t xml:space="preserve">,</w:t>
+      </w:r>
+      <w:r>
+        <w:t xml:space="preserve"> </w:t>
+      </w:r>
+      <w:r>
+        <w:rPr>
+          <w:b/>
+          <w:bCs/>
+        </w:rPr>
+        <w:t xml:space="preserve">Career targets</w:t>
+      </w:r>
+      <w:r>
+        <w:t xml:space="preserve">,</w:t>
+      </w:r>
+      <w:r>
+        <w:t xml:space="preserve"> </w:t>
+      </w:r>
+      <w:r>
+        <w:rPr>
+          <w:b/>
+          <w:bCs/>
+        </w:rPr>
+        <w:t xml:space="preserve">Create an assessment</w:t>
+      </w:r>
+      <w:r>
+        <w:t xml:space="preserve">,</w:t>
+      </w:r>
+      <w:r>
+        <w:t xml:space="preserve"> </w:t>
+      </w:r>
+      <w:r>
+        <w:rPr>
+          <w:b/>
+          <w:bCs/>
+        </w:rPr>
+        <w:t xml:space="preserve">Grade subjective answer</w:t>
+      </w:r>
+      <w:r>
+        <w:t xml:space="preserve">.</w:t>
+      </w:r>
+    </w:p>
+    <w:p>
+      <w:pPr>
+        <w:pStyle w:val="BodyText"/>
+      </w:pPr>
+      <w:r>
+        <w:rPr>
+          <w:b/>
+          <w:bCs/>
+        </w:rPr>
+        <w:t xml:space="preserve">My learners</w:t>
+      </w:r>
+      <w:r>
+        <w:t xml:space="preserve"> </w:t>
+      </w:r>
+      <w:r>
+        <w:t xml:space="preserve">(</w:t>
+      </w:r>
+      <w:r>
+        <w:rPr>
+          <w:rStyle w:val="VerbatimChar"/>
+        </w:rPr>
+        <w:t xml:space="preserve">GET /lms/v1/learners</w:t>
+      </w:r>
+      <w:r>
+        <w:t xml:space="preserve">)</w:t>
+      </w:r>
+      <w:r>
+        <w:t xml:space="preserve"> </w:t>
+      </w:r>
+      <w:r>
+        <w:t xml:space="preserve">- Per learner row (name, roll · year):</w:t>
+      </w:r>
+      <w:r>
+        <w:t xml:space="preserve"> </w:t>
+      </w:r>
+      <w:r>
+        <w:t xml:space="preserve">-</w:t>
+      </w:r>
+      <w:r>
+        <w:t xml:space="preserve"> </w:t>
+      </w:r>
+      <w:r>
+        <w:rPr>
+          <w:b/>
+          <w:bCs/>
+        </w:rPr>
+        <w:t xml:space="preserve">Present</w:t>
+      </w:r>
+      <w:r>
+        <w:t xml:space="preserve"> </w:t>
+      </w:r>
+      <w:r>
+        <w:t xml:space="preserve">→</w:t>
+      </w:r>
+      <w:r>
+        <w:t xml:space="preserve"> </w:t>
+      </w:r>
+      <w:r>
+        <w:rPr>
+          <w:rStyle w:val="VerbatimChar"/>
+        </w:rPr>
+        <w:t xml:space="preserve">POST /lms/v1/attendance { learner_id, schedule_slot_id:"today", status:"present" }</w:t>
+      </w:r>
+      <w:r>
+        <w:t xml:space="preserve">.</w:t>
+      </w:r>
+      <w:r>
+        <w:t xml:space="preserve"> </w:t>
+      </w:r>
+      <w:r>
+        <w:t xml:space="preserve">-</w:t>
+      </w:r>
+      <w:r>
+        <w:t xml:space="preserve"> </w:t>
+      </w:r>
+      <w:r>
+        <w:rPr>
+          <w:b/>
+          <w:bCs/>
+        </w:rPr>
+        <w:t xml:space="preserve">Absent</w:t>
+      </w:r>
+      <w:r>
+        <w:t xml:space="preserve"> </w:t>
+      </w:r>
+      <w:r>
+        <w:t xml:space="preserve">→ same with</w:t>
+      </w:r>
+      <w:r>
+        <w:t xml:space="preserve"> </w:t>
+      </w:r>
+      <w:r>
+        <w:rPr>
+          <w:rStyle w:val="VerbatimChar"/>
+        </w:rPr>
+        <w:t xml:space="preserve">status:"absent"</w:t>
+      </w:r>
+      <w:r>
+        <w:t xml:space="preserve">.</w:t>
+      </w:r>
+      <w:r>
+        <w:t xml:space="preserve"> </w:t>
+      </w:r>
+      <w:r>
+        <w:t xml:space="preserve">-</w:t>
+      </w:r>
+      <w:r>
+        <w:t xml:space="preserve"> </w:t>
+      </w:r>
+      <w:r>
+        <w:rPr>
+          <w:b/>
+          <w:bCs/>
+        </w:rPr>
+        <w:t xml:space="preserve">Year check</w:t>
+      </w:r>
+      <w:r>
+        <w:t xml:space="preserve"> </w:t>
+      </w:r>
+      <w:r>
+        <w:t xml:space="preserve">→</w:t>
+      </w:r>
+      <w:r>
+        <w:t xml:space="preserve"> </w:t>
+      </w:r>
+      <w:r>
+        <w:rPr>
+          <w:rStyle w:val="VerbatimChar"/>
+        </w:rPr>
+        <w:t xml:space="preserve">POST /lms/v1/progress/compute-year { learner_id, year_no }</w:t>
+      </w:r>
+      <w:r>
+        <w:t xml:space="preserve">; flash reports eligibility (avg score + attendance %); on pass, the certificate auto-issues.</w:t>
+      </w:r>
+    </w:p>
+    <w:p>
+      <w:pPr>
+        <w:pStyle w:val="BodyText"/>
+      </w:pPr>
+      <w:r>
+        <w:rPr>
+          <w:b/>
+          <w:bCs/>
+        </w:rPr>
+        <w:t xml:space="preserve">Career targets</w:t>
+      </w:r>
+      <w:r>
+        <w:t xml:space="preserve"> </w:t>
+      </w:r>
+      <w:r>
+        <w:t xml:space="preserve">(</w:t>
+      </w:r>
+      <w:r>
+        <w:rPr>
+          <w:rStyle w:val="VerbatimChar"/>
+        </w:rPr>
+        <w:t xml:space="preserve">CareerManager</w:t>
+      </w:r>
+      <w:r>
+        <w:t xml:space="preserve">) — defines the roles Career Readiness matches against.</w:t>
+      </w:r>
+      <w:r>
+        <w:t xml:space="preserve"> </w:t>
+      </w:r>
+      <w:r>
+        <w:t xml:space="preserve">- Lists existing roles (title, description, weighted skill chips) with a</w:t>
+      </w:r>
+      <w:r>
+        <w:t xml:space="preserve"> </w:t>
+      </w:r>
+      <w:r>
+        <w:rPr>
+          <w:b/>
+          <w:bCs/>
+        </w:rPr>
+        <w:t xml:space="preserve">Remove</w:t>
+      </w:r>
+      <w:r>
+        <w:t xml:space="preserve"> </w:t>
+      </w:r>
+      <w:r>
+        <w:t xml:space="preserve">link (</w:t>
+      </w:r>
+      <w:r>
+        <w:rPr>
+          <w:rStyle w:val="VerbatimChar"/>
+        </w:rPr>
+        <w:t xml:space="preserve">DELETE /lms/v1/careers/{id}</w:t>
+      </w:r>
+      <w:r>
+        <w:t xml:space="preserve">).</w:t>
+      </w:r>
+      <w:r>
+        <w:t xml:space="preserve"> </w:t>
+      </w:r>
+      <w:r>
+        <w:t xml:space="preserve">-</w:t>
+      </w:r>
+      <w:r>
+        <w:t xml:space="preserve"> </w:t>
+      </w:r>
+      <w:r>
+        <w:rPr>
+          <w:b/>
+          <w:bCs/>
+        </w:rPr>
+        <w:t xml:space="preserve">Add form</w:t>
+      </w:r>
+      <w:r>
+        <w:t xml:space="preserve"> </w:t>
+      </w:r>
+      <w:r>
+        <w:t xml:space="preserve">— Role title, Description, and</w:t>
+      </w:r>
+      <w:r>
+        <w:t xml:space="preserve"> </w:t>
+      </w:r>
+      <w:r>
+        <w:rPr>
+          <w:b/>
+          <w:bCs/>
+        </w:rPr>
+        <w:t xml:space="preserve">Required skills</w:t>
+      </w:r>
+      <w:r>
+        <w:t xml:space="preserve"> </w:t>
+      </w:r>
+      <w:r>
+        <w:t xml:space="preserve">(comma-separated with optional</w:t>
+      </w:r>
+      <w:r>
+        <w:t xml:space="preserve"> </w:t>
+      </w:r>
+      <w:r>
+        <w:rPr>
+          <w:rStyle w:val="VerbatimChar"/>
+        </w:rPr>
+        <w:t xml:space="preserve">:weight</w:t>
+      </w:r>
+      <w:r>
+        <w:t xml:space="preserve">, e.g. </w:t>
+      </w:r>
+      <w:r>
+        <w:rPr>
+          <w:rStyle w:val="VerbatimChar"/>
+        </w:rPr>
+        <w:t xml:space="preserve">SQL:2, Arrays, Python</w:t>
+      </w:r>
+      <w:r>
+        <w:t xml:space="preserve">).</w:t>
+      </w:r>
+      <w:r>
+        <w:t xml:space="preserve"> </w:t>
+      </w:r>
+      <w:r>
+        <w:rPr>
+          <w:b/>
+          <w:bCs/>
+        </w:rPr>
+        <w:t xml:space="preserve">Add career target</w:t>
+      </w:r>
+      <w:r>
+        <w:t xml:space="preserve"> </w:t>
+      </w:r>
+      <w:r>
+        <w:t xml:space="preserve">→</w:t>
+      </w:r>
+      <w:r>
+        <w:t xml:space="preserve"> </w:t>
+      </w:r>
+      <w:r>
+        <w:rPr>
+          <w:rStyle w:val="VerbatimChar"/>
+        </w:rPr>
+        <w:t xml:space="preserve">POST /lms/v1/careers { title, description, required_skills }</w:t>
+      </w:r>
+      <w:r>
+        <w:t xml:space="preserve">.</w:t>
+      </w:r>
+    </w:p>
+    <w:p>
+      <w:pPr>
+        <w:pStyle w:val="BodyText"/>
+      </w:pPr>
+      <w:r>
+        <w:rPr>
+          <w:b/>
+          <w:bCs/>
+        </w:rPr>
+        <w:t xml:space="preserve">Create an assessment</w:t>
+      </w:r>
+      <w:r>
+        <w:t xml:space="preserve"> </w:t>
+      </w:r>
+      <w:r>
+        <w:t xml:space="preserve">(</w:t>
+      </w:r>
+      <w:r>
+        <w:rPr>
+          <w:rStyle w:val="VerbatimChar"/>
+        </w:rPr>
+        <w:t xml:space="preserve">CreateAssessment</w:t>
+      </w:r>
+      <w:r>
+        <w:t xml:space="preserve">) — builds a real quiz for students.</w:t>
+      </w:r>
+      <w:r>
+        <w:t xml:space="preserve"> </w:t>
+      </w:r>
+      <w:r>
+        <w:t xml:space="preserve">-</w:t>
+      </w:r>
+      <w:r>
+        <w:t xml:space="preserve"> </w:t>
+      </w:r>
+      <w:r>
+        <w:rPr>
+          <w:b/>
+          <w:bCs/>
+        </w:rPr>
+        <w:t xml:space="preserve">Meta</w:t>
+      </w:r>
+      <w:r>
+        <w:t xml:space="preserve">: Title, Dimension (aptitude/coding/communication/project), Passing %, Time limit (0 = none), Attempts allowed, Topics (comma-separated).</w:t>
+      </w:r>
+      <w:r>
+        <w:t xml:space="preserve"> </w:t>
+      </w:r>
+      <w:r>
+        <w:t xml:space="preserve">-</w:t>
+      </w:r>
+      <w:r>
+        <w:t xml:space="preserve"> </w:t>
+      </w:r>
+      <w:r>
+        <w:rPr>
+          <w:b/>
+          <w:bCs/>
+        </w:rPr>
+        <w:t xml:space="preserve">Toggles</w:t>
+      </w:r>
+      <w:r>
+        <w:t xml:space="preserve">:</w:t>
+      </w:r>
+      <w:r>
+        <w:t xml:space="preserve"> </w:t>
+      </w:r>
+      <w:r>
+        <w:rPr>
+          <w:b/>
+          <w:bCs/>
+        </w:rPr>
+        <w:t xml:space="preserve">Proctored</w:t>
+      </w:r>
+      <w:r>
+        <w:t xml:space="preserve"> </w:t>
+      </w:r>
+      <w:r>
+        <w:t xml:space="preserve">(fullscreen + anti-cheat, 5-flag auto-submit) and</w:t>
+      </w:r>
+      <w:r>
+        <w:t xml:space="preserve"> </w:t>
+      </w:r>
+      <w:r>
+        <w:rPr>
+          <w:b/>
+          <w:bCs/>
+        </w:rPr>
+        <w:t xml:space="preserve">Shuffle questions &amp; options per student</w:t>
+      </w:r>
+      <w:r>
+        <w:t xml:space="preserve">.</w:t>
+      </w:r>
+      <w:r>
+        <w:t xml:space="preserve"> </w:t>
+      </w:r>
+      <w:r>
+        <w:t xml:space="preserve">-</w:t>
+      </w:r>
+      <w:r>
+        <w:t xml:space="preserve"> </w:t>
+      </w:r>
+      <w:r>
+        <w:rPr>
+          <w:b/>
+          <w:bCs/>
+        </w:rPr>
+        <w:t xml:space="preserve">Questions</w:t>
+      </w:r>
+      <w:r>
+        <w:t xml:space="preserve"> </w:t>
+      </w:r>
+      <w:r>
+        <w:t xml:space="preserve">— per question: number badge, prompt input, a</w:t>
+      </w:r>
+      <w:r>
+        <w:t xml:space="preserve"> </w:t>
+      </w:r>
+      <w:r>
+        <w:rPr>
+          <w:b/>
+          <w:bCs/>
+        </w:rPr>
+        <w:t xml:space="preserve">difficulty select</w:t>
+      </w:r>
+      <w:r>
+        <w:t xml:space="preserve"> </w:t>
+      </w:r>
+      <w:r>
+        <w:t xml:space="preserve">(easy/medium/hard — drives the Adaptive Drill), a</w:t>
+      </w:r>
+      <w:r>
+        <w:t xml:space="preserve"> </w:t>
+      </w:r>
+      <w:r>
+        <w:rPr>
+          <w:b/>
+          <w:bCs/>
+        </w:rPr>
+        <w:t xml:space="preserve">remove</w:t>
+      </w:r>
+      <w:r>
+        <w:t xml:space="preserve"> </w:t>
+      </w:r>
+      <w:r>
+        <w:t xml:space="preserve">trash (when &gt;1), and 4 option inputs each with a</w:t>
+      </w:r>
+      <w:r>
+        <w:t xml:space="preserve"> </w:t>
+      </w:r>
+      <w:r>
+        <w:rPr>
+          <w:b/>
+          <w:bCs/>
+        </w:rPr>
+        <w:t xml:space="preserve">correct-answer radio</w:t>
+      </w:r>
+      <w:r>
+        <w:t xml:space="preserve">.</w:t>
+      </w:r>
+      <w:r>
+        <w:t xml:space="preserve"> </w:t>
+      </w:r>
+      <w:r>
+        <w:t xml:space="preserve">-</w:t>
+      </w:r>
+      <w:r>
+        <w:t xml:space="preserve"> </w:t>
+      </w:r>
+      <w:r>
+        <w:rPr>
+          <w:b/>
+          <w:bCs/>
+        </w:rPr>
+        <w:t xml:space="preserve">Buttons: Add question</w:t>
+      </w:r>
+      <w:r>
+        <w:t xml:space="preserve"> </w:t>
+      </w:r>
+      <w:r>
+        <w:t xml:space="preserve">and</w:t>
+      </w:r>
+      <w:r>
+        <w:t xml:space="preserve"> </w:t>
+      </w:r>
+      <w:r>
+        <w:rPr>
+          <w:b/>
+          <w:bCs/>
+        </w:rPr>
+        <w:t xml:space="preserve">Create assessment</w:t>
+      </w:r>
+      <w:r>
+        <w:t xml:space="preserve"> </w:t>
+      </w:r>
+      <w:r>
+        <w:t xml:space="preserve">→</w:t>
+      </w:r>
+      <w:r>
+        <w:t xml:space="preserve"> </w:t>
+      </w:r>
+      <w:r>
+        <w:rPr>
+          <w:rStyle w:val="VerbatimChar"/>
+        </w:rPr>
+        <w:t xml:space="preserve">POST /lms/v1/assessments { …, proctored, shuffle, items }</w:t>
+      </w:r>
+      <w:r>
+        <w:t xml:space="preserve">. Validation requires a title + ≥1 question with options.</w:t>
+      </w:r>
+    </w:p>
+    <w:p>
+      <w:pPr>
+        <w:pStyle w:val="BodyText"/>
+      </w:pPr>
+      <w:r>
+        <w:rPr>
+          <w:b/>
+          <w:bCs/>
+        </w:rPr>
+        <w:t xml:space="preserve">Grade subjective answer</w:t>
+      </w:r>
+      <w:r>
+        <w:t xml:space="preserve"> </w:t>
+      </w:r>
+      <w:r>
+        <w:t xml:space="preserve">(</w:t>
+      </w:r>
+      <w:r>
+        <w:rPr>
+          <w:rStyle w:val="VerbatimChar"/>
+        </w:rPr>
+        <w:t xml:space="preserve">SubjectiveGrading</w:t>
+      </w:r>
+      <w:r>
+        <w:t xml:space="preserve">)</w:t>
+      </w:r>
+      <w:r>
+        <w:t xml:space="preserve"> </w:t>
+      </w:r>
+      <w:r>
+        <w:t xml:space="preserve">-</w:t>
+      </w:r>
+      <w:r>
+        <w:t xml:space="preserve"> </w:t>
+      </w:r>
+      <w:r>
+        <w:rPr>
+          <w:b/>
+          <w:bCs/>
+        </w:rPr>
+        <w:t xml:space="preserve">Answer id</w:t>
+      </w:r>
+      <w:r>
+        <w:t xml:space="preserve"> </w:t>
+      </w:r>
+      <w:r>
+        <w:t xml:space="preserve">input +</w:t>
+      </w:r>
+      <w:r>
+        <w:t xml:space="preserve"> </w:t>
+      </w:r>
+      <w:r>
+        <w:rPr>
+          <w:b/>
+          <w:bCs/>
+        </w:rPr>
+        <w:t xml:space="preserve">Score</w:t>
+      </w:r>
+      <w:r>
+        <w:t xml:space="preserve"> </w:t>
+      </w:r>
+      <w:r>
+        <w:t xml:space="preserve">input +</w:t>
+      </w:r>
+      <w:r>
+        <w:t xml:space="preserve"> </w:t>
+      </w:r>
+      <w:r>
+        <w:rPr>
+          <w:b/>
+          <w:bCs/>
+        </w:rPr>
+        <w:t xml:space="preserve">Grade</w:t>
+      </w:r>
+      <w:r>
+        <w:t xml:space="preserve"> </w:t>
+      </w:r>
+      <w:r>
+        <w:t xml:space="preserve">→</w:t>
+      </w:r>
+      <w:r>
+        <w:t xml:space="preserve"> </w:t>
+      </w:r>
+      <w:r>
+        <w:rPr>
+          <w:rStyle w:val="VerbatimChar"/>
+        </w:rPr>
+        <w:t xml:space="preserve">POST /lms/v1/answers/{answerId}/grade { score }</w:t>
+      </w:r>
+      <w:r>
+        <w:t xml:space="preserve">.</w:t>
+      </w:r>
+    </w:p>
+    <w:bookmarkEnd w:id="209"/>
+    <w:bookmarkStart w:id="210" w:name="candidate-drives-drive-every-control"/>
+    <w:p>
+      <w:pPr>
+        <w:pStyle w:val="Heading2"/>
+      </w:pPr>
+      <w:r>
+        <w:t xml:space="preserve">24.2 Candidate Drives (</w:t>
+      </w:r>
+      <w:r>
+        <w:rPr>
+          <w:rStyle w:val="VerbatimChar"/>
+        </w:rPr>
+        <w:t xml:space="preserve">/drive</w:t>
+      </w:r>
+      <w:r>
+        <w:t xml:space="preserve">) — every control</w:t>
+      </w:r>
+    </w:p>
+    <w:p>
+      <w:pPr>
+        <w:pStyle w:val="FirstParagraph"/>
+      </w:pPr>
+      <w:r>
+        <w:t xml:space="preserve">Student view of LARE Hire (students register via the public Attend flow, so there’s no per-drive apply here).</w:t>
+      </w:r>
+      <w:r>
+        <w:t xml:space="preserve"> </w:t>
+      </w:r>
+      <w:r>
+        <w:t xml:space="preserve">- Loads</w:t>
+      </w:r>
+      <w:r>
+        <w:t xml:space="preserve"> </w:t>
+      </w:r>
+      <w:r>
+        <w:rPr>
+          <w:rStyle w:val="VerbatimChar"/>
+        </w:rPr>
+        <w:t xml:space="preserve">GET /drive/v1/drives?status=open</w:t>
+      </w:r>
+      <w:r>
+        <w:t xml:space="preserve">; for each drive, loads its exams (</w:t>
+      </w:r>
+      <w:r>
+        <w:rPr>
+          <w:rStyle w:val="VerbatimChar"/>
+        </w:rPr>
+        <w:t xml:space="preserve">GET /drive/v1/exams?drive_id=…</w:t>
+      </w:r>
+      <w:r>
+        <w:t xml:space="preserve">).</w:t>
+      </w:r>
+      <w:r>
+        <w:t xml:space="preserve"> </w:t>
+      </w:r>
+      <w:r>
+        <w:t xml:space="preserve">-</w:t>
+      </w:r>
+      <w:r>
+        <w:t xml:space="preserve"> </w:t>
+      </w:r>
+      <w:r>
+        <w:rPr>
+          <w:b/>
+          <w:bCs/>
+        </w:rPr>
+        <w:t xml:space="preserve">Drive card</w:t>
+      </w:r>
+      <w:r>
+        <w:t xml:space="preserve"> </w:t>
+      </w:r>
+      <w:r>
+        <w:t xml:space="preserve">— building icon, status badge, title, company, venue, reporting time.</w:t>
+      </w:r>
+      <w:r>
+        <w:t xml:space="preserve"> </w:t>
+      </w:r>
+      <w:r>
+        <w:t xml:space="preserve">-</w:t>
+      </w:r>
+      <w:r>
+        <w:t xml:space="preserve"> </w:t>
+      </w:r>
+      <w:r>
+        <w:rPr>
+          <w:b/>
+          <w:bCs/>
+        </w:rPr>
+        <w:t xml:space="preserve">Assessment rows</w:t>
+      </w:r>
+      <w:r>
+        <w:t xml:space="preserve"> </w:t>
+      </w:r>
+      <w:r>
+        <w:t xml:space="preserve">— title +</w:t>
+      </w:r>
+      <w:r>
+        <w:t xml:space="preserve"> </w:t>
+      </w:r>
+      <w:r>
+        <w:t xml:space="preserve">“N sections · M min”</w:t>
+      </w:r>
+      <w:r>
+        <w:t xml:space="preserve"> </w:t>
+      </w:r>
+      <w:r>
+        <w:t xml:space="preserve">and a</w:t>
+      </w:r>
+      <w:r>
+        <w:t xml:space="preserve"> </w:t>
+      </w:r>
+      <w:r>
+        <w:rPr>
+          <w:b/>
+          <w:bCs/>
+        </w:rPr>
+        <w:t xml:space="preserve">Start</w:t>
+      </w:r>
+      <w:r>
+        <w:t xml:space="preserve"> </w:t>
+      </w:r>
+      <w:r>
+        <w:t xml:space="preserve">button (amber) → navigates to</w:t>
+      </w:r>
+      <w:r>
+        <w:t xml:space="preserve"> </w:t>
+      </w:r>
+      <w:r>
+        <w:rPr>
+          <w:rStyle w:val="VerbatimChar"/>
+        </w:rPr>
+        <w:t xml:space="preserve">/drive/test/{examId}</w:t>
+      </w:r>
+      <w:r>
+        <w:t xml:space="preserve"> </w:t>
+      </w:r>
+      <w:r>
+        <w:t xml:space="preserve">(the Exam Portal). If no exam is scheduled, a</w:t>
+      </w:r>
+      <w:r>
+        <w:t xml:space="preserve"> </w:t>
+      </w:r>
+      <w:r>
+        <w:t xml:space="preserve">“check back soon”</w:t>
+      </w:r>
+      <w:r>
+        <w:t xml:space="preserve"> </w:t>
+      </w:r>
+      <w:r>
+        <w:t xml:space="preserve">note shows.</w:t>
+      </w:r>
+      <w:r>
+        <w:t xml:space="preserve"> </w:t>
+      </w:r>
+      <w:r>
+        <w:t xml:space="preserve">- Empty state:</w:t>
+      </w:r>
+      <w:r>
+        <w:t xml:space="preserve"> </w:t>
+      </w:r>
+      <w:r>
+        <w:t xml:space="preserve">“No open drives”</w:t>
+      </w:r>
+      <w:r>
+        <w:t xml:space="preserve">.</w:t>
+      </w:r>
+    </w:p>
+    <w:bookmarkEnd w:id="210"/>
+    <w:bookmarkStart w:id="211" w:name="X4e18474b67b47079ed7200bf49274cc3dccefcb"/>
+    <w:p>
+      <w:pPr>
+        <w:pStyle w:val="Heading2"/>
+      </w:pPr>
+      <w:r>
+        <w:t xml:space="preserve">24.3 Notifications (</w:t>
+      </w:r>
+      <w:r>
+        <w:rPr>
+          <w:rStyle w:val="VerbatimChar"/>
+        </w:rPr>
+        <w:t xml:space="preserve">/lms/notifications</w:t>
+      </w:r>
+      <w:r>
+        <w:t xml:space="preserve">,</w:t>
+      </w:r>
+      <w:r>
+        <w:t xml:space="preserve"> </w:t>
+      </w:r>
+      <w:r>
+        <w:rPr>
+          <w:rStyle w:val="VerbatimChar"/>
+        </w:rPr>
+        <w:t xml:space="preserve">/drive/notifications</w:t>
+      </w:r>
+      <w:r>
+        <w:t xml:space="preserve">) — every control</w:t>
+      </w:r>
+    </w:p>
+    <w:p>
+      <w:pPr>
+        <w:pStyle w:val="Compact"/>
+        <w:numPr>
+          <w:ilvl w:val="0"/>
+          <w:numId w:val="1095"/>
+        </w:numPr>
+      </w:pPr>
+      <w:r>
+        <w:t xml:space="preserve">Loads</w:t>
+      </w:r>
+      <w:r>
+        <w:t xml:space="preserve"> </w:t>
+      </w:r>
+      <w:r>
+        <w:rPr>
+          <w:rStyle w:val="VerbatimChar"/>
+        </w:rPr>
+        <w:t xml:space="preserve">GET /notify/v1/inbox</w:t>
+      </w:r>
+      <w:r>
+        <w:t xml:space="preserve">; the header shows the unread count.</w:t>
+      </w:r>
+    </w:p>
+    <w:p>
+      <w:pPr>
+        <w:pStyle w:val="Compact"/>
+        <w:numPr>
+          <w:ilvl w:val="0"/>
+          <w:numId w:val="1095"/>
+        </w:numPr>
+      </w:pPr>
+      <w:r>
+        <w:rPr>
+          <w:b/>
+          <w:bCs/>
+        </w:rPr>
+        <w:t xml:space="preserve">Notification card</w:t>
+      </w:r>
+      <w:r>
+        <w:t xml:space="preserve"> </w:t>
+      </w:r>
+      <w:r>
+        <w:t xml:space="preserve">— template icon (badge/exam/certificate/bell), subject, a</w:t>
+      </w:r>
+      <w:r>
+        <w:t xml:space="preserve"> </w:t>
+      </w:r>
+      <w:r>
+        <w:rPr>
+          <w:b/>
+          <w:bCs/>
+        </w:rPr>
+        <w:t xml:space="preserve">new</w:t>
+      </w:r>
+      <w:r>
+        <w:t xml:space="preserve"> </w:t>
+      </w:r>
+      <w:r>
+        <w:t xml:space="preserve">badge for unread (with a tinted border), body, and a relative timestamp.</w:t>
+      </w:r>
+    </w:p>
+    <w:p>
+      <w:pPr>
+        <w:pStyle w:val="Compact"/>
+        <w:numPr>
+          <w:ilvl w:val="0"/>
+          <w:numId w:val="1095"/>
+        </w:numPr>
+      </w:pPr>
+      <w:r>
+        <w:rPr>
+          <w:b/>
+          <w:bCs/>
+        </w:rPr>
+        <w:t xml:space="preserve">Button: Read</w:t>
+      </w:r>
+      <w:r>
+        <w:t xml:space="preserve"> </w:t>
+      </w:r>
+      <w:r>
+        <w:t xml:space="preserve">(unread only) → optimistically marks read +</w:t>
+      </w:r>
+      <w:r>
+        <w:t xml:space="preserve"> </w:t>
+      </w:r>
+      <w:r>
+        <w:rPr>
+          <w:rStyle w:val="VerbatimChar"/>
+        </w:rPr>
+        <w:t xml:space="preserve">POST /notify/v1/inbox/{id}/read</w:t>
+      </w:r>
+      <w:r>
+        <w:t xml:space="preserve">.</w:t>
+      </w:r>
+    </w:p>
+    <w:p>
+      <w:pPr>
+        <w:pStyle w:val="Compact"/>
+        <w:numPr>
+          <w:ilvl w:val="0"/>
+          <w:numId w:val="1095"/>
+        </w:numPr>
+      </w:pPr>
+      <w:r>
+        <w:t xml:space="preserve">Empty state:</w:t>
+      </w:r>
+      <w:r>
+        <w:t xml:space="preserve"> </w:t>
+      </w:r>
+      <w:r>
+        <w:t xml:space="preserve">“No notifications”</w:t>
+      </w:r>
+      <w:r>
+        <w:t xml:space="preserve">.</w:t>
+      </w:r>
+    </w:p>
+    <w:bookmarkEnd w:id="211"/>
+    <w:bookmarkStart w:id="212" w:name="Xf371834d2b6a3ee801128e7049d8c52fabf4726"/>
+    <w:p>
+      <w:pPr>
+        <w:pStyle w:val="Heading2"/>
+      </w:pPr>
+      <w:r>
+        <w:t xml:space="preserve">24.4 Settings (</w:t>
+      </w:r>
+      <w:r>
+        <w:rPr>
+          <w:rStyle w:val="VerbatimChar"/>
+        </w:rPr>
+        <w:t xml:space="preserve">/lms/settings</w:t>
+      </w:r>
+      <w:r>
+        <w:t xml:space="preserve">,</w:t>
+      </w:r>
+      <w:r>
+        <w:t xml:space="preserve"> </w:t>
+      </w:r>
+      <w:r>
+        <w:rPr>
+          <w:rStyle w:val="VerbatimChar"/>
+        </w:rPr>
+        <w:t xml:space="preserve">/drive/settings</w:t>
+      </w:r>
+      <w:r>
+        <w:t xml:space="preserve">) — every control</w:t>
+      </w:r>
+    </w:p>
+    <w:p>
+      <w:pPr>
+        <w:pStyle w:val="FirstParagraph"/>
+      </w:pPr>
+      <w:r>
+        <w:t xml:space="preserve">Two cards:</w:t>
+      </w:r>
+      <w:r>
+        <w:t xml:space="preserve"> </w:t>
+      </w:r>
+      <w:r>
+        <w:rPr>
+          <w:b/>
+          <w:bCs/>
+        </w:rPr>
+        <w:t xml:space="preserve">Notification preferences</w:t>
+      </w:r>
+      <w:r>
+        <w:t xml:space="preserve"> </w:t>
+      </w:r>
+      <w:r>
+        <w:t xml:space="preserve">and</w:t>
+      </w:r>
+      <w:r>
+        <w:t xml:space="preserve"> </w:t>
+      </w:r>
+      <w:r>
+        <w:rPr>
+          <w:b/>
+          <w:bCs/>
+        </w:rPr>
+        <w:t xml:space="preserve">Account</w:t>
+      </w:r>
+      <w:r>
+        <w:t xml:space="preserve">.</w:t>
+      </w:r>
+    </w:p>
+    <w:p>
+      <w:pPr>
+        <w:pStyle w:val="BodyText"/>
+      </w:pPr>
+      <w:r>
+        <w:rPr>
+          <w:b/>
+          <w:bCs/>
+        </w:rPr>
+        <w:t xml:space="preserve">Notification preferences</w:t>
+      </w:r>
+      <w:r>
+        <w:t xml:space="preserve"> </w:t>
+      </w:r>
+      <w:r>
+        <w:t xml:space="preserve">- Toggle switches for</w:t>
+      </w:r>
+      <w:r>
+        <w:t xml:space="preserve"> </w:t>
+      </w:r>
+      <w:r>
+        <w:rPr>
+          <w:b/>
+          <w:bCs/>
+        </w:rPr>
+        <w:t xml:space="preserve">In-app inbox</w:t>
+      </w:r>
+      <w:r>
+        <w:t xml:space="preserve">,</w:t>
+      </w:r>
+      <w:r>
+        <w:t xml:space="preserve"> </w:t>
+      </w:r>
+      <w:r>
+        <w:rPr>
+          <w:b/>
+          <w:bCs/>
+        </w:rPr>
+        <w:t xml:space="preserve">Email</w:t>
+      </w:r>
+      <w:r>
+        <w:t xml:space="preserve">,</w:t>
+      </w:r>
+      <w:r>
+        <w:t xml:space="preserve"> </w:t>
+      </w:r>
+      <w:r>
+        <w:rPr>
+          <w:b/>
+          <w:bCs/>
+        </w:rPr>
+        <w:t xml:space="preserve">SMS</w:t>
+      </w:r>
+      <w:r>
+        <w:t xml:space="preserve"> </w:t>
+      </w:r>
+      <w:r>
+        <w:t xml:space="preserve">→ each</w:t>
+      </w:r>
+      <w:r>
+        <w:t xml:space="preserve"> </w:t>
+      </w:r>
+      <w:r>
+        <w:rPr>
+          <w:rStyle w:val="VerbatimChar"/>
+        </w:rPr>
+        <w:t xml:space="preserve">PUT /notify/v1/preferences { channel, enabled }</w:t>
+      </w:r>
+      <w:r>
+        <w:t xml:space="preserve"> </w:t>
+      </w:r>
+      <w:r>
+        <w:t xml:space="preserve">(optimistic; flash confirms).</w:t>
+      </w:r>
+    </w:p>
+    <w:p>
+      <w:pPr>
+        <w:pStyle w:val="BodyText"/>
+      </w:pPr>
+      <w:r>
+        <w:rPr>
+          <w:b/>
+          <w:bCs/>
+        </w:rPr>
+        <w:t xml:space="preserve">Account</w:t>
+      </w:r>
+      <w:r>
+        <w:t xml:space="preserve"> </w:t>
+      </w:r>
+      <w:r>
+        <w:t xml:space="preserve">- Read-only</w:t>
+      </w:r>
+      <w:r>
+        <w:t xml:space="preserve"> </w:t>
+      </w:r>
+      <w:r>
+        <w:rPr>
+          <w:b/>
+          <w:bCs/>
+        </w:rPr>
+        <w:t xml:space="preserve">Name</w:t>
+      </w:r>
+      <w:r>
+        <w:t xml:space="preserve"> </w:t>
+      </w:r>
+      <w:r>
+        <w:t xml:space="preserve">and</w:t>
+      </w:r>
+      <w:r>
+        <w:t xml:space="preserve"> </w:t>
+      </w:r>
+      <w:r>
+        <w:rPr>
+          <w:b/>
+          <w:bCs/>
+        </w:rPr>
+        <w:t xml:space="preserve">Email</w:t>
+      </w:r>
+      <w:r>
+        <w:t xml:space="preserve"> </w:t>
+      </w:r>
+      <w:r>
+        <w:t xml:space="preserve">rows.</w:t>
+      </w:r>
+      <w:r>
+        <w:t xml:space="preserve"> </w:t>
+      </w:r>
+      <w:r>
+        <w:t xml:space="preserve">-</w:t>
+      </w:r>
+      <w:r>
+        <w:t xml:space="preserve"> </w:t>
+      </w:r>
+      <w:r>
+        <w:rPr>
+          <w:b/>
+          <w:bCs/>
+        </w:rPr>
+        <w:t xml:space="preserve">Email verified</w:t>
+      </w:r>
+      <w:r>
+        <w:t xml:space="preserve"> </w:t>
+      </w:r>
+      <w:r>
+        <w:t xml:space="preserve">— a</w:t>
+      </w:r>
+      <w:r>
+        <w:t xml:space="preserve"> </w:t>
+      </w:r>
+      <w:r>
+        <w:t xml:space="preserve">“verified”</w:t>
+      </w:r>
+      <w:r>
+        <w:t xml:space="preserve"> </w:t>
+      </w:r>
+      <w:r>
+        <w:t xml:space="preserve">badge, or a</w:t>
+      </w:r>
+      <w:r>
+        <w:t xml:space="preserve"> </w:t>
+      </w:r>
+      <w:r>
+        <w:rPr>
+          <w:b/>
+          <w:bCs/>
+        </w:rPr>
+        <w:t xml:space="preserve">Verify now</w:t>
+      </w:r>
+      <w:r>
+        <w:t xml:space="preserve"> </w:t>
+      </w:r>
+      <w:r>
+        <w:t xml:space="preserve">button →</w:t>
+      </w:r>
+      <w:r>
+        <w:t xml:space="preserve"> </w:t>
+      </w:r>
+      <w:r>
+        <w:rPr>
+          <w:rStyle w:val="VerbatimChar"/>
+        </w:rPr>
+        <w:t xml:space="preserve">POST /auth/v1/email/verify/request</w:t>
+      </w:r>
+      <w:r>
+        <w:t xml:space="preserve"> </w:t>
+      </w:r>
+      <w:r>
+        <w:t xml:space="preserve">(becomes</w:t>
+      </w:r>
+      <w:r>
+        <w:t xml:space="preserve"> </w:t>
+      </w:r>
+      <w:r>
+        <w:t xml:space="preserve">“Sent”</w:t>
+      </w:r>
+      <w:r>
+        <w:t xml:space="preserve">).</w:t>
+      </w:r>
+      <w:r>
+        <w:t xml:space="preserve"> </w:t>
+      </w:r>
+      <w:r>
+        <w:t xml:space="preserve">-</w:t>
+      </w:r>
+      <w:r>
+        <w:t xml:space="preserve"> </w:t>
+      </w:r>
+      <w:r>
+        <w:rPr>
+          <w:b/>
+          <w:bCs/>
+        </w:rPr>
+        <w:t xml:space="preserve">Roles</w:t>
+      </w:r>
+      <w:r>
+        <w:t xml:space="preserve"> </w:t>
+      </w:r>
+      <w:r>
+        <w:t xml:space="preserve">— the user’s role badges.</w:t>
+      </w:r>
+    </w:p>
+    <w:p>
+      <w:r>
         <w:pict>
           <v:rect style="width:0;height:1.5pt" o:hralign="center" o:hrstd="t" o:hr="t"/>
         </w:pict>
@@ -38958,8 +40241,8 @@
         <w:t xml:space="preserve">End of document. Prepared for LARE Cloud Solutions - a unit of LARE Consulting &amp; Technology Pvt. Ltd.</w:t>
       </w:r>
     </w:p>
-    <w:bookmarkEnd w:id="207"/>
-    <w:bookmarkEnd w:id="208"/>
+    <w:bookmarkEnd w:id="212"/>
+    <w:bookmarkEnd w:id="213"/>
     <w:sectPr>
       <w:footnotePr>
         <w:numRestart w:val="eachSect"/>
@@ -39676,6 +40959,9 @@
     <w:abstractNumId w:val="991"/>
   </w:num>
   <w:num w:numId="1094">
+    <w:abstractNumId w:val="991"/>
+  </w:num>
+  <w:num w:numId="1095">
     <w:abstractNumId w:val="991"/>
   </w:num>
 </w:numbering>

</xml_diff>

<commit_message>
docs: screen reference part 7 (auth, app chooser, opportunities, public verify)
Every page's buttons now documented across sections 9 and 19-25.

Co-Authored-By: Claude Opus 4.8 <noreply@anthropic.com>
</commit_message>
<xml_diff>
--- a/docs/LARE-Documentation.docx
+++ b/docs/LARE-Documentation.docx
@@ -40224,6 +40224,1325 @@
     </w:p>
     <w:p>
       <w:r>
+        <w:br w:type="page"/>
+      </w:r>
+    </w:p>
+    <w:bookmarkEnd w:id="212"/>
+    <w:bookmarkEnd w:id="213"/>
+    <w:bookmarkStart w:id="223" w:name="Xca3fe1300bdb27422df66a8b6667ebf2e7e34e2"/>
+    <w:p>
+      <w:pPr>
+        <w:pStyle w:val="Heading1"/>
+      </w:pPr>
+      <w:r>
+        <w:t xml:space="preserve">25. Detailed Screen Reference — Authentication, App Chooser, Opportunities &amp; Public Verify</w:t>
+      </w:r>
+    </w:p>
+    <w:bookmarkStart w:id="214" w:name="login-login"/>
+    <w:p>
+      <w:pPr>
+        <w:pStyle w:val="Heading2"/>
+      </w:pPr>
+      <w:r>
+        <w:t xml:space="preserve">25.1 Login (</w:t>
+      </w:r>
+      <w:r>
+        <w:rPr>
+          <w:rStyle w:val="VerbatimChar"/>
+        </w:rPr>
+        <w:t xml:space="preserve">/login</w:t>
+      </w:r>
+      <w:r>
+        <w:t xml:space="preserve">)</w:t>
+      </w:r>
+    </w:p>
+    <w:p>
+      <w:pPr>
+        <w:pStyle w:val="Compact"/>
+        <w:numPr>
+          <w:ilvl w:val="0"/>
+          <w:numId w:val="1096"/>
+        </w:numPr>
+      </w:pPr>
+      <w:r>
+        <w:t xml:space="preserve">Framed by</w:t>
+      </w:r>
+      <w:r>
+        <w:t xml:space="preserve"> </w:t>
+      </w:r>
+      <w:r>
+        <w:rPr>
+          <w:b/>
+          <w:bCs/>
+        </w:rPr>
+        <w:t xml:space="preserve">AuthLayout</w:t>
+      </w:r>
+      <w:r>
+        <w:t xml:space="preserve"> </w:t>
+      </w:r>
+      <w:r>
+        <w:t xml:space="preserve">(brand panel + form). Fields:</w:t>
+      </w:r>
+      <w:r>
+        <w:t xml:space="preserve"> </w:t>
+      </w:r>
+      <w:r>
+        <w:rPr>
+          <w:b/>
+          <w:bCs/>
+        </w:rPr>
+        <w:t xml:space="preserve">Email</w:t>
+      </w:r>
+      <w:r>
+        <w:t xml:space="preserve">,</w:t>
+      </w:r>
+      <w:r>
+        <w:t xml:space="preserve"> </w:t>
+      </w:r>
+      <w:r>
+        <w:rPr>
+          <w:b/>
+          <w:bCs/>
+        </w:rPr>
+        <w:t xml:space="preserve">Password</w:t>
+      </w:r>
+      <w:r>
+        <w:t xml:space="preserve"> </w:t>
+      </w:r>
+      <w:r>
+        <w:t xml:space="preserve">(with</w:t>
+      </w:r>
+      <w:r>
+        <w:t xml:space="preserve"> </w:t>
+      </w:r>
+      <w:r>
+        <w:rPr>
+          <w:rStyle w:val="VerbatimChar"/>
+        </w:rPr>
+        <w:t xml:space="preserve">autoComplete</w:t>
+      </w:r>
+      <w:r>
+        <w:t xml:space="preserve">).</w:t>
+      </w:r>
+    </w:p>
+    <w:p>
+      <w:pPr>
+        <w:pStyle w:val="Compact"/>
+        <w:numPr>
+          <w:ilvl w:val="0"/>
+          <w:numId w:val="1096"/>
+        </w:numPr>
+      </w:pPr>
+      <w:r>
+        <w:rPr>
+          <w:b/>
+          <w:bCs/>
+        </w:rPr>
+        <w:t xml:space="preserve">Link: Forgot password?</w:t>
+      </w:r>
+      <w:r>
+        <w:t xml:space="preserve"> </w:t>
+      </w:r>
+      <w:r>
+        <w:t xml:space="preserve">→</w:t>
+      </w:r>
+      <w:r>
+        <w:t xml:space="preserve"> </w:t>
+      </w:r>
+      <w:r>
+        <w:rPr>
+          <w:rStyle w:val="VerbatimChar"/>
+        </w:rPr>
+        <w:t xml:space="preserve">/forgot-password</w:t>
+      </w:r>
+      <w:r>
+        <w:t xml:space="preserve">.</w:t>
+      </w:r>
+      <w:r>
+        <w:t xml:space="preserve"> </w:t>
+      </w:r>
+      <w:r>
+        <w:rPr>
+          <w:b/>
+          <w:bCs/>
+        </w:rPr>
+        <w:t xml:space="preserve">Link: Create an account</w:t>
+      </w:r>
+      <w:r>
+        <w:t xml:space="preserve"> </w:t>
+      </w:r>
+      <w:r>
+        <w:t xml:space="preserve">→</w:t>
+      </w:r>
+      <w:r>
+        <w:t xml:space="preserve"> </w:t>
+      </w:r>
+      <w:r>
+        <w:rPr>
+          <w:rStyle w:val="VerbatimChar"/>
+        </w:rPr>
+        <w:t xml:space="preserve">/register</w:t>
+      </w:r>
+      <w:r>
+        <w:t xml:space="preserve">.</w:t>
+      </w:r>
+    </w:p>
+    <w:p>
+      <w:pPr>
+        <w:pStyle w:val="Compact"/>
+        <w:numPr>
+          <w:ilvl w:val="0"/>
+          <w:numId w:val="1096"/>
+        </w:numPr>
+      </w:pPr>
+      <w:r>
+        <w:rPr>
+          <w:b/>
+          <w:bCs/>
+        </w:rPr>
+        <w:t xml:space="preserve">Button: Sign in</w:t>
+      </w:r>
+      <w:r>
+        <w:t xml:space="preserve"> </w:t>
+      </w:r>
+      <w:r>
+        <w:t xml:space="preserve">→</w:t>
+      </w:r>
+      <w:r>
+        <w:t xml:space="preserve"> </w:t>
+      </w:r>
+      <w:r>
+        <w:rPr>
+          <w:rStyle w:val="VerbatimChar"/>
+        </w:rPr>
+        <w:t xml:space="preserve">useAuth().login(email, password)</w:t>
+      </w:r>
+      <w:r>
+        <w:t xml:space="preserve"> </w:t>
+      </w:r>
+      <w:r>
+        <w:t xml:space="preserve">(</w:t>
+      </w:r>
+      <w:r>
+        <w:rPr>
+          <w:rStyle w:val="VerbatimChar"/>
+        </w:rPr>
+        <w:t xml:space="preserve">POST /auth/v1/login</w:t>
+      </w:r>
+      <w:r>
+        <w:t xml:space="preserve">), then navigates to</w:t>
+      </w:r>
+      <w:r>
+        <w:t xml:space="preserve"> </w:t>
+      </w:r>
+      <w:r>
+        <w:rPr>
+          <w:rStyle w:val="VerbatimChar"/>
+        </w:rPr>
+        <w:t xml:space="preserve">/apps</w:t>
+      </w:r>
+      <w:r>
+        <w:t xml:space="preserve">. Errors render inline.</w:t>
+      </w:r>
+    </w:p>
+    <w:bookmarkEnd w:id="214"/>
+    <w:bookmarkStart w:id="215" w:name="register-register"/>
+    <w:p>
+      <w:pPr>
+        <w:pStyle w:val="Heading2"/>
+      </w:pPr>
+      <w:r>
+        <w:t xml:space="preserve">25.2 Register (</w:t>
+      </w:r>
+      <w:r>
+        <w:rPr>
+          <w:rStyle w:val="VerbatimChar"/>
+        </w:rPr>
+        <w:t xml:space="preserve">/register</w:t>
+      </w:r>
+      <w:r>
+        <w:t xml:space="preserve">)</w:t>
+      </w:r>
+    </w:p>
+    <w:p>
+      <w:pPr>
+        <w:pStyle w:val="Compact"/>
+        <w:numPr>
+          <w:ilvl w:val="0"/>
+          <w:numId w:val="1097"/>
+        </w:numPr>
+      </w:pPr>
+      <w:r>
+        <w:t xml:space="preserve">Fields:</w:t>
+      </w:r>
+      <w:r>
+        <w:t xml:space="preserve"> </w:t>
+      </w:r>
+      <w:r>
+        <w:rPr>
+          <w:b/>
+          <w:bCs/>
+        </w:rPr>
+        <w:t xml:space="preserve">Full name</w:t>
+      </w:r>
+      <w:r>
+        <w:t xml:space="preserve">,</w:t>
+      </w:r>
+      <w:r>
+        <w:t xml:space="preserve"> </w:t>
+      </w:r>
+      <w:r>
+        <w:rPr>
+          <w:b/>
+          <w:bCs/>
+        </w:rPr>
+        <w:t xml:space="preserve">Email</w:t>
+      </w:r>
+      <w:r>
+        <w:t xml:space="preserve">,</w:t>
+      </w:r>
+      <w:r>
+        <w:t xml:space="preserve"> </w:t>
+      </w:r>
+      <w:r>
+        <w:rPr>
+          <w:b/>
+          <w:bCs/>
+        </w:rPr>
+        <w:t xml:space="preserve">Password</w:t>
+      </w:r>
+      <w:r>
+        <w:t xml:space="preserve"> </w:t>
+      </w:r>
+      <w:r>
+        <w:t xml:space="preserve">(client-side validation: ≥8 chars).</w:t>
+      </w:r>
+    </w:p>
+    <w:p>
+      <w:pPr>
+        <w:pStyle w:val="Compact"/>
+        <w:numPr>
+          <w:ilvl w:val="0"/>
+          <w:numId w:val="1097"/>
+        </w:numPr>
+      </w:pPr>
+      <w:r>
+        <w:rPr>
+          <w:b/>
+          <w:bCs/>
+        </w:rPr>
+        <w:t xml:space="preserve">Button: Create account</w:t>
+      </w:r>
+      <w:r>
+        <w:t xml:space="preserve"> </w:t>
+      </w:r>
+      <w:r>
+        <w:t xml:space="preserve">→</w:t>
+      </w:r>
+      <w:r>
+        <w:t xml:space="preserve"> </w:t>
+      </w:r>
+      <w:r>
+        <w:rPr>
+          <w:rStyle w:val="VerbatimChar"/>
+        </w:rPr>
+        <w:t xml:space="preserve">useAuth().register(email, password, full_name)</w:t>
+      </w:r>
+      <w:r>
+        <w:t xml:space="preserve"> </w:t>
+      </w:r>
+      <w:r>
+        <w:t xml:space="preserve">(</w:t>
+      </w:r>
+      <w:r>
+        <w:rPr>
+          <w:rStyle w:val="VerbatimChar"/>
+        </w:rPr>
+        <w:t xml:space="preserve">POST /auth/v1/register</w:t>
+      </w:r>
+      <w:r>
+        <w:t xml:space="preserve">), then</w:t>
+      </w:r>
+      <w:r>
+        <w:t xml:space="preserve"> </w:t>
+      </w:r>
+      <w:r>
+        <w:rPr>
+          <w:rStyle w:val="VerbatimChar"/>
+        </w:rPr>
+        <w:t xml:space="preserve">/apps</w:t>
+      </w:r>
+      <w:r>
+        <w:t xml:space="preserve">.</w:t>
+      </w:r>
+    </w:p>
+    <w:p>
+      <w:pPr>
+        <w:pStyle w:val="Compact"/>
+        <w:numPr>
+          <w:ilvl w:val="0"/>
+          <w:numId w:val="1097"/>
+        </w:numPr>
+      </w:pPr>
+      <w:r>
+        <w:rPr>
+          <w:b/>
+          <w:bCs/>
+        </w:rPr>
+        <w:t xml:space="preserve">Link: Sign in</w:t>
+      </w:r>
+      <w:r>
+        <w:t xml:space="preserve"> </w:t>
+      </w:r>
+      <w:r>
+        <w:t xml:space="preserve">→</w:t>
+      </w:r>
+      <w:r>
+        <w:t xml:space="preserve"> </w:t>
+      </w:r>
+      <w:r>
+        <w:rPr>
+          <w:rStyle w:val="VerbatimChar"/>
+        </w:rPr>
+        <w:t xml:space="preserve">/login</w:t>
+      </w:r>
+      <w:r>
+        <w:t xml:space="preserve">.</w:t>
+      </w:r>
+    </w:p>
+    <w:bookmarkEnd w:id="215"/>
+    <w:bookmarkStart w:id="216" w:name="forgot-password-forgot-password"/>
+    <w:p>
+      <w:pPr>
+        <w:pStyle w:val="Heading2"/>
+      </w:pPr>
+      <w:r>
+        <w:t xml:space="preserve">25.3 Forgot Password (</w:t>
+      </w:r>
+      <w:r>
+        <w:rPr>
+          <w:rStyle w:val="VerbatimChar"/>
+        </w:rPr>
+        <w:t xml:space="preserve">/forgot-password</w:t>
+      </w:r>
+      <w:r>
+        <w:t xml:space="preserve">)</w:t>
+      </w:r>
+    </w:p>
+    <w:p>
+      <w:pPr>
+        <w:pStyle w:val="Compact"/>
+        <w:numPr>
+          <w:ilvl w:val="0"/>
+          <w:numId w:val="1098"/>
+        </w:numPr>
+      </w:pPr>
+      <w:r>
+        <w:rPr>
+          <w:b/>
+          <w:bCs/>
+        </w:rPr>
+        <w:t xml:space="preserve">Send reset link</w:t>
+      </w:r>
+      <w:r>
+        <w:t xml:space="preserve"> </w:t>
+      </w:r>
+      <w:r>
+        <w:t xml:space="preserve">→</w:t>
+      </w:r>
+      <w:r>
+        <w:t xml:space="preserve"> </w:t>
+      </w:r>
+      <w:r>
+        <w:rPr>
+          <w:rStyle w:val="VerbatimChar"/>
+        </w:rPr>
+        <w:t xml:space="preserve">POST /auth/v1/password/forgot { email }</w:t>
+      </w:r>
+      <w:r>
+        <w:t xml:space="preserve">. With a token,</w:t>
+      </w:r>
+      <w:r>
+        <w:t xml:space="preserve"> </w:t>
+      </w:r>
+      <w:r>
+        <w:rPr>
+          <w:b/>
+          <w:bCs/>
+        </w:rPr>
+        <w:t xml:space="preserve">Reset password</w:t>
+      </w:r>
+      <w:r>
+        <w:t xml:space="preserve"> </w:t>
+      </w:r>
+      <w:r>
+        <w:t xml:space="preserve">→</w:t>
+      </w:r>
+      <w:r>
+        <w:t xml:space="preserve"> </w:t>
+      </w:r>
+      <w:r>
+        <w:rPr>
+          <w:rStyle w:val="VerbatimChar"/>
+        </w:rPr>
+        <w:t xml:space="preserve">POST /auth/v1/password/reset { token, new_password }</w:t>
+      </w:r>
+      <w:r>
+        <w:t xml:space="preserve">. Link back to</w:t>
+      </w:r>
+      <w:r>
+        <w:t xml:space="preserve"> </w:t>
+      </w:r>
+      <w:r>
+        <w:rPr>
+          <w:b/>
+          <w:bCs/>
+        </w:rPr>
+        <w:t xml:space="preserve">Sign in</w:t>
+      </w:r>
+      <w:r>
+        <w:t xml:space="preserve">.</w:t>
+      </w:r>
+    </w:p>
+    <w:bookmarkEnd w:id="216"/>
+    <w:bookmarkStart w:id="217" w:name="app-chooser-apps"/>
+    <w:p>
+      <w:pPr>
+        <w:pStyle w:val="Heading2"/>
+      </w:pPr>
+      <w:r>
+        <w:t xml:space="preserve">25.4 App Chooser (</w:t>
+      </w:r>
+      <w:r>
+        <w:rPr>
+          <w:rStyle w:val="VerbatimChar"/>
+        </w:rPr>
+        <w:t xml:space="preserve">/apps</w:t>
+      </w:r>
+      <w:r>
+        <w:t xml:space="preserve">)</w:t>
+      </w:r>
+    </w:p>
+    <w:p>
+      <w:pPr>
+        <w:pStyle w:val="Compact"/>
+        <w:numPr>
+          <w:ilvl w:val="0"/>
+          <w:numId w:val="1099"/>
+        </w:numPr>
+      </w:pPr>
+      <w:r>
+        <w:rPr>
+          <w:b/>
+          <w:bCs/>
+        </w:rPr>
+        <w:t xml:space="preserve">Header</w:t>
+      </w:r>
+      <w:r>
+        <w:t xml:space="preserve"> </w:t>
+      </w:r>
+      <w:r>
+        <w:t xml:space="preserve">— the LARE</w:t>
+      </w:r>
+      <w:r>
+        <w:t xml:space="preserve"> </w:t>
+      </w:r>
+      <w:r>
+        <w:rPr>
+          <w:b/>
+          <w:bCs/>
+        </w:rPr>
+        <w:t xml:space="preserve">Logo</w:t>
+      </w:r>
+      <w:r>
+        <w:t xml:space="preserve">, the user’s name/email, and a</w:t>
+      </w:r>
+      <w:r>
+        <w:t xml:space="preserve"> </w:t>
+      </w:r>
+      <w:r>
+        <w:rPr>
+          <w:b/>
+          <w:bCs/>
+        </w:rPr>
+        <w:t xml:space="preserve">Sign out</w:t>
+      </w:r>
+      <w:r>
+        <w:t xml:space="preserve"> </w:t>
+      </w:r>
+      <w:r>
+        <w:t xml:space="preserve">button →</w:t>
+      </w:r>
+      <w:r>
+        <w:t xml:space="preserve"> </w:t>
+      </w:r>
+      <w:r>
+        <w:rPr>
+          <w:rStyle w:val="VerbatimChar"/>
+        </w:rPr>
+        <w:t xml:space="preserve">useAuth().logout()</w:t>
+      </w:r>
+      <w:r>
+        <w:t xml:space="preserve"> </w:t>
+      </w:r>
+      <w:r>
+        <w:t xml:space="preserve">then</w:t>
+      </w:r>
+      <w:r>
+        <w:t xml:space="preserve"> </w:t>
+      </w:r>
+      <w:r>
+        <w:rPr>
+          <w:rStyle w:val="VerbatimChar"/>
+        </w:rPr>
+        <w:t xml:space="preserve">/login</w:t>
+      </w:r>
+      <w:r>
+        <w:t xml:space="preserve">.</w:t>
+      </w:r>
+    </w:p>
+    <w:p>
+      <w:pPr>
+        <w:pStyle w:val="Compact"/>
+        <w:numPr>
+          <w:ilvl w:val="0"/>
+          <w:numId w:val="1099"/>
+        </w:numPr>
+      </w:pPr>
+      <w:r>
+        <w:rPr>
+          <w:b/>
+          <w:bCs/>
+        </w:rPr>
+        <w:t xml:space="preserve">Two app cards</w:t>
+      </w:r>
+      <w:r>
+        <w:t xml:space="preserve"> </w:t>
+      </w:r>
+      <w:r>
+        <w:t xml:space="preserve">(the products never mix on screen):</w:t>
+      </w:r>
+    </w:p>
+    <w:p>
+      <w:pPr>
+        <w:pStyle w:val="Compact"/>
+        <w:numPr>
+          <w:ilvl w:val="1"/>
+          <w:numId w:val="1100"/>
+        </w:numPr>
+      </w:pPr>
+      <w:r>
+        <w:rPr>
+          <w:b/>
+          <w:bCs/>
+        </w:rPr>
+        <w:t xml:space="preserve">LARE Learn</w:t>
+      </w:r>
+      <w:r>
+        <w:t xml:space="preserve"> </w:t>
+      </w:r>
+      <w:r>
+        <w:t xml:space="preserve">→ navigates to</w:t>
+      </w:r>
+      <w:r>
+        <w:t xml:space="preserve"> </w:t>
+      </w:r>
+      <w:r>
+        <w:rPr>
+          <w:rStyle w:val="VerbatimChar"/>
+        </w:rPr>
+        <w:t xml:space="preserve">/lms</w:t>
+      </w:r>
+      <w:r>
+        <w:t xml:space="preserve"> </w:t>
+      </w:r>
+      <w:r>
+        <w:t xml:space="preserve">(</w:t>
+      </w:r>
+      <w:r>
+        <w:t xml:space="preserve">“Four years. One platform. Career-ready.”</w:t>
+      </w:r>
+      <w:r>
+        <w:t xml:space="preserve">).</w:t>
+      </w:r>
+    </w:p>
+    <w:p>
+      <w:pPr>
+        <w:pStyle w:val="Compact"/>
+        <w:numPr>
+          <w:ilvl w:val="1"/>
+          <w:numId w:val="1100"/>
+        </w:numPr>
+      </w:pPr>
+      <w:r>
+        <w:rPr>
+          <w:b/>
+          <w:bCs/>
+        </w:rPr>
+        <w:t xml:space="preserve">LARE Hire</w:t>
+      </w:r>
+      <w:r>
+        <w:t xml:space="preserve"> </w:t>
+      </w:r>
+      <w:r>
+        <w:t xml:space="preserve">→ navigates to</w:t>
+      </w:r>
+      <w:r>
+        <w:t xml:space="preserve"> </w:t>
+      </w:r>
+      <w:r>
+        <w:rPr>
+          <w:rStyle w:val="VerbatimChar"/>
+        </w:rPr>
+        <w:t xml:space="preserve">/drive</w:t>
+      </w:r>
+      <w:r>
+        <w:t xml:space="preserve"> </w:t>
+      </w:r>
+      <w:r>
+        <w:t xml:space="preserve">(</w:t>
+      </w:r>
+      <w:r>
+        <w:t xml:space="preserve">“Find the right talent, faster.”</w:t>
+      </w:r>
+      <w:r>
+        <w:t xml:space="preserve">).</w:t>
+      </w:r>
+    </w:p>
+    <w:bookmarkEnd w:id="217"/>
+    <w:bookmarkStart w:id="218" w:name="attend-drive-driveattend-public"/>
+    <w:p>
+      <w:pPr>
+        <w:pStyle w:val="Heading2"/>
+      </w:pPr>
+      <w:r>
+        <w:t xml:space="preserve">25.5 Attend Drive (</w:t>
+      </w:r>
+      <w:r>
+        <w:rPr>
+          <w:rStyle w:val="VerbatimChar"/>
+        </w:rPr>
+        <w:t xml:space="preserve">/drive/attend</w:t>
+      </w:r>
+      <w:r>
+        <w:t xml:space="preserve">) — public</w:t>
+      </w:r>
+    </w:p>
+    <w:p>
+      <w:pPr>
+        <w:pStyle w:val="Compact"/>
+        <w:numPr>
+          <w:ilvl w:val="0"/>
+          <w:numId w:val="1101"/>
+        </w:numPr>
+      </w:pPr>
+      <w:r>
+        <w:t xml:space="preserve">A public, no-login form for walk-in campus drives: drive code + the student’s own details.</w:t>
+      </w:r>
+    </w:p>
+    <w:p>
+      <w:pPr>
+        <w:pStyle w:val="Compact"/>
+        <w:numPr>
+          <w:ilvl w:val="0"/>
+          <w:numId w:val="1101"/>
+        </w:numPr>
+      </w:pPr>
+      <w:r>
+        <w:rPr>
+          <w:b/>
+          <w:bCs/>
+        </w:rPr>
+        <w:t xml:space="preserve">Button: Attend</w:t>
+      </w:r>
+      <w:r>
+        <w:t xml:space="preserve"> </w:t>
+      </w:r>
+      <w:r>
+        <w:t xml:space="preserve">→</w:t>
+      </w:r>
+      <w:r>
+        <w:t xml:space="preserve"> </w:t>
+      </w:r>
+      <w:r>
+        <w:rPr>
+          <w:rStyle w:val="VerbatimChar"/>
+        </w:rPr>
+        <w:t xml:space="preserve">POST /drive/v1/attend</w:t>
+      </w:r>
+      <w:r>
+        <w:t xml:space="preserve"> </w:t>
+      </w:r>
+      <w:r>
+        <w:t xml:space="preserve">(issues a Student ID + a scoped session, returns access/refresh tokens).</w:t>
+      </w:r>
+      <w:r>
+        <w:t xml:space="preserve"> </w:t>
+      </w:r>
+      <w:r>
+        <w:rPr>
+          <w:b/>
+          <w:bCs/>
+        </w:rPr>
+        <w:t xml:space="preserve">Button/flow: Resume</w:t>
+      </w:r>
+      <w:r>
+        <w:t xml:space="preserve"> </w:t>
+      </w:r>
+      <w:r>
+        <w:t xml:space="preserve">→</w:t>
+      </w:r>
+      <w:r>
+        <w:t xml:space="preserve"> </w:t>
+      </w:r>
+      <w:r>
+        <w:rPr>
+          <w:rStyle w:val="VerbatimChar"/>
+        </w:rPr>
+        <w:t xml:space="preserve">POST /drive/v1/attend/resume { student_id }</w:t>
+      </w:r>
+      <w:r>
+        <w:t xml:space="preserve">.</w:t>
+      </w:r>
+    </w:p>
+    <w:bookmarkEnd w:id="218"/>
+    <w:bookmarkStart w:id="219" w:name="matched-opportunities-driveopportunities"/>
+    <w:p>
+      <w:pPr>
+        <w:pStyle w:val="Heading2"/>
+      </w:pPr>
+      <w:r>
+        <w:t xml:space="preserve">25.6 Matched Opportunities (</w:t>
+      </w:r>
+      <w:r>
+        <w:rPr>
+          <w:rStyle w:val="VerbatimChar"/>
+        </w:rPr>
+        <w:t xml:space="preserve">/drive/opportunities</w:t>
+      </w:r>
+      <w:r>
+        <w:t xml:space="preserve">)</w:t>
+      </w:r>
+    </w:p>
+    <w:p>
+      <w:pPr>
+        <w:pStyle w:val="FirstParagraph"/>
+      </w:pPr>
+      <w:r>
+        <w:t xml:space="preserve">LARE Hire Skills-to-Opportunity — ranks</w:t>
+      </w:r>
+      <w:r>
+        <w:t xml:space="preserve"> </w:t>
+      </w:r>
+      <w:r>
+        <w:rPr>
+          <w:b/>
+          <w:bCs/>
+        </w:rPr>
+        <w:t xml:space="preserve">open drives</w:t>
+      </w:r>
+      <w:r>
+        <w:t xml:space="preserve"> </w:t>
+      </w:r>
+      <w:r>
+        <w:t xml:space="preserve">by how well the candidate’s drive-exam skills fit each role (Hire data only).</w:t>
+      </w:r>
+      <w:r>
+        <w:t xml:space="preserve"> </w:t>
+      </w:r>
+      <w:r>
+        <w:t xml:space="preserve">-</w:t>
+      </w:r>
+      <w:r>
+        <w:t xml:space="preserve"> </w:t>
+      </w:r>
+      <w:r>
+        <w:rPr>
+          <w:rStyle w:val="VerbatimChar"/>
+        </w:rPr>
+        <w:t xml:space="preserve">GET /drive/v1/opportunities</w:t>
+      </w:r>
+      <w:r>
+        <w:t xml:space="preserve"> </w:t>
+      </w:r>
+      <w:r>
+        <w:t xml:space="preserve">→</w:t>
+      </w:r>
+      <w:r>
+        <w:t xml:space="preserve"> </w:t>
+      </w:r>
+      <w:r>
+        <w:rPr>
+          <w:rStyle w:val="VerbatimChar"/>
+        </w:rPr>
+        <w:t xml:space="preserve">{ matches, unspecified, has_skill_data }</w:t>
+      </w:r>
+      <w:r>
+        <w:t xml:space="preserve">.</w:t>
+      </w:r>
+      <w:r>
+        <w:t xml:space="preserve"> </w:t>
+      </w:r>
+      <w:r>
+        <w:t xml:space="preserve">- A hint card shows when there’s no skill data yet (</w:t>
+      </w:r>
+      <w:r>
+        <w:t xml:space="preserve">“take part in a drive’s tests…”</w:t>
+      </w:r>
+      <w:r>
+        <w:t xml:space="preserve">).</w:t>
+      </w:r>
+      <w:r>
+        <w:t xml:space="preserve"> </w:t>
+      </w:r>
+      <w:r>
+        <w:t xml:space="preserve">-</w:t>
+      </w:r>
+      <w:r>
+        <w:t xml:space="preserve"> </w:t>
+      </w:r>
+      <w:r>
+        <w:rPr>
+          <w:b/>
+          <w:bCs/>
+        </w:rPr>
+        <w:t xml:space="preserve">Match card</w:t>
+      </w:r>
+      <w:r>
+        <w:t xml:space="preserve"> </w:t>
+      </w:r>
+      <w:r>
+        <w:t xml:space="preserve">(per drive) — title, company · reporting time · venue, a large</w:t>
+      </w:r>
+      <w:r>
+        <w:t xml:space="preserve"> </w:t>
+      </w:r>
+      <w:r>
+        <w:rPr>
+          <w:b/>
+          <w:bCs/>
+        </w:rPr>
+        <w:t xml:space="preserve">match %</w:t>
+      </w:r>
+      <w:r>
+        <w:t xml:space="preserve"> </w:t>
+      </w:r>
+      <w:r>
+        <w:t xml:space="preserve">(teal ≥75 / amber ≥45 / rose below) with a bar, role chips (title · CTC), and two columns:</w:t>
+      </w:r>
+      <w:r>
+        <w:t xml:space="preserve"> </w:t>
+      </w:r>
+      <w:r>
+        <w:rPr>
+          <w:b/>
+          <w:bCs/>
+        </w:rPr>
+        <w:t xml:space="preserve">Your matching skills</w:t>
+      </w:r>
+      <w:r>
+        <w:t xml:space="preserve"> </w:t>
+      </w:r>
+      <w:r>
+        <w:t xml:space="preserve">(name + mastery) and</w:t>
+      </w:r>
+      <w:r>
+        <w:t xml:space="preserve"> </w:t>
+      </w:r>
+      <w:r>
+        <w:rPr>
+          <w:b/>
+          <w:bCs/>
+        </w:rPr>
+        <w:t xml:space="preserve">Skills to build</w:t>
+      </w:r>
+      <w:r>
+        <w:t xml:space="preserve"> </w:t>
+      </w:r>
+      <w:r>
+        <w:t xml:space="preserve">(name + mastery).</w:t>
+      </w:r>
+      <w:r>
+        <w:t xml:space="preserve"> </w:t>
+      </w:r>
+      <w:r>
+        <w:t xml:space="preserve">“You meet every required skill!”</w:t>
+      </w:r>
+      <w:r>
+        <w:t xml:space="preserve"> </w:t>
+      </w:r>
+      <w:r>
+        <w:t xml:space="preserve">when none missing.</w:t>
+      </w:r>
+      <w:r>
+        <w:t xml:space="preserve"> </w:t>
+      </w:r>
+      <w:r>
+        <w:t xml:space="preserve">-</w:t>
+      </w:r>
+      <w:r>
+        <w:t xml:space="preserve"> </w:t>
+      </w:r>
+      <w:r>
+        <w:rPr>
+          <w:b/>
+          <w:bCs/>
+        </w:rPr>
+        <w:t xml:space="preserve">Other open drives</w:t>
+      </w:r>
+      <w:r>
+        <w:t xml:space="preserve"> </w:t>
+      </w:r>
+      <w:r>
+        <w:t xml:space="preserve">— drives with no skills specified for matching.</w:t>
+      </w:r>
+      <w:r>
+        <w:t xml:space="preserve"> </w:t>
+      </w:r>
+      <w:r>
+        <w:t xml:space="preserve">-</w:t>
+      </w:r>
+      <w:r>
+        <w:t xml:space="preserve"> </w:t>
+      </w:r>
+      <w:r>
+        <w:rPr>
+          <w:b/>
+          <w:bCs/>
+        </w:rPr>
+        <w:t xml:space="preserve">Header button: My Drives</w:t>
+      </w:r>
+      <w:r>
+        <w:t xml:space="preserve"> </w:t>
+      </w:r>
+      <w:r>
+        <w:t xml:space="preserve">→</w:t>
+      </w:r>
+      <w:r>
+        <w:t xml:space="preserve"> </w:t>
+      </w:r>
+      <w:r>
+        <w:rPr>
+          <w:rStyle w:val="VerbatimChar"/>
+        </w:rPr>
+        <w:t xml:space="preserve">/drive</w:t>
+      </w:r>
+      <w:r>
+        <w:t xml:space="preserve">.</w:t>
+      </w:r>
+      <w:r>
+        <w:t xml:space="preserve"> </w:t>
+      </w:r>
+      <w:r>
+        <w:t xml:space="preserve">- Empty state:</w:t>
+      </w:r>
+      <w:r>
+        <w:t xml:space="preserve"> </w:t>
+      </w:r>
+      <w:r>
+        <w:t xml:space="preserve">“No open drives right now”</w:t>
+      </w:r>
+      <w:r>
+        <w:t xml:space="preserve">.</w:t>
+      </w:r>
+    </w:p>
+    <w:bookmarkEnd w:id="219"/>
+    <w:bookmarkStart w:id="220" w:name="certificate-verify-verifyverifyid-public"/>
+    <w:p>
+      <w:pPr>
+        <w:pStyle w:val="Heading2"/>
+      </w:pPr>
+      <w:r>
+        <w:t xml:space="preserve">25.7 Certificate Verify (</w:t>
+      </w:r>
+      <w:r>
+        <w:rPr>
+          <w:rStyle w:val="VerbatimChar"/>
+        </w:rPr>
+        <w:t xml:space="preserve">/verify/:verifyId</w:t>
+      </w:r>
+      <w:r>
+        <w:t xml:space="preserve">) — public</w:t>
+      </w:r>
+    </w:p>
+    <w:p>
+      <w:pPr>
+        <w:pStyle w:val="Compact"/>
+        <w:numPr>
+          <w:ilvl w:val="0"/>
+          <w:numId w:val="1102"/>
+        </w:numPr>
+      </w:pPr>
+      <w:r>
+        <w:t xml:space="preserve">Loads</w:t>
+      </w:r>
+      <w:r>
+        <w:t xml:space="preserve"> </w:t>
+      </w:r>
+      <w:r>
+        <w:rPr>
+          <w:rStyle w:val="VerbatimChar"/>
+        </w:rPr>
+        <w:t xml:space="preserve">GET /verify/{verifyId}</w:t>
+      </w:r>
+      <w:r>
+        <w:t xml:space="preserve"> </w:t>
+      </w:r>
+      <w:r>
+        <w:t xml:space="preserve">(no auth). States:</w:t>
+      </w:r>
+      <w:r>
+        <w:t xml:space="preserve"> </w:t>
+      </w:r>
+      <w:r>
+        <w:rPr>
+          <w:b/>
+          <w:bCs/>
+        </w:rPr>
+        <w:t xml:space="preserve">Verifying…</w:t>
+      </w:r>
+      <w:r>
+        <w:t xml:space="preserve">,</w:t>
+      </w:r>
+      <w:r>
+        <w:t xml:space="preserve"> </w:t>
+      </w:r>
+      <w:r>
+        <w:rPr>
+          <w:b/>
+          <w:bCs/>
+        </w:rPr>
+        <w:t xml:space="preserve">Authentic</w:t>
+      </w:r>
+      <w:r>
+        <w:t xml:space="preserve"> </w:t>
+      </w:r>
+      <w:r>
+        <w:t xml:space="preserve">(a teal banner + a</w:t>
+      </w:r>
+      <w:r>
+        <w:t xml:space="preserve"> </w:t>
+      </w:r>
+      <w:r>
+        <w:rPr>
+          <w:b/>
+          <w:bCs/>
+        </w:rPr>
+        <w:t xml:space="preserve">Print</w:t>
+      </w:r>
+      <w:r>
+        <w:t xml:space="preserve"> </w:t>
+      </w:r>
+      <w:r>
+        <w:t xml:space="preserve">button + the rendered certificate artwork via</w:t>
+      </w:r>
+      <w:r>
+        <w:t xml:space="preserve"> </w:t>
+      </w:r>
+      <w:r>
+        <w:rPr>
+          <w:rStyle w:val="VerbatimChar"/>
+        </w:rPr>
+        <w:t xml:space="preserve">certificateHtml</w:t>
+      </w:r>
+      <w:r>
+        <w:t xml:space="preserve">), or</w:t>
+      </w:r>
+      <w:r>
+        <w:t xml:space="preserve"> </w:t>
+      </w:r>
+      <w:r>
+        <w:rPr>
+          <w:b/>
+          <w:bCs/>
+        </w:rPr>
+        <w:t xml:space="preserve">Could not verify</w:t>
+      </w:r>
+      <w:r>
+        <w:t xml:space="preserve"> </w:t>
+      </w:r>
+      <w:r>
+        <w:t xml:space="preserve">(not found / invalid / revoked).</w:t>
+      </w:r>
+    </w:p>
+    <w:p>
+      <w:pPr>
+        <w:pStyle w:val="Compact"/>
+        <w:numPr>
+          <w:ilvl w:val="0"/>
+          <w:numId w:val="1102"/>
+        </w:numPr>
+      </w:pPr>
+      <w:r>
+        <w:t xml:space="preserve">Header shows the LARE</w:t>
+      </w:r>
+      <w:r>
+        <w:t xml:space="preserve"> </w:t>
+      </w:r>
+      <w:r>
+        <w:rPr>
+          <w:b/>
+          <w:bCs/>
+        </w:rPr>
+        <w:t xml:space="preserve">Logo</w:t>
+      </w:r>
+      <w:r>
+        <w:t xml:space="preserve">; footer links back to</w:t>
+      </w:r>
+      <w:r>
+        <w:t xml:space="preserve"> </w:t>
+      </w:r>
+      <w:r>
+        <w:rPr>
+          <w:rStyle w:val="VerbatimChar"/>
+        </w:rPr>
+        <w:t xml:space="preserve">/</w:t>
+      </w:r>
+      <w:r>
+        <w:t xml:space="preserve">.</w:t>
+      </w:r>
+    </w:p>
+    <w:bookmarkEnd w:id="220"/>
+    <w:bookmarkStart w:id="221" w:name="X708569f865d5f6fe6ca7f2a7e71ab7f13a47763"/>
+    <w:p>
+      <w:pPr>
+        <w:pStyle w:val="Heading2"/>
+      </w:pPr>
+      <w:r>
+        <w:t xml:space="preserve">25.8 Wallet Verify (</w:t>
+      </w:r>
+      <w:r>
+        <w:rPr>
+          <w:rStyle w:val="VerbatimChar"/>
+        </w:rPr>
+        <w:t xml:space="preserve">/verify/wallet/:verifyId</w:t>
+      </w:r>
+      <w:r>
+        <w:t xml:space="preserve">) — public</w:t>
+      </w:r>
+    </w:p>
+    <w:p>
+      <w:pPr>
+        <w:pStyle w:val="Compact"/>
+        <w:numPr>
+          <w:ilvl w:val="0"/>
+          <w:numId w:val="1103"/>
+        </w:numPr>
+      </w:pPr>
+      <w:r>
+        <w:t xml:space="preserve">Loads</w:t>
+      </w:r>
+      <w:r>
+        <w:t xml:space="preserve"> </w:t>
+      </w:r>
+      <w:r>
+        <w:rPr>
+          <w:rStyle w:val="VerbatimChar"/>
+        </w:rPr>
+        <w:t xml:space="preserve">GET /verify/wallet/{verifyId}</w:t>
+      </w:r>
+      <w:r>
+        <w:t xml:space="preserve"> </w:t>
+      </w:r>
+      <w:r>
+        <w:t xml:space="preserve">(no auth). Shows the signature-verified status, subject name, issued date, and the competence claims. No login required — an employer can confirm authenticity directly.</w:t>
+      </w:r>
+    </w:p>
+    <w:bookmarkEnd w:id="221"/>
+    <w:bookmarkStart w:id="222" w:name="landing"/>
+    <w:p>
+      <w:pPr>
+        <w:pStyle w:val="Heading2"/>
+      </w:pPr>
+      <w:r>
+        <w:t xml:space="preserve">25.9 Landing (</w:t>
+      </w:r>
+      <w:r>
+        <w:rPr>
+          <w:rStyle w:val="VerbatimChar"/>
+        </w:rPr>
+        <w:t xml:space="preserve">/</w:t>
+      </w:r>
+      <w:r>
+        <w:t xml:space="preserve">)</w:t>
+      </w:r>
+    </w:p>
+    <w:p>
+      <w:pPr>
+        <w:pStyle w:val="Compact"/>
+        <w:numPr>
+          <w:ilvl w:val="0"/>
+          <w:numId w:val="1104"/>
+        </w:numPr>
+      </w:pPr>
+      <w:r>
+        <w:t xml:space="preserve">Public marketing entry: hero + product highlights for LARE Learn and LARE Hire.</w:t>
+      </w:r>
+    </w:p>
+    <w:p>
+      <w:pPr>
+        <w:pStyle w:val="Compact"/>
+        <w:numPr>
+          <w:ilvl w:val="0"/>
+          <w:numId w:val="1104"/>
+        </w:numPr>
+      </w:pPr>
+      <w:r>
+        <w:rPr>
+          <w:b/>
+          <w:bCs/>
+        </w:rPr>
+        <w:t xml:space="preserve">Buttons: Log in</w:t>
+      </w:r>
+      <w:r>
+        <w:t xml:space="preserve"> </w:t>
+      </w:r>
+      <w:r>
+        <w:t xml:space="preserve">(→</w:t>
+      </w:r>
+      <w:r>
+        <w:t xml:space="preserve"> </w:t>
+      </w:r>
+      <w:r>
+        <w:rPr>
+          <w:rStyle w:val="VerbatimChar"/>
+        </w:rPr>
+        <w:t xml:space="preserve">/login</w:t>
+      </w:r>
+      <w:r>
+        <w:t xml:space="preserve">) and</w:t>
+      </w:r>
+      <w:r>
+        <w:t xml:space="preserve"> </w:t>
+      </w:r>
+      <w:r>
+        <w:rPr>
+          <w:b/>
+          <w:bCs/>
+        </w:rPr>
+        <w:t xml:space="preserve">Get started / Register</w:t>
+      </w:r>
+      <w:r>
+        <w:t xml:space="preserve"> </w:t>
+      </w:r>
+      <w:r>
+        <w:t xml:space="preserve">(→</w:t>
+      </w:r>
+      <w:r>
+        <w:t xml:space="preserve"> </w:t>
+      </w:r>
+      <w:r>
+        <w:rPr>
+          <w:rStyle w:val="VerbatimChar"/>
+        </w:rPr>
+        <w:t xml:space="preserve">/register</w:t>
+      </w:r>
+      <w:r>
+        <w:t xml:space="preserve">).</w:t>
+      </w:r>
+    </w:p>
+    <w:p>
+      <w:r>
         <w:pict>
           <v:rect style="width:0;height:1.5pt" o:hralign="center" o:hrstd="t" o:hr="t"/>
         </w:pict>
@@ -40241,8 +41560,8 @@
         <w:t xml:space="preserve">End of document. Prepared for LARE Cloud Solutions - a unit of LARE Consulting &amp; Technology Pvt. Ltd.</w:t>
       </w:r>
     </w:p>
-    <w:bookmarkEnd w:id="212"/>
-    <w:bookmarkEnd w:id="213"/>
+    <w:bookmarkEnd w:id="222"/>
+    <w:bookmarkEnd w:id="223"/>
     <w:sectPr>
       <w:footnotePr>
         <w:numRestart w:val="eachSect"/>
@@ -40962,6 +42281,33 @@
     <w:abstractNumId w:val="991"/>
   </w:num>
   <w:num w:numId="1095">
+    <w:abstractNumId w:val="991"/>
+  </w:num>
+  <w:num w:numId="1096">
+    <w:abstractNumId w:val="991"/>
+  </w:num>
+  <w:num w:numId="1097">
+    <w:abstractNumId w:val="991"/>
+  </w:num>
+  <w:num w:numId="1098">
+    <w:abstractNumId w:val="991"/>
+  </w:num>
+  <w:num w:numId="1099">
+    <w:abstractNumId w:val="991"/>
+  </w:num>
+  <w:num w:numId="1100">
+    <w:abstractNumId w:val="991"/>
+  </w:num>
+  <w:num w:numId="1101">
+    <w:abstractNumId w:val="991"/>
+  </w:num>
+  <w:num w:numId="1102">
+    <w:abstractNumId w:val="991"/>
+  </w:num>
+  <w:num w:numId="1103">
+    <w:abstractNumId w:val="991"/>
+  </w:num>
+  <w:num w:numId="1104">
     <w:abstractNumId w:val="991"/>
   </w:num>
 </w:numbering>

</xml_diff>

<commit_message>
docs: add NFRs, AI integration, proctoring, testing, and ops runbook chapters (26-30)
Co-Authored-By: Claude Opus 4.8 <noreply@anthropic.com>
</commit_message>
<xml_diff>
--- a/docs/LARE-Documentation.docx
+++ b/docs/LARE-Documentation.docx
@@ -41543,6 +41543,2207 @@
     </w:p>
     <w:p>
       <w:r>
+        <w:br w:type="page"/>
+      </w:r>
+    </w:p>
+    <w:bookmarkEnd w:id="222"/>
+    <w:bookmarkEnd w:id="223"/>
+    <w:bookmarkStart w:id="224" w:name="non-functional-requirements"/>
+    <w:p>
+      <w:pPr>
+        <w:pStyle w:val="Heading1"/>
+      </w:pPr>
+      <w:r>
+        <w:t xml:space="preserve">26. Non-Functional Requirements</w:t>
+      </w:r>
+    </w:p>
+    <w:tbl>
+      <w:tblPr>
+        <w:tblStyle w:val="Table"/>
+        <w:tblW w:type="pct" w:w="5000"/>
+        <w:tblLayout w:type="fixed"/>
+        <w:tblLook w:firstRow="1" w:lastRow="0" w:firstColumn="0" w:lastColumn="0" w:noHBand="0" w:noVBand="0" w:val="0020"/>
+      </w:tblPr>
+      <w:tblGrid>
+        <w:gridCol w:w="3960"/>
+        <w:gridCol w:w="3960"/>
+      </w:tblGrid>
+      <w:tr>
+        <w:trPr>
+          <w:tblHeader w:val="on"/>
+        </w:trPr>
+        <w:tc>
+          <w:tcPr/>
+          <w:p>
+            <w:pPr>
+              <w:pStyle w:val="Compact"/>
+            </w:pPr>
+            <w:r>
+              <w:t xml:space="preserve">Attribute</w:t>
+            </w:r>
+          </w:p>
+        </w:tc>
+        <w:tc>
+          <w:tcPr/>
+          <w:p>
+            <w:pPr>
+              <w:pStyle w:val="Compact"/>
+            </w:pPr>
+            <w:r>
+              <w:t xml:space="preserve">Approach in LARE</w:t>
+            </w:r>
+          </w:p>
+        </w:tc>
+      </w:tr>
+      <w:tr>
+        <w:tc>
+          <w:tcPr/>
+          <w:p>
+            <w:pPr>
+              <w:pStyle w:val="Compact"/>
+            </w:pPr>
+            <w:r>
+              <w:rPr>
+                <w:b/>
+                <w:bCs/>
+              </w:rPr>
+              <w:t xml:space="preserve">Performance</w:t>
+            </w:r>
+          </w:p>
+        </w:tc>
+        <w:tc>
+          <w:tcPr/>
+          <w:p>
+            <w:pPr>
+              <w:pStyle w:val="Compact"/>
+            </w:pPr>
+            <w:r>
+              <w:t xml:space="preserve">Stateless services behind a gateway; per-service schemas keep queries local; the SPA loads a single hashed bundle and calls</w:t>
+            </w:r>
+            <w:r>
+              <w:t xml:space="preserve"> </w:t>
+            </w:r>
+            <w:r>
+              <w:rPr>
+                <w:rStyle w:val="VerbatimChar"/>
+              </w:rPr>
+              <w:t xml:space="preserve">/api</w:t>
+            </w:r>
+            <w:r>
+              <w:t xml:space="preserve"> </w:t>
+            </w:r>
+            <w:r>
+              <w:t xml:space="preserve">with</w:t>
+            </w:r>
+            <w:r>
+              <w:t xml:space="preserve"> </w:t>
+            </w:r>
+            <w:r>
+              <w:rPr>
+                <w:rStyle w:val="VerbatimChar"/>
+              </w:rPr>
+              <w:t xml:space="preserve">cache: no-store</w:t>
+            </w:r>
+            <w:r>
+              <w:t xml:space="preserve"> </w:t>
+            </w:r>
+            <w:r>
+              <w:t xml:space="preserve">for per-user safety. AI/code-exec routes are marked</w:t>
+            </w:r>
+            <w:r>
+              <w:t xml:space="preserve"> </w:t>
+            </w:r>
+            <w:r>
+              <w:rPr>
+                <w:b/>
+                <w:bCs/>
+              </w:rPr>
+              <w:t xml:space="preserve">slow</w:t>
+            </w:r>
+            <w:r>
+              <w:t xml:space="preserve"> </w:t>
+            </w:r>
+            <w:r>
+              <w:t xml:space="preserve">so the gateway grants extended timeouts.</w:t>
+            </w:r>
+          </w:p>
+        </w:tc>
+      </w:tr>
+      <w:tr>
+        <w:tc>
+          <w:tcPr/>
+          <w:p>
+            <w:pPr>
+              <w:pStyle w:val="Compact"/>
+            </w:pPr>
+            <w:r>
+              <w:rPr>
+                <w:b/>
+                <w:bCs/>
+              </w:rPr>
+              <w:t xml:space="preserve">Scalability</w:t>
+            </w:r>
+          </w:p>
+        </w:tc>
+        <w:tc>
+          <w:tcPr/>
+          <w:p>
+            <w:pPr>
+              <w:pStyle w:val="Compact"/>
+            </w:pPr>
+            <w:r>
+              <w:t xml:space="preserve">Horizontal: services are stateless (session state is in signed tokens), so app boxes scale behind a load balancer. The event bus moves to Redis Streams/ElastiCache; hot paths (exam, coding) get more workers. Data scales via the managed RDS instance class + read replicas.</w:t>
+            </w:r>
+          </w:p>
+        </w:tc>
+      </w:tr>
+      <w:tr>
+        <w:tc>
+          <w:tcPr/>
+          <w:p>
+            <w:pPr>
+              <w:pStyle w:val="Compact"/>
+            </w:pPr>
+            <w:r>
+              <w:rPr>
+                <w:b/>
+                <w:bCs/>
+              </w:rPr>
+              <w:t xml:space="preserve">Availability</w:t>
+            </w:r>
+          </w:p>
+        </w:tc>
+        <w:tc>
+          <w:tcPr/>
+          <w:p>
+            <w:pPr>
+              <w:pStyle w:val="Compact"/>
+            </w:pPr>
+            <w:r>
+              <w:t xml:space="preserve">No single service is a hard dependency for unrelated features; the SPA degrades gracefully (empty states in production, demo data only in dev). RDS provides automated backups + PITR.</w:t>
+            </w:r>
+          </w:p>
+        </w:tc>
+      </w:tr>
+      <w:tr>
+        <w:tc>
+          <w:tcPr/>
+          <w:p>
+            <w:pPr>
+              <w:pStyle w:val="Compact"/>
+            </w:pPr>
+            <w:r>
+              <w:rPr>
+                <w:b/>
+                <w:bCs/>
+              </w:rPr>
+              <w:t xml:space="preserve">Reliability (exam integrity)</w:t>
+            </w:r>
+          </w:p>
+        </w:tc>
+        <w:tc>
+          <w:tcPr/>
+          <w:p>
+            <w:pPr>
+              <w:pStyle w:val="Compact"/>
+            </w:pPr>
+            <w:r>
+              <w:t xml:space="preserve">The Submission service is</w:t>
+            </w:r>
+            <w:r>
+              <w:t xml:space="preserve"> </w:t>
+            </w:r>
+            <w:r>
+              <w:rPr>
+                <w:b/>
+                <w:bCs/>
+              </w:rPr>
+              <w:t xml:space="preserve">append-only</w:t>
+            </w:r>
+            <w:r>
+              <w:t xml:space="preserve"> </w:t>
+            </w:r>
+            <w:r>
+              <w:t xml:space="preserve">with a materialized latest view and an immutable final snapshot — no accepted answer is ever lost. The exam timer is server-anchored; auto-submit is idempotent (one-shot guard).</w:t>
+            </w:r>
+          </w:p>
+        </w:tc>
+      </w:tr>
+      <w:tr>
+        <w:tc>
+          <w:tcPr/>
+          <w:p>
+            <w:pPr>
+              <w:pStyle w:val="Compact"/>
+            </w:pPr>
+            <w:r>
+              <w:rPr>
+                <w:b/>
+                <w:bCs/>
+              </w:rPr>
+              <w:t xml:space="preserve">Security</w:t>
+            </w:r>
+          </w:p>
+        </w:tc>
+        <w:tc>
+          <w:tcPr/>
+          <w:p>
+            <w:pPr>
+              <w:pStyle w:val="Compact"/>
+            </w:pPr>
+            <w:r>
+              <w:t xml:space="preserve">RS256 JWT, per-request auth at the gateway, subject-ownership checks, TLS end-to-end, schema isolation, tamper-evident hash-chained audit, sandboxed code execution.</w:t>
+            </w:r>
+          </w:p>
+        </w:tc>
+      </w:tr>
+      <w:tr>
+        <w:tc>
+          <w:tcPr/>
+          <w:p>
+            <w:pPr>
+              <w:pStyle w:val="Compact"/>
+            </w:pPr>
+            <w:r>
+              <w:rPr>
+                <w:b/>
+                <w:bCs/>
+              </w:rPr>
+              <w:t xml:space="preserve">Maintainability</w:t>
+            </w:r>
+          </w:p>
+        </w:tc>
+        <w:tc>
+          <w:tcPr/>
+          <w:p>
+            <w:pPr>
+              <w:pStyle w:val="Compact"/>
+            </w:pPr>
+            <w:r>
+              <w:t xml:space="preserve">One shared</w:t>
+            </w:r>
+            <w:r>
+              <w:t xml:space="preserve"> </w:t>
+            </w:r>
+            <w:r>
+              <w:rPr>
+                <w:rStyle w:val="VerbatimChar"/>
+              </w:rPr>
+              <w:t xml:space="preserve">lare_common</w:t>
+            </w:r>
+            <w:r>
+              <w:t xml:space="preserve"> </w:t>
+            </w:r>
+            <w:r>
+              <w:t xml:space="preserve">library; identical service shape (</w:t>
+            </w:r>
+            <w:r>
+              <w:rPr>
+                <w:rStyle w:val="VerbatimChar"/>
+              </w:rPr>
+              <w:t xml:space="preserve">manage.py</w:t>
+            </w:r>
+            <w:r>
+              <w:t xml:space="preserve">,</w:t>
+            </w:r>
+            <w:r>
+              <w:t xml:space="preserve"> </w:t>
+            </w:r>
+            <w:r>
+              <w:rPr>
+                <w:rStyle w:val="VerbatimChar"/>
+              </w:rPr>
+              <w:t xml:space="preserve">app/</w:t>
+            </w:r>
+            <w:r>
+              <w:t xml:space="preserve">); schema-per-service so changes stay local; a single design system on the frontend.</w:t>
+            </w:r>
+          </w:p>
+        </w:tc>
+      </w:tr>
+      <w:tr>
+        <w:tc>
+          <w:tcPr/>
+          <w:p>
+            <w:pPr>
+              <w:pStyle w:val="Compact"/>
+            </w:pPr>
+            <w:r>
+              <w:rPr>
+                <w:b/>
+                <w:bCs/>
+              </w:rPr>
+              <w:t xml:space="preserve">Observability</w:t>
+            </w:r>
+          </w:p>
+        </w:tc>
+        <w:tc>
+          <w:tcPr/>
+          <w:p>
+            <w:pPr>
+              <w:pStyle w:val="Compact"/>
+            </w:pPr>
+            <w:r>
+              <w:t xml:space="preserve">Health endpoints per service (</w:t>
+            </w:r>
+            <w:r>
+              <w:rPr>
+                <w:rStyle w:val="VerbatimChar"/>
+              </w:rPr>
+              <w:t xml:space="preserve">/health</w:t>
+            </w:r>
+            <w:r>
+              <w:t xml:space="preserve">); an append-only analytics fact store; the AI-calls audit table (usage/latency/mode); service logs under</w:t>
+            </w:r>
+            <w:r>
+              <w:t xml:space="preserve"> </w:t>
+            </w:r>
+            <w:r>
+              <w:rPr>
+                <w:rStyle w:val="VerbatimChar"/>
+              </w:rPr>
+              <w:t xml:space="preserve">.run/</w:t>
+            </w:r>
+            <w:r>
+              <w:t xml:space="preserve">.</w:t>
+            </w:r>
+          </w:p>
+        </w:tc>
+      </w:tr>
+      <w:tr>
+        <w:tc>
+          <w:tcPr/>
+          <w:p>
+            <w:pPr>
+              <w:pStyle w:val="Compact"/>
+            </w:pPr>
+            <w:r>
+              <w:rPr>
+                <w:b/>
+                <w:bCs/>
+              </w:rPr>
+              <w:t xml:space="preserve">Accessibility</w:t>
+            </w:r>
+          </w:p>
+        </w:tc>
+        <w:tc>
+          <w:tcPr/>
+          <w:p>
+            <w:pPr>
+              <w:pStyle w:val="Compact"/>
+            </w:pPr>
+            <w:r>
+              <w:t xml:space="preserve">Semantic controls, labelled inputs/toggles, keyboard-focus states, and colour choices with text/badge redundancy (not colour alone).</w:t>
+            </w:r>
+          </w:p>
+        </w:tc>
+      </w:tr>
+      <w:tr>
+        <w:tc>
+          <w:tcPr/>
+          <w:p>
+            <w:pPr>
+              <w:pStyle w:val="Compact"/>
+            </w:pPr>
+            <w:r>
+              <w:rPr>
+                <w:b/>
+                <w:bCs/>
+              </w:rPr>
+              <w:t xml:space="preserve">Portability</w:t>
+            </w:r>
+          </w:p>
+        </w:tc>
+        <w:tc>
+          <w:tcPr/>
+          <w:p>
+            <w:pPr>
+              <w:pStyle w:val="Compact"/>
+            </w:pPr>
+            <w:r>
+              <w:t xml:space="preserve">No Docker requirement; runs as processes/systemd units on one box, or scales out. Postgres + Redis are the only infra dependencies.</w:t>
+            </w:r>
+          </w:p>
+        </w:tc>
+      </w:tr>
+    </w:tbl>
+    <w:p>
+      <w:r>
+        <w:br w:type="page"/>
+      </w:r>
+    </w:p>
+    <w:bookmarkEnd w:id="224"/>
+    <w:bookmarkStart w:id="230" w:name="ai-integration-specification"/>
+    <w:p>
+      <w:pPr>
+        <w:pStyle w:val="Heading1"/>
+      </w:pPr>
+      <w:r>
+        <w:t xml:space="preserve">27. AI Integration Specification</w:t>
+      </w:r>
+    </w:p>
+    <w:bookmarkStart w:id="225" w:name="providers-routing"/>
+    <w:p>
+      <w:pPr>
+        <w:pStyle w:val="Heading2"/>
+      </w:pPr>
+      <w:r>
+        <w:t xml:space="preserve">27.1 Providers &amp; routing</w:t>
+      </w:r>
+    </w:p>
+    <w:p>
+      <w:pPr>
+        <w:pStyle w:val="Compact"/>
+        <w:numPr>
+          <w:ilvl w:val="0"/>
+          <w:numId w:val="1105"/>
+        </w:numPr>
+      </w:pPr>
+      <w:r>
+        <w:rPr>
+          <w:b/>
+          <w:bCs/>
+        </w:rPr>
+        <w:t xml:space="preserve">LARE Learn</w:t>
+      </w:r>
+      <w:r>
+        <w:t xml:space="preserve"> </w:t>
+      </w:r>
+      <w:r>
+        <w:t xml:space="preserve">uses</w:t>
+      </w:r>
+      <w:r>
+        <w:t xml:space="preserve"> </w:t>
+      </w:r>
+      <w:r>
+        <w:rPr>
+          <w:b/>
+          <w:bCs/>
+        </w:rPr>
+        <w:t xml:space="preserve">Google Gemini</w:t>
+      </w:r>
+      <w:r>
+        <w:t xml:space="preserve"> </w:t>
+      </w:r>
+      <w:r>
+        <w:t xml:space="preserve">(</w:t>
+      </w:r>
+      <w:r>
+        <w:rPr>
+          <w:rStyle w:val="VerbatimChar"/>
+        </w:rPr>
+        <w:t xml:space="preserve">AI_PROVIDER=gemini</w:t>
+      </w:r>
+      <w:r>
+        <w:t xml:space="preserve">,</w:t>
+      </w:r>
+      <w:r>
+        <w:t xml:space="preserve"> </w:t>
+      </w:r>
+      <w:r>
+        <w:rPr>
+          <w:rStyle w:val="VerbatimChar"/>
+        </w:rPr>
+        <w:t xml:space="preserve">GEMINI_API_KEY</w:t>
+      </w:r>
+      <w:r>
+        <w:t xml:space="preserve">,</w:t>
+      </w:r>
+      <w:r>
+        <w:t xml:space="preserve"> </w:t>
+      </w:r>
+      <w:r>
+        <w:rPr>
+          <w:rStyle w:val="VerbatimChar"/>
+        </w:rPr>
+        <w:t xml:space="preserve">GEMINI_MODEL</w:t>
+      </w:r>
+      <w:r>
+        <w:t xml:space="preserve">);</w:t>
+      </w:r>
+      <w:r>
+        <w:t xml:space="preserve"> </w:t>
+      </w:r>
+      <w:r>
+        <w:rPr>
+          <w:b/>
+          <w:bCs/>
+        </w:rPr>
+        <w:t xml:space="preserve">LARE Hire</w:t>
+      </w:r>
+      <w:r>
+        <w:t xml:space="preserve"> </w:t>
+      </w:r>
+      <w:r>
+        <w:t xml:space="preserve">uses</w:t>
+      </w:r>
+      <w:r>
+        <w:t xml:space="preserve"> </w:t>
+      </w:r>
+      <w:r>
+        <w:rPr>
+          <w:b/>
+          <w:bCs/>
+        </w:rPr>
+        <w:t xml:space="preserve">Mistral</w:t>
+      </w:r>
+      <w:r>
+        <w:t xml:space="preserve"> </w:t>
+      </w:r>
+      <w:r>
+        <w:t xml:space="preserve">(</w:t>
+      </w:r>
+      <w:r>
+        <w:rPr>
+          <w:rStyle w:val="VerbatimChar"/>
+        </w:rPr>
+        <w:t xml:space="preserve">DRIVE_AI_PROVIDER=mistral</w:t>
+      </w:r>
+      <w:r>
+        <w:t xml:space="preserve">,</w:t>
+      </w:r>
+      <w:r>
+        <w:t xml:space="preserve"> </w:t>
+      </w:r>
+      <w:r>
+        <w:rPr>
+          <w:rStyle w:val="VerbatimChar"/>
+        </w:rPr>
+        <w:t xml:space="preserve">MISTRAL_API_KEY</w:t>
+      </w:r>
+      <w:r>
+        <w:t xml:space="preserve">). A common client (</w:t>
+      </w:r>
+      <w:r>
+        <w:rPr>
+          <w:rStyle w:val="VerbatimChar"/>
+        </w:rPr>
+        <w:t xml:space="preserve">lare_common.ai.build_client_from_env</w:t>
+      </w:r>
+      <w:r>
+        <w:t xml:space="preserve">) selects the provider and returns a</w:t>
+      </w:r>
+      <w:r>
+        <w:t xml:space="preserve"> </w:t>
+      </w:r>
+      <w:r>
+        <w:rPr>
+          <w:b/>
+          <w:bCs/>
+        </w:rPr>
+        <w:t xml:space="preserve">stub</w:t>
+      </w:r>
+      <w:r>
+        <w:t xml:space="preserve"> </w:t>
+      </w:r>
+      <w:r>
+        <w:t xml:space="preserve">when no key is configured (so features degrade to deterministic fallbacks instead of failing).</w:t>
+      </w:r>
+    </w:p>
+    <w:bookmarkEnd w:id="225"/>
+    <w:bookmarkStart w:id="226" w:name="governance-ai-orchestration"/>
+    <w:p>
+      <w:pPr>
+        <w:pStyle w:val="Heading2"/>
+      </w:pPr>
+      <w:r>
+        <w:t xml:space="preserve">27.2 Governance (AI Orchestration)</w:t>
+      </w:r>
+    </w:p>
+    <w:p>
+      <w:pPr>
+        <w:pStyle w:val="Compact"/>
+        <w:numPr>
+          <w:ilvl w:val="0"/>
+          <w:numId w:val="1106"/>
+        </w:numPr>
+      </w:pPr>
+      <w:r>
+        <w:t xml:space="preserve">Every governed AI call is</w:t>
+      </w:r>
+      <w:r>
+        <w:t xml:space="preserve"> </w:t>
+      </w:r>
+      <w:r>
+        <w:rPr>
+          <w:b/>
+          <w:bCs/>
+        </w:rPr>
+        <w:t xml:space="preserve">audited</w:t>
+      </w:r>
+      <w:r>
+        <w:t xml:space="preserve"> </w:t>
+      </w:r>
+      <w:r>
+        <w:t xml:space="preserve">in</w:t>
+      </w:r>
+      <w:r>
+        <w:t xml:space="preserve"> </w:t>
+      </w:r>
+      <w:r>
+        <w:rPr>
+          <w:rStyle w:val="VerbatimChar"/>
+        </w:rPr>
+        <w:t xml:space="preserve">ai_calls</w:t>
+      </w:r>
+      <w:r>
+        <w:t xml:space="preserve"> </w:t>
+      </w:r>
+      <w:r>
+        <w:t xml:space="preserve">(prompt key, purpose, actor, model, mode live/stub, input/output tokens, latency, status, preview). This gives per-call usage, latency, and cost visibility and enforces a token budget (</w:t>
+      </w:r>
+      <w:r>
+        <w:rPr>
+          <w:rStyle w:val="VerbatimChar"/>
+        </w:rPr>
+        <w:t xml:space="preserve">AI_MAX_TOKENS</w:t>
+      </w:r>
+      <w:r>
+        <w:t xml:space="preserve">).</w:t>
+      </w:r>
+    </w:p>
+    <w:bookmarkEnd w:id="226"/>
+    <w:bookmarkStart w:id="227" w:name="where-ai-is-used"/>
+    <w:p>
+      <w:pPr>
+        <w:pStyle w:val="Heading2"/>
+      </w:pPr>
+      <w:r>
+        <w:t xml:space="preserve">27.3 Where AI is used</w:t>
+      </w:r>
+    </w:p>
+    <w:p>
+      <w:pPr>
+        <w:pStyle w:val="Compact"/>
+        <w:numPr>
+          <w:ilvl w:val="0"/>
+          <w:numId w:val="1107"/>
+        </w:numPr>
+      </w:pPr>
+      <w:r>
+        <w:rPr>
+          <w:b/>
+          <w:bCs/>
+        </w:rPr>
+        <w:t xml:space="preserve">Micro-lessons &amp; Curriculum Studio blocks</w:t>
+      </w:r>
+      <w:r>
+        <w:t xml:space="preserve"> </w:t>
+      </w:r>
+      <w:r>
+        <w:t xml:space="preserve">— generate a full lesson as blocks.</w:t>
+      </w:r>
+    </w:p>
+    <w:p>
+      <w:pPr>
+        <w:pStyle w:val="Compact"/>
+        <w:numPr>
+          <w:ilvl w:val="0"/>
+          <w:numId w:val="1107"/>
+        </w:numPr>
+      </w:pPr>
+      <w:r>
+        <w:rPr>
+          <w:b/>
+          <w:bCs/>
+        </w:rPr>
+        <w:t xml:space="preserve">AI study coach</w:t>
+      </w:r>
+      <w:r>
+        <w:t xml:space="preserve"> </w:t>
+      </w:r>
+      <w:r>
+        <w:t xml:space="preserve">— a persistent, weak-area-focused plan.</w:t>
+      </w:r>
+    </w:p>
+    <w:p>
+      <w:pPr>
+        <w:pStyle w:val="Compact"/>
+        <w:numPr>
+          <w:ilvl w:val="0"/>
+          <w:numId w:val="1107"/>
+        </w:numPr>
+      </w:pPr>
+      <w:r>
+        <w:rPr>
+          <w:b/>
+          <w:bCs/>
+        </w:rPr>
+        <w:t xml:space="preserve">Adaptive drill</w:t>
+      </w:r>
+      <w:r>
+        <w:t xml:space="preserve"> </w:t>
+      </w:r>
+      <w:r>
+        <w:t xml:space="preserve">— AI-generated questions with server-held keys.</w:t>
+      </w:r>
+    </w:p>
+    <w:p>
+      <w:pPr>
+        <w:pStyle w:val="Compact"/>
+        <w:numPr>
+          <w:ilvl w:val="0"/>
+          <w:numId w:val="1107"/>
+        </w:numPr>
+      </w:pPr>
+      <w:r>
+        <w:rPr>
+          <w:b/>
+          <w:bCs/>
+        </w:rPr>
+        <w:t xml:space="preserve">Adversarial viva</w:t>
+      </w:r>
+      <w:r>
+        <w:t xml:space="preserve"> </w:t>
+      </w:r>
+      <w:r>
+        <w:t xml:space="preserve">— generate a question about the learner’s own solution and grade the explanation.</w:t>
+      </w:r>
+    </w:p>
+    <w:p>
+      <w:pPr>
+        <w:pStyle w:val="Compact"/>
+        <w:numPr>
+          <w:ilvl w:val="0"/>
+          <w:numId w:val="1107"/>
+        </w:numPr>
+      </w:pPr>
+      <w:r>
+        <w:rPr>
+          <w:b/>
+          <w:bCs/>
+        </w:rPr>
+        <w:t xml:space="preserve">AI Tutor</w:t>
+      </w:r>
+      <w:r>
+        <w:t xml:space="preserve"> </w:t>
+      </w:r>
+      <w:r>
+        <w:t xml:space="preserve">— grounded chat + study-plan generation.</w:t>
+      </w:r>
+    </w:p>
+    <w:p>
+      <w:pPr>
+        <w:pStyle w:val="Compact"/>
+        <w:numPr>
+          <w:ilvl w:val="0"/>
+          <w:numId w:val="1107"/>
+        </w:numPr>
+      </w:pPr>
+      <w:r>
+        <w:rPr>
+          <w:b/>
+          <w:bCs/>
+        </w:rPr>
+        <w:t xml:space="preserve">Question Bank</w:t>
+      </w:r>
+      <w:r>
+        <w:t xml:space="preserve"> </w:t>
+      </w:r>
+      <w:r>
+        <w:t xml:space="preserve">— generate exam-ready MCQ/coding questions.</w:t>
+      </w:r>
+    </w:p>
+    <w:p>
+      <w:pPr>
+        <w:pStyle w:val="Compact"/>
+        <w:numPr>
+          <w:ilvl w:val="0"/>
+          <w:numId w:val="1107"/>
+        </w:numPr>
+      </w:pPr>
+      <w:r>
+        <w:rPr>
+          <w:b/>
+          <w:bCs/>
+        </w:rPr>
+        <w:t xml:space="preserve">Practice Worlds</w:t>
+      </w:r>
+      <w:r>
+        <w:t xml:space="preserve"> </w:t>
+      </w:r>
+      <w:r>
+        <w:t xml:space="preserve">— scenario content.</w:t>
+      </w:r>
+    </w:p>
+    <w:bookmarkEnd w:id="227"/>
+    <w:bookmarkStart w:id="228" w:name="robust-generation-the-marker-format"/>
+    <w:p>
+      <w:pPr>
+        <w:pStyle w:val="Heading2"/>
+      </w:pPr>
+      <w:r>
+        <w:t xml:space="preserve">27.4 Robust generation (the marker format)</w:t>
+      </w:r>
+    </w:p>
+    <w:p>
+      <w:pPr>
+        <w:pStyle w:val="FirstParagraph"/>
+      </w:pPr>
+      <w:r>
+        <w:t xml:space="preserve">LLMs frequently break strict JSON when a lesson contains code blocks and tables. LARE therefore generates lessons in a</w:t>
+      </w:r>
+      <w:r>
+        <w:t xml:space="preserve"> </w:t>
+      </w:r>
+      <w:r>
+        <w:rPr>
+          <w:rStyle w:val="VerbatimChar"/>
+          <w:b/>
+          <w:bCs/>
+        </w:rPr>
+        <w:t xml:space="preserve">@@</w:t>
+      </w:r>
+      <w:r>
+        <w:rPr>
+          <w:b/>
+          <w:bCs/>
+        </w:rPr>
+        <w:t xml:space="preserve">-marker format</w:t>
+      </w:r>
+      <w:r>
+        <w:t xml:space="preserve"> </w:t>
+      </w:r>
+      <w:r>
+        <w:t xml:space="preserve">parsed by a deterministic parser into blocks (</w:t>
+      </w:r>
+      <w:r>
+        <w:rPr>
+          <w:rStyle w:val="VerbatimChar"/>
+        </w:rPr>
+        <w:t xml:space="preserve">text</w:t>
+      </w:r>
+      <w:r>
+        <w:t xml:space="preserve">,</w:t>
+      </w:r>
+      <w:r>
+        <w:t xml:space="preserve"> </w:t>
+      </w:r>
+      <w:r>
+        <w:rPr>
+          <w:rStyle w:val="VerbatimChar"/>
+        </w:rPr>
+        <w:t xml:space="preserve">code</w:t>
+      </w:r>
+      <w:r>
+        <w:t xml:space="preserve">,</w:t>
+      </w:r>
+      <w:r>
+        <w:t xml:space="preserve"> </w:t>
+      </w:r>
+      <w:r>
+        <w:rPr>
+          <w:rStyle w:val="VerbatimChar"/>
+        </w:rPr>
+        <w:t xml:space="preserve">callout</w:t>
+      </w:r>
+      <w:r>
+        <w:t xml:space="preserve">,</w:t>
+      </w:r>
+      <w:r>
+        <w:t xml:space="preserve"> </w:t>
+      </w:r>
+      <w:r>
+        <w:rPr>
+          <w:rStyle w:val="VerbatimChar"/>
+        </w:rPr>
+        <w:t xml:space="preserve">check</w:t>
+      </w:r>
+      <w:r>
+        <w:t xml:space="preserve">). Transient provider errors (e.g. 503</w:t>
+      </w:r>
+      <w:r>
+        <w:t xml:space="preserve"> </w:t>
+      </w:r>
+      <w:r>
+        <w:t xml:space="preserve">“high demand”</w:t>
+      </w:r>
+      <w:r>
+        <w:t xml:space="preserve">)</w:t>
+      </w:r>
+      <w:r>
+        <w:t xml:space="preserve"> </w:t>
+      </w:r>
+      <w:r>
+        <w:rPr>
+          <w:b/>
+          <w:bCs/>
+        </w:rPr>
+        <w:t xml:space="preserve">retry</w:t>
+      </w:r>
+      <w:r>
+        <w:t xml:space="preserve">, and a</w:t>
+      </w:r>
+      <w:r>
+        <w:t xml:space="preserve"> </w:t>
+      </w:r>
+      <w:r>
+        <w:rPr>
+          <w:rStyle w:val="VerbatimChar"/>
+        </w:rPr>
+        <w:t xml:space="preserve">transient</w:t>
+      </w:r>
+      <w:r>
+        <w:t xml:space="preserve"> </w:t>
+      </w:r>
+      <w:r>
+        <w:t xml:space="preserve">flag ensures a generic fallback template is</w:t>
+      </w:r>
+      <w:r>
+        <w:t xml:space="preserve"> </w:t>
+      </w:r>
+      <w:r>
+        <w:rPr>
+          <w:b/>
+          <w:bCs/>
+        </w:rPr>
+        <w:t xml:space="preserve">never persisted</w:t>
+      </w:r>
+      <w:r>
+        <w:t xml:space="preserve"> </w:t>
+      </w:r>
+      <w:r>
+        <w:t xml:space="preserve">as if it were a real lesson. The same block format powers author-side generation (</w:t>
+      </w:r>
+      <w:r>
+        <w:rPr>
+          <w:rStyle w:val="VerbatimChar"/>
+        </w:rPr>
+        <w:t xml:space="preserve">author-blocks</w:t>
+      </w:r>
+      <w:r>
+        <w:t xml:space="preserve">).</w:t>
+      </w:r>
+    </w:p>
+    <w:bookmarkEnd w:id="228"/>
+    <w:bookmarkStart w:id="229" w:name="failure-behaviour"/>
+    <w:p>
+      <w:pPr>
+        <w:pStyle w:val="Heading2"/>
+      </w:pPr>
+      <w:r>
+        <w:t xml:space="preserve">27.5 Failure behaviour</w:t>
+      </w:r>
+    </w:p>
+    <w:p>
+      <w:pPr>
+        <w:pStyle w:val="Compact"/>
+        <w:numPr>
+          <w:ilvl w:val="0"/>
+          <w:numId w:val="1108"/>
+        </w:numPr>
+      </w:pPr>
+      <w:r>
+        <w:t xml:space="preserve">On provider quota/error, the server returns the</w:t>
+      </w:r>
+      <w:r>
+        <w:t xml:space="preserve"> </w:t>
+      </w:r>
+      <w:r>
+        <w:rPr>
+          <w:b/>
+          <w:bCs/>
+        </w:rPr>
+        <w:t xml:space="preserve">specific reason</w:t>
+      </w:r>
+      <w:r>
+        <w:t xml:space="preserve"> </w:t>
+      </w:r>
+      <w:r>
+        <w:t xml:space="preserve">(surfaced verbatim in the UI, e.g. Question Bank AI generation). Where a deterministic fallback exists (coach</w:t>
+      </w:r>
+      <w:r>
+        <w:t xml:space="preserve"> </w:t>
+      </w:r>
+      <w:r>
+        <w:t xml:space="preserve">“smart plan”</w:t>
+      </w:r>
+      <w:r>
+        <w:t xml:space="preserve">, tutor offline reply), it is clearly badged as non-AI so it is never mistaken for live output.</w:t>
+      </w:r>
+    </w:p>
+    <w:p>
+      <w:r>
+        <w:br w:type="page"/>
+      </w:r>
+    </w:p>
+    <w:bookmarkEnd w:id="229"/>
+    <w:bookmarkEnd w:id="230"/>
+    <w:bookmarkStart w:id="236" w:name="proctoring-anti-cheat-specification"/>
+    <w:p>
+      <w:pPr>
+        <w:pStyle w:val="Heading1"/>
+      </w:pPr>
+      <w:r>
+        <w:t xml:space="preserve">28. Proctoring &amp; Anti-Cheat Specification</w:t>
+      </w:r>
+    </w:p>
+    <w:bookmarkStart w:id="231" w:name="where-it-applies"/>
+    <w:p>
+      <w:pPr>
+        <w:pStyle w:val="Heading2"/>
+      </w:pPr>
+      <w:r>
+        <w:t xml:space="preserve">28.1 Where it applies</w:t>
+      </w:r>
+    </w:p>
+    <w:p>
+      <w:pPr>
+        <w:pStyle w:val="FirstParagraph"/>
+      </w:pPr>
+      <w:r>
+        <w:t xml:space="preserve">Every surface where a student submits an answer shows a</w:t>
+      </w:r>
+      <w:r>
+        <w:t xml:space="preserve"> </w:t>
+      </w:r>
+      <w:r>
+        <w:rPr>
+          <w:b/>
+          <w:bCs/>
+        </w:rPr>
+        <w:t xml:space="preserve">ProctorBanner</w:t>
+      </w:r>
+      <w:r>
+        <w:t xml:space="preserve">: LMS assessments, coding practice, adaptive drill, practice worlds, lesson checks, and the Drive exam portal.</w:t>
+      </w:r>
+    </w:p>
+    <w:bookmarkEnd w:id="231"/>
+    <w:bookmarkStart w:id="232" w:name="signals-client"/>
+    <w:p>
+      <w:pPr>
+        <w:pStyle w:val="Heading2"/>
+      </w:pPr>
+      <w:r>
+        <w:t xml:space="preserve">28.2 Signals (client)</w:t>
+      </w:r>
+    </w:p>
+    <w:p>
+      <w:pPr>
+        <w:pStyle w:val="FirstParagraph"/>
+      </w:pPr>
+      <w:r>
+        <w:rPr>
+          <w:rStyle w:val="VerbatimChar"/>
+        </w:rPr>
+        <w:t xml:space="preserve">lib/proctor.js#attachProctoring</w:t>
+      </w:r>
+      <w:r>
+        <w:t xml:space="preserve"> </w:t>
+      </w:r>
+      <w:r>
+        <w:t xml:space="preserve">captures: tab-switch / window blur, visibility change, fullscreen exit, copy/paste, right-click/context-menu, and dev-tools signals.</w:t>
+      </w:r>
+      <w:r>
+        <w:t xml:space="preserve"> </w:t>
+      </w:r>
+      <w:r>
+        <w:rPr>
+          <w:rStyle w:val="VerbatimChar"/>
+        </w:rPr>
+        <w:t xml:space="preserve">SIGNAL_LABEL</w:t>
+      </w:r>
+      <w:r>
+        <w:t xml:space="preserve"> </w:t>
+      </w:r>
+      <w:r>
+        <w:t xml:space="preserve">maps each to a human label shown in a toast and the proctor log.</w:t>
+      </w:r>
+    </w:p>
+    <w:bookmarkEnd w:id="232"/>
+    <w:bookmarkStart w:id="233" w:name="thresholds"/>
+    <w:p>
+      <w:pPr>
+        <w:pStyle w:val="Heading2"/>
+      </w:pPr>
+      <w:r>
+        <w:t xml:space="preserve">28.3 Thresholds</w:t>
+      </w:r>
+    </w:p>
+    <w:p>
+      <w:pPr>
+        <w:pStyle w:val="Compact"/>
+        <w:numPr>
+          <w:ilvl w:val="0"/>
+          <w:numId w:val="1109"/>
+        </w:numPr>
+      </w:pPr>
+      <w:r>
+        <w:t xml:space="preserve">The client counts flags toward</w:t>
+      </w:r>
+      <w:r>
+        <w:t xml:space="preserve"> </w:t>
+      </w:r>
+      <w:r>
+        <w:rPr>
+          <w:rStyle w:val="VerbatimChar"/>
+          <w:b/>
+          <w:bCs/>
+        </w:rPr>
+        <w:t xml:space="preserve">VIOLATION_LIMIT = 5</w:t>
+      </w:r>
+      <w:r>
+        <w:t xml:space="preserve">; at 5 it</w:t>
+      </w:r>
+      <w:r>
+        <w:t xml:space="preserve"> </w:t>
+      </w:r>
+      <w:r>
+        <w:rPr>
+          <w:b/>
+          <w:bCs/>
+        </w:rPr>
+        <w:t xml:space="preserve">auto-submits</w:t>
+      </w:r>
+      <w:r>
+        <w:t xml:space="preserve"> </w:t>
+      </w:r>
+      <w:r>
+        <w:t xml:space="preserve">(assessment or exam). A one-shot guard prevents overshoot and double submission.</w:t>
+      </w:r>
+    </w:p>
+    <w:p>
+      <w:pPr>
+        <w:pStyle w:val="Compact"/>
+        <w:numPr>
+          <w:ilvl w:val="0"/>
+          <w:numId w:val="1109"/>
+        </w:numPr>
+      </w:pPr>
+      <w:r>
+        <w:t xml:space="preserve">The</w:t>
+      </w:r>
+      <w:r>
+        <w:t xml:space="preserve"> </w:t>
+      </w:r>
+      <w:r>
+        <w:rPr>
+          <w:b/>
+          <w:bCs/>
+        </w:rPr>
+        <w:t xml:space="preserve">backend</w:t>
+      </w:r>
+      <w:r>
+        <w:t xml:space="preserve"> </w:t>
+      </w:r>
+      <w:r>
+        <w:t xml:space="preserve">is authoritative: the anticheat service records each event with a</w:t>
+      </w:r>
+      <w:r>
+        <w:t xml:space="preserve"> </w:t>
+      </w:r>
+      <w:r>
+        <w:rPr>
+          <w:b/>
+          <w:bCs/>
+        </w:rPr>
+        <w:t xml:space="preserve">weight</w:t>
+      </w:r>
+      <w:r>
+        <w:t xml:space="preserve"> </w:t>
+      </w:r>
+      <w:r>
+        <w:t xml:space="preserve">and maintains a</w:t>
+      </w:r>
+      <w:r>
+        <w:t xml:space="preserve"> </w:t>
+      </w:r>
+      <w:r>
+        <w:rPr>
+          <w:b/>
+          <w:bCs/>
+        </w:rPr>
+        <w:t xml:space="preserve">violation_score</w:t>
+      </w:r>
+      <w:r>
+        <w:t xml:space="preserve"> </w:t>
+      </w:r>
+      <w:r>
+        <w:t xml:space="preserve">on the proctor session; it can flag/auto-submit via the weighted score independently of the client count.</w:t>
+      </w:r>
+    </w:p>
+    <w:bookmarkEnd w:id="233"/>
+    <w:bookmarkStart w:id="234" w:name="data-captured"/>
+    <w:p>
+      <w:pPr>
+        <w:pStyle w:val="Heading2"/>
+      </w:pPr>
+      <w:r>
+        <w:t xml:space="preserve">28.4 Data captured</w:t>
+      </w:r>
+    </w:p>
+    <w:p>
+      <w:pPr>
+        <w:pStyle w:val="FirstParagraph"/>
+      </w:pPr>
+      <w:r>
+        <w:rPr>
+          <w:rStyle w:val="VerbatimChar"/>
+        </w:rPr>
+        <w:t xml:space="preserve">proctor_sessions</w:t>
+      </w:r>
+      <w:r>
+        <w:t xml:space="preserve"> </w:t>
+      </w:r>
+      <w:r>
+        <w:t xml:space="preserve">(exam_session_id, candidate, drive, fingerprint, ip, browser, violation_score, status active/flagged/auto_submitted) and append-only</w:t>
+      </w:r>
+      <w:r>
+        <w:t xml:space="preserve"> </w:t>
+      </w:r>
+      <w:r>
+        <w:rPr>
+          <w:rStyle w:val="VerbatimChar"/>
+        </w:rPr>
+        <w:t xml:space="preserve">events</w:t>
+      </w:r>
+      <w:r>
+        <w:t xml:space="preserve"> </w:t>
+      </w:r>
+      <w:r>
+        <w:t xml:space="preserve">(type, weight, ip, browser, device, meta, ts). The exam confirmation reports the final flag count; auto-submitted-for-violation is visually distinct.</w:t>
+      </w:r>
+    </w:p>
+    <w:bookmarkEnd w:id="234"/>
+    <w:bookmarkStart w:id="235" w:name="integrity-beyond-proctoring"/>
+    <w:p>
+      <w:pPr>
+        <w:pStyle w:val="Heading2"/>
+      </w:pPr>
+      <w:r>
+        <w:t xml:space="preserve">28.5 Integrity beyond proctoring</w:t>
+      </w:r>
+    </w:p>
+    <w:p>
+      <w:pPr>
+        <w:pStyle w:val="Compact"/>
+        <w:numPr>
+          <w:ilvl w:val="0"/>
+          <w:numId w:val="1110"/>
+        </w:numPr>
+      </w:pPr>
+      <w:r>
+        <w:rPr>
+          <w:b/>
+          <w:bCs/>
+        </w:rPr>
+        <w:t xml:space="preserve">Shuffle</w:t>
+      </w:r>
+      <w:r>
+        <w:t xml:space="preserve"> </w:t>
+      </w:r>
+      <w:r>
+        <w:t xml:space="preserve">— assessments can shuffle question + option order per student.</w:t>
+      </w:r>
+    </w:p>
+    <w:p>
+      <w:pPr>
+        <w:pStyle w:val="Compact"/>
+        <w:numPr>
+          <w:ilvl w:val="0"/>
+          <w:numId w:val="1110"/>
+        </w:numPr>
+      </w:pPr>
+      <w:r>
+        <w:rPr>
+          <w:b/>
+          <w:bCs/>
+        </w:rPr>
+        <w:t xml:space="preserve">Adversarial viva</w:t>
+      </w:r>
+      <w:r>
+        <w:t xml:space="preserve"> </w:t>
+      </w:r>
+      <w:r>
+        <w:t xml:space="preserve">— coding</w:t>
+      </w:r>
+      <w:r>
+        <w:t xml:space="preserve"> </w:t>
+      </w:r>
+      <w:r>
+        <w:t xml:space="preserve">“verified”</w:t>
+      </w:r>
+      <w:r>
+        <w:t xml:space="preserve"> </w:t>
+      </w:r>
+      <w:r>
+        <w:t xml:space="preserve">status requires explaining your own solution, defeating paste-only cheating.</w:t>
+      </w:r>
+    </w:p>
+    <w:p>
+      <w:pPr>
+        <w:pStyle w:val="Compact"/>
+        <w:numPr>
+          <w:ilvl w:val="0"/>
+          <w:numId w:val="1110"/>
+        </w:numPr>
+      </w:pPr>
+      <w:r>
+        <w:rPr>
+          <w:b/>
+          <w:bCs/>
+        </w:rPr>
+        <w:t xml:space="preserve">Hidden test cases</w:t>
+      </w:r>
+      <w:r>
+        <w:t xml:space="preserve"> </w:t>
+      </w:r>
+      <w:r>
+        <w:t xml:space="preserve">— never exposed to students; grading happens server-side.</w:t>
+      </w:r>
+    </w:p>
+    <w:p>
+      <w:r>
+        <w:br w:type="page"/>
+      </w:r>
+    </w:p>
+    <w:bookmarkEnd w:id="235"/>
+    <w:bookmarkEnd w:id="236"/>
+    <w:bookmarkStart w:id="237" w:name="testing-quality-strategy"/>
+    <w:p>
+      <w:pPr>
+        <w:pStyle w:val="Heading1"/>
+      </w:pPr>
+      <w:r>
+        <w:t xml:space="preserve">29. Testing &amp; Quality Strategy</w:t>
+      </w:r>
+    </w:p>
+    <w:tbl>
+      <w:tblPr>
+        <w:tblStyle w:val="Table"/>
+        <w:tblW w:type="pct" w:w="5000"/>
+        <w:tblLayout w:type="fixed"/>
+        <w:tblLook w:firstRow="1" w:lastRow="0" w:firstColumn="0" w:lastColumn="0" w:noHBand="0" w:noVBand="0" w:val="0020"/>
+      </w:tblPr>
+      <w:tblGrid>
+        <w:gridCol w:w="3960"/>
+        <w:gridCol w:w="3960"/>
+      </w:tblGrid>
+      <w:tr>
+        <w:trPr>
+          <w:tblHeader w:val="on"/>
+        </w:trPr>
+        <w:tc>
+          <w:tcPr/>
+          <w:p>
+            <w:pPr>
+              <w:pStyle w:val="Compact"/>
+            </w:pPr>
+            <w:r>
+              <w:t xml:space="preserve">Layer</w:t>
+            </w:r>
+          </w:p>
+        </w:tc>
+        <w:tc>
+          <w:tcPr/>
+          <w:p>
+            <w:pPr>
+              <w:pStyle w:val="Compact"/>
+            </w:pPr>
+            <w:r>
+              <w:t xml:space="preserve">Strategy</w:t>
+            </w:r>
+          </w:p>
+        </w:tc>
+      </w:tr>
+      <w:tr>
+        <w:tc>
+          <w:tcPr/>
+          <w:p>
+            <w:pPr>
+              <w:pStyle w:val="Compact"/>
+            </w:pPr>
+            <w:r>
+              <w:rPr>
+                <w:b/>
+                <w:bCs/>
+              </w:rPr>
+              <w:t xml:space="preserve">Unit</w:t>
+            </w:r>
+          </w:p>
+        </w:tc>
+        <w:tc>
+          <w:tcPr/>
+          <w:p>
+            <w:pPr>
+              <w:pStyle w:val="Compact"/>
+            </w:pPr>
+            <w:r>
+              <w:t xml:space="preserve">Pure functions (scoring, spaced-repetition scheduling, the marker parser, the exam calculator’s shunting-yard evaluator) are deterministic and unit-testable.</w:t>
+            </w:r>
+          </w:p>
+        </w:tc>
+      </w:tr>
+      <w:tr>
+        <w:tc>
+          <w:tcPr/>
+          <w:p>
+            <w:pPr>
+              <w:pStyle w:val="Compact"/>
+            </w:pPr>
+            <w:r>
+              <w:rPr>
+                <w:b/>
+                <w:bCs/>
+              </w:rPr>
+              <w:t xml:space="preserve">Service/API</w:t>
+            </w:r>
+          </w:p>
+        </w:tc>
+        <w:tc>
+          <w:tcPr/>
+          <w:p>
+            <w:pPr>
+              <w:pStyle w:val="Compact"/>
+            </w:pPr>
+            <w:r>
+              <w:t xml:space="preserve">Each service exposes a versioned REST surface with the standard envelope; contract tests assert status + envelope + auth/ownership (e.g. cross-user 403).</w:t>
+            </w:r>
+          </w:p>
+        </w:tc>
+      </w:tr>
+      <w:tr>
+        <w:tc>
+          <w:tcPr/>
+          <w:p>
+            <w:pPr>
+              <w:pStyle w:val="Compact"/>
+            </w:pPr>
+            <w:r>
+              <w:rPr>
+                <w:b/>
+                <w:bCs/>
+              </w:rPr>
+              <w:t xml:space="preserve">Integration</w:t>
+            </w:r>
+          </w:p>
+        </w:tc>
+        <w:tc>
+          <w:tcPr/>
+          <w:p>
+            <w:pPr>
+              <w:pStyle w:val="Compact"/>
+            </w:pPr>
+            <w:r>
+              <w:t xml:space="preserve">Take-flows (assessment attempt → submit → score → twin update; exam start → save → submit → evaluate → rank → result → offer) validated end-to-end against a seeded dataset.</w:t>
+            </w:r>
+          </w:p>
+        </w:tc>
+      </w:tr>
+      <w:tr>
+        <w:tc>
+          <w:tcPr/>
+          <w:p>
+            <w:pPr>
+              <w:pStyle w:val="Compact"/>
+            </w:pPr>
+            <w:r>
+              <w:rPr>
+                <w:b/>
+                <w:bCs/>
+              </w:rPr>
+              <w:t xml:space="preserve">Seed-based E2E</w:t>
+            </w:r>
+          </w:p>
+        </w:tc>
+        <w:tc>
+          <w:tcPr/>
+          <w:p>
+            <w:pPr>
+              <w:pStyle w:val="Compact"/>
+            </w:pPr>
+            <w:r>
+              <w:t xml:space="preserve">A 30-student demo dataset spanning every feature enables realistic click-throughs and admin analytics validation; a</w:t>
+            </w:r>
+            <w:r>
+              <w:t xml:space="preserve"> </w:t>
+            </w:r>
+            <w:r>
+              <w:rPr>
+                <w:rStyle w:val="VerbatimChar"/>
+              </w:rPr>
+              <w:t xml:space="preserve">clean</w:t>
+            </w:r>
+            <w:r>
+              <w:t xml:space="preserve"> </w:t>
+            </w:r>
+            <w:r>
+              <w:t xml:space="preserve">mode wipes it.</w:t>
+            </w:r>
+          </w:p>
+        </w:tc>
+      </w:tr>
+      <w:tr>
+        <w:tc>
+          <w:tcPr/>
+          <w:p>
+            <w:pPr>
+              <w:pStyle w:val="Compact"/>
+            </w:pPr>
+            <w:r>
+              <w:rPr>
+                <w:b/>
+                <w:bCs/>
+              </w:rPr>
+              <w:t xml:space="preserve">Resilience</w:t>
+            </w:r>
+          </w:p>
+        </w:tc>
+        <w:tc>
+          <w:tcPr/>
+          <w:p>
+            <w:pPr>
+              <w:pStyle w:val="Compact"/>
+            </w:pPr>
+            <w:r>
+              <w:t xml:space="preserve">Per-student seed commits with try/except so one bad row can’t abort a run; the frontend renders empty states on failure (never fabricated data in production).</w:t>
+            </w:r>
+          </w:p>
+        </w:tc>
+      </w:tr>
+      <w:tr>
+        <w:tc>
+          <w:tcPr/>
+          <w:p>
+            <w:pPr>
+              <w:pStyle w:val="Compact"/>
+            </w:pPr>
+            <w:r>
+              <w:rPr>
+                <w:b/>
+                <w:bCs/>
+              </w:rPr>
+              <w:t xml:space="preserve">Regression focus</w:t>
+            </w:r>
+          </w:p>
+        </w:tc>
+        <w:tc>
+          <w:tcPr/>
+          <w:p>
+            <w:pPr>
+              <w:pStyle w:val="Compact"/>
+            </w:pPr>
+            <w:r>
+              <w:t xml:space="preserve">The known-risk areas — token refresh on binary downloads, proctor auto-submit idempotency, no-answer-loss in Submission, per-user data isolation — have explicit guards described in this document.</w:t>
+            </w:r>
+          </w:p>
+        </w:tc>
+      </w:tr>
+    </w:tbl>
+    <w:p>
+      <w:r>
+        <w:br w:type="page"/>
+      </w:r>
+    </w:p>
+    <w:bookmarkEnd w:id="237"/>
+    <w:bookmarkStart w:id="243" w:name="operations-runbook"/>
+    <w:p>
+      <w:pPr>
+        <w:pStyle w:val="Heading1"/>
+      </w:pPr>
+      <w:r>
+        <w:t xml:space="preserve">30. Operations Runbook</w:t>
+      </w:r>
+    </w:p>
+    <w:bookmarkStart w:id="238" w:name="deploy-redeploy"/>
+    <w:p>
+      <w:pPr>
+        <w:pStyle w:val="Heading2"/>
+      </w:pPr>
+      <w:r>
+        <w:t xml:space="preserve">30.1 Deploy / redeploy</w:t>
+      </w:r>
+    </w:p>
+    <w:p>
+      <w:pPr>
+        <w:pStyle w:val="Compact"/>
+        <w:numPr>
+          <w:ilvl w:val="0"/>
+          <w:numId w:val="1111"/>
+        </w:numPr>
+      </w:pPr>
+      <w:r>
+        <w:t xml:space="preserve">First-time: provision RDS + EC2, install packages, clone, venv +</w:t>
+      </w:r>
+      <w:r>
+        <w:t xml:space="preserve"> </w:t>
+      </w:r>
+      <w:r>
+        <w:rPr>
+          <w:rStyle w:val="VerbatimChar"/>
+        </w:rPr>
+        <w:t xml:space="preserve">pip install</w:t>
+      </w:r>
+      <w:r>
+        <w:t xml:space="preserve"> </w:t>
+      </w:r>
+      <w:r>
+        <w:t xml:space="preserve">(base + per-service + editable</w:t>
+      </w:r>
+      <w:r>
+        <w:t xml:space="preserve"> </w:t>
+      </w:r>
+      <w:r>
+        <w:rPr>
+          <w:rStyle w:val="VerbatimChar"/>
+        </w:rPr>
+        <w:t xml:space="preserve">libs/</w:t>
+      </w:r>
+      <w:r>
+        <w:t xml:space="preserve">), RS256 keys,</w:t>
+      </w:r>
+      <w:r>
+        <w:t xml:space="preserve"> </w:t>
+      </w:r>
+      <w:r>
+        <w:rPr>
+          <w:rStyle w:val="VerbatimChar"/>
+        </w:rPr>
+        <w:t xml:space="preserve">.env</w:t>
+      </w:r>
+      <w:r>
+        <w:t xml:space="preserve">,</w:t>
+      </w:r>
+      <w:r>
+        <w:t xml:space="preserve"> </w:t>
+      </w:r>
+      <w:r>
+        <w:rPr>
+          <w:rStyle w:val="VerbatimChar"/>
+        </w:rPr>
+        <w:t xml:space="preserve">init-db</w:t>
+      </w:r>
+      <w:r>
+        <w:t xml:space="preserve"> </w:t>
+      </w:r>
+      <w:r>
+        <w:t xml:space="preserve">per service + column migrations, build SPA → nginx root, configure nginx + TLS, start services.</w:t>
+      </w:r>
+    </w:p>
+    <w:p>
+      <w:pPr>
+        <w:pStyle w:val="Compact"/>
+        <w:numPr>
+          <w:ilvl w:val="0"/>
+          <w:numId w:val="1111"/>
+        </w:numPr>
+      </w:pPr>
+      <w:r>
+        <w:t xml:space="preserve">Redeploy:</w:t>
+      </w:r>
+      <w:r>
+        <w:t xml:space="preserve"> </w:t>
+      </w:r>
+      <w:r>
+        <w:rPr>
+          <w:rStyle w:val="VerbatimChar"/>
+        </w:rPr>
+        <w:t xml:space="preserve">./redeploy.sh</w:t>
+      </w:r>
+      <w:r>
+        <w:t xml:space="preserve"> </w:t>
+      </w:r>
+      <w:r>
+        <w:t xml:space="preserve">(pull → restart backend → rebuild + publish SPA). Flags:</w:t>
+      </w:r>
+      <w:r>
+        <w:t xml:space="preserve"> </w:t>
+      </w:r>
+      <w:r>
+        <w:rPr>
+          <w:rStyle w:val="VerbatimChar"/>
+        </w:rPr>
+        <w:t xml:space="preserve">FRONTEND_ONLY</w:t>
+      </w:r>
+      <w:r>
+        <w:t xml:space="preserve">,</w:t>
+      </w:r>
+      <w:r>
+        <w:t xml:space="preserve"> </w:t>
+      </w:r>
+      <w:r>
+        <w:rPr>
+          <w:rStyle w:val="VerbatimChar"/>
+        </w:rPr>
+        <w:t xml:space="preserve">BACKEND_ONLY</w:t>
+      </w:r>
+      <w:r>
+        <w:t xml:space="preserve">,</w:t>
+      </w:r>
+      <w:r>
+        <w:t xml:space="preserve"> </w:t>
+      </w:r>
+      <w:r>
+        <w:rPr>
+          <w:rStyle w:val="VerbatimChar"/>
+        </w:rPr>
+        <w:t xml:space="preserve">DEPS</w:t>
+      </w:r>
+      <w:r>
+        <w:t xml:space="preserve">,</w:t>
+      </w:r>
+      <w:r>
+        <w:t xml:space="preserve"> </w:t>
+      </w:r>
+      <w:r>
+        <w:rPr>
+          <w:rStyle w:val="VerbatimChar"/>
+        </w:rPr>
+        <w:t xml:space="preserve">WEB_ROOT</w:t>
+      </w:r>
+      <w:r>
+        <w:t xml:space="preserve">.</w:t>
+      </w:r>
+      <w:r>
+        <w:t xml:space="preserve"> </w:t>
+      </w:r>
+      <w:r>
+        <w:rPr>
+          <w:rStyle w:val="VerbatimChar"/>
+        </w:rPr>
+        <w:t xml:space="preserve">npm ci</w:t>
+      </w:r>
+      <w:r>
+        <w:t xml:space="preserve"> </w:t>
+      </w:r>
+      <w:r>
+        <w:t xml:space="preserve">auto-runs if</w:t>
+      </w:r>
+      <w:r>
+        <w:t xml:space="preserve"> </w:t>
+      </w:r>
+      <w:r>
+        <w:rPr>
+          <w:rStyle w:val="VerbatimChar"/>
+        </w:rPr>
+        <w:t xml:space="preserve">node_modules</w:t>
+      </w:r>
+      <w:r>
+        <w:t xml:space="preserve"> </w:t>
+      </w:r>
+      <w:r>
+        <w:t xml:space="preserve">is missing.</w:t>
+      </w:r>
+      <w:r>
+        <w:t xml:space="preserve"> </w:t>
+      </w:r>
+      <w:r>
+        <w:rPr>
+          <w:b/>
+          <w:bCs/>
+        </w:rPr>
+        <w:t xml:space="preserve">Publishing must copy</w:t>
+      </w:r>
+      <w:r>
+        <w:rPr>
+          <w:b/>
+          <w:bCs/>
+        </w:rPr>
+        <w:t xml:space="preserve"> </w:t>
+      </w:r>
+      <w:r>
+        <w:rPr>
+          <w:rStyle w:val="VerbatimChar"/>
+          <w:b/>
+          <w:bCs/>
+        </w:rPr>
+        <w:t xml:space="preserve">dist</w:t>
+      </w:r>
+      <w:r>
+        <w:rPr>
+          <w:b/>
+          <w:bCs/>
+        </w:rPr>
+        <w:t xml:space="preserve"> </w:t>
+      </w:r>
+      <w:r>
+        <w:rPr>
+          <w:b/>
+          <w:bCs/>
+        </w:rPr>
+        <w:t xml:space="preserve">into the nginx root</w:t>
+      </w:r>
+      <w:r>
+        <w:t xml:space="preserve"> </w:t>
+      </w:r>
+      <w:r>
+        <w:t xml:space="preserve">— building alone doesn’t update what nginx serves.</w:t>
+      </w:r>
+    </w:p>
+    <w:bookmarkEnd w:id="238"/>
+    <w:bookmarkStart w:id="239" w:name="start-stop-health"/>
+    <w:p>
+      <w:pPr>
+        <w:pStyle w:val="Heading2"/>
+      </w:pPr>
+      <w:r>
+        <w:t xml:space="preserve">30.2 Start / stop / health</w:t>
+      </w:r>
+    </w:p>
+    <w:p>
+      <w:pPr>
+        <w:pStyle w:val="Compact"/>
+        <w:numPr>
+          <w:ilvl w:val="0"/>
+          <w:numId w:val="1112"/>
+        </w:numPr>
+      </w:pPr>
+      <w:r>
+        <w:rPr>
+          <w:rStyle w:val="VerbatimChar"/>
+        </w:rPr>
+        <w:t xml:space="preserve">./run-all.sh</w:t>
+      </w:r>
+      <w:r>
+        <w:t xml:space="preserve"> </w:t>
+      </w:r>
+      <w:r>
+        <w:t xml:space="preserve">starts the gateway + 26 services (loads</w:t>
+      </w:r>
+      <w:r>
+        <w:t xml:space="preserve"> </w:t>
+      </w:r>
+      <w:r>
+        <w:rPr>
+          <w:rStyle w:val="VerbatimChar"/>
+        </w:rPr>
+        <w:t xml:space="preserve">.env</w:t>
+      </w:r>
+      <w:r>
+        <w:t xml:space="preserve">, sets</w:t>
+      </w:r>
+      <w:r>
+        <w:t xml:space="preserve"> </w:t>
+      </w:r>
+      <w:r>
+        <w:rPr>
+          <w:rStyle w:val="VerbatimChar"/>
+        </w:rPr>
+        <w:t xml:space="preserve">DB_SCHEMA</w:t>
+      </w:r>
+      <w:r>
+        <w:t xml:space="preserve"> </w:t>
+      </w:r>
+      <w:r>
+        <w:t xml:space="preserve">per service, runs</w:t>
+      </w:r>
+      <w:r>
+        <w:t xml:space="preserve"> </w:t>
+      </w:r>
+      <w:r>
+        <w:rPr>
+          <w:rStyle w:val="VerbatimChar"/>
+        </w:rPr>
+        <w:t xml:space="preserve">init-db</w:t>
+      </w:r>
+      <w:r>
+        <w:t xml:space="preserve">, serves).</w:t>
+      </w:r>
+      <w:r>
+        <w:t xml:space="preserve"> </w:t>
+      </w:r>
+      <w:r>
+        <w:rPr>
+          <w:rStyle w:val="VerbatimChar"/>
+        </w:rPr>
+        <w:t xml:space="preserve">./stop-all.sh</w:t>
+      </w:r>
+      <w:r>
+        <w:t xml:space="preserve"> </w:t>
+      </w:r>
+      <w:r>
+        <w:t xml:space="preserve">(or</w:t>
+      </w:r>
+      <w:r>
+        <w:t xml:space="preserve"> </w:t>
+      </w:r>
+      <w:r>
+        <w:rPr>
+          <w:rStyle w:val="VerbatimChar"/>
+        </w:rPr>
+        <w:t xml:space="preserve">pkill -f "manage.py serve"</w:t>
+      </w:r>
+      <w:r>
+        <w:t xml:space="preserve">) stops them.</w:t>
+      </w:r>
+    </w:p>
+    <w:p>
+      <w:pPr>
+        <w:pStyle w:val="Compact"/>
+        <w:numPr>
+          <w:ilvl w:val="0"/>
+          <w:numId w:val="1112"/>
+        </w:numPr>
+      </w:pPr>
+      <w:r>
+        <w:t xml:space="preserve">Health:</w:t>
+      </w:r>
+      <w:r>
+        <w:t xml:space="preserve"> </w:t>
+      </w:r>
+      <w:r>
+        <w:rPr>
+          <w:rStyle w:val="VerbatimChar"/>
+        </w:rPr>
+        <w:t xml:space="preserve">curl http://127.0.0.1:8000/health</w:t>
+      </w:r>
+      <w:r>
+        <w:t xml:space="preserve">; scan all ports 8000–8026; each</w:t>
+      </w:r>
+      <w:r>
+        <w:t xml:space="preserve"> </w:t>
+      </w:r>
+      <w:r>
+        <w:rPr>
+          <w:rStyle w:val="VerbatimChar"/>
+        </w:rPr>
+        <w:t xml:space="preserve">/health</w:t>
+      </w:r>
+      <w:r>
+        <w:t xml:space="preserve"> </w:t>
+      </w:r>
+      <w:r>
+        <w:t xml:space="preserve">returns</w:t>
+      </w:r>
+      <w:r>
+        <w:t xml:space="preserve"> </w:t>
+      </w:r>
+      <w:r>
+        <w:rPr>
+          <w:rStyle w:val="VerbatimChar"/>
+        </w:rPr>
+        <w:t xml:space="preserve">{status:"ok"}</w:t>
+      </w:r>
+      <w:r>
+        <w:t xml:space="preserve">.</w:t>
+      </w:r>
+    </w:p>
+    <w:bookmarkEnd w:id="239"/>
+    <w:bookmarkStart w:id="240" w:name="backups-dr"/>
+    <w:p>
+      <w:pPr>
+        <w:pStyle w:val="Heading2"/>
+      </w:pPr>
+      <w:r>
+        <w:t xml:space="preserve">30.3 Backups &amp; DR</w:t>
+      </w:r>
+    </w:p>
+    <w:p>
+      <w:pPr>
+        <w:pStyle w:val="Compact"/>
+        <w:numPr>
+          <w:ilvl w:val="0"/>
+          <w:numId w:val="1113"/>
+        </w:numPr>
+      </w:pPr>
+      <w:r>
+        <w:t xml:space="preserve">RDS automated backups + PITR. Keep</w:t>
+      </w:r>
+      <w:r>
+        <w:t xml:space="preserve"> </w:t>
+      </w:r>
+      <w:r>
+        <w:rPr>
+          <w:rStyle w:val="VerbatimChar"/>
+        </w:rPr>
+        <w:t xml:space="preserve">.env</w:t>
+      </w:r>
+      <w:r>
+        <w:t xml:space="preserve"> </w:t>
+      </w:r>
+      <w:r>
+        <w:t xml:space="preserve">and the JWT PEMs in a secrets store, not only on the box. The wallet/certificate verify ids are stable so shared links survive re-issue.</w:t>
+      </w:r>
+    </w:p>
+    <w:bookmarkEnd w:id="240"/>
+    <w:bookmarkStart w:id="241" w:name="scaling"/>
+    <w:p>
+      <w:pPr>
+        <w:pStyle w:val="Heading2"/>
+      </w:pPr>
+      <w:r>
+        <w:t xml:space="preserve">30.4 Scaling</w:t>
+      </w:r>
+    </w:p>
+    <w:p>
+      <w:pPr>
+        <w:pStyle w:val="Compact"/>
+        <w:numPr>
+          <w:ilvl w:val="0"/>
+          <w:numId w:val="1114"/>
+        </w:numPr>
+      </w:pPr>
+      <w:r>
+        <w:t xml:space="preserve">Grow the EBS disk before it fills (venv + node build need headroom). Add swap on low-RAM boxes so the Vite build isn’t OOM-killed; build the SPA before starting the 26 services when RAM is tight. Move Redis to ElastiCache; put multiple app boxes behind a load balancer; give exam + coding more workers.</w:t>
+      </w:r>
+    </w:p>
+    <w:bookmarkEnd w:id="241"/>
+    <w:bookmarkStart w:id="242" w:name="Xe5fb6c8f48134566e44c5a19f54b2ba22efa160"/>
+    <w:p>
+      <w:pPr>
+        <w:pStyle w:val="Heading2"/>
+      </w:pPr>
+      <w:r>
+        <w:t xml:space="preserve">30.5 Known operational lessons (captured in production)</w:t>
+      </w:r>
+    </w:p>
+    <w:p>
+      <w:pPr>
+        <w:pStyle w:val="Compact"/>
+        <w:numPr>
+          <w:ilvl w:val="0"/>
+          <w:numId w:val="1115"/>
+        </w:numPr>
+      </w:pPr>
+      <w:r>
+        <w:rPr>
+          <w:b/>
+          <w:bCs/>
+        </w:rPr>
+        <w:t xml:space="preserve">Python 3.14</w:t>
+      </w:r>
+      <w:r>
+        <w:t xml:space="preserve">: relax pins for</w:t>
+      </w:r>
+      <w:r>
+        <w:t xml:space="preserve"> </w:t>
+      </w:r>
+      <w:r>
+        <w:rPr>
+          <w:rStyle w:val="VerbatimChar"/>
+        </w:rPr>
+        <w:t xml:space="preserve">psycopg</w:t>
+      </w:r>
+      <w:r>
+        <w:t xml:space="preserve">,</w:t>
+      </w:r>
+      <w:r>
+        <w:t xml:space="preserve"> </w:t>
+      </w:r>
+      <w:r>
+        <w:rPr>
+          <w:rStyle w:val="VerbatimChar"/>
+        </w:rPr>
+        <w:t xml:space="preserve">pydantic</w:t>
+      </w:r>
+      <w:r>
+        <w:t xml:space="preserve"> </w:t>
+      </w:r>
+      <w:r>
+        <w:t xml:space="preserve">(≥2.13.4), and</w:t>
+      </w:r>
+      <w:r>
+        <w:t xml:space="preserve"> </w:t>
+      </w:r>
+      <w:r>
+        <w:rPr>
+          <w:rStyle w:val="VerbatimChar"/>
+        </w:rPr>
+        <w:t xml:space="preserve">SQLAlchemy</w:t>
+      </w:r>
+      <w:r>
+        <w:t xml:space="preserve"> </w:t>
+      </w:r>
+      <w:r>
+        <w:t xml:space="preserve">(≥2.0.43) to versions shipping 3.14 wheels.</w:t>
+      </w:r>
+    </w:p>
+    <w:p>
+      <w:pPr>
+        <w:pStyle w:val="Compact"/>
+        <w:numPr>
+          <w:ilvl w:val="0"/>
+          <w:numId w:val="1115"/>
+        </w:numPr>
+      </w:pPr>
+      <w:r>
+        <w:rPr>
+          <w:rStyle w:val="VerbatimChar"/>
+          <w:b/>
+          <w:bCs/>
+        </w:rPr>
+        <w:t xml:space="preserve">lare_common</w:t>
+      </w:r>
+      <w:r>
+        <w:t xml:space="preserve"> </w:t>
+      </w:r>
+      <w:r>
+        <w:t xml:space="preserve">must be</w:t>
+      </w:r>
+      <w:r>
+        <w:t xml:space="preserve"> </w:t>
+      </w:r>
+      <w:r>
+        <w:rPr>
+          <w:rStyle w:val="VerbatimChar"/>
+        </w:rPr>
+        <w:t xml:space="preserve">pip install -e libs</w:t>
+      </w:r>
+      <w:r>
+        <w:t xml:space="preserve"> </w:t>
+      </w:r>
+      <w:r>
+        <w:t xml:space="preserve">— a fresh venv without it fails every service on import.</w:t>
+      </w:r>
+    </w:p>
+    <w:p>
+      <w:pPr>
+        <w:pStyle w:val="Compact"/>
+        <w:numPr>
+          <w:ilvl w:val="0"/>
+          <w:numId w:val="1115"/>
+        </w:numPr>
+      </w:pPr>
+      <w:r>
+        <w:rPr>
+          <w:b/>
+          <w:bCs/>
+        </w:rPr>
+        <w:t xml:space="preserve">Binary downloads</w:t>
+      </w:r>
+      <w:r>
+        <w:t xml:space="preserve"> </w:t>
+      </w:r>
+      <w:r>
+        <w:t xml:space="preserve">refresh the token like any call, so exports survive an access-token expiry mid-session.</w:t>
+      </w:r>
+    </w:p>
+    <w:p>
+      <w:pPr>
+        <w:pStyle w:val="Compact"/>
+        <w:numPr>
+          <w:ilvl w:val="0"/>
+          <w:numId w:val="1115"/>
+        </w:numPr>
+      </w:pPr>
+      <w:r>
+        <w:rPr>
+          <w:b/>
+          <w:bCs/>
+        </w:rPr>
+        <w:t xml:space="preserve">No fabricated data in production</w:t>
+      </w:r>
+      <w:r>
+        <w:t xml:space="preserve">:</w:t>
+      </w:r>
+      <w:r>
+        <w:t xml:space="preserve"> </w:t>
+      </w:r>
+      <w:r>
+        <w:rPr>
+          <w:rStyle w:val="VerbatimChar"/>
+        </w:rPr>
+        <w:t xml:space="preserve">withFallback</w:t>
+      </w:r>
+      <w:r>
+        <w:t xml:space="preserve"> </w:t>
+      </w:r>
+      <w:r>
+        <w:t xml:space="preserve">blanks demo data in production builds, preventing one user’s shape (e.g. a demo profile) from showing to another.</w:t>
+      </w:r>
+    </w:p>
+    <w:p>
+      <w:r>
         <w:pict>
           <v:rect style="width:0;height:1.5pt" o:hralign="center" o:hrstd="t" o:hr="t"/>
         </w:pict>
@@ -41560,8 +43761,8 @@
         <w:t xml:space="preserve">End of document. Prepared for LARE Cloud Solutions - a unit of LARE Consulting &amp; Technology Pvt. Ltd.</w:t>
       </w:r>
     </w:p>
-    <w:bookmarkEnd w:id="222"/>
-    <w:bookmarkEnd w:id="223"/>
+    <w:bookmarkEnd w:id="242"/>
+    <w:bookmarkEnd w:id="243"/>
     <w:sectPr>
       <w:footnotePr>
         <w:numRestart w:val="eachSect"/>
@@ -42308,6 +44509,39 @@
     <w:abstractNumId w:val="991"/>
   </w:num>
   <w:num w:numId="1104">
+    <w:abstractNumId w:val="991"/>
+  </w:num>
+  <w:num w:numId="1105">
+    <w:abstractNumId w:val="991"/>
+  </w:num>
+  <w:num w:numId="1106">
+    <w:abstractNumId w:val="991"/>
+  </w:num>
+  <w:num w:numId="1107">
+    <w:abstractNumId w:val="991"/>
+  </w:num>
+  <w:num w:numId="1108">
+    <w:abstractNumId w:val="991"/>
+  </w:num>
+  <w:num w:numId="1109">
+    <w:abstractNumId w:val="991"/>
+  </w:num>
+  <w:num w:numId="1110">
+    <w:abstractNumId w:val="991"/>
+  </w:num>
+  <w:num w:numId="1111">
+    <w:abstractNumId w:val="991"/>
+  </w:num>
+  <w:num w:numId="1112">
+    <w:abstractNumId w:val="991"/>
+  </w:num>
+  <w:num w:numId="1113">
+    <w:abstractNumId w:val="991"/>
+  </w:num>
+  <w:num w:numId="1114">
+    <w:abstractNumId w:val="991"/>
+  </w:num>
+  <w:num w:numId="1115">
     <w:abstractNumId w:val="991"/>
   </w:num>
 </w:numbering>

</xml_diff>